<commit_message>
Réorganise le corps des fiches en tableaux et ajoute la légende
Reprend l'organisation des fiches Diploma Santé : tout le corps est
désormais structuré en tableaux à deux colonnes (concept | détail
exhaustif), avec sous-tableaux de comparaison. Ajoute une légende sur la
page de garde avec trois marqueurs colorés insérés dans le contenu par
l'IA : ★ déjà tombé aux ECN, ◆ notion à haut rendement, ⚠ piège
classique. Supprime les encadrés au profit de ce format tout-tableaux.

https://claude.ai/code/session_019UxbrWiVNiHBdkHsxX6ghC
</commit_message>
<xml_diff>
--- a/examples/Cardiologie_Hypertension-Arterielle_2025-2026.docx
+++ b/examples/Cardiologie_Hypertension-Arterielle_2025-2026.docx
@@ -6,8 +6,6 @@
       <w:tblPr>
         <w:tblW w:type="auto" w:w="0"/>
         <w:jc w:val="center"/>
-        <w:tblLayout w:type="fixed"/>
-        <w:tblLook w:firstColumn="1" w:firstRow="1" w:lastColumn="0" w:lastRow="0" w:noHBand="0" w:noVBand="1" w:val="04A0"/>
         <w:tblBorders>
           <w:top w:val="none"/>
           <w:left w:val="none"/>
@@ -16,6 +14,8 @@
           <w:insideH w:val="none"/>
           <w:insideV w:val="none"/>
         </w:tblBorders>
+        <w:tblLayout w:type="fixed"/>
+        <w:tblLook w:firstColumn="1" w:firstRow="1" w:lastColumn="0" w:lastRow="0" w:noHBand="0" w:noVBand="1" w:val="04A0"/>
       </w:tblPr>
       <w:tblGrid>
         <w:gridCol w:w="4933"/>
@@ -99,8 +99,8 @@
                 <w:rFonts w:ascii="Inter" w:hAnsi="Inter"/>
                 <w:b/>
                 <w:color w:val="C9A961"/>
+                <w:spacing w:val="80"/>
                 <w:sz w:val="26"/>
-                <w:spacing w:val="80"/>
               </w:rPr>
               <w:t>CARDIOLOGIE</w:t>
             </w:r>
@@ -167,8 +167,8 @@
               <w:rPr>
                 <w:rFonts w:ascii="Inter" w:hAnsi="Inter"/>
                 <w:color w:val="9CA3AF"/>
+                <w:spacing w:val="40"/>
                 <w:sz w:val="18"/>
-                <w:spacing w:val="40"/>
               </w:rPr>
               <w:t>ITEM 224</w:t>
             </w:r>
@@ -201,6 +201,94 @@
               <w:t>Item 224</w:t>
             </w:r>
           </w:p>
+          <w:p>
+            <w:r>
+              <w:rPr>
+                <w:sz w:val="28"/>
+              </w:rPr>
+            </w:r>
+          </w:p>
+          <w:p>
+            <w:pPr>
+              <w:jc w:val="center"/>
+            </w:pPr>
+            <w:r>
+              <w:rPr>
+                <w:rFonts w:ascii="Inter" w:hAnsi="Inter"/>
+                <w:b/>
+                <w:color w:val="C9A961"/>
+                <w:spacing w:val="44"/>
+                <w:sz w:val="18"/>
+              </w:rPr>
+              <w:t>LÉGENDE</w:t>
+            </w:r>
+          </w:p>
+          <w:p>
+            <w:pPr>
+              <w:spacing w:after="40"/>
+              <w:jc w:val="center"/>
+            </w:pPr>
+            <w:r>
+              <w:rPr>
+                <w:b/>
+                <w:color w:val="C9A961"/>
+                <w:sz w:val="22"/>
+              </w:rPr>
+              <w:t xml:space="preserve">★  </w:t>
+            </w:r>
+            <w:r>
+              <w:rPr>
+                <w:rFonts w:ascii="Inter" w:hAnsi="Inter"/>
+                <w:color w:val="1F2937"/>
+                <w:sz w:val="18"/>
+              </w:rPr>
+              <w:t>Déjà tombé aux ECN</w:t>
+            </w:r>
+          </w:p>
+          <w:p>
+            <w:pPr>
+              <w:spacing w:after="40"/>
+              <w:jc w:val="center"/>
+            </w:pPr>
+            <w:r>
+              <w:rPr>
+                <w:b/>
+                <w:color w:val="E11D48"/>
+                <w:sz w:val="22"/>
+              </w:rPr>
+              <w:t xml:space="preserve">◆  </w:t>
+            </w:r>
+            <w:r>
+              <w:rPr>
+                <w:rFonts w:ascii="Inter" w:hAnsi="Inter"/>
+                <w:color w:val="1F2937"/>
+                <w:sz w:val="18"/>
+              </w:rPr>
+              <w:t>Notion à haut rendement</w:t>
+            </w:r>
+          </w:p>
+          <w:p>
+            <w:pPr>
+              <w:spacing w:after="40"/>
+              <w:jc w:val="center"/>
+            </w:pPr>
+            <w:r>
+              <w:rPr>
+                <w:b/>
+                <w:color w:val="B91C1C"/>
+                <w:sz w:val="22"/>
+              </w:rPr>
+              <w:t xml:space="preserve">⚠  </w:t>
+            </w:r>
+            <w:r>
+              <w:rPr>
+                <w:rFonts w:ascii="Inter" w:hAnsi="Inter"/>
+                <w:color w:val="1F2937"/>
+                <w:sz w:val="18"/>
+              </w:rPr>
+              <w:t>Piège classique</w:t>
+            </w:r>
+          </w:p>
         </w:tc>
       </w:tr>
     </w:tbl>
@@ -211,12 +299,12 @@
     </w:p>
     <w:p>
       <w:pPr>
-        <w:spacing w:before="80"/>
-        <w:jc w:val="center"/>
         <w:pBdr>
           <w:top w:val="single" w:sz="12" w:space="6" w:color="E11D48"/>
           <w:bottom w:val="single" w:sz="12" w:space="6" w:color="E11D48"/>
         </w:pBdr>
+        <w:spacing w:before="80"/>
+        <w:jc w:val="center"/>
       </w:pPr>
       <w:r>
         <w:rPr>
@@ -535,8 +623,8 @@
     </w:p>
     <w:p>
       <w:pPr>
+        <w:shd w:val="clear" w:color="auto" w:fill="E11D48"/>
         <w:spacing w:before="40" w:after="200"/>
-        <w:shd w:val="clear" w:color="auto" w:fill="E11D48"/>
       </w:pPr>
       <w:r>
         <w:rPr>
@@ -548,718 +636,126 @@
         <w:t>I.  Définition et épidémiologie</w:t>
       </w:r>
     </w:p>
-    <w:p>
-      <w:pPr>
-        <w:spacing w:before="160" w:after="80"/>
-        <w:shd w:val="clear" w:color="auto" w:fill="FAF7F2"/>
-        <w:pBdr>
-          <w:left w:val="single" w:sz="18" w:space="6" w:color="C9A961"/>
-        </w:pBdr>
-      </w:pPr>
-      <w:r>
-        <w:rPr>
-          <w:rFonts w:ascii="Cormorant Garamond" w:hAnsi="Cormorant Garamond"/>
-          <w:b/>
-          <w:color w:val="E11D48"/>
-          <w:sz w:val="27"/>
-        </w:rPr>
-        <w:t xml:space="preserve">A.  </w:t>
-      </w:r>
-      <w:r>
-        <w:rPr>
-          <w:rFonts w:ascii="Cormorant Garamond" w:hAnsi="Cormorant Garamond"/>
-          <w:b/>
-          <w:color w:val="1F2937"/>
-          <w:sz w:val="27"/>
-        </w:rPr>
-        <w:t>Définitions et seuils</w:t>
-      </w:r>
-    </w:p>
-    <w:p>
-      <w:pPr>
-        <w:pStyle w:val="ListBullet"/>
-        <w:spacing w:after="40"/>
-      </w:pPr>
-      <w:r>
-        <w:rPr>
-          <w:rFonts w:ascii="Inter" w:hAnsi="Inter"/>
-          <w:b/>
-          <w:i w:val="0"/>
-          <w:color w:val="BE123C"/>
-          <w:sz w:val="20"/>
-        </w:rPr>
-        <w:t>Hypertension artérielle (HTA)</w:t>
-      </w:r>
-      <w:r>
-        <w:rPr>
-          <w:rFonts w:ascii="Inter" w:hAnsi="Inter"/>
-          <w:b w:val="0"/>
-          <w:i w:val="0"/>
-          <w:color w:val="1F2937"/>
-          <w:sz w:val="20"/>
-        </w:rPr>
-        <w:t xml:space="preserve"> : pression artérielle systolique (</w:t>
-      </w:r>
-      <w:r>
-        <w:rPr>
-          <w:rFonts w:ascii="Inter" w:hAnsi="Inter"/>
-          <w:b/>
-          <w:i w:val="0"/>
-          <w:color w:val="BE123C"/>
-          <w:sz w:val="20"/>
-        </w:rPr>
-        <w:t>PAS</w:t>
-      </w:r>
-      <w:r>
-        <w:rPr>
-          <w:rFonts w:ascii="Inter" w:hAnsi="Inter"/>
-          <w:b w:val="0"/>
-          <w:i w:val="0"/>
-          <w:color w:val="1F2937"/>
-          <w:sz w:val="20"/>
-        </w:rPr>
-        <w:t xml:space="preserve">) ≥ </w:t>
-      </w:r>
-      <w:r>
-        <w:rPr>
-          <w:rFonts w:ascii="Inter" w:hAnsi="Inter"/>
-          <w:b/>
-          <w:i w:val="0"/>
-          <w:color w:val="BE123C"/>
-          <w:sz w:val="20"/>
-        </w:rPr>
-        <w:t>140 mmHg</w:t>
-      </w:r>
-      <w:r>
-        <w:rPr>
-          <w:rFonts w:ascii="Inter" w:hAnsi="Inter"/>
-          <w:b w:val="0"/>
-          <w:i w:val="0"/>
-          <w:color w:val="1F2937"/>
-          <w:sz w:val="20"/>
-        </w:rPr>
-        <w:t xml:space="preserve"> et/ou pression artérielle diastolique (</w:t>
-      </w:r>
-      <w:r>
-        <w:rPr>
-          <w:rFonts w:ascii="Inter" w:hAnsi="Inter"/>
-          <w:b/>
-          <w:i w:val="0"/>
-          <w:color w:val="BE123C"/>
-          <w:sz w:val="20"/>
-        </w:rPr>
-        <w:t>PAD</w:t>
-      </w:r>
-      <w:r>
-        <w:rPr>
-          <w:rFonts w:ascii="Inter" w:hAnsi="Inter"/>
-          <w:b w:val="0"/>
-          <w:i w:val="0"/>
-          <w:color w:val="1F2937"/>
-          <w:sz w:val="20"/>
-        </w:rPr>
-        <w:t xml:space="preserve">) ≥ </w:t>
-      </w:r>
-      <w:r>
-        <w:rPr>
-          <w:rFonts w:ascii="Inter" w:hAnsi="Inter"/>
-          <w:b/>
-          <w:i w:val="0"/>
-          <w:color w:val="BE123C"/>
-          <w:sz w:val="20"/>
-        </w:rPr>
-        <w:t>90 mmHg</w:t>
-      </w:r>
-      <w:r>
-        <w:rPr>
-          <w:rFonts w:ascii="Inter" w:hAnsi="Inter"/>
-          <w:b w:val="0"/>
-          <w:i w:val="0"/>
-          <w:color w:val="1F2937"/>
-          <w:sz w:val="20"/>
-        </w:rPr>
-        <w:t xml:space="preserve"> au cabinet.</w:t>
-      </w:r>
-    </w:p>
-    <w:p>
-      <w:pPr>
-        <w:pStyle w:val="ListBullet2"/>
-        <w:spacing w:after="40"/>
-      </w:pPr>
-      <w:r>
-        <w:rPr>
-          <w:rFonts w:ascii="Inter" w:hAnsi="Inter"/>
-          <w:b w:val="0"/>
-          <w:i w:val="0"/>
-          <w:color w:val="1F2937"/>
-          <w:sz w:val="20"/>
-        </w:rPr>
-        <w:t xml:space="preserve">Mesure confirmée à </w:t>
-      </w:r>
-      <w:r>
-        <w:rPr>
-          <w:rFonts w:ascii="Inter" w:hAnsi="Inter"/>
-          <w:b/>
-          <w:i w:val="0"/>
-          <w:color w:val="BE123C"/>
-          <w:sz w:val="20"/>
-        </w:rPr>
-        <w:t>deux consultations</w:t>
-      </w:r>
-      <w:r>
-        <w:rPr>
-          <w:rFonts w:ascii="Inter" w:hAnsi="Inter"/>
-          <w:b w:val="0"/>
-          <w:i w:val="0"/>
-          <w:color w:val="1F2937"/>
-          <w:sz w:val="20"/>
-        </w:rPr>
-        <w:t xml:space="preserve"> distinctes.</w:t>
-      </w:r>
-    </w:p>
-    <w:p>
-      <w:pPr>
-        <w:pStyle w:val="ListBullet2"/>
-        <w:spacing w:after="40"/>
-      </w:pPr>
-      <w:r>
-        <w:rPr>
-          <w:rFonts w:ascii="Inter" w:hAnsi="Inter"/>
-          <w:b w:val="0"/>
-          <w:i w:val="0"/>
-          <w:color w:val="1F2937"/>
-          <w:sz w:val="20"/>
-        </w:rPr>
-        <w:t xml:space="preserve">Seuils abaissés en automesure : </w:t>
-      </w:r>
-      <w:r>
-        <w:rPr>
-          <w:rFonts w:ascii="Inter" w:hAnsi="Inter"/>
-          <w:b/>
-          <w:i w:val="0"/>
-          <w:color w:val="BE123C"/>
-          <w:sz w:val="20"/>
-        </w:rPr>
-        <w:t>≥ 135/85 mmHg</w:t>
-      </w:r>
-      <w:r>
-        <w:rPr>
-          <w:rFonts w:ascii="Inter" w:hAnsi="Inter"/>
-          <w:b w:val="0"/>
-          <w:i w:val="0"/>
-          <w:color w:val="1F2937"/>
-          <w:sz w:val="20"/>
-        </w:rPr>
-        <w:t>.</w:t>
-      </w:r>
-    </w:p>
-    <w:p>
-      <w:pPr>
-        <w:pStyle w:val="ListBullet"/>
-        <w:spacing w:after="40"/>
-      </w:pPr>
-      <w:r>
-        <w:rPr>
-          <w:rFonts w:ascii="Inter" w:hAnsi="Inter"/>
-          <w:b/>
-          <w:i w:val="0"/>
-          <w:color w:val="BE123C"/>
-          <w:sz w:val="20"/>
-        </w:rPr>
-        <w:t>Grades de sévérité</w:t>
-      </w:r>
-      <w:r>
-        <w:rPr>
-          <w:rFonts w:ascii="Inter" w:hAnsi="Inter"/>
-          <w:b w:val="0"/>
-          <w:i w:val="0"/>
-          <w:color w:val="1F2937"/>
-          <w:sz w:val="20"/>
-        </w:rPr>
-        <w:t xml:space="preserve"> :</w:t>
-      </w:r>
-    </w:p>
-    <w:p>
-      <w:pPr>
-        <w:pStyle w:val="ListBullet2"/>
-        <w:spacing w:after="40"/>
-      </w:pPr>
-      <w:r>
-        <w:rPr>
-          <w:rFonts w:ascii="Inter" w:hAnsi="Inter"/>
-          <w:b/>
-          <w:i w:val="0"/>
-          <w:color w:val="BE123C"/>
-          <w:sz w:val="20"/>
-        </w:rPr>
-        <w:t>Grade 1</w:t>
-      </w:r>
-      <w:r>
-        <w:rPr>
-          <w:rFonts w:ascii="Inter" w:hAnsi="Inter"/>
-          <w:b w:val="0"/>
-          <w:i w:val="0"/>
-          <w:color w:val="1F2937"/>
-          <w:sz w:val="20"/>
-        </w:rPr>
-        <w:t xml:space="preserve"> : 140-159 / 90-99 mmHg.</w:t>
-      </w:r>
-    </w:p>
-    <w:p>
-      <w:pPr>
-        <w:pStyle w:val="ListBullet2"/>
-        <w:spacing w:after="40"/>
-      </w:pPr>
-      <w:r>
-        <w:rPr>
-          <w:rFonts w:ascii="Inter" w:hAnsi="Inter"/>
-          <w:b/>
-          <w:i w:val="0"/>
-          <w:color w:val="BE123C"/>
-          <w:sz w:val="20"/>
-        </w:rPr>
-        <w:t>Grade 2</w:t>
-      </w:r>
-      <w:r>
-        <w:rPr>
-          <w:rFonts w:ascii="Inter" w:hAnsi="Inter"/>
-          <w:b w:val="0"/>
-          <w:i w:val="0"/>
-          <w:color w:val="1F2937"/>
-          <w:sz w:val="20"/>
-        </w:rPr>
-        <w:t xml:space="preserve"> : 160-179 / 100-109 mmHg.</w:t>
-      </w:r>
-    </w:p>
-    <w:p>
-      <w:pPr>
-        <w:pStyle w:val="ListBullet2"/>
-        <w:spacing w:after="40"/>
-      </w:pPr>
-      <w:r>
-        <w:rPr>
-          <w:rFonts w:ascii="Inter" w:hAnsi="Inter"/>
-          <w:b/>
-          <w:i w:val="0"/>
-          <w:color w:val="BE123C"/>
-          <w:sz w:val="20"/>
-        </w:rPr>
-        <w:t>Grade 3</w:t>
-      </w:r>
-      <w:r>
-        <w:rPr>
-          <w:rFonts w:ascii="Inter" w:hAnsi="Inter"/>
-          <w:b w:val="0"/>
-          <w:i w:val="0"/>
-          <w:color w:val="1F2937"/>
-          <w:sz w:val="20"/>
-        </w:rPr>
-        <w:t xml:space="preserve"> : ≥ 180 / 110 mmHg.</w:t>
-      </w:r>
-    </w:p>
-    <w:p>
-      <w:pPr>
-        <w:pStyle w:val="ListBullet"/>
-        <w:spacing w:after="40"/>
-      </w:pPr>
-      <w:r>
-        <w:rPr>
-          <w:rFonts w:ascii="Inter" w:hAnsi="Inter"/>
-          <w:b/>
-          <w:i w:val="0"/>
-          <w:color w:val="BE123C"/>
-          <w:sz w:val="20"/>
-        </w:rPr>
-        <w:t>HTA blouse blanche</w:t>
-      </w:r>
-      <w:r>
-        <w:rPr>
-          <w:rFonts w:ascii="Inter" w:hAnsi="Inter"/>
-          <w:b w:val="0"/>
-          <w:i w:val="0"/>
-          <w:color w:val="1F2937"/>
-          <w:sz w:val="20"/>
-        </w:rPr>
-        <w:t xml:space="preserve"> : élévation tensionnelle limitée au cabinet médical, à confirmer par </w:t>
-      </w:r>
-      <w:r>
-        <w:rPr>
-          <w:rFonts w:ascii="Inter" w:hAnsi="Inter"/>
-          <w:b/>
-          <w:i w:val="0"/>
-          <w:color w:val="BE123C"/>
-          <w:sz w:val="20"/>
-        </w:rPr>
-        <w:t>MAPA</w:t>
-      </w:r>
-      <w:r>
-        <w:rPr>
-          <w:rFonts w:ascii="Inter" w:hAnsi="Inter"/>
-          <w:b w:val="0"/>
-          <w:i w:val="0"/>
-          <w:color w:val="1F2937"/>
-          <w:sz w:val="20"/>
-        </w:rPr>
-        <w:t xml:space="preserve"> ou </w:t>
-      </w:r>
-      <w:r>
-        <w:rPr>
-          <w:rFonts w:ascii="Inter" w:hAnsi="Inter"/>
-          <w:b/>
-          <w:i w:val="0"/>
-          <w:color w:val="BE123C"/>
-          <w:sz w:val="20"/>
-        </w:rPr>
-        <w:t>automesure</w:t>
-      </w:r>
-      <w:r>
-        <w:rPr>
-          <w:rFonts w:ascii="Inter" w:hAnsi="Inter"/>
-          <w:b w:val="0"/>
-          <w:i w:val="0"/>
-          <w:color w:val="1F2937"/>
-          <w:sz w:val="20"/>
-        </w:rPr>
-        <w:t>.</w:t>
-      </w:r>
-    </w:p>
-    <w:p>
-      <w:pPr>
-        <w:spacing w:before="160" w:after="80"/>
-        <w:shd w:val="clear" w:color="auto" w:fill="FAF7F2"/>
-        <w:pBdr>
-          <w:left w:val="single" w:sz="18" w:space="6" w:color="C9A961"/>
-        </w:pBdr>
-      </w:pPr>
-      <w:r>
-        <w:rPr>
-          <w:rFonts w:ascii="Cormorant Garamond" w:hAnsi="Cormorant Garamond"/>
-          <w:b/>
-          <w:color w:val="E11D48"/>
-          <w:sz w:val="27"/>
-        </w:rPr>
-        <w:t xml:space="preserve">B.  </w:t>
-      </w:r>
-      <w:r>
-        <w:rPr>
-          <w:rFonts w:ascii="Cormorant Garamond" w:hAnsi="Cormorant Garamond"/>
-          <w:b/>
-          <w:color w:val="1F2937"/>
-          <w:sz w:val="27"/>
-        </w:rPr>
-        <w:t>Épidémiologie</w:t>
-      </w:r>
-    </w:p>
-    <w:p>
-      <w:pPr>
-        <w:pStyle w:val="ListBullet"/>
-        <w:spacing w:after="40"/>
-      </w:pPr>
-      <w:r>
-        <w:rPr>
-          <w:rFonts w:ascii="Inter" w:hAnsi="Inter"/>
-          <w:b/>
-          <w:i w:val="0"/>
-          <w:color w:val="BE123C"/>
-          <w:sz w:val="20"/>
-        </w:rPr>
-        <w:t>Prévalence</w:t>
-      </w:r>
-      <w:r>
-        <w:rPr>
-          <w:rFonts w:ascii="Inter" w:hAnsi="Inter"/>
-          <w:b w:val="0"/>
-          <w:i w:val="0"/>
-          <w:color w:val="1F2937"/>
-          <w:sz w:val="20"/>
-        </w:rPr>
-        <w:t xml:space="preserve"> : environ </w:t>
-      </w:r>
-      <w:r>
-        <w:rPr>
-          <w:rFonts w:ascii="Inter" w:hAnsi="Inter"/>
-          <w:b/>
-          <w:i w:val="0"/>
-          <w:color w:val="BE123C"/>
-          <w:sz w:val="20"/>
-        </w:rPr>
-        <w:t>30 %</w:t>
-      </w:r>
-      <w:r>
-        <w:rPr>
-          <w:rFonts w:ascii="Inter" w:hAnsi="Inter"/>
-          <w:b w:val="0"/>
-          <w:i w:val="0"/>
-          <w:color w:val="1F2937"/>
-          <w:sz w:val="20"/>
-        </w:rPr>
-        <w:t xml:space="preserve"> de la population adulte ; augmente avec l'âge.</w:t>
-      </w:r>
-    </w:p>
-    <w:p>
-      <w:pPr>
-        <w:pStyle w:val="ListBullet"/>
-        <w:spacing w:after="40"/>
-      </w:pPr>
-      <w:r>
-        <w:rPr>
-          <w:rFonts w:ascii="Inter" w:hAnsi="Inter"/>
-          <w:b w:val="0"/>
-          <w:i w:val="0"/>
-          <w:color w:val="1F2937"/>
-          <w:sz w:val="20"/>
-        </w:rPr>
-        <w:t>Premier motif de consultation en médecine générale.</w:t>
-      </w:r>
-    </w:p>
-    <w:p>
-      <w:pPr>
-        <w:pStyle w:val="ListBullet"/>
-        <w:spacing w:after="40"/>
-      </w:pPr>
-      <w:r>
-        <w:rPr>
-          <w:rFonts w:ascii="Inter" w:hAnsi="Inter"/>
-          <w:b/>
-          <w:i w:val="0"/>
-          <w:color w:val="BE123C"/>
-          <w:sz w:val="20"/>
-        </w:rPr>
-        <w:t>Facteurs de risque</w:t>
-      </w:r>
-      <w:r>
-        <w:rPr>
-          <w:rFonts w:ascii="Inter" w:hAnsi="Inter"/>
-          <w:b w:val="0"/>
-          <w:i w:val="0"/>
-          <w:color w:val="1F2937"/>
-          <w:sz w:val="20"/>
-        </w:rPr>
-        <w:t xml:space="preserve"> :</w:t>
-      </w:r>
-    </w:p>
-    <w:p>
-      <w:pPr>
-        <w:pStyle w:val="ListBullet2"/>
-        <w:spacing w:after="40"/>
-      </w:pPr>
-      <w:r>
-        <w:rPr>
-          <w:rFonts w:ascii="Inter" w:hAnsi="Inter"/>
-          <w:b w:val="0"/>
-          <w:i w:val="0"/>
-          <w:color w:val="1F2937"/>
-          <w:sz w:val="20"/>
-        </w:rPr>
-        <w:t xml:space="preserve">Non modifiables : </w:t>
-      </w:r>
-      <w:r>
-        <w:rPr>
-          <w:rFonts w:ascii="Inter" w:hAnsi="Inter"/>
-          <w:b/>
-          <w:i w:val="0"/>
-          <w:color w:val="BE123C"/>
-          <w:sz w:val="20"/>
-        </w:rPr>
-        <w:t>âge</w:t>
-      </w:r>
-      <w:r>
-        <w:rPr>
-          <w:rFonts w:ascii="Inter" w:hAnsi="Inter"/>
-          <w:b w:val="0"/>
-          <w:i w:val="0"/>
-          <w:color w:val="1F2937"/>
-          <w:sz w:val="20"/>
-        </w:rPr>
-        <w:t xml:space="preserve">, </w:t>
-      </w:r>
-      <w:r>
-        <w:rPr>
-          <w:rFonts w:ascii="Inter" w:hAnsi="Inter"/>
-          <w:b/>
-          <w:i w:val="0"/>
-          <w:color w:val="BE123C"/>
-          <w:sz w:val="20"/>
-        </w:rPr>
-        <w:t>sexe masculin</w:t>
-      </w:r>
-      <w:r>
-        <w:rPr>
-          <w:rFonts w:ascii="Inter" w:hAnsi="Inter"/>
-          <w:b w:val="0"/>
-          <w:i w:val="0"/>
-          <w:color w:val="1F2937"/>
-          <w:sz w:val="20"/>
-        </w:rPr>
-        <w:t>, hérédité.</w:t>
-      </w:r>
-    </w:p>
-    <w:p>
-      <w:pPr>
-        <w:pStyle w:val="ListBullet2"/>
-        <w:spacing w:after="40"/>
-      </w:pPr>
-      <w:r>
-        <w:rPr>
-          <w:rFonts w:ascii="Inter" w:hAnsi="Inter"/>
-          <w:b w:val="0"/>
-          <w:i w:val="0"/>
-          <w:color w:val="1F2937"/>
-          <w:sz w:val="20"/>
-        </w:rPr>
-        <w:t xml:space="preserve">Modifiables : </w:t>
-      </w:r>
-      <w:r>
-        <w:rPr>
-          <w:rFonts w:ascii="Inter" w:hAnsi="Inter"/>
-          <w:b/>
-          <w:i w:val="0"/>
-          <w:color w:val="BE123C"/>
-          <w:sz w:val="20"/>
-        </w:rPr>
-        <w:t>surpoids</w:t>
-      </w:r>
-      <w:r>
-        <w:rPr>
-          <w:rFonts w:ascii="Inter" w:hAnsi="Inter"/>
-          <w:b w:val="0"/>
-          <w:i w:val="0"/>
-          <w:color w:val="1F2937"/>
-          <w:sz w:val="20"/>
-        </w:rPr>
-        <w:t xml:space="preserve">, </w:t>
-      </w:r>
-      <w:r>
-        <w:rPr>
-          <w:rFonts w:ascii="Inter" w:hAnsi="Inter"/>
-          <w:b/>
-          <w:i w:val="0"/>
-          <w:color w:val="BE123C"/>
-          <w:sz w:val="20"/>
-        </w:rPr>
-        <w:t>sédentarité</w:t>
-      </w:r>
-      <w:r>
-        <w:rPr>
-          <w:rFonts w:ascii="Inter" w:hAnsi="Inter"/>
-          <w:b w:val="0"/>
-          <w:i w:val="0"/>
-          <w:color w:val="1F2937"/>
-          <w:sz w:val="20"/>
-        </w:rPr>
-        <w:t xml:space="preserve">, </w:t>
-      </w:r>
-      <w:r>
-        <w:rPr>
-          <w:rFonts w:ascii="Inter" w:hAnsi="Inter"/>
-          <w:b/>
-          <w:i w:val="0"/>
-          <w:color w:val="BE123C"/>
-          <w:sz w:val="20"/>
-        </w:rPr>
-        <w:t>consommation de sel</w:t>
-      </w:r>
-      <w:r>
-        <w:rPr>
-          <w:rFonts w:ascii="Inter" w:hAnsi="Inter"/>
-          <w:b w:val="0"/>
-          <w:i w:val="0"/>
-          <w:color w:val="1F2937"/>
-          <w:sz w:val="20"/>
-        </w:rPr>
-        <w:t xml:space="preserve">, </w:t>
-      </w:r>
-      <w:r>
-        <w:rPr>
-          <w:rFonts w:ascii="Inter" w:hAnsi="Inter"/>
-          <w:b/>
-          <w:i w:val="0"/>
-          <w:color w:val="BE123C"/>
-          <w:sz w:val="20"/>
-        </w:rPr>
-        <w:t>alcool</w:t>
-      </w:r>
-      <w:r>
-        <w:rPr>
-          <w:rFonts w:ascii="Inter" w:hAnsi="Inter"/>
-          <w:b w:val="0"/>
-          <w:i w:val="0"/>
-          <w:color w:val="1F2937"/>
-          <w:sz w:val="20"/>
-        </w:rPr>
-        <w:t>, tabac.</w:t>
-      </w:r>
-    </w:p>
-    <w:p>
-      <w:pPr>
-        <w:pStyle w:val="ListBullet"/>
-        <w:spacing w:after="40"/>
-      </w:pPr>
-      <w:r>
-        <w:rPr>
-          <w:rFonts w:ascii="Inter" w:hAnsi="Inter"/>
-          <w:b w:val="0"/>
-          <w:i w:val="0"/>
-          <w:color w:val="1F2937"/>
-          <w:sz w:val="20"/>
-        </w:rPr>
-        <w:t xml:space="preserve">L'HTA est un facteur de risque </w:t>
-      </w:r>
-      <w:r>
-        <w:rPr>
-          <w:rFonts w:ascii="Inter" w:hAnsi="Inter"/>
-          <w:b/>
-          <w:i w:val="0"/>
-          <w:color w:val="BE123C"/>
-          <w:sz w:val="20"/>
-        </w:rPr>
-        <w:t>cardiovasculaire majeur</w:t>
-      </w:r>
-      <w:r>
-        <w:rPr>
-          <w:rFonts w:ascii="Inter" w:hAnsi="Inter"/>
-          <w:b w:val="0"/>
-          <w:i w:val="0"/>
-          <w:color w:val="1F2937"/>
-          <w:sz w:val="20"/>
-        </w:rPr>
-        <w:t xml:space="preserve"> : AVC, insuffisance cardiaque, coronaropathie, néphropathie.</w:t>
-      </w:r>
-    </w:p>
     <w:tbl>
       <w:tblPr>
         <w:tblW w:type="auto" w:w="0"/>
         <w:jc w:val="center"/>
+        <w:tblBorders>
+          <w:top w:val="single" w:sz="4" w:space="0" w:color="9CA3AF"/>
+          <w:left w:val="single" w:sz="4" w:space="0" w:color="9CA3AF"/>
+          <w:bottom w:val="single" w:sz="4" w:space="0" w:color="9CA3AF"/>
+          <w:right w:val="single" w:sz="4" w:space="0" w:color="9CA3AF"/>
+          <w:insideH w:val="single" w:sz="4" w:space="0" w:color="9CA3AF"/>
+          <w:insideV w:val="single" w:sz="4" w:space="0" w:color="9CA3AF"/>
+        </w:tblBorders>
         <w:tblLayout w:type="fixed"/>
         <w:tblLook w:firstColumn="1" w:firstRow="1" w:lastColumn="0" w:lastRow="0" w:noHBand="0" w:noVBand="1" w:val="04A0"/>
       </w:tblPr>
       <w:tblGrid>
-        <w:gridCol w:w="9866"/>
+        <w:gridCol w:w="4933"/>
+        <w:gridCol w:w="4933"/>
       </w:tblGrid>
+      <w:tr>
+        <w:trPr>
+          <w:tblHeader w:val="true"/>
+        </w:trPr>
+        <w:tc>
+          <w:tcPr>
+            <w:tcW w:type="dxa" w:w="2663"/>
+            <w:shd w:val="clear" w:color="auto" w:fill="E11D48"/>
+            <w:vAlign w:val="center"/>
+          </w:tcPr>
+          <w:p>
+            <w:pPr>
+              <w:jc w:val="center"/>
+            </w:pPr>
+            <w:r>
+              <w:rPr>
+                <w:rFonts w:ascii="Cormorant Garamond" w:hAnsi="Cormorant Garamond"/>
+                <w:b/>
+                <w:i/>
+                <w:color w:val="FFFFFF"/>
+                <w:sz w:val="26"/>
+              </w:rPr>
+              <w:t>I</w:t>
+            </w:r>
+          </w:p>
+        </w:tc>
+        <w:tc>
+          <w:tcPr>
+            <w:tcW w:type="dxa" w:w="7201"/>
+            <w:shd w:val="clear" w:color="auto" w:fill="FCE7EC"/>
+            <w:vAlign w:val="center"/>
+          </w:tcPr>
+          <w:p>
+            <w:pPr>
+              <w:jc w:val="center"/>
+            </w:pPr>
+            <w:r>
+              <w:rPr>
+                <w:rFonts w:ascii="Playfair Display" w:hAnsi="Playfair Display"/>
+                <w:b/>
+                <w:color w:val="9F1239"/>
+                <w:sz w:val="26"/>
+              </w:rPr>
+              <w:t>A.  Définitions et seuils</w:t>
+            </w:r>
+          </w:p>
+        </w:tc>
+      </w:tr>
       <w:tr>
         <w:tc>
           <w:tcPr>
-            <w:tcW w:type="dxa" w:w="9865"/>
+            <w:tcW w:type="dxa" w:w="2663"/>
             <w:shd w:val="clear" w:color="auto" w:fill="FAF7F2"/>
-            <w:tcBorders>
-              <w:top w:val="single" w:sz="4" w:color="E11D48" w:space="0"/>
-              <w:left w:val="single" w:sz="24" w:color="E11D48" w:space="0"/>
-              <w:bottom w:val="single" w:sz="4" w:color="E11D48" w:space="0"/>
-              <w:right w:val="single" w:sz="4" w:color="E11D48" w:space="0"/>
-            </w:tcBorders>
+            <w:vAlign w:val="center"/>
           </w:tcPr>
           <w:p>
+            <w:pPr>
+              <w:jc w:val="center"/>
+            </w:pPr>
             <w:r>
               <w:rPr>
                 <w:rFonts w:ascii="Inter" w:hAnsi="Inter"/>
                 <w:b/>
-                <w:color w:val="E11D48"/>
-                <w:sz w:val="21"/>
+                <w:i w:val="0"/>
+                <w:color w:val="C9A961"/>
+                <w:sz w:val="20"/>
               </w:rPr>
-              <w:t>🎯  À retenir</w:t>
+              <w:t>★</w:t>
+            </w:r>
+            <w:r>
+              <w:rPr>
+                <w:rFonts w:ascii="Inter" w:hAnsi="Inter"/>
+                <w:b/>
+                <w:i w:val="0"/>
+                <w:color w:val="1F2937"/>
+                <w:sz w:val="20"/>
+              </w:rPr>
+              <w:t xml:space="preserve"> Définition de l'HTA</w:t>
             </w:r>
           </w:p>
+        </w:tc>
+        <w:tc>
+          <w:tcPr>
+            <w:tcW w:type="dxa" w:w="7201"/>
+            <w:vAlign w:val="top"/>
+          </w:tcPr>
           <w:p>
+            <w:pPr>
+              <w:pStyle w:val="ListBullet"/>
+              <w:spacing w:after="40"/>
+            </w:pPr>
+            <w:r>
+              <w:rPr>
+                <w:rFonts w:ascii="Inter" w:hAnsi="Inter"/>
+                <w:b/>
+                <w:i w:val="0"/>
+                <w:color w:val="BE123C"/>
+                <w:sz w:val="20"/>
+              </w:rPr>
+              <w:t>Hypertension artérielle (HTA)</w:t>
+            </w:r>
             <w:r>
               <w:rPr>
                 <w:rFonts w:ascii="Inter" w:hAnsi="Inter"/>
@@ -1268,7 +764,7 @@
                 <w:color w:val="1F2937"/>
                 <w:sz w:val="20"/>
               </w:rPr>
-              <w:t xml:space="preserve">Le diagnostic d'HTA repose sur des mesures </w:t>
+              <w:t xml:space="preserve"> : pression artérielle systolique (</w:t>
             </w:r>
             <w:r>
               <w:rPr>
@@ -1278,7 +774,7 @@
                 <w:color w:val="BE123C"/>
                 <w:sz w:val="20"/>
               </w:rPr>
-              <w:t>répétées</w:t>
+              <w:t>PAS</w:t>
             </w:r>
             <w:r>
               <w:rPr>
@@ -1288,7 +784,7 @@
                 <w:color w:val="1F2937"/>
                 <w:sz w:val="20"/>
               </w:rPr>
-              <w:t xml:space="preserve"> et </w:t>
+              <w:t xml:space="preserve">) ≥ </w:t>
             </w:r>
             <w:r>
               <w:rPr>
@@ -1298,7 +794,7 @@
                 <w:color w:val="BE123C"/>
                 <w:sz w:val="20"/>
               </w:rPr>
-              <w:t>standardisées</w:t>
+              <w:t>140 mmHg</w:t>
             </w:r>
             <w:r>
               <w:rPr>
@@ -1308,60 +804,7 @@
                 <w:color w:val="1F2937"/>
                 <w:sz w:val="20"/>
               </w:rPr>
-              <w:t>. Une seule mesure élevée ne suffit jamais.</w:t>
-            </w:r>
-          </w:p>
-        </w:tc>
-      </w:tr>
-    </w:tbl>
-    <w:p>
-      <w:pPr>
-        <w:spacing w:after="80"/>
-      </w:pPr>
-    </w:p>
-    <w:tbl>
-      <w:tblPr>
-        <w:tblW w:type="auto" w:w="0"/>
-        <w:jc w:val="center"/>
-        <w:tblLayout w:type="fixed"/>
-        <w:tblLook w:firstColumn="1" w:firstRow="1" w:lastColumn="0" w:lastRow="0" w:noHBand="0" w:noVBand="1" w:val="04A0"/>
-      </w:tblPr>
-      <w:tblGrid>
-        <w:gridCol w:w="9866"/>
-      </w:tblGrid>
-      <w:tr>
-        <w:tc>
-          <w:tcPr>
-            <w:tcW w:type="dxa" w:w="9865"/>
-            <w:shd w:val="clear" w:color="auto" w:fill="FEE2E2"/>
-            <w:tcBorders>
-              <w:top w:val="single" w:sz="4" w:color="E11D48" w:space="0"/>
-              <w:left w:val="single" w:sz="24" w:color="E11D48" w:space="0"/>
-              <w:bottom w:val="single" w:sz="4" w:color="E11D48" w:space="0"/>
-              <w:right w:val="single" w:sz="4" w:color="E11D48" w:space="0"/>
-            </w:tcBorders>
-          </w:tcPr>
-          <w:p>
-            <w:r>
-              <w:rPr>
-                <w:rFonts w:ascii="Inter" w:hAnsi="Inter"/>
-                <w:b/>
-                <w:color w:val="B91C1C"/>
-                <w:sz w:val="21"/>
-              </w:rPr>
-              <w:t>⚠️  Piège ECN</w:t>
-            </w:r>
-          </w:p>
-          <w:p>
-            <w:r>
-              <w:rPr>
-                <w:rFonts w:ascii="Inter" w:hAnsi="Inter"/>
-                <w:b w:val="0"/>
-                <w:i w:val="0"/>
-                <w:color w:val="1F2937"/>
-                <w:sz w:val="20"/>
-              </w:rPr>
-              <w:t xml:space="preserve">Ne pas confondre </w:t>
+              <w:t xml:space="preserve"> et/ou diastolique (</w:t>
             </w:r>
             <w:r>
               <w:rPr>
@@ -1371,7 +814,7 @@
                 <w:color w:val="BE123C"/>
                 <w:sz w:val="20"/>
               </w:rPr>
-              <w:t>HTA blouse blanche</w:t>
+              <w:t>PAD</w:t>
             </w:r>
             <w:r>
               <w:rPr>
@@ -1381,7 +824,548 @@
                 <w:color w:val="1F2937"/>
                 <w:sz w:val="20"/>
               </w:rPr>
-              <w:t xml:space="preserve"> (PA élevée au cabinet uniquement) et </w:t>
+              <w:t xml:space="preserve">) ≥ </w:t>
+            </w:r>
+            <w:r>
+              <w:rPr>
+                <w:rFonts w:ascii="Inter" w:hAnsi="Inter"/>
+                <w:b/>
+                <w:i w:val="0"/>
+                <w:color w:val="BE123C"/>
+                <w:sz w:val="20"/>
+              </w:rPr>
+              <w:t>90 mmHg</w:t>
+            </w:r>
+            <w:r>
+              <w:rPr>
+                <w:rFonts w:ascii="Inter" w:hAnsi="Inter"/>
+                <w:b w:val="0"/>
+                <w:i w:val="0"/>
+                <w:color w:val="1F2937"/>
+                <w:sz w:val="20"/>
+              </w:rPr>
+              <w:t xml:space="preserve"> au cabinet</w:t>
+            </w:r>
+          </w:p>
+          <w:p>
+            <w:pPr>
+              <w:pStyle w:val="ListBullet2"/>
+              <w:spacing w:after="40"/>
+            </w:pPr>
+            <w:r>
+              <w:rPr>
+                <w:rFonts w:ascii="Inter" w:hAnsi="Inter"/>
+                <w:b w:val="0"/>
+                <w:i w:val="0"/>
+                <w:color w:val="1F2937"/>
+                <w:sz w:val="20"/>
+              </w:rPr>
+              <w:t xml:space="preserve">diagnostic confirmé sur </w:t>
+            </w:r>
+            <w:r>
+              <w:rPr>
+                <w:rFonts w:ascii="Inter" w:hAnsi="Inter"/>
+                <w:b/>
+                <w:i w:val="0"/>
+                <w:color w:val="BE123C"/>
+                <w:sz w:val="20"/>
+              </w:rPr>
+              <w:t>deux consultations</w:t>
+            </w:r>
+            <w:r>
+              <w:rPr>
+                <w:rFonts w:ascii="Inter" w:hAnsi="Inter"/>
+                <w:b w:val="0"/>
+                <w:i w:val="0"/>
+                <w:color w:val="1F2937"/>
+                <w:sz w:val="20"/>
+              </w:rPr>
+              <w:t xml:space="preserve"> distinctes</w:t>
+            </w:r>
+          </w:p>
+          <w:p>
+            <w:pPr>
+              <w:pStyle w:val="ListBullet2"/>
+              <w:spacing w:after="40"/>
+            </w:pPr>
+            <w:r>
+              <w:rPr>
+                <w:rFonts w:ascii="Inter" w:hAnsi="Inter"/>
+                <w:b w:val="0"/>
+                <w:i w:val="0"/>
+                <w:color w:val="1F2937"/>
+                <w:sz w:val="20"/>
+              </w:rPr>
+              <w:t xml:space="preserve">en automesure, seuil abaissé à </w:t>
+            </w:r>
+            <w:r>
+              <w:rPr>
+                <w:rFonts w:ascii="Inter" w:hAnsi="Inter"/>
+                <w:b/>
+                <w:i w:val="0"/>
+                <w:color w:val="BE123C"/>
+                <w:sz w:val="20"/>
+              </w:rPr>
+              <w:t>≥ 135/85 mmHg</w:t>
+            </w:r>
+          </w:p>
+        </w:tc>
+      </w:tr>
+      <w:tr>
+        <w:tc>
+          <w:tcPr>
+            <w:tcW w:type="dxa" w:w="2663"/>
+            <w:shd w:val="clear" w:color="auto" w:fill="FAF7F2"/>
+            <w:vAlign w:val="center"/>
+          </w:tcPr>
+          <w:p>
+            <w:pPr>
+              <w:jc w:val="center"/>
+            </w:pPr>
+            <w:r>
+              <w:rPr>
+                <w:rFonts w:ascii="Inter" w:hAnsi="Inter"/>
+                <w:b/>
+                <w:i w:val="0"/>
+                <w:color w:val="E11D48"/>
+                <w:sz w:val="20"/>
+              </w:rPr>
+              <w:t>◆</w:t>
+            </w:r>
+            <w:r>
+              <w:rPr>
+                <w:rFonts w:ascii="Inter" w:hAnsi="Inter"/>
+                <w:b/>
+                <w:i w:val="0"/>
+                <w:color w:val="1F2937"/>
+                <w:sz w:val="20"/>
+              </w:rPr>
+              <w:t xml:space="preserve"> Grades de sévérité</w:t>
+            </w:r>
+          </w:p>
+        </w:tc>
+        <w:tc>
+          <w:tcPr>
+            <w:tcW w:type="dxa" w:w="7201"/>
+            <w:vAlign w:val="top"/>
+          </w:tcPr>
+          <w:tbl>
+            <w:tblPr>
+              <w:tblW w:type="auto" w:w="0"/>
+              <w:jc w:val="center"/>
+              <w:tblBorders>
+                <w:top w:val="single" w:sz="4" w:space="0" w:color="9CA3AF"/>
+                <w:left w:val="single" w:sz="4" w:space="0" w:color="9CA3AF"/>
+                <w:bottom w:val="single" w:sz="4" w:space="0" w:color="9CA3AF"/>
+                <w:right w:val="single" w:sz="4" w:space="0" w:color="9CA3AF"/>
+                <w:insideH w:val="single" w:sz="4" w:space="0" w:color="9CA3AF"/>
+                <w:insideV w:val="single" w:sz="4" w:space="0" w:color="9CA3AF"/>
+              </w:tblBorders>
+              <w:tblLayout w:type="autofit"/>
+              <w:tblLook w:firstColumn="1" w:firstRow="1" w:lastColumn="0" w:lastRow="0" w:noHBand="0" w:noVBand="1" w:val="04A0"/>
+            </w:tblPr>
+            <w:tblGrid>
+              <w:gridCol w:w="1644"/>
+              <w:gridCol w:w="1644"/>
+              <w:gridCol w:w="1644"/>
+            </w:tblGrid>
+            <w:tr>
+              <w:tc>
+                <w:tcPr>
+                  <w:tcW w:type="dxa" w:w="1644"/>
+                  <w:shd w:val="clear" w:color="auto" w:fill="FAF7F2"/>
+                </w:tcPr>
+                <w:p>
+                  <w:pPr>
+                    <w:spacing w:after="40"/>
+                  </w:pPr>
+                  <w:r>
+                    <w:rPr>
+                      <w:rFonts w:ascii="Inter" w:hAnsi="Inter"/>
+                      <w:b/>
+                      <w:i w:val="0"/>
+                      <w:color w:val="1F2937"/>
+                      <w:sz w:val="18"/>
+                    </w:rPr>
+                    <w:t>Grade</w:t>
+                  </w:r>
+                </w:p>
+              </w:tc>
+              <w:tc>
+                <w:tcPr>
+                  <w:tcW w:type="dxa" w:w="1644"/>
+                  <w:shd w:val="clear" w:color="auto" w:fill="FAF7F2"/>
+                </w:tcPr>
+                <w:p>
+                  <w:pPr>
+                    <w:spacing w:after="40"/>
+                  </w:pPr>
+                  <w:r>
+                    <w:rPr>
+                      <w:rFonts w:ascii="Inter" w:hAnsi="Inter"/>
+                      <w:b/>
+                      <w:i w:val="0"/>
+                      <w:color w:val="1F2937"/>
+                      <w:sz w:val="18"/>
+                    </w:rPr>
+                    <w:t>PAS (mmHg)</w:t>
+                  </w:r>
+                </w:p>
+              </w:tc>
+              <w:tc>
+                <w:tcPr>
+                  <w:tcW w:type="dxa" w:w="1644"/>
+                  <w:shd w:val="clear" w:color="auto" w:fill="FAF7F2"/>
+                </w:tcPr>
+                <w:p>
+                  <w:pPr>
+                    <w:spacing w:after="40"/>
+                  </w:pPr>
+                  <w:r>
+                    <w:rPr>
+                      <w:rFonts w:ascii="Inter" w:hAnsi="Inter"/>
+                      <w:b/>
+                      <w:i w:val="0"/>
+                      <w:color w:val="1F2937"/>
+                      <w:sz w:val="18"/>
+                    </w:rPr>
+                    <w:t>PAD (mmHg)</w:t>
+                  </w:r>
+                </w:p>
+              </w:tc>
+            </w:tr>
+            <w:tr>
+              <w:tc>
+                <w:tcPr>
+                  <w:tcW w:type="dxa" w:w="1644"/>
+                </w:tcPr>
+                <w:p>
+                  <w:pPr>
+                    <w:spacing w:after="40"/>
+                  </w:pPr>
+                  <w:r>
+                    <w:rPr>
+                      <w:rFonts w:ascii="Inter" w:hAnsi="Inter"/>
+                      <w:b/>
+                      <w:i w:val="0"/>
+                      <w:color w:val="BE123C"/>
+                      <w:sz w:val="18"/>
+                    </w:rPr>
+                    <w:t>Grade 1</w:t>
+                  </w:r>
+                </w:p>
+              </w:tc>
+              <w:tc>
+                <w:tcPr>
+                  <w:tcW w:type="dxa" w:w="1644"/>
+                </w:tcPr>
+                <w:p>
+                  <w:pPr>
+                    <w:spacing w:after="40"/>
+                  </w:pPr>
+                  <w:r>
+                    <w:rPr>
+                      <w:rFonts w:ascii="Inter" w:hAnsi="Inter"/>
+                      <w:b w:val="0"/>
+                      <w:i w:val="0"/>
+                      <w:color w:val="1F2937"/>
+                      <w:sz w:val="18"/>
+                    </w:rPr>
+                    <w:t>140-159</w:t>
+                  </w:r>
+                </w:p>
+              </w:tc>
+              <w:tc>
+                <w:tcPr>
+                  <w:tcW w:type="dxa" w:w="1644"/>
+                </w:tcPr>
+                <w:p>
+                  <w:pPr>
+                    <w:spacing w:after="40"/>
+                  </w:pPr>
+                  <w:r>
+                    <w:rPr>
+                      <w:rFonts w:ascii="Inter" w:hAnsi="Inter"/>
+                      <w:b w:val="0"/>
+                      <w:i w:val="0"/>
+                      <w:color w:val="1F2937"/>
+                      <w:sz w:val="18"/>
+                    </w:rPr>
+                    <w:t>90-99</w:t>
+                  </w:r>
+                </w:p>
+              </w:tc>
+            </w:tr>
+            <w:tr>
+              <w:tc>
+                <w:tcPr>
+                  <w:tcW w:type="dxa" w:w="1644"/>
+                  <w:shd w:val="clear" w:color="auto" w:fill="FCFBF7"/>
+                </w:tcPr>
+                <w:p>
+                  <w:pPr>
+                    <w:spacing w:after="40"/>
+                  </w:pPr>
+                  <w:r>
+                    <w:rPr>
+                      <w:rFonts w:ascii="Inter" w:hAnsi="Inter"/>
+                      <w:b/>
+                      <w:i w:val="0"/>
+                      <w:color w:val="BE123C"/>
+                      <w:sz w:val="18"/>
+                    </w:rPr>
+                    <w:t>Grade 2</w:t>
+                  </w:r>
+                </w:p>
+              </w:tc>
+              <w:tc>
+                <w:tcPr>
+                  <w:tcW w:type="dxa" w:w="1644"/>
+                  <w:shd w:val="clear" w:color="auto" w:fill="FCFBF7"/>
+                </w:tcPr>
+                <w:p>
+                  <w:pPr>
+                    <w:spacing w:after="40"/>
+                  </w:pPr>
+                  <w:r>
+                    <w:rPr>
+                      <w:rFonts w:ascii="Inter" w:hAnsi="Inter"/>
+                      <w:b w:val="0"/>
+                      <w:i w:val="0"/>
+                      <w:color w:val="1F2937"/>
+                      <w:sz w:val="18"/>
+                    </w:rPr>
+                    <w:t>160-179</w:t>
+                  </w:r>
+                </w:p>
+              </w:tc>
+              <w:tc>
+                <w:tcPr>
+                  <w:tcW w:type="dxa" w:w="1644"/>
+                  <w:shd w:val="clear" w:color="auto" w:fill="FCFBF7"/>
+                </w:tcPr>
+                <w:p>
+                  <w:pPr>
+                    <w:spacing w:after="40"/>
+                  </w:pPr>
+                  <w:r>
+                    <w:rPr>
+                      <w:rFonts w:ascii="Inter" w:hAnsi="Inter"/>
+                      <w:b w:val="0"/>
+                      <w:i w:val="0"/>
+                      <w:color w:val="1F2937"/>
+                      <w:sz w:val="18"/>
+                    </w:rPr>
+                    <w:t>100-109</w:t>
+                  </w:r>
+                </w:p>
+              </w:tc>
+            </w:tr>
+            <w:tr>
+              <w:tc>
+                <w:tcPr>
+                  <w:tcW w:type="dxa" w:w="1644"/>
+                </w:tcPr>
+                <w:p>
+                  <w:pPr>
+                    <w:spacing w:after="40"/>
+                  </w:pPr>
+                  <w:r>
+                    <w:rPr>
+                      <w:rFonts w:ascii="Inter" w:hAnsi="Inter"/>
+                      <w:b/>
+                      <w:i w:val="0"/>
+                      <w:color w:val="BE123C"/>
+                      <w:sz w:val="18"/>
+                    </w:rPr>
+                    <w:t>Grade 3</w:t>
+                  </w:r>
+                </w:p>
+              </w:tc>
+              <w:tc>
+                <w:tcPr>
+                  <w:tcW w:type="dxa" w:w="1644"/>
+                </w:tcPr>
+                <w:p>
+                  <w:pPr>
+                    <w:spacing w:after="40"/>
+                  </w:pPr>
+                  <w:r>
+                    <w:rPr>
+                      <w:rFonts w:ascii="Inter" w:hAnsi="Inter"/>
+                      <w:b w:val="0"/>
+                      <w:i w:val="0"/>
+                      <w:color w:val="1F2937"/>
+                      <w:sz w:val="18"/>
+                    </w:rPr>
+                    <w:t>≥ 180</w:t>
+                  </w:r>
+                </w:p>
+              </w:tc>
+              <w:tc>
+                <w:tcPr>
+                  <w:tcW w:type="dxa" w:w="1644"/>
+                </w:tcPr>
+                <w:p>
+                  <w:pPr>
+                    <w:spacing w:after="40"/>
+                  </w:pPr>
+                  <w:r>
+                    <w:rPr>
+                      <w:rFonts w:ascii="Inter" w:hAnsi="Inter"/>
+                      <w:b w:val="0"/>
+                      <w:i w:val="0"/>
+                      <w:color w:val="1F2937"/>
+                      <w:sz w:val="18"/>
+                    </w:rPr>
+                    <w:t>≥ 110</w:t>
+                  </w:r>
+                </w:p>
+              </w:tc>
+            </w:tr>
+          </w:tbl>
+          <w:p/>
+          <w:p>
+            <w:pPr>
+              <w:spacing w:after="80"/>
+            </w:pPr>
+          </w:p>
+        </w:tc>
+      </w:tr>
+      <w:tr>
+        <w:tc>
+          <w:tcPr>
+            <w:tcW w:type="dxa" w:w="2663"/>
+            <w:shd w:val="clear" w:color="auto" w:fill="FAF7F2"/>
+            <w:vAlign w:val="center"/>
+          </w:tcPr>
+          <w:p>
+            <w:pPr>
+              <w:jc w:val="center"/>
+            </w:pPr>
+            <w:r>
+              <w:rPr>
+                <w:rFonts w:ascii="Inter" w:hAnsi="Inter"/>
+                <w:b/>
+                <w:i w:val="0"/>
+                <w:color w:val="B91C1C"/>
+                <w:sz w:val="20"/>
+              </w:rPr>
+              <w:t>⚠</w:t>
+            </w:r>
+            <w:r>
+              <w:rPr>
+                <w:rFonts w:ascii="Inter" w:hAnsi="Inter"/>
+                <w:b/>
+                <w:i w:val="0"/>
+                <w:color w:val="1F2937"/>
+                <w:sz w:val="20"/>
+              </w:rPr>
+              <w:t xml:space="preserve"> HTA blouse blanche</w:t>
+            </w:r>
+          </w:p>
+        </w:tc>
+        <w:tc>
+          <w:tcPr>
+            <w:tcW w:type="dxa" w:w="7201"/>
+            <w:vAlign w:val="top"/>
+          </w:tcPr>
+          <w:p>
+            <w:pPr>
+              <w:pStyle w:val="ListBullet"/>
+              <w:spacing w:after="40"/>
+            </w:pPr>
+            <w:r>
+              <w:rPr>
+                <w:rFonts w:ascii="Inter" w:hAnsi="Inter"/>
+                <w:b w:val="0"/>
+                <w:i w:val="0"/>
+                <w:color w:val="1F2937"/>
+                <w:sz w:val="20"/>
+              </w:rPr>
+              <w:t xml:space="preserve">élévation tensionnelle </w:t>
+            </w:r>
+            <w:r>
+              <w:rPr>
+                <w:rFonts w:ascii="Inter" w:hAnsi="Inter"/>
+                <w:b/>
+                <w:i w:val="0"/>
+                <w:color w:val="BE123C"/>
+                <w:sz w:val="20"/>
+              </w:rPr>
+              <w:t>au cabinet uniquement</w:t>
+            </w:r>
+          </w:p>
+          <w:p>
+            <w:pPr>
+              <w:pStyle w:val="ListBullet"/>
+              <w:spacing w:after="40"/>
+            </w:pPr>
+            <w:r>
+              <w:rPr>
+                <w:rFonts w:ascii="Inter" w:hAnsi="Inter"/>
+                <w:b w:val="0"/>
+                <w:i w:val="0"/>
+                <w:color w:val="1F2937"/>
+                <w:sz w:val="20"/>
+              </w:rPr>
+              <w:t xml:space="preserve">à confirmer par </w:t>
+            </w:r>
+            <w:r>
+              <w:rPr>
+                <w:rFonts w:ascii="Inter" w:hAnsi="Inter"/>
+                <w:b/>
+                <w:i w:val="0"/>
+                <w:color w:val="BE123C"/>
+                <w:sz w:val="20"/>
+              </w:rPr>
+              <w:t>MAPA</w:t>
+            </w:r>
+            <w:r>
+              <w:rPr>
+                <w:rFonts w:ascii="Inter" w:hAnsi="Inter"/>
+                <w:b w:val="0"/>
+                <w:i w:val="0"/>
+                <w:color w:val="1F2937"/>
+                <w:sz w:val="20"/>
+              </w:rPr>
+              <w:t xml:space="preserve"> ou </w:t>
+            </w:r>
+            <w:r>
+              <w:rPr>
+                <w:rFonts w:ascii="Inter" w:hAnsi="Inter"/>
+                <w:b/>
+                <w:i w:val="0"/>
+                <w:color w:val="BE123C"/>
+                <w:sz w:val="20"/>
+              </w:rPr>
+              <w:t>automesure</w:t>
+            </w:r>
+          </w:p>
+          <w:p>
+            <w:pPr>
+              <w:pStyle w:val="ListBullet"/>
+              <w:spacing w:after="40"/>
+            </w:pPr>
+            <w:r>
+              <w:rPr>
+                <w:rFonts w:ascii="Inter" w:hAnsi="Inter"/>
+                <w:b/>
+                <w:i w:val="0"/>
+                <w:color w:val="B91C1C"/>
+                <w:sz w:val="20"/>
+              </w:rPr>
+              <w:t>⚠</w:t>
+            </w:r>
+            <w:r>
+              <w:rPr>
+                <w:rFonts w:ascii="Inter" w:hAnsi="Inter"/>
+                <w:b w:val="0"/>
+                <w:i w:val="0"/>
+                <w:color w:val="1F2937"/>
+                <w:sz w:val="20"/>
+              </w:rPr>
+              <w:t xml:space="preserve"> à ne pas confondre avec l'</w:t>
             </w:r>
             <w:r>
               <w:rPr>
@@ -1401,7 +1385,300 @@
                 <w:color w:val="1F2937"/>
                 <w:sz w:val="20"/>
               </w:rPr>
-              <w:t xml:space="preserve"> (PA normale au cabinet, élevée en ambulatoire) — pronostic différent.</w:t>
+              <w:t xml:space="preserve"> (normale au cabinet, élevée en ambulatoire)</w:t>
+            </w:r>
+          </w:p>
+        </w:tc>
+      </w:tr>
+    </w:tbl>
+    <w:p>
+      <w:pPr>
+        <w:spacing w:after="80"/>
+      </w:pPr>
+    </w:p>
+    <w:tbl>
+      <w:tblPr>
+        <w:tblW w:type="auto" w:w="0"/>
+        <w:jc w:val="center"/>
+        <w:tblBorders>
+          <w:top w:val="single" w:sz="4" w:space="0" w:color="9CA3AF"/>
+          <w:left w:val="single" w:sz="4" w:space="0" w:color="9CA3AF"/>
+          <w:bottom w:val="single" w:sz="4" w:space="0" w:color="9CA3AF"/>
+          <w:right w:val="single" w:sz="4" w:space="0" w:color="9CA3AF"/>
+          <w:insideH w:val="single" w:sz="4" w:space="0" w:color="9CA3AF"/>
+          <w:insideV w:val="single" w:sz="4" w:space="0" w:color="9CA3AF"/>
+        </w:tblBorders>
+        <w:tblLayout w:type="fixed"/>
+        <w:tblLook w:firstColumn="1" w:firstRow="1" w:lastColumn="0" w:lastRow="0" w:noHBand="0" w:noVBand="1" w:val="04A0"/>
+      </w:tblPr>
+      <w:tblGrid>
+        <w:gridCol w:w="4933"/>
+        <w:gridCol w:w="4933"/>
+      </w:tblGrid>
+      <w:tr>
+        <w:trPr>
+          <w:tblHeader w:val="true"/>
+        </w:trPr>
+        <w:tc>
+          <w:tcPr>
+            <w:tcW w:type="dxa" w:w="2663"/>
+            <w:shd w:val="clear" w:color="auto" w:fill="E11D48"/>
+            <w:vAlign w:val="center"/>
+          </w:tcPr>
+          <w:p>
+            <w:pPr>
+              <w:jc w:val="center"/>
+            </w:pPr>
+            <w:r>
+              <w:rPr>
+                <w:rFonts w:ascii="Cormorant Garamond" w:hAnsi="Cormorant Garamond"/>
+                <w:b/>
+                <w:i/>
+                <w:color w:val="FFFFFF"/>
+                <w:sz w:val="26"/>
+              </w:rPr>
+              <w:t>I</w:t>
+            </w:r>
+          </w:p>
+        </w:tc>
+        <w:tc>
+          <w:tcPr>
+            <w:tcW w:type="dxa" w:w="7201"/>
+            <w:shd w:val="clear" w:color="auto" w:fill="FCE7EC"/>
+            <w:vAlign w:val="center"/>
+          </w:tcPr>
+          <w:p>
+            <w:pPr>
+              <w:jc w:val="center"/>
+            </w:pPr>
+            <w:r>
+              <w:rPr>
+                <w:rFonts w:ascii="Playfair Display" w:hAnsi="Playfair Display"/>
+                <w:b/>
+                <w:color w:val="9F1239"/>
+                <w:sz w:val="26"/>
+              </w:rPr>
+              <w:t>B.  Épidémiologie</w:t>
+            </w:r>
+          </w:p>
+        </w:tc>
+      </w:tr>
+      <w:tr>
+        <w:tc>
+          <w:tcPr>
+            <w:tcW w:type="dxa" w:w="2663"/>
+            <w:shd w:val="clear" w:color="auto" w:fill="FAF7F2"/>
+            <w:vAlign w:val="center"/>
+          </w:tcPr>
+          <w:p>
+            <w:pPr>
+              <w:jc w:val="center"/>
+            </w:pPr>
+            <w:r>
+              <w:rPr>
+                <w:rFonts w:ascii="Inter" w:hAnsi="Inter"/>
+                <w:b/>
+                <w:i w:val="0"/>
+                <w:color w:val="1F2937"/>
+                <w:sz w:val="20"/>
+              </w:rPr>
+              <w:t>Prévalence</w:t>
+            </w:r>
+          </w:p>
+        </w:tc>
+        <w:tc>
+          <w:tcPr>
+            <w:tcW w:type="dxa" w:w="7201"/>
+            <w:vAlign w:val="top"/>
+          </w:tcPr>
+          <w:p>
+            <w:pPr>
+              <w:pStyle w:val="ListBullet"/>
+              <w:spacing w:after="40"/>
+            </w:pPr>
+            <w:r>
+              <w:rPr>
+                <w:rFonts w:ascii="Inter" w:hAnsi="Inter"/>
+                <w:b w:val="0"/>
+                <w:i w:val="0"/>
+                <w:color w:val="1F2937"/>
+                <w:sz w:val="20"/>
+              </w:rPr>
+              <w:t xml:space="preserve">environ </w:t>
+            </w:r>
+            <w:r>
+              <w:rPr>
+                <w:rFonts w:ascii="Inter" w:hAnsi="Inter"/>
+                <w:b/>
+                <w:i w:val="0"/>
+                <w:color w:val="BE123C"/>
+                <w:sz w:val="20"/>
+              </w:rPr>
+              <w:t>30 %</w:t>
+            </w:r>
+            <w:r>
+              <w:rPr>
+                <w:rFonts w:ascii="Inter" w:hAnsi="Inter"/>
+                <w:b w:val="0"/>
+                <w:i w:val="0"/>
+                <w:color w:val="1F2937"/>
+                <w:sz w:val="20"/>
+              </w:rPr>
+              <w:t xml:space="preserve"> de la population adulte</w:t>
+            </w:r>
+          </w:p>
+          <w:p>
+            <w:pPr>
+              <w:pStyle w:val="ListBullet"/>
+              <w:spacing w:after="40"/>
+            </w:pPr>
+            <w:r>
+              <w:rPr>
+                <w:rFonts w:ascii="Inter" w:hAnsi="Inter"/>
+                <w:b w:val="0"/>
+                <w:i w:val="0"/>
+                <w:color w:val="1F2937"/>
+                <w:sz w:val="20"/>
+              </w:rPr>
+              <w:t>augmente avec l'</w:t>
+            </w:r>
+            <w:r>
+              <w:rPr>
+                <w:rFonts w:ascii="Inter" w:hAnsi="Inter"/>
+                <w:b/>
+                <w:i w:val="0"/>
+                <w:color w:val="BE123C"/>
+                <w:sz w:val="20"/>
+              </w:rPr>
+              <w:t>âge</w:t>
+            </w:r>
+          </w:p>
+          <w:p>
+            <w:pPr>
+              <w:pStyle w:val="ListBullet"/>
+              <w:spacing w:after="40"/>
+            </w:pPr>
+            <w:r>
+              <w:rPr>
+                <w:rFonts w:ascii="Inter" w:hAnsi="Inter"/>
+                <w:b w:val="0"/>
+                <w:i w:val="0"/>
+                <w:color w:val="1F2937"/>
+                <w:sz w:val="20"/>
+              </w:rPr>
+              <w:t>premier motif de consultation en médecine générale</w:t>
+            </w:r>
+          </w:p>
+        </w:tc>
+      </w:tr>
+      <w:tr>
+        <w:tc>
+          <w:tcPr>
+            <w:tcW w:type="dxa" w:w="2663"/>
+            <w:shd w:val="clear" w:color="auto" w:fill="FAF7F2"/>
+            <w:vAlign w:val="center"/>
+          </w:tcPr>
+          <w:p>
+            <w:pPr>
+              <w:jc w:val="center"/>
+            </w:pPr>
+            <w:r>
+              <w:rPr>
+                <w:rFonts w:ascii="Inter" w:hAnsi="Inter"/>
+                <w:b/>
+                <w:i w:val="0"/>
+                <w:color w:val="E11D48"/>
+                <w:sz w:val="20"/>
+              </w:rPr>
+              <w:t>◆</w:t>
+            </w:r>
+            <w:r>
+              <w:rPr>
+                <w:rFonts w:ascii="Inter" w:hAnsi="Inter"/>
+                <w:b/>
+                <w:i w:val="0"/>
+                <w:color w:val="1F2937"/>
+                <w:sz w:val="20"/>
+              </w:rPr>
+              <w:t xml:space="preserve"> Facteurs de risque</w:t>
+            </w:r>
+          </w:p>
+        </w:tc>
+        <w:tc>
+          <w:tcPr>
+            <w:tcW w:type="dxa" w:w="7201"/>
+            <w:vAlign w:val="top"/>
+          </w:tcPr>
+          <w:p>
+            <w:pPr>
+              <w:pStyle w:val="ListBullet"/>
+              <w:spacing w:after="40"/>
+            </w:pPr>
+            <w:r>
+              <w:rPr>
+                <w:rFonts w:ascii="Inter" w:hAnsi="Inter"/>
+                <w:b/>
+                <w:i w:val="0"/>
+                <w:color w:val="BE123C"/>
+                <w:sz w:val="20"/>
+              </w:rPr>
+              <w:t>Non modifiables</w:t>
+            </w:r>
+            <w:r>
+              <w:rPr>
+                <w:rFonts w:ascii="Inter" w:hAnsi="Inter"/>
+                <w:b w:val="0"/>
+                <w:i w:val="0"/>
+                <w:color w:val="1F2937"/>
+                <w:sz w:val="20"/>
+              </w:rPr>
+              <w:t xml:space="preserve"> : âge, sexe masculin, hérédité</w:t>
+            </w:r>
+          </w:p>
+          <w:p>
+            <w:pPr>
+              <w:pStyle w:val="ListBullet"/>
+              <w:spacing w:after="40"/>
+            </w:pPr>
+            <w:r>
+              <w:rPr>
+                <w:rFonts w:ascii="Inter" w:hAnsi="Inter"/>
+                <w:b/>
+                <w:i w:val="0"/>
+                <w:color w:val="BE123C"/>
+                <w:sz w:val="20"/>
+              </w:rPr>
+              <w:t>Modifiables</w:t>
+            </w:r>
+            <w:r>
+              <w:rPr>
+                <w:rFonts w:ascii="Inter" w:hAnsi="Inter"/>
+                <w:b w:val="0"/>
+                <w:i w:val="0"/>
+                <w:color w:val="1F2937"/>
+                <w:sz w:val="20"/>
+              </w:rPr>
+              <w:t xml:space="preserve"> : surpoids, sédentarité, consommation de </w:t>
+            </w:r>
+            <w:r>
+              <w:rPr>
+                <w:rFonts w:ascii="Inter" w:hAnsi="Inter"/>
+                <w:b/>
+                <w:i w:val="0"/>
+                <w:color w:val="BE123C"/>
+                <w:sz w:val="20"/>
+              </w:rPr>
+              <w:t>sel</w:t>
+            </w:r>
+            <w:r>
+              <w:rPr>
+                <w:rFonts w:ascii="Inter" w:hAnsi="Inter"/>
+                <w:b w:val="0"/>
+                <w:i w:val="0"/>
+                <w:color w:val="1F2937"/>
+                <w:sz w:val="20"/>
+              </w:rPr>
+              <w:t>, alcool, tabac</w:t>
             </w:r>
           </w:p>
         </w:tc>
@@ -1419,8 +1696,8 @@
     </w:p>
     <w:p>
       <w:pPr>
+        <w:shd w:val="clear" w:color="auto" w:fill="E11D48"/>
         <w:spacing w:before="40" w:after="200"/>
-        <w:shd w:val="clear" w:color="auto" w:fill="E11D48"/>
       </w:pPr>
       <w:r>
         <w:rPr>
@@ -1432,498 +1709,105 @@
         <w:t>II.  Diagnostic et bilan initial</w:t>
       </w:r>
     </w:p>
-    <w:p>
-      <w:pPr>
-        <w:spacing w:before="160" w:after="80"/>
-        <w:shd w:val="clear" w:color="auto" w:fill="FAF7F2"/>
-        <w:pBdr>
-          <w:left w:val="single" w:sz="18" w:space="6" w:color="C9A961"/>
-        </w:pBdr>
-      </w:pPr>
-      <w:r>
-        <w:rPr>
-          <w:rFonts w:ascii="Cormorant Garamond" w:hAnsi="Cormorant Garamond"/>
-          <w:b/>
-          <w:color w:val="E11D48"/>
-          <w:sz w:val="27"/>
-        </w:rPr>
-        <w:t xml:space="preserve">A.  </w:t>
-      </w:r>
-      <w:r>
-        <w:rPr>
-          <w:rFonts w:ascii="Cormorant Garamond" w:hAnsi="Cormorant Garamond"/>
-          <w:b/>
-          <w:color w:val="1F2937"/>
-          <w:sz w:val="27"/>
-        </w:rPr>
-        <w:t>Mesure de la pression artérielle</w:t>
-      </w:r>
-    </w:p>
-    <w:p>
-      <w:pPr>
-        <w:pStyle w:val="ListBullet"/>
-        <w:spacing w:after="40"/>
-      </w:pPr>
-      <w:r>
-        <w:rPr>
-          <w:rFonts w:ascii="Inter" w:hAnsi="Inter"/>
-          <w:b/>
-          <w:i w:val="0"/>
-          <w:color w:val="BE123C"/>
-          <w:sz w:val="20"/>
-        </w:rPr>
-        <w:t>Conditions de mesure</w:t>
-      </w:r>
-      <w:r>
-        <w:rPr>
-          <w:rFonts w:ascii="Inter" w:hAnsi="Inter"/>
-          <w:b w:val="0"/>
-          <w:i w:val="0"/>
-          <w:color w:val="1F2937"/>
-          <w:sz w:val="20"/>
-        </w:rPr>
-        <w:t xml:space="preserve"> :</w:t>
-      </w:r>
-    </w:p>
-    <w:p>
-      <w:pPr>
-        <w:pStyle w:val="ListBullet2"/>
-        <w:spacing w:after="40"/>
-      </w:pPr>
-      <w:r>
-        <w:rPr>
-          <w:rFonts w:ascii="Inter" w:hAnsi="Inter"/>
-          <w:b w:val="0"/>
-          <w:i w:val="0"/>
-          <w:color w:val="1F2937"/>
-          <w:sz w:val="20"/>
-        </w:rPr>
-        <w:t xml:space="preserve">Patient au </w:t>
-      </w:r>
-      <w:r>
-        <w:rPr>
-          <w:rFonts w:ascii="Inter" w:hAnsi="Inter"/>
-          <w:b/>
-          <w:i w:val="0"/>
-          <w:color w:val="BE123C"/>
-          <w:sz w:val="20"/>
-        </w:rPr>
-        <w:t>repos</w:t>
-      </w:r>
-      <w:r>
-        <w:rPr>
-          <w:rFonts w:ascii="Inter" w:hAnsi="Inter"/>
-          <w:b w:val="0"/>
-          <w:i w:val="0"/>
-          <w:color w:val="1F2937"/>
-          <w:sz w:val="20"/>
-        </w:rPr>
-        <w:t xml:space="preserve"> depuis 5 minutes, assis.</w:t>
-      </w:r>
-    </w:p>
-    <w:p>
-      <w:pPr>
-        <w:pStyle w:val="ListBullet2"/>
-        <w:spacing w:after="40"/>
-      </w:pPr>
-      <w:r>
-        <w:rPr>
-          <w:rFonts w:ascii="Inter" w:hAnsi="Inter"/>
-          <w:b w:val="0"/>
-          <w:i w:val="0"/>
-          <w:color w:val="1F2937"/>
-          <w:sz w:val="20"/>
-        </w:rPr>
-        <w:t>Brassard adapté à la circonférence du bras.</w:t>
-      </w:r>
-    </w:p>
-    <w:p>
-      <w:pPr>
-        <w:pStyle w:val="ListBullet2"/>
-        <w:spacing w:after="40"/>
-      </w:pPr>
-      <w:r>
-        <w:rPr>
-          <w:rFonts w:ascii="Inter" w:hAnsi="Inter"/>
-          <w:b w:val="0"/>
-          <w:i w:val="0"/>
-          <w:color w:val="1F2937"/>
-          <w:sz w:val="20"/>
-        </w:rPr>
-        <w:t xml:space="preserve">Mesure aux </w:t>
-      </w:r>
-      <w:r>
-        <w:rPr>
-          <w:rFonts w:ascii="Inter" w:hAnsi="Inter"/>
-          <w:b/>
-          <w:i w:val="0"/>
-          <w:color w:val="BE123C"/>
-          <w:sz w:val="20"/>
-        </w:rPr>
-        <w:t>deux bras</w:t>
-      </w:r>
-      <w:r>
-        <w:rPr>
-          <w:rFonts w:ascii="Inter" w:hAnsi="Inter"/>
-          <w:b w:val="0"/>
-          <w:i w:val="0"/>
-          <w:color w:val="1F2937"/>
-          <w:sz w:val="20"/>
-        </w:rPr>
-        <w:t xml:space="preserve"> lors du bilan initial.</w:t>
-      </w:r>
-    </w:p>
-    <w:p>
-      <w:pPr>
-        <w:pStyle w:val="ListBullet"/>
-        <w:spacing w:after="40"/>
-      </w:pPr>
-      <w:r>
-        <w:rPr>
-          <w:rFonts w:ascii="Inter" w:hAnsi="Inter"/>
-          <w:b/>
-          <w:i w:val="0"/>
-          <w:color w:val="BE123C"/>
-          <w:sz w:val="20"/>
-        </w:rPr>
-        <w:t>MAPA</w:t>
-      </w:r>
-      <w:r>
-        <w:rPr>
-          <w:rFonts w:ascii="Inter" w:hAnsi="Inter"/>
-          <w:b w:val="0"/>
-          <w:i w:val="0"/>
-          <w:color w:val="1F2937"/>
-          <w:sz w:val="20"/>
-        </w:rPr>
-        <w:t xml:space="preserve"> (mesure ambulatoire sur 24 h) : référence pour confirmer le diagnostic et dépister l'</w:t>
-      </w:r>
-      <w:r>
-        <w:rPr>
-          <w:rFonts w:ascii="Inter" w:hAnsi="Inter"/>
-          <w:b/>
-          <w:i w:val="0"/>
-          <w:color w:val="BE123C"/>
-          <w:sz w:val="20"/>
-        </w:rPr>
-        <w:t>HTA masquée</w:t>
-      </w:r>
-      <w:r>
-        <w:rPr>
-          <w:rFonts w:ascii="Inter" w:hAnsi="Inter"/>
-          <w:b w:val="0"/>
-          <w:i w:val="0"/>
-          <w:color w:val="1F2937"/>
-          <w:sz w:val="20"/>
-        </w:rPr>
-        <w:t>.</w:t>
-      </w:r>
-    </w:p>
-    <w:p>
-      <w:pPr>
-        <w:pStyle w:val="ListBullet"/>
-        <w:spacing w:after="40"/>
-      </w:pPr>
-      <w:r>
-        <w:rPr>
-          <w:rFonts w:ascii="Inter" w:hAnsi="Inter"/>
-          <w:b/>
-          <w:i w:val="0"/>
-          <w:color w:val="BE123C"/>
-          <w:sz w:val="20"/>
-        </w:rPr>
-        <w:t>Automesure</w:t>
-      </w:r>
-      <w:r>
-        <w:rPr>
-          <w:rFonts w:ascii="Inter" w:hAnsi="Inter"/>
-          <w:b w:val="0"/>
-          <w:i w:val="0"/>
-          <w:color w:val="1F2937"/>
-          <w:sz w:val="20"/>
-        </w:rPr>
-        <w:t xml:space="preserve"> : 3 mesures matin et soir, 3 jours de suite (</w:t>
-      </w:r>
-      <w:r>
-        <w:rPr>
-          <w:rFonts w:ascii="Inter" w:hAnsi="Inter"/>
-          <w:b/>
-          <w:i w:val="0"/>
-          <w:color w:val="BE123C"/>
-          <w:sz w:val="20"/>
-        </w:rPr>
-        <w:t>règle des 3</w:t>
-      </w:r>
-      <w:r>
-        <w:rPr>
-          <w:rFonts w:ascii="Inter" w:hAnsi="Inter"/>
-          <w:b w:val="0"/>
-          <w:i w:val="0"/>
-          <w:color w:val="1F2937"/>
-          <w:sz w:val="20"/>
-        </w:rPr>
-        <w:t>).</w:t>
-      </w:r>
-    </w:p>
-    <w:p>
-      <w:pPr>
-        <w:spacing w:before="160" w:after="80"/>
-        <w:shd w:val="clear" w:color="auto" w:fill="FAF7F2"/>
-        <w:pBdr>
-          <w:left w:val="single" w:sz="18" w:space="6" w:color="C9A961"/>
-        </w:pBdr>
-      </w:pPr>
-      <w:r>
-        <w:rPr>
-          <w:rFonts w:ascii="Cormorant Garamond" w:hAnsi="Cormorant Garamond"/>
-          <w:b/>
-          <w:color w:val="E11D48"/>
-          <w:sz w:val="27"/>
-        </w:rPr>
-        <w:t xml:space="preserve">B.  </w:t>
-      </w:r>
-      <w:r>
-        <w:rPr>
-          <w:rFonts w:ascii="Cormorant Garamond" w:hAnsi="Cormorant Garamond"/>
-          <w:b/>
-          <w:color w:val="1F2937"/>
-          <w:sz w:val="27"/>
-        </w:rPr>
-        <w:t>Bilan de retentissement</w:t>
-      </w:r>
-    </w:p>
-    <w:p>
-      <w:pPr>
-        <w:pStyle w:val="ListBullet"/>
-        <w:spacing w:after="40"/>
-      </w:pPr>
-      <w:r>
-        <w:rPr>
-          <w:rFonts w:ascii="Inter" w:hAnsi="Inter"/>
-          <w:b w:val="0"/>
-          <w:i w:val="0"/>
-          <w:color w:val="1F2937"/>
-          <w:sz w:val="20"/>
-        </w:rPr>
-        <w:t xml:space="preserve">Recherche d'une </w:t>
-      </w:r>
-      <w:r>
-        <w:rPr>
-          <w:rFonts w:ascii="Inter" w:hAnsi="Inter"/>
-          <w:b/>
-          <w:i w:val="0"/>
-          <w:color w:val="BE123C"/>
-          <w:sz w:val="20"/>
-        </w:rPr>
-        <w:t>atteinte des organes cibles</w:t>
-      </w:r>
-      <w:r>
-        <w:rPr>
-          <w:rFonts w:ascii="Inter" w:hAnsi="Inter"/>
-          <w:b w:val="0"/>
-          <w:i w:val="0"/>
-          <w:color w:val="1F2937"/>
-          <w:sz w:val="20"/>
-        </w:rPr>
-        <w:t xml:space="preserve"> :</w:t>
-      </w:r>
-    </w:p>
-    <w:p>
-      <w:pPr>
-        <w:pStyle w:val="ListBullet2"/>
-        <w:spacing w:after="40"/>
-      </w:pPr>
-      <w:r>
-        <w:rPr>
-          <w:rFonts w:ascii="Inter" w:hAnsi="Inter"/>
-          <w:b/>
-          <w:i w:val="0"/>
-          <w:color w:val="BE123C"/>
-          <w:sz w:val="20"/>
-        </w:rPr>
-        <w:t>Cœur</w:t>
-      </w:r>
-      <w:r>
-        <w:rPr>
-          <w:rFonts w:ascii="Inter" w:hAnsi="Inter"/>
-          <w:b w:val="0"/>
-          <w:i w:val="0"/>
-          <w:color w:val="1F2937"/>
-          <w:sz w:val="20"/>
-        </w:rPr>
-        <w:t xml:space="preserve"> : ECG, hypertrophie ventriculaire gauche.</w:t>
-      </w:r>
-    </w:p>
-    <w:p>
-      <w:pPr>
-        <w:pStyle w:val="ListBullet2"/>
-        <w:spacing w:after="40"/>
-      </w:pPr>
-      <w:r>
-        <w:rPr>
-          <w:rFonts w:ascii="Inter" w:hAnsi="Inter"/>
-          <w:b/>
-          <w:i w:val="0"/>
-          <w:color w:val="BE123C"/>
-          <w:sz w:val="20"/>
-        </w:rPr>
-        <w:t>Rein</w:t>
-      </w:r>
-      <w:r>
-        <w:rPr>
-          <w:rFonts w:ascii="Inter" w:hAnsi="Inter"/>
-          <w:b w:val="0"/>
-          <w:i w:val="0"/>
-          <w:color w:val="1F2937"/>
-          <w:sz w:val="20"/>
-        </w:rPr>
-        <w:t xml:space="preserve"> : créatininémie, </w:t>
-      </w:r>
-      <w:r>
-        <w:rPr>
-          <w:rFonts w:ascii="Inter" w:hAnsi="Inter"/>
-          <w:b/>
-          <w:i w:val="0"/>
-          <w:color w:val="BE123C"/>
-          <w:sz w:val="20"/>
-        </w:rPr>
-        <w:t>DFG</w:t>
-      </w:r>
-      <w:r>
-        <w:rPr>
-          <w:rFonts w:ascii="Inter" w:hAnsi="Inter"/>
-          <w:b w:val="0"/>
-          <w:i w:val="0"/>
-          <w:color w:val="1F2937"/>
-          <w:sz w:val="20"/>
-        </w:rPr>
-        <w:t>, protéinurie.</w:t>
-      </w:r>
-    </w:p>
-    <w:p>
-      <w:pPr>
-        <w:pStyle w:val="ListBullet2"/>
-        <w:spacing w:after="40"/>
-      </w:pPr>
-      <w:r>
-        <w:rPr>
-          <w:rFonts w:ascii="Inter" w:hAnsi="Inter"/>
-          <w:b/>
-          <w:i w:val="0"/>
-          <w:color w:val="BE123C"/>
-          <w:sz w:val="20"/>
-        </w:rPr>
-        <w:t>Œil</w:t>
-      </w:r>
-      <w:r>
-        <w:rPr>
-          <w:rFonts w:ascii="Inter" w:hAnsi="Inter"/>
-          <w:b w:val="0"/>
-          <w:i w:val="0"/>
-          <w:color w:val="1F2937"/>
-          <w:sz w:val="20"/>
-        </w:rPr>
-        <w:t xml:space="preserve"> : rétinopathie hypertensive si HTA sévère.</w:t>
-      </w:r>
-    </w:p>
-    <w:p>
-      <w:pPr>
-        <w:pStyle w:val="ListBullet"/>
-        <w:spacing w:after="40"/>
-      </w:pPr>
-      <w:r>
-        <w:rPr>
-          <w:rFonts w:ascii="Inter" w:hAnsi="Inter"/>
-          <w:b/>
-          <w:i w:val="0"/>
-          <w:color w:val="BE123C"/>
-          <w:sz w:val="20"/>
-        </w:rPr>
-        <w:t>Bilan biologique minimal</w:t>
-      </w:r>
-      <w:r>
-        <w:rPr>
-          <w:rFonts w:ascii="Inter" w:hAnsi="Inter"/>
-          <w:b w:val="0"/>
-          <w:i w:val="0"/>
-          <w:color w:val="1F2937"/>
-          <w:sz w:val="20"/>
-        </w:rPr>
-        <w:t xml:space="preserve"> : kaliémie, glycémie à jeun, bilan lipidique, créatininémie.</w:t>
-      </w:r>
-    </w:p>
-    <w:p>
-      <w:pPr>
-        <w:pStyle w:val="ListBullet"/>
-        <w:spacing w:after="40"/>
-      </w:pPr>
-      <w:r>
-        <w:rPr>
-          <w:rFonts w:ascii="Inter" w:hAnsi="Inter"/>
-          <w:b w:val="0"/>
-          <w:i w:val="0"/>
-          <w:color w:val="1F2937"/>
-          <w:sz w:val="20"/>
-        </w:rPr>
-        <w:t xml:space="preserve">Recherche d'une </w:t>
-      </w:r>
-      <w:r>
-        <w:rPr>
-          <w:rFonts w:ascii="Inter" w:hAnsi="Inter"/>
-          <w:b/>
-          <w:i w:val="0"/>
-          <w:color w:val="BE123C"/>
-          <w:sz w:val="20"/>
-        </w:rPr>
-        <w:t>HTA secondaire</w:t>
-      </w:r>
-      <w:r>
-        <w:rPr>
-          <w:rFonts w:ascii="Inter" w:hAnsi="Inter"/>
-          <w:b w:val="0"/>
-          <w:i w:val="0"/>
-          <w:color w:val="1F2937"/>
-          <w:sz w:val="20"/>
-        </w:rPr>
-        <w:t xml:space="preserve"> si HTA résistante, sujet jeune ou signes d'orientation.</w:t>
-      </w:r>
-    </w:p>
     <w:tbl>
       <w:tblPr>
         <w:tblW w:type="auto" w:w="0"/>
         <w:jc w:val="center"/>
+        <w:tblBorders>
+          <w:top w:val="single" w:sz="4" w:space="0" w:color="9CA3AF"/>
+          <w:left w:val="single" w:sz="4" w:space="0" w:color="9CA3AF"/>
+          <w:bottom w:val="single" w:sz="4" w:space="0" w:color="9CA3AF"/>
+          <w:right w:val="single" w:sz="4" w:space="0" w:color="9CA3AF"/>
+          <w:insideH w:val="single" w:sz="4" w:space="0" w:color="9CA3AF"/>
+          <w:insideV w:val="single" w:sz="4" w:space="0" w:color="9CA3AF"/>
+        </w:tblBorders>
         <w:tblLayout w:type="fixed"/>
         <w:tblLook w:firstColumn="1" w:firstRow="1" w:lastColumn="0" w:lastRow="0" w:noHBand="0" w:noVBand="1" w:val="04A0"/>
       </w:tblPr>
       <w:tblGrid>
-        <w:gridCol w:w="9866"/>
+        <w:gridCol w:w="4933"/>
+        <w:gridCol w:w="4933"/>
       </w:tblGrid>
+      <w:tr>
+        <w:trPr>
+          <w:tblHeader w:val="true"/>
+        </w:trPr>
+        <w:tc>
+          <w:tcPr>
+            <w:tcW w:type="dxa" w:w="2663"/>
+            <w:shd w:val="clear" w:color="auto" w:fill="E11D48"/>
+            <w:vAlign w:val="center"/>
+          </w:tcPr>
+          <w:p>
+            <w:pPr>
+              <w:jc w:val="center"/>
+            </w:pPr>
+            <w:r>
+              <w:rPr>
+                <w:rFonts w:ascii="Cormorant Garamond" w:hAnsi="Cormorant Garamond"/>
+                <w:b/>
+                <w:i/>
+                <w:color w:val="FFFFFF"/>
+                <w:sz w:val="26"/>
+              </w:rPr>
+              <w:t>II</w:t>
+            </w:r>
+          </w:p>
+        </w:tc>
+        <w:tc>
+          <w:tcPr>
+            <w:tcW w:type="dxa" w:w="7201"/>
+            <w:shd w:val="clear" w:color="auto" w:fill="FCE7EC"/>
+            <w:vAlign w:val="center"/>
+          </w:tcPr>
+          <w:p>
+            <w:pPr>
+              <w:jc w:val="center"/>
+            </w:pPr>
+            <w:r>
+              <w:rPr>
+                <w:rFonts w:ascii="Playfair Display" w:hAnsi="Playfair Display"/>
+                <w:b/>
+                <w:color w:val="9F1239"/>
+                <w:sz w:val="26"/>
+              </w:rPr>
+              <w:t>A.  Mesure de la pression artérielle</w:t>
+            </w:r>
+          </w:p>
+        </w:tc>
+      </w:tr>
       <w:tr>
         <w:tc>
           <w:tcPr>
-            <w:tcW w:type="dxa" w:w="9865"/>
-            <w:shd w:val="clear" w:color="auto" w:fill="F3F4F6"/>
-            <w:tcBorders>
-              <w:top w:val="single" w:sz="4" w:color="9CA3AF" w:space="0"/>
-              <w:left w:val="single" w:sz="24" w:color="9CA3AF" w:space="0"/>
-              <w:bottom w:val="single" w:sz="4" w:color="9CA3AF" w:space="0"/>
-              <w:right w:val="single" w:sz="4" w:color="9CA3AF" w:space="0"/>
-            </w:tcBorders>
+            <w:tcW w:type="dxa" w:w="2663"/>
+            <w:shd w:val="clear" w:color="auto" w:fill="FAF7F2"/>
+            <w:vAlign w:val="center"/>
           </w:tcPr>
           <w:p>
+            <w:pPr>
+              <w:jc w:val="center"/>
+            </w:pPr>
             <w:r>
               <w:rPr>
                 <w:rFonts w:ascii="Inter" w:hAnsi="Inter"/>
                 <w:b/>
-                <w:color w:val="4B5563"/>
-                <w:sz w:val="21"/>
+                <w:i w:val="0"/>
+                <w:color w:val="1F2937"/>
+                <w:sz w:val="20"/>
               </w:rPr>
-              <w:t>🔑  Mots-clés tombés</w:t>
+              <w:t>Conditions de mesure</w:t>
             </w:r>
           </w:p>
+        </w:tc>
+        <w:tc>
+          <w:tcPr>
+            <w:tcW w:type="dxa" w:w="7201"/>
+            <w:vAlign w:val="top"/>
+          </w:tcPr>
           <w:p>
             <w:pPr>
               <w:pStyle w:val="ListBullet"/>
+              <w:spacing w:after="40"/>
             </w:pPr>
             <w:r>
               <w:rPr>
@@ -1933,12 +1817,33 @@
                 <w:color w:val="1F2937"/>
                 <w:sz w:val="20"/>
               </w:rPr>
-              <w:t>MAPA</w:t>
+              <w:t xml:space="preserve">patient au </w:t>
+            </w:r>
+            <w:r>
+              <w:rPr>
+                <w:rFonts w:ascii="Inter" w:hAnsi="Inter"/>
+                <w:b/>
+                <w:i w:val="0"/>
+                <w:color w:val="BE123C"/>
+                <w:sz w:val="20"/>
+              </w:rPr>
+              <w:t>repos</w:t>
+            </w:r>
+            <w:r>
+              <w:rPr>
+                <w:rFonts w:ascii="Inter" w:hAnsi="Inter"/>
+                <w:b w:val="0"/>
+                <w:i w:val="0"/>
+                <w:color w:val="1F2937"/>
+                <w:sz w:val="20"/>
+              </w:rPr>
+              <w:t xml:space="preserve"> depuis 5 minutes, assis</w:t>
             </w:r>
           </w:p>
           <w:p>
             <w:pPr>
               <w:pStyle w:val="ListBullet"/>
+              <w:spacing w:after="40"/>
             </w:pPr>
             <w:r>
               <w:rPr>
@@ -1948,12 +1853,13 @@
                 <w:color w:val="1F2937"/>
                 <w:sz w:val="20"/>
               </w:rPr>
-              <w:t>Hypertrophie ventriculaire gauche</w:t>
+              <w:t>brassard adapté à la circonférence du bras</w:t>
             </w:r>
           </w:p>
           <w:p>
             <w:pPr>
               <w:pStyle w:val="ListBullet"/>
+              <w:spacing w:after="40"/>
             </w:pPr>
             <w:r>
               <w:rPr>
@@ -1963,12 +1869,73 @@
                 <w:color w:val="1F2937"/>
                 <w:sz w:val="20"/>
               </w:rPr>
-              <w:t>Organes cibles</w:t>
+              <w:t xml:space="preserve">mesure aux </w:t>
+            </w:r>
+            <w:r>
+              <w:rPr>
+                <w:rFonts w:ascii="Inter" w:hAnsi="Inter"/>
+                <w:b/>
+                <w:i w:val="0"/>
+                <w:color w:val="BE123C"/>
+                <w:sz w:val="20"/>
+              </w:rPr>
+              <w:t>deux bras</w:t>
+            </w:r>
+            <w:r>
+              <w:rPr>
+                <w:rFonts w:ascii="Inter" w:hAnsi="Inter"/>
+                <w:b w:val="0"/>
+                <w:i w:val="0"/>
+                <w:color w:val="1F2937"/>
+                <w:sz w:val="20"/>
+              </w:rPr>
+              <w:t xml:space="preserve"> lors du bilan initial</w:t>
             </w:r>
           </w:p>
+        </w:tc>
+      </w:tr>
+      <w:tr>
+        <w:tc>
+          <w:tcPr>
+            <w:tcW w:type="dxa" w:w="2663"/>
+            <w:shd w:val="clear" w:color="auto" w:fill="FAF7F2"/>
+            <w:vAlign w:val="center"/>
+          </w:tcPr>
+          <w:p>
+            <w:pPr>
+              <w:jc w:val="center"/>
+            </w:pPr>
+            <w:r>
+              <w:rPr>
+                <w:rFonts w:ascii="Inter" w:hAnsi="Inter"/>
+                <w:b/>
+                <w:i w:val="0"/>
+                <w:color w:val="C9A961"/>
+                <w:sz w:val="20"/>
+              </w:rPr>
+              <w:t>★</w:t>
+            </w:r>
+            <w:r>
+              <w:rPr>
+                <w:rFonts w:ascii="Inter" w:hAnsi="Inter"/>
+                <w:b/>
+                <w:i w:val="0"/>
+                <w:color w:val="1F2937"/>
+                <w:sz w:val="20"/>
+              </w:rPr>
+              <w:t xml:space="preserve"> MAPA</w:t>
+            </w:r>
+          </w:p>
+        </w:tc>
+        <w:tc>
+          <w:tcPr>
+            <w:tcW w:type="dxa" w:w="7201"/>
+            <w:vAlign w:val="top"/>
+          </w:tcPr>
           <w:p>
             <w:pPr>
               <w:pStyle w:val="ListBullet"/>
+              <w:spacing w:after="40"/>
             </w:pPr>
             <w:r>
               <w:rPr>
@@ -1978,12 +1945,33 @@
                 <w:color w:val="1F2937"/>
                 <w:sz w:val="20"/>
               </w:rPr>
-              <w:t>HTA secondaire</w:t>
+              <w:t xml:space="preserve">mesure </w:t>
+            </w:r>
+            <w:r>
+              <w:rPr>
+                <w:rFonts w:ascii="Inter" w:hAnsi="Inter"/>
+                <w:b/>
+                <w:i w:val="0"/>
+                <w:color w:val="BE123C"/>
+                <w:sz w:val="20"/>
+              </w:rPr>
+              <w:t>ambulatoire</w:t>
+            </w:r>
+            <w:r>
+              <w:rPr>
+                <w:rFonts w:ascii="Inter" w:hAnsi="Inter"/>
+                <w:b w:val="0"/>
+                <w:i w:val="0"/>
+                <w:color w:val="1F2937"/>
+                <w:sz w:val="20"/>
+              </w:rPr>
+              <w:t xml:space="preserve"> de la PA sur 24 h</w:t>
             </w:r>
           </w:p>
           <w:p>
             <w:pPr>
               <w:pStyle w:val="ListBullet"/>
+              <w:spacing w:after="40"/>
             </w:pPr>
             <w:r>
               <w:rPr>
@@ -1993,7 +1981,458 @@
                 <w:color w:val="1F2937"/>
                 <w:sz w:val="20"/>
               </w:rPr>
-              <w:t>Protéinurie</w:t>
+              <w:t xml:space="preserve">examen de </w:t>
+            </w:r>
+            <w:r>
+              <w:rPr>
+                <w:rFonts w:ascii="Inter" w:hAnsi="Inter"/>
+                <w:b/>
+                <w:i w:val="0"/>
+                <w:color w:val="BE123C"/>
+                <w:sz w:val="20"/>
+              </w:rPr>
+              <w:t>référence</w:t>
+            </w:r>
+            <w:r>
+              <w:rPr>
+                <w:rFonts w:ascii="Inter" w:hAnsi="Inter"/>
+                <w:b w:val="0"/>
+                <w:i w:val="0"/>
+                <w:color w:val="1F2937"/>
+                <w:sz w:val="20"/>
+              </w:rPr>
+              <w:t xml:space="preserve"> pour confirmer le diagnostic</w:t>
+            </w:r>
+          </w:p>
+          <w:p>
+            <w:pPr>
+              <w:pStyle w:val="ListBullet"/>
+              <w:spacing w:after="40"/>
+            </w:pPr>
+            <w:r>
+              <w:rPr>
+                <w:rFonts w:ascii="Inter" w:hAnsi="Inter"/>
+                <w:b w:val="0"/>
+                <w:i w:val="0"/>
+                <w:color w:val="1F2937"/>
+                <w:sz w:val="20"/>
+              </w:rPr>
+              <w:t>dépiste l'</w:t>
+            </w:r>
+            <w:r>
+              <w:rPr>
+                <w:rFonts w:ascii="Inter" w:hAnsi="Inter"/>
+                <w:b/>
+                <w:i w:val="0"/>
+                <w:color w:val="BE123C"/>
+                <w:sz w:val="20"/>
+              </w:rPr>
+              <w:t>HTA masquée</w:t>
+            </w:r>
+          </w:p>
+        </w:tc>
+      </w:tr>
+      <w:tr>
+        <w:tc>
+          <w:tcPr>
+            <w:tcW w:type="dxa" w:w="2663"/>
+            <w:shd w:val="clear" w:color="auto" w:fill="FAF7F2"/>
+            <w:vAlign w:val="center"/>
+          </w:tcPr>
+          <w:p>
+            <w:pPr>
+              <w:jc w:val="center"/>
+            </w:pPr>
+            <w:r>
+              <w:rPr>
+                <w:rFonts w:ascii="Inter" w:hAnsi="Inter"/>
+                <w:b/>
+                <w:i w:val="0"/>
+                <w:color w:val="1F2937"/>
+                <w:sz w:val="20"/>
+              </w:rPr>
+              <w:t>Automesure</w:t>
+            </w:r>
+          </w:p>
+        </w:tc>
+        <w:tc>
+          <w:tcPr>
+            <w:tcW w:type="dxa" w:w="7201"/>
+            <w:vAlign w:val="top"/>
+          </w:tcPr>
+          <w:p>
+            <w:pPr>
+              <w:pStyle w:val="ListBullet"/>
+              <w:spacing w:after="40"/>
+            </w:pPr>
+            <w:r>
+              <w:rPr>
+                <w:rFonts w:ascii="Inter" w:hAnsi="Inter"/>
+                <w:b/>
+                <w:i w:val="0"/>
+                <w:color w:val="BE123C"/>
+                <w:sz w:val="20"/>
+              </w:rPr>
+              <w:t>règle des 3</w:t>
+            </w:r>
+            <w:r>
+              <w:rPr>
+                <w:rFonts w:ascii="Inter" w:hAnsi="Inter"/>
+                <w:b w:val="0"/>
+                <w:i w:val="0"/>
+                <w:color w:val="1F2937"/>
+                <w:sz w:val="20"/>
+              </w:rPr>
+              <w:t xml:space="preserve"> : 3 mesures matin et soir, 3 jours de suite</w:t>
+            </w:r>
+          </w:p>
+        </w:tc>
+      </w:tr>
+    </w:tbl>
+    <w:p>
+      <w:pPr>
+        <w:spacing w:after="80"/>
+      </w:pPr>
+    </w:p>
+    <w:tbl>
+      <w:tblPr>
+        <w:tblW w:type="auto" w:w="0"/>
+        <w:jc w:val="center"/>
+        <w:tblBorders>
+          <w:top w:val="single" w:sz="4" w:space="0" w:color="9CA3AF"/>
+          <w:left w:val="single" w:sz="4" w:space="0" w:color="9CA3AF"/>
+          <w:bottom w:val="single" w:sz="4" w:space="0" w:color="9CA3AF"/>
+          <w:right w:val="single" w:sz="4" w:space="0" w:color="9CA3AF"/>
+          <w:insideH w:val="single" w:sz="4" w:space="0" w:color="9CA3AF"/>
+          <w:insideV w:val="single" w:sz="4" w:space="0" w:color="9CA3AF"/>
+        </w:tblBorders>
+        <w:tblLayout w:type="fixed"/>
+        <w:tblLook w:firstColumn="1" w:firstRow="1" w:lastColumn="0" w:lastRow="0" w:noHBand="0" w:noVBand="1" w:val="04A0"/>
+      </w:tblPr>
+      <w:tblGrid>
+        <w:gridCol w:w="4933"/>
+        <w:gridCol w:w="4933"/>
+      </w:tblGrid>
+      <w:tr>
+        <w:trPr>
+          <w:tblHeader w:val="true"/>
+        </w:trPr>
+        <w:tc>
+          <w:tcPr>
+            <w:tcW w:type="dxa" w:w="2663"/>
+            <w:shd w:val="clear" w:color="auto" w:fill="E11D48"/>
+            <w:vAlign w:val="center"/>
+          </w:tcPr>
+          <w:p>
+            <w:pPr>
+              <w:jc w:val="center"/>
+            </w:pPr>
+            <w:r>
+              <w:rPr>
+                <w:rFonts w:ascii="Cormorant Garamond" w:hAnsi="Cormorant Garamond"/>
+                <w:b/>
+                <w:i/>
+                <w:color w:val="FFFFFF"/>
+                <w:sz w:val="26"/>
+              </w:rPr>
+              <w:t>II</w:t>
+            </w:r>
+          </w:p>
+        </w:tc>
+        <w:tc>
+          <w:tcPr>
+            <w:tcW w:type="dxa" w:w="7201"/>
+            <w:shd w:val="clear" w:color="auto" w:fill="FCE7EC"/>
+            <w:vAlign w:val="center"/>
+          </w:tcPr>
+          <w:p>
+            <w:pPr>
+              <w:jc w:val="center"/>
+            </w:pPr>
+            <w:r>
+              <w:rPr>
+                <w:rFonts w:ascii="Playfair Display" w:hAnsi="Playfair Display"/>
+                <w:b/>
+                <w:color w:val="9F1239"/>
+                <w:sz w:val="26"/>
+              </w:rPr>
+              <w:t>B.  Bilan de retentissement</w:t>
+            </w:r>
+          </w:p>
+        </w:tc>
+      </w:tr>
+      <w:tr>
+        <w:tc>
+          <w:tcPr>
+            <w:tcW w:type="dxa" w:w="2663"/>
+            <w:shd w:val="clear" w:color="auto" w:fill="FAF7F2"/>
+            <w:vAlign w:val="center"/>
+          </w:tcPr>
+          <w:p>
+            <w:pPr>
+              <w:jc w:val="center"/>
+            </w:pPr>
+            <w:r>
+              <w:rPr>
+                <w:rFonts w:ascii="Inter" w:hAnsi="Inter"/>
+                <w:b/>
+                <w:i w:val="0"/>
+                <w:color w:val="E11D48"/>
+                <w:sz w:val="20"/>
+              </w:rPr>
+              <w:t>◆</w:t>
+            </w:r>
+            <w:r>
+              <w:rPr>
+                <w:rFonts w:ascii="Inter" w:hAnsi="Inter"/>
+                <w:b/>
+                <w:i w:val="0"/>
+                <w:color w:val="1F2937"/>
+                <w:sz w:val="20"/>
+              </w:rPr>
+              <w:t xml:space="preserve"> Organes cibles</w:t>
+            </w:r>
+          </w:p>
+        </w:tc>
+        <w:tc>
+          <w:tcPr>
+            <w:tcW w:type="dxa" w:w="7201"/>
+            <w:vAlign w:val="top"/>
+          </w:tcPr>
+          <w:p>
+            <w:pPr>
+              <w:pStyle w:val="ListBullet"/>
+              <w:spacing w:after="40"/>
+            </w:pPr>
+            <w:r>
+              <w:rPr>
+                <w:rFonts w:ascii="Inter" w:hAnsi="Inter"/>
+                <w:b/>
+                <w:i w:val="0"/>
+                <w:color w:val="BE123C"/>
+                <w:sz w:val="20"/>
+              </w:rPr>
+              <w:t>Cœur</w:t>
+            </w:r>
+            <w:r>
+              <w:rPr>
+                <w:rFonts w:ascii="Inter" w:hAnsi="Inter"/>
+                <w:b w:val="0"/>
+                <w:i w:val="0"/>
+                <w:color w:val="1F2937"/>
+                <w:sz w:val="20"/>
+              </w:rPr>
+              <w:t xml:space="preserve"> : ECG, hypertrophie ventriculaire gauche</w:t>
+            </w:r>
+          </w:p>
+          <w:p>
+            <w:pPr>
+              <w:pStyle w:val="ListBullet"/>
+              <w:spacing w:after="40"/>
+            </w:pPr>
+            <w:r>
+              <w:rPr>
+                <w:rFonts w:ascii="Inter" w:hAnsi="Inter"/>
+                <w:b/>
+                <w:i w:val="0"/>
+                <w:color w:val="BE123C"/>
+                <w:sz w:val="20"/>
+              </w:rPr>
+              <w:t>Rein</w:t>
+            </w:r>
+            <w:r>
+              <w:rPr>
+                <w:rFonts w:ascii="Inter" w:hAnsi="Inter"/>
+                <w:b w:val="0"/>
+                <w:i w:val="0"/>
+                <w:color w:val="1F2937"/>
+                <w:sz w:val="20"/>
+              </w:rPr>
+              <w:t xml:space="preserve"> : créatininémie, </w:t>
+            </w:r>
+            <w:r>
+              <w:rPr>
+                <w:rFonts w:ascii="Inter" w:hAnsi="Inter"/>
+                <w:b/>
+                <w:i w:val="0"/>
+                <w:color w:val="BE123C"/>
+                <w:sz w:val="20"/>
+              </w:rPr>
+              <w:t>DFG</w:t>
+            </w:r>
+            <w:r>
+              <w:rPr>
+                <w:rFonts w:ascii="Inter" w:hAnsi="Inter"/>
+                <w:b w:val="0"/>
+                <w:i w:val="0"/>
+                <w:color w:val="1F2937"/>
+                <w:sz w:val="20"/>
+              </w:rPr>
+              <w:t>, protéinurie</w:t>
+            </w:r>
+          </w:p>
+          <w:p>
+            <w:pPr>
+              <w:pStyle w:val="ListBullet"/>
+              <w:spacing w:after="40"/>
+            </w:pPr>
+            <w:r>
+              <w:rPr>
+                <w:rFonts w:ascii="Inter" w:hAnsi="Inter"/>
+                <w:b/>
+                <w:i w:val="0"/>
+                <w:color w:val="BE123C"/>
+                <w:sz w:val="20"/>
+              </w:rPr>
+              <w:t>Œil</w:t>
+            </w:r>
+            <w:r>
+              <w:rPr>
+                <w:rFonts w:ascii="Inter" w:hAnsi="Inter"/>
+                <w:b w:val="0"/>
+                <w:i w:val="0"/>
+                <w:color w:val="1F2937"/>
+                <w:sz w:val="20"/>
+              </w:rPr>
+              <w:t xml:space="preserve"> : rétinopathie hypertensive si HTA sévère</w:t>
+            </w:r>
+          </w:p>
+        </w:tc>
+      </w:tr>
+      <w:tr>
+        <w:tc>
+          <w:tcPr>
+            <w:tcW w:type="dxa" w:w="2663"/>
+            <w:shd w:val="clear" w:color="auto" w:fill="FAF7F2"/>
+            <w:vAlign w:val="center"/>
+          </w:tcPr>
+          <w:p>
+            <w:pPr>
+              <w:jc w:val="center"/>
+            </w:pPr>
+            <w:r>
+              <w:rPr>
+                <w:rFonts w:ascii="Inter" w:hAnsi="Inter"/>
+                <w:b/>
+                <w:i w:val="0"/>
+                <w:color w:val="1F2937"/>
+                <w:sz w:val="20"/>
+              </w:rPr>
+              <w:t>Bilan biologique</w:t>
+            </w:r>
+          </w:p>
+        </w:tc>
+        <w:tc>
+          <w:tcPr>
+            <w:tcW w:type="dxa" w:w="7201"/>
+            <w:vAlign w:val="top"/>
+          </w:tcPr>
+          <w:p>
+            <w:pPr>
+              <w:pStyle w:val="ListBullet"/>
+              <w:spacing w:after="40"/>
+            </w:pPr>
+            <w:r>
+              <w:rPr>
+                <w:rFonts w:ascii="Inter" w:hAnsi="Inter"/>
+                <w:b w:val="0"/>
+                <w:i w:val="0"/>
+                <w:color w:val="1F2937"/>
+                <w:sz w:val="20"/>
+              </w:rPr>
+              <w:t>kaliémie, glycémie à jeun</w:t>
+            </w:r>
+          </w:p>
+          <w:p>
+            <w:pPr>
+              <w:pStyle w:val="ListBullet"/>
+              <w:spacing w:after="40"/>
+            </w:pPr>
+            <w:r>
+              <w:rPr>
+                <w:rFonts w:ascii="Inter" w:hAnsi="Inter"/>
+                <w:b w:val="0"/>
+                <w:i w:val="0"/>
+                <w:color w:val="1F2937"/>
+                <w:sz w:val="20"/>
+              </w:rPr>
+              <w:t>bilan lipidique, créatininémie</w:t>
+            </w:r>
+          </w:p>
+        </w:tc>
+      </w:tr>
+      <w:tr>
+        <w:tc>
+          <w:tcPr>
+            <w:tcW w:type="dxa" w:w="2663"/>
+            <w:shd w:val="clear" w:color="auto" w:fill="FAF7F2"/>
+            <w:vAlign w:val="center"/>
+          </w:tcPr>
+          <w:p>
+            <w:pPr>
+              <w:jc w:val="center"/>
+            </w:pPr>
+            <w:r>
+              <w:rPr>
+                <w:rFonts w:ascii="Inter" w:hAnsi="Inter"/>
+                <w:b/>
+                <w:i w:val="0"/>
+                <w:color w:val="B91C1C"/>
+                <w:sz w:val="20"/>
+              </w:rPr>
+              <w:t>⚠</w:t>
+            </w:r>
+            <w:r>
+              <w:rPr>
+                <w:rFonts w:ascii="Inter" w:hAnsi="Inter"/>
+                <w:b/>
+                <w:i w:val="0"/>
+                <w:color w:val="1F2937"/>
+                <w:sz w:val="20"/>
+              </w:rPr>
+              <w:t xml:space="preserve"> HTA secondaire</w:t>
+            </w:r>
+          </w:p>
+        </w:tc>
+        <w:tc>
+          <w:tcPr>
+            <w:tcW w:type="dxa" w:w="7201"/>
+            <w:vAlign w:val="top"/>
+          </w:tcPr>
+          <w:p>
+            <w:pPr>
+              <w:pStyle w:val="ListBullet"/>
+              <w:spacing w:after="40"/>
+            </w:pPr>
+            <w:r>
+              <w:rPr>
+                <w:rFonts w:ascii="Inter" w:hAnsi="Inter"/>
+                <w:b w:val="0"/>
+                <w:i w:val="0"/>
+                <w:color w:val="1F2937"/>
+                <w:sz w:val="20"/>
+              </w:rPr>
+              <w:t xml:space="preserve">à rechercher si </w:t>
+            </w:r>
+            <w:r>
+              <w:rPr>
+                <w:rFonts w:ascii="Inter" w:hAnsi="Inter"/>
+                <w:b/>
+                <w:i w:val="0"/>
+                <w:color w:val="BE123C"/>
+                <w:sz w:val="20"/>
+              </w:rPr>
+              <w:t>HTA résistante</w:t>
+            </w:r>
+            <w:r>
+              <w:rPr>
+                <w:rFonts w:ascii="Inter" w:hAnsi="Inter"/>
+                <w:b w:val="0"/>
+                <w:i w:val="0"/>
+                <w:color w:val="1F2937"/>
+                <w:sz w:val="20"/>
+              </w:rPr>
+              <w:t>, sujet jeune ou signes d'orientation</w:t>
             </w:r>
           </w:p>
         </w:tc>
@@ -2011,8 +2450,8 @@
     </w:p>
     <w:p>
       <w:pPr>
+        <w:shd w:val="clear" w:color="auto" w:fill="E11D48"/>
         <w:spacing w:before="40" w:after="200"/>
-        <w:shd w:val="clear" w:color="auto" w:fill="E11D48"/>
       </w:pPr>
       <w:r>
         <w:rPr>
@@ -2024,532 +2463,106 @@
         <w:t>III.  Prise en charge thérapeutique</w:t>
       </w:r>
     </w:p>
-    <w:p>
-      <w:pPr>
-        <w:spacing w:before="160" w:after="80"/>
-        <w:shd w:val="clear" w:color="auto" w:fill="FAF7F2"/>
-        <w:pBdr>
-          <w:left w:val="single" w:sz="18" w:space="6" w:color="C9A961"/>
-        </w:pBdr>
-      </w:pPr>
-      <w:r>
-        <w:rPr>
-          <w:rFonts w:ascii="Cormorant Garamond" w:hAnsi="Cormorant Garamond"/>
-          <w:b/>
-          <w:color w:val="E11D48"/>
-          <w:sz w:val="27"/>
-        </w:rPr>
-        <w:t xml:space="preserve">A.  </w:t>
-      </w:r>
-      <w:r>
-        <w:rPr>
-          <w:rFonts w:ascii="Cormorant Garamond" w:hAnsi="Cormorant Garamond"/>
-          <w:b/>
-          <w:color w:val="1F2937"/>
-          <w:sz w:val="27"/>
-        </w:rPr>
-        <w:t>Mesures non médicamenteuses</w:t>
-      </w:r>
-    </w:p>
-    <w:p>
-      <w:pPr>
-        <w:pStyle w:val="ListBullet"/>
-        <w:spacing w:after="40"/>
-      </w:pPr>
-      <w:r>
-        <w:rPr>
-          <w:rFonts w:ascii="Inter" w:hAnsi="Inter"/>
-          <w:b/>
-          <w:i w:val="0"/>
-          <w:color w:val="BE123C"/>
-          <w:sz w:val="20"/>
-        </w:rPr>
-        <w:t>Règles hygiéno-diététiques</w:t>
-      </w:r>
-      <w:r>
-        <w:rPr>
-          <w:rFonts w:ascii="Inter" w:hAnsi="Inter"/>
-          <w:b w:val="0"/>
-          <w:i w:val="0"/>
-          <w:color w:val="1F2937"/>
-          <w:sz w:val="20"/>
-        </w:rPr>
-        <w:t>, systématiques :</w:t>
-      </w:r>
-    </w:p>
-    <w:p>
-      <w:pPr>
-        <w:pStyle w:val="ListBullet2"/>
-        <w:spacing w:after="40"/>
-      </w:pPr>
-      <w:r>
-        <w:rPr>
-          <w:rFonts w:ascii="Inter" w:hAnsi="Inter"/>
-          <w:b w:val="0"/>
-          <w:i w:val="0"/>
-          <w:color w:val="1F2937"/>
-          <w:sz w:val="20"/>
-        </w:rPr>
-        <w:t xml:space="preserve">Réduction des apports en </w:t>
-      </w:r>
-      <w:r>
-        <w:rPr>
-          <w:rFonts w:ascii="Inter" w:hAnsi="Inter"/>
-          <w:b/>
-          <w:i w:val="0"/>
-          <w:color w:val="BE123C"/>
-          <w:sz w:val="20"/>
-        </w:rPr>
-        <w:t>sel</w:t>
-      </w:r>
-      <w:r>
-        <w:rPr>
-          <w:rFonts w:ascii="Inter" w:hAnsi="Inter"/>
-          <w:b w:val="0"/>
-          <w:i w:val="0"/>
-          <w:color w:val="1F2937"/>
-          <w:sz w:val="20"/>
-        </w:rPr>
-        <w:t xml:space="preserve"> (&lt; 6 g/j).</w:t>
-      </w:r>
-    </w:p>
-    <w:p>
-      <w:pPr>
-        <w:pStyle w:val="ListBullet2"/>
-        <w:spacing w:after="40"/>
-      </w:pPr>
-      <w:r>
-        <w:rPr>
-          <w:rFonts w:ascii="Inter" w:hAnsi="Inter"/>
-          <w:b w:val="0"/>
-          <w:i w:val="0"/>
-          <w:color w:val="1F2937"/>
-          <w:sz w:val="20"/>
-        </w:rPr>
-        <w:t>Perte de poids en cas de surpoids.</w:t>
-      </w:r>
-    </w:p>
-    <w:p>
-      <w:pPr>
-        <w:pStyle w:val="ListBullet2"/>
-        <w:spacing w:after="40"/>
-      </w:pPr>
-      <w:r>
-        <w:rPr>
-          <w:rFonts w:ascii="Inter" w:hAnsi="Inter"/>
-          <w:b/>
-          <w:i w:val="0"/>
-          <w:color w:val="BE123C"/>
-          <w:sz w:val="20"/>
-        </w:rPr>
-        <w:t>Activité physique</w:t>
-      </w:r>
-      <w:r>
-        <w:rPr>
-          <w:rFonts w:ascii="Inter" w:hAnsi="Inter"/>
-          <w:b w:val="0"/>
-          <w:i w:val="0"/>
-          <w:color w:val="1F2937"/>
-          <w:sz w:val="20"/>
-        </w:rPr>
-        <w:t xml:space="preserve"> régulière (30 min/j).</w:t>
-      </w:r>
-    </w:p>
-    <w:p>
-      <w:pPr>
-        <w:pStyle w:val="ListBullet2"/>
-        <w:spacing w:after="40"/>
-      </w:pPr>
-      <w:r>
-        <w:rPr>
-          <w:rFonts w:ascii="Inter" w:hAnsi="Inter"/>
-          <w:b w:val="0"/>
-          <w:i w:val="0"/>
-          <w:color w:val="1F2937"/>
-          <w:sz w:val="20"/>
-        </w:rPr>
-        <w:t>Limitation de l'</w:t>
-      </w:r>
-      <w:r>
-        <w:rPr>
-          <w:rFonts w:ascii="Inter" w:hAnsi="Inter"/>
-          <w:b/>
-          <w:i w:val="0"/>
-          <w:color w:val="BE123C"/>
-          <w:sz w:val="20"/>
-        </w:rPr>
-        <w:t>alcool</w:t>
-      </w:r>
-      <w:r>
-        <w:rPr>
-          <w:rFonts w:ascii="Inter" w:hAnsi="Inter"/>
-          <w:b w:val="0"/>
-          <w:i w:val="0"/>
-          <w:color w:val="1F2937"/>
-          <w:sz w:val="20"/>
-        </w:rPr>
-        <w:t xml:space="preserve">, arrêt du </w:t>
-      </w:r>
-      <w:r>
-        <w:rPr>
-          <w:rFonts w:ascii="Inter" w:hAnsi="Inter"/>
-          <w:b/>
-          <w:i w:val="0"/>
-          <w:color w:val="BE123C"/>
-          <w:sz w:val="20"/>
-        </w:rPr>
-        <w:t>tabac</w:t>
-      </w:r>
-      <w:r>
-        <w:rPr>
-          <w:rFonts w:ascii="Inter" w:hAnsi="Inter"/>
-          <w:b w:val="0"/>
-          <w:i w:val="0"/>
-          <w:color w:val="1F2937"/>
-          <w:sz w:val="20"/>
-        </w:rPr>
-        <w:t>.</w:t>
-      </w:r>
-    </w:p>
-    <w:p>
-      <w:pPr>
-        <w:pStyle w:val="ListBullet"/>
-        <w:spacing w:after="40"/>
-      </w:pPr>
-      <w:r>
-        <w:rPr>
-          <w:rFonts w:ascii="Inter" w:hAnsi="Inter"/>
-          <w:b w:val="0"/>
-          <w:i w:val="0"/>
-          <w:color w:val="1F2937"/>
-          <w:sz w:val="20"/>
-        </w:rPr>
-        <w:t>Toujours associées au traitement médicamenteux.</w:t>
-      </w:r>
-    </w:p>
-    <w:p>
-      <w:pPr>
-        <w:spacing w:before="160" w:after="80"/>
-        <w:shd w:val="clear" w:color="auto" w:fill="FAF7F2"/>
-        <w:pBdr>
-          <w:left w:val="single" w:sz="18" w:space="6" w:color="C9A961"/>
-        </w:pBdr>
-      </w:pPr>
-      <w:r>
-        <w:rPr>
-          <w:rFonts w:ascii="Cormorant Garamond" w:hAnsi="Cormorant Garamond"/>
-          <w:b/>
-          <w:color w:val="E11D48"/>
-          <w:sz w:val="27"/>
-        </w:rPr>
-        <w:t xml:space="preserve">B.  </w:t>
-      </w:r>
-      <w:r>
-        <w:rPr>
-          <w:rFonts w:ascii="Cormorant Garamond" w:hAnsi="Cormorant Garamond"/>
-          <w:b/>
-          <w:color w:val="1F2937"/>
-          <w:sz w:val="27"/>
-        </w:rPr>
-        <w:t>Traitement médicamenteux</w:t>
-      </w:r>
-    </w:p>
-    <w:p>
-      <w:pPr>
-        <w:pStyle w:val="ListBullet"/>
-        <w:spacing w:after="40"/>
-      </w:pPr>
-      <w:r>
-        <w:rPr>
-          <w:rFonts w:ascii="Inter" w:hAnsi="Inter"/>
-          <w:b/>
-          <w:i w:val="0"/>
-          <w:color w:val="BE123C"/>
-          <w:sz w:val="20"/>
-        </w:rPr>
-        <w:t>Cinq classes</w:t>
-      </w:r>
-      <w:r>
-        <w:rPr>
-          <w:rFonts w:ascii="Inter" w:hAnsi="Inter"/>
-          <w:b w:val="0"/>
-          <w:i w:val="0"/>
-          <w:color w:val="1F2937"/>
-          <w:sz w:val="20"/>
-        </w:rPr>
-        <w:t xml:space="preserve"> de première intention :</w:t>
-      </w:r>
-    </w:p>
-    <w:p>
-      <w:pPr>
-        <w:pStyle w:val="ListBullet2"/>
-        <w:spacing w:after="40"/>
-      </w:pPr>
-      <w:r>
-        <w:rPr>
-          <w:rFonts w:ascii="Inter" w:hAnsi="Inter"/>
-          <w:b/>
-          <w:i w:val="0"/>
-          <w:color w:val="BE123C"/>
-          <w:sz w:val="20"/>
-        </w:rPr>
-        <w:t>IEC</w:t>
-      </w:r>
-      <w:r>
-        <w:rPr>
-          <w:rFonts w:ascii="Inter" w:hAnsi="Inter"/>
-          <w:b w:val="0"/>
-          <w:i w:val="0"/>
-          <w:color w:val="1F2937"/>
-          <w:sz w:val="20"/>
-        </w:rPr>
-        <w:t xml:space="preserve"> et </w:t>
-      </w:r>
-      <w:r>
-        <w:rPr>
-          <w:rFonts w:ascii="Inter" w:hAnsi="Inter"/>
-          <w:b/>
-          <w:i w:val="0"/>
-          <w:color w:val="BE123C"/>
-          <w:sz w:val="20"/>
-        </w:rPr>
-        <w:t>ARA II</w:t>
-      </w:r>
-      <w:r>
-        <w:rPr>
-          <w:rFonts w:ascii="Inter" w:hAnsi="Inter"/>
-          <w:b w:val="0"/>
-          <w:i w:val="0"/>
-          <w:color w:val="1F2937"/>
-          <w:sz w:val="20"/>
-        </w:rPr>
-        <w:t xml:space="preserve"> : bloqueurs du système rénine-angiotensine.</w:t>
-      </w:r>
-    </w:p>
-    <w:p>
-      <w:pPr>
-        <w:pStyle w:val="ListBullet2"/>
-        <w:spacing w:after="40"/>
-      </w:pPr>
-      <w:r>
-        <w:rPr>
-          <w:rFonts w:ascii="Inter" w:hAnsi="Inter"/>
-          <w:b/>
-          <w:i w:val="0"/>
-          <w:color w:val="BE123C"/>
-          <w:sz w:val="20"/>
-        </w:rPr>
-        <w:t>Inhibiteurs calciques</w:t>
-      </w:r>
-      <w:r>
-        <w:rPr>
-          <w:rFonts w:ascii="Inter" w:hAnsi="Inter"/>
-          <w:b w:val="0"/>
-          <w:i w:val="0"/>
-          <w:color w:val="1F2937"/>
-          <w:sz w:val="20"/>
-        </w:rPr>
-        <w:t>.</w:t>
-      </w:r>
-    </w:p>
-    <w:p>
-      <w:pPr>
-        <w:pStyle w:val="ListBullet2"/>
-        <w:spacing w:after="40"/>
-      </w:pPr>
-      <w:r>
-        <w:rPr>
-          <w:rFonts w:ascii="Inter" w:hAnsi="Inter"/>
-          <w:b/>
-          <w:i w:val="0"/>
-          <w:color w:val="BE123C"/>
-          <w:sz w:val="20"/>
-        </w:rPr>
-        <w:t>Diurétiques thiazidiques</w:t>
-      </w:r>
-      <w:r>
-        <w:rPr>
-          <w:rFonts w:ascii="Inter" w:hAnsi="Inter"/>
-          <w:b w:val="0"/>
-          <w:i w:val="0"/>
-          <w:color w:val="1F2937"/>
-          <w:sz w:val="20"/>
-        </w:rPr>
-        <w:t>.</w:t>
-      </w:r>
-    </w:p>
-    <w:p>
-      <w:pPr>
-        <w:pStyle w:val="ListBullet2"/>
-        <w:spacing w:after="40"/>
-      </w:pPr>
-      <w:r>
-        <w:rPr>
-          <w:rFonts w:ascii="Inter" w:hAnsi="Inter"/>
-          <w:b/>
-          <w:i w:val="0"/>
-          <w:color w:val="BE123C"/>
-          <w:sz w:val="20"/>
-        </w:rPr>
-        <w:t>Bêtabloquants</w:t>
-      </w:r>
-      <w:r>
-        <w:rPr>
-          <w:rFonts w:ascii="Inter" w:hAnsi="Inter"/>
-          <w:b w:val="0"/>
-          <w:i w:val="0"/>
-          <w:color w:val="1F2937"/>
-          <w:sz w:val="20"/>
-        </w:rPr>
-        <w:t xml:space="preserve"> (indications spécifiques).</w:t>
-      </w:r>
-    </w:p>
-    <w:p>
-      <w:pPr>
-        <w:pStyle w:val="ListBullet"/>
-        <w:spacing w:after="40"/>
-      </w:pPr>
-      <w:r>
-        <w:rPr>
-          <w:rFonts w:ascii="Inter" w:hAnsi="Inter"/>
-          <w:b w:val="0"/>
-          <w:i w:val="0"/>
-          <w:color w:val="1F2937"/>
-          <w:sz w:val="20"/>
-        </w:rPr>
-        <w:t xml:space="preserve">Stratégie : </w:t>
-      </w:r>
-      <w:r>
-        <w:rPr>
-          <w:rFonts w:ascii="Inter" w:hAnsi="Inter"/>
-          <w:b/>
-          <w:i w:val="0"/>
-          <w:color w:val="BE123C"/>
-          <w:sz w:val="20"/>
-        </w:rPr>
-        <w:t>bithérapie d'emblée</w:t>
-      </w:r>
-      <w:r>
-        <w:rPr>
-          <w:rFonts w:ascii="Inter" w:hAnsi="Inter"/>
-          <w:b w:val="0"/>
-          <w:i w:val="0"/>
-          <w:color w:val="1F2937"/>
-          <w:sz w:val="20"/>
-        </w:rPr>
-        <w:t xml:space="preserve"> souvent recommandée, en privilégiant les </w:t>
-      </w:r>
-      <w:r>
-        <w:rPr>
-          <w:rFonts w:ascii="Inter" w:hAnsi="Inter"/>
-          <w:b/>
-          <w:i w:val="0"/>
-          <w:color w:val="BE123C"/>
-          <w:sz w:val="20"/>
-        </w:rPr>
-        <w:t>associations fixes</w:t>
-      </w:r>
-      <w:r>
-        <w:rPr>
-          <w:rFonts w:ascii="Inter" w:hAnsi="Inter"/>
-          <w:b w:val="0"/>
-          <w:i w:val="0"/>
-          <w:color w:val="1F2937"/>
-          <w:sz w:val="20"/>
-        </w:rPr>
-        <w:t>.</w:t>
-      </w:r>
-    </w:p>
-    <w:p>
-      <w:pPr>
-        <w:pStyle w:val="ListBullet"/>
-        <w:spacing w:after="40"/>
-      </w:pPr>
-      <w:r>
-        <w:rPr>
-          <w:rFonts w:ascii="Inter" w:hAnsi="Inter"/>
-          <w:b w:val="0"/>
-          <w:i w:val="0"/>
-          <w:color w:val="1F2937"/>
-          <w:sz w:val="20"/>
-        </w:rPr>
-        <w:t xml:space="preserve">Objectif tensionnel : </w:t>
-      </w:r>
-      <w:r>
-        <w:rPr>
-          <w:rFonts w:ascii="Inter" w:hAnsi="Inter"/>
-          <w:b/>
-          <w:i w:val="0"/>
-          <w:color w:val="BE123C"/>
-          <w:sz w:val="20"/>
-        </w:rPr>
-        <w:t>&lt; 140/90 mmHg</w:t>
-      </w:r>
-      <w:r>
-        <w:rPr>
-          <w:rFonts w:ascii="Inter" w:hAnsi="Inter"/>
-          <w:b w:val="0"/>
-          <w:i w:val="0"/>
-          <w:color w:val="1F2937"/>
-          <w:sz w:val="20"/>
-        </w:rPr>
-        <w:t xml:space="preserve">, voire </w:t>
-      </w:r>
-      <w:r>
-        <w:rPr>
-          <w:rFonts w:ascii="Inter" w:hAnsi="Inter"/>
-          <w:b/>
-          <w:i w:val="0"/>
-          <w:color w:val="BE123C"/>
-          <w:sz w:val="20"/>
-        </w:rPr>
-        <w:t>&lt; 130/80 mmHg</w:t>
-      </w:r>
-      <w:r>
-        <w:rPr>
-          <w:rFonts w:ascii="Inter" w:hAnsi="Inter"/>
-          <w:b w:val="0"/>
-          <w:i w:val="0"/>
-          <w:color w:val="1F2937"/>
-          <w:sz w:val="20"/>
-        </w:rPr>
-        <w:t xml:space="preserve"> si bien toléré.</w:t>
-      </w:r>
-    </w:p>
     <w:tbl>
       <w:tblPr>
         <w:tblW w:type="auto" w:w="0"/>
         <w:jc w:val="center"/>
+        <w:tblBorders>
+          <w:top w:val="single" w:sz="4" w:space="0" w:color="9CA3AF"/>
+          <w:left w:val="single" w:sz="4" w:space="0" w:color="9CA3AF"/>
+          <w:bottom w:val="single" w:sz="4" w:space="0" w:color="9CA3AF"/>
+          <w:right w:val="single" w:sz="4" w:space="0" w:color="9CA3AF"/>
+          <w:insideH w:val="single" w:sz="4" w:space="0" w:color="9CA3AF"/>
+          <w:insideV w:val="single" w:sz="4" w:space="0" w:color="9CA3AF"/>
+        </w:tblBorders>
         <w:tblLayout w:type="fixed"/>
         <w:tblLook w:firstColumn="1" w:firstRow="1" w:lastColumn="0" w:lastRow="0" w:noHBand="0" w:noVBand="1" w:val="04A0"/>
       </w:tblPr>
       <w:tblGrid>
-        <w:gridCol w:w="9866"/>
+        <w:gridCol w:w="4933"/>
+        <w:gridCol w:w="4933"/>
       </w:tblGrid>
+      <w:tr>
+        <w:trPr>
+          <w:tblHeader w:val="true"/>
+        </w:trPr>
+        <w:tc>
+          <w:tcPr>
+            <w:tcW w:type="dxa" w:w="2663"/>
+            <w:shd w:val="clear" w:color="auto" w:fill="E11D48"/>
+            <w:vAlign w:val="center"/>
+          </w:tcPr>
+          <w:p>
+            <w:pPr>
+              <w:jc w:val="center"/>
+            </w:pPr>
+            <w:r>
+              <w:rPr>
+                <w:rFonts w:ascii="Cormorant Garamond" w:hAnsi="Cormorant Garamond"/>
+                <w:b/>
+                <w:i/>
+                <w:color w:val="FFFFFF"/>
+                <w:sz w:val="26"/>
+              </w:rPr>
+              <w:t>III</w:t>
+            </w:r>
+          </w:p>
+        </w:tc>
+        <w:tc>
+          <w:tcPr>
+            <w:tcW w:type="dxa" w:w="7201"/>
+            <w:shd w:val="clear" w:color="auto" w:fill="FCE7EC"/>
+            <w:vAlign w:val="center"/>
+          </w:tcPr>
+          <w:p>
+            <w:pPr>
+              <w:jc w:val="center"/>
+            </w:pPr>
+            <w:r>
+              <w:rPr>
+                <w:rFonts w:ascii="Playfair Display" w:hAnsi="Playfair Display"/>
+                <w:b/>
+                <w:color w:val="9F1239"/>
+                <w:sz w:val="26"/>
+              </w:rPr>
+              <w:t>A.  Mesures non médicamenteuses</w:t>
+            </w:r>
+          </w:p>
+        </w:tc>
+      </w:tr>
       <w:tr>
         <w:tc>
           <w:tcPr>
-            <w:tcW w:type="dxa" w:w="9865"/>
-            <w:shd w:val="clear" w:color="auto" w:fill="FBF6E8"/>
-            <w:tcBorders>
-              <w:top w:val="single" w:sz="4" w:color="C9A961" w:space="0"/>
-              <w:left w:val="single" w:sz="24" w:color="C9A961" w:space="0"/>
-              <w:bottom w:val="single" w:sz="4" w:color="C9A961" w:space="0"/>
-              <w:right w:val="single" w:sz="4" w:color="C9A961" w:space="0"/>
-            </w:tcBorders>
+            <w:tcW w:type="dxa" w:w="2663"/>
+            <w:shd w:val="clear" w:color="auto" w:fill="FAF7F2"/>
+            <w:vAlign w:val="center"/>
           </w:tcPr>
           <w:p>
+            <w:pPr>
+              <w:jc w:val="center"/>
+            </w:pPr>
             <w:r>
               <w:rPr>
                 <w:rFonts w:ascii="Inter" w:hAnsi="Inter"/>
                 <w:b/>
-                <w:color w:val="9A7B33"/>
-                <w:sz w:val="21"/>
+                <w:i w:val="0"/>
+                <w:color w:val="1F2937"/>
+                <w:sz w:val="20"/>
               </w:rPr>
-              <w:t>💡  Astuce mnémotechnique</w:t>
+              <w:t>Règles hygiéno-diététiques</w:t>
             </w:r>
           </w:p>
+        </w:tc>
+        <w:tc>
+          <w:tcPr>
+            <w:tcW w:type="dxa" w:w="7201"/>
+            <w:vAlign w:val="top"/>
+          </w:tcPr>
           <w:p>
+            <w:pPr>
+              <w:pStyle w:val="ListBullet"/>
+              <w:spacing w:after="40"/>
+            </w:pPr>
             <w:r>
               <w:rPr>
                 <w:rFonts w:ascii="Inter" w:hAnsi="Inter"/>
@@ -2558,7 +2571,7 @@
                 <w:color w:val="1F2937"/>
                 <w:sz w:val="20"/>
               </w:rPr>
-              <w:t xml:space="preserve">Les 5 classes — moyen mnémotechnique « </w:t>
+              <w:t xml:space="preserve">réduction des apports en </w:t>
             </w:r>
             <w:r>
               <w:rPr>
@@ -2568,7 +2581,7 @@
                 <w:color w:val="BE123C"/>
                 <w:sz w:val="20"/>
               </w:rPr>
-              <w:t>A-B-C-D</w:t>
+              <w:t>sel</w:t>
             </w:r>
             <w:r>
               <w:rPr>
@@ -2578,7 +2591,75 @@
                 <w:color w:val="1F2937"/>
                 <w:sz w:val="20"/>
               </w:rPr>
-              <w:t xml:space="preserve"> » : </w:t>
+              <w:t xml:space="preserve"> (&lt; 6 g/j)</w:t>
+            </w:r>
+          </w:p>
+          <w:p>
+            <w:pPr>
+              <w:pStyle w:val="ListBullet"/>
+              <w:spacing w:after="40"/>
+            </w:pPr>
+            <w:r>
+              <w:rPr>
+                <w:rFonts w:ascii="Inter" w:hAnsi="Inter"/>
+                <w:b/>
+                <w:i w:val="0"/>
+                <w:color w:val="BE123C"/>
+                <w:sz w:val="20"/>
+              </w:rPr>
+              <w:t>perte de poids</w:t>
+            </w:r>
+            <w:r>
+              <w:rPr>
+                <w:rFonts w:ascii="Inter" w:hAnsi="Inter"/>
+                <w:b w:val="0"/>
+                <w:i w:val="0"/>
+                <w:color w:val="1F2937"/>
+                <w:sz w:val="20"/>
+              </w:rPr>
+              <w:t xml:space="preserve"> en cas de surpoids</w:t>
+            </w:r>
+          </w:p>
+          <w:p>
+            <w:pPr>
+              <w:pStyle w:val="ListBullet"/>
+              <w:spacing w:after="40"/>
+            </w:pPr>
+            <w:r>
+              <w:rPr>
+                <w:rFonts w:ascii="Inter" w:hAnsi="Inter"/>
+                <w:b/>
+                <w:i w:val="0"/>
+                <w:color w:val="BE123C"/>
+                <w:sz w:val="20"/>
+              </w:rPr>
+              <w:t>activité physique</w:t>
+            </w:r>
+            <w:r>
+              <w:rPr>
+                <w:rFonts w:ascii="Inter" w:hAnsi="Inter"/>
+                <w:b w:val="0"/>
+                <w:i w:val="0"/>
+                <w:color w:val="1F2937"/>
+                <w:sz w:val="20"/>
+              </w:rPr>
+              <w:t xml:space="preserve"> régulière (30 min/j)</w:t>
+            </w:r>
+          </w:p>
+          <w:p>
+            <w:pPr>
+              <w:pStyle w:val="ListBullet"/>
+              <w:spacing w:after="40"/>
+            </w:pPr>
+            <w:r>
+              <w:rPr>
+                <w:rFonts w:ascii="Inter" w:hAnsi="Inter"/>
+                <w:b w:val="0"/>
+                <w:i w:val="0"/>
+                <w:color w:val="1F2937"/>
+                <w:sz w:val="20"/>
+              </w:rPr>
+              <w:t>limitation de l'</w:t>
             </w:r>
             <w:r>
               <w:rPr>
@@ -2588,7 +2669,7 @@
                 <w:color w:val="BE123C"/>
                 <w:sz w:val="20"/>
               </w:rPr>
-              <w:t>A</w:t>
+              <w:t>alcool</w:t>
             </w:r>
             <w:r>
               <w:rPr>
@@ -2598,7 +2679,7 @@
                 <w:color w:val="1F2937"/>
                 <w:sz w:val="20"/>
               </w:rPr>
-              <w:t xml:space="preserve">RA II / IEC, </w:t>
+              <w:t xml:space="preserve">, arrêt du </w:t>
             </w:r>
             <w:r>
               <w:rPr>
@@ -2608,7 +2689,522 @@
                 <w:color w:val="BE123C"/>
                 <w:sz w:val="20"/>
               </w:rPr>
-              <w:t>B</w:t>
+              <w:t>tabac</w:t>
+            </w:r>
+          </w:p>
+        </w:tc>
+      </w:tr>
+    </w:tbl>
+    <w:p>
+      <w:pPr>
+        <w:spacing w:after="80"/>
+      </w:pPr>
+    </w:p>
+    <w:tbl>
+      <w:tblPr>
+        <w:tblW w:type="auto" w:w="0"/>
+        <w:jc w:val="center"/>
+        <w:tblBorders>
+          <w:top w:val="single" w:sz="4" w:space="0" w:color="9CA3AF"/>
+          <w:left w:val="single" w:sz="4" w:space="0" w:color="9CA3AF"/>
+          <w:bottom w:val="single" w:sz="4" w:space="0" w:color="9CA3AF"/>
+          <w:right w:val="single" w:sz="4" w:space="0" w:color="9CA3AF"/>
+          <w:insideH w:val="single" w:sz="4" w:space="0" w:color="9CA3AF"/>
+          <w:insideV w:val="single" w:sz="4" w:space="0" w:color="9CA3AF"/>
+        </w:tblBorders>
+        <w:tblLayout w:type="fixed"/>
+        <w:tblLook w:firstColumn="1" w:firstRow="1" w:lastColumn="0" w:lastRow="0" w:noHBand="0" w:noVBand="1" w:val="04A0"/>
+      </w:tblPr>
+      <w:tblGrid>
+        <w:gridCol w:w="4933"/>
+        <w:gridCol w:w="4933"/>
+      </w:tblGrid>
+      <w:tr>
+        <w:trPr>
+          <w:tblHeader w:val="true"/>
+        </w:trPr>
+        <w:tc>
+          <w:tcPr>
+            <w:tcW w:type="dxa" w:w="2663"/>
+            <w:shd w:val="clear" w:color="auto" w:fill="E11D48"/>
+            <w:vAlign w:val="center"/>
+          </w:tcPr>
+          <w:p>
+            <w:pPr>
+              <w:jc w:val="center"/>
+            </w:pPr>
+            <w:r>
+              <w:rPr>
+                <w:rFonts w:ascii="Cormorant Garamond" w:hAnsi="Cormorant Garamond"/>
+                <w:b/>
+                <w:i/>
+                <w:color w:val="FFFFFF"/>
+                <w:sz w:val="26"/>
+              </w:rPr>
+              <w:t>III</w:t>
+            </w:r>
+          </w:p>
+        </w:tc>
+        <w:tc>
+          <w:tcPr>
+            <w:tcW w:type="dxa" w:w="7201"/>
+            <w:shd w:val="clear" w:color="auto" w:fill="FCE7EC"/>
+            <w:vAlign w:val="center"/>
+          </w:tcPr>
+          <w:p>
+            <w:pPr>
+              <w:jc w:val="center"/>
+            </w:pPr>
+            <w:r>
+              <w:rPr>
+                <w:rFonts w:ascii="Playfair Display" w:hAnsi="Playfair Display"/>
+                <w:b/>
+                <w:color w:val="9F1239"/>
+                <w:sz w:val="26"/>
+              </w:rPr>
+              <w:t>B.  Traitement médicamenteux</w:t>
+            </w:r>
+          </w:p>
+        </w:tc>
+      </w:tr>
+      <w:tr>
+        <w:tc>
+          <w:tcPr>
+            <w:tcW w:type="dxa" w:w="2663"/>
+            <w:shd w:val="clear" w:color="auto" w:fill="FAF7F2"/>
+            <w:vAlign w:val="center"/>
+          </w:tcPr>
+          <w:p>
+            <w:pPr>
+              <w:jc w:val="center"/>
+            </w:pPr>
+            <w:r>
+              <w:rPr>
+                <w:rFonts w:ascii="Inter" w:hAnsi="Inter"/>
+                <w:b/>
+                <w:i w:val="0"/>
+                <w:color w:val="C9A961"/>
+                <w:sz w:val="20"/>
+              </w:rPr>
+              <w:t>★</w:t>
+            </w:r>
+            <w:r>
+              <w:rPr>
+                <w:rFonts w:ascii="Inter" w:hAnsi="Inter"/>
+                <w:b/>
+                <w:i w:val="0"/>
+                <w:color w:val="1F2937"/>
+                <w:sz w:val="20"/>
+              </w:rPr>
+              <w:t xml:space="preserve"> Classes de 1re intention</w:t>
+            </w:r>
+          </w:p>
+        </w:tc>
+        <w:tc>
+          <w:tcPr>
+            <w:tcW w:type="dxa" w:w="7201"/>
+            <w:vAlign w:val="top"/>
+          </w:tcPr>
+          <w:tbl>
+            <w:tblPr>
+              <w:tblW w:type="auto" w:w="0"/>
+              <w:jc w:val="center"/>
+              <w:tblBorders>
+                <w:top w:val="single" w:sz="4" w:space="0" w:color="9CA3AF"/>
+                <w:left w:val="single" w:sz="4" w:space="0" w:color="9CA3AF"/>
+                <w:bottom w:val="single" w:sz="4" w:space="0" w:color="9CA3AF"/>
+                <w:right w:val="single" w:sz="4" w:space="0" w:color="9CA3AF"/>
+                <w:insideH w:val="single" w:sz="4" w:space="0" w:color="9CA3AF"/>
+                <w:insideV w:val="single" w:sz="4" w:space="0" w:color="9CA3AF"/>
+              </w:tblBorders>
+              <w:tblLayout w:type="autofit"/>
+              <w:tblLook w:firstColumn="1" w:firstRow="1" w:lastColumn="0" w:lastRow="0" w:noHBand="0" w:noVBand="1" w:val="04A0"/>
+            </w:tblPr>
+            <w:tblGrid>
+              <w:gridCol w:w="1644"/>
+              <w:gridCol w:w="1644"/>
+              <w:gridCol w:w="1644"/>
+            </w:tblGrid>
+            <w:tr>
+              <w:tc>
+                <w:tcPr>
+                  <w:tcW w:type="dxa" w:w="1644"/>
+                  <w:shd w:val="clear" w:color="auto" w:fill="FAF7F2"/>
+                </w:tcPr>
+                <w:p>
+                  <w:pPr>
+                    <w:spacing w:after="40"/>
+                  </w:pPr>
+                  <w:r>
+                    <w:rPr>
+                      <w:rFonts w:ascii="Inter" w:hAnsi="Inter"/>
+                      <w:b/>
+                      <w:i w:val="0"/>
+                      <w:color w:val="1F2937"/>
+                      <w:sz w:val="18"/>
+                    </w:rPr>
+                    <w:t>Classe</w:t>
+                  </w:r>
+                </w:p>
+              </w:tc>
+              <w:tc>
+                <w:tcPr>
+                  <w:tcW w:type="dxa" w:w="1644"/>
+                  <w:shd w:val="clear" w:color="auto" w:fill="FAF7F2"/>
+                </w:tcPr>
+                <w:p>
+                  <w:pPr>
+                    <w:spacing w:after="40"/>
+                  </w:pPr>
+                  <w:r>
+                    <w:rPr>
+                      <w:rFonts w:ascii="Inter" w:hAnsi="Inter"/>
+                      <w:b/>
+                      <w:i w:val="0"/>
+                      <w:color w:val="1F2937"/>
+                      <w:sz w:val="18"/>
+                    </w:rPr>
+                    <w:t>Exemple</w:t>
+                  </w:r>
+                </w:p>
+              </w:tc>
+              <w:tc>
+                <w:tcPr>
+                  <w:tcW w:type="dxa" w:w="1644"/>
+                  <w:shd w:val="clear" w:color="auto" w:fill="FAF7F2"/>
+                </w:tcPr>
+                <w:p>
+                  <w:pPr>
+                    <w:spacing w:after="40"/>
+                  </w:pPr>
+                  <w:r>
+                    <w:rPr>
+                      <w:rFonts w:ascii="Inter" w:hAnsi="Inter"/>
+                      <w:b/>
+                      <w:i w:val="0"/>
+                      <w:color w:val="1F2937"/>
+                      <w:sz w:val="18"/>
+                    </w:rPr>
+                    <w:t>Indication préférentielle</w:t>
+                  </w:r>
+                </w:p>
+              </w:tc>
+            </w:tr>
+            <w:tr>
+              <w:tc>
+                <w:tcPr>
+                  <w:tcW w:type="dxa" w:w="1644"/>
+                </w:tcPr>
+                <w:p>
+                  <w:pPr>
+                    <w:spacing w:after="40"/>
+                  </w:pPr>
+                  <w:r>
+                    <w:rPr>
+                      <w:rFonts w:ascii="Inter" w:hAnsi="Inter"/>
+                      <w:b/>
+                      <w:i w:val="0"/>
+                      <w:color w:val="BE123C"/>
+                      <w:sz w:val="18"/>
+                    </w:rPr>
+                    <w:t>IEC</w:t>
+                  </w:r>
+                </w:p>
+              </w:tc>
+              <w:tc>
+                <w:tcPr>
+                  <w:tcW w:type="dxa" w:w="1644"/>
+                </w:tcPr>
+                <w:p>
+                  <w:pPr>
+                    <w:spacing w:after="40"/>
+                  </w:pPr>
+                  <w:r>
+                    <w:rPr>
+                      <w:rFonts w:ascii="Inter" w:hAnsi="Inter"/>
+                      <w:b w:val="0"/>
+                      <w:i w:val="0"/>
+                      <w:color w:val="1F2937"/>
+                      <w:sz w:val="18"/>
+                    </w:rPr>
+                    <w:t>Ramipril</w:t>
+                  </w:r>
+                </w:p>
+              </w:tc>
+              <w:tc>
+                <w:tcPr>
+                  <w:tcW w:type="dxa" w:w="1644"/>
+                </w:tcPr>
+                <w:p>
+                  <w:pPr>
+                    <w:spacing w:after="40"/>
+                  </w:pPr>
+                  <w:r>
+                    <w:rPr>
+                      <w:rFonts w:ascii="Inter" w:hAnsi="Inter"/>
+                      <w:b w:val="0"/>
+                      <w:i w:val="0"/>
+                      <w:color w:val="1F2937"/>
+                      <w:sz w:val="18"/>
+                    </w:rPr>
+                    <w:t>Diabète, insuffisance cardiaque</w:t>
+                  </w:r>
+                </w:p>
+              </w:tc>
+            </w:tr>
+            <w:tr>
+              <w:tc>
+                <w:tcPr>
+                  <w:tcW w:type="dxa" w:w="1644"/>
+                  <w:shd w:val="clear" w:color="auto" w:fill="FCFBF7"/>
+                </w:tcPr>
+                <w:p>
+                  <w:pPr>
+                    <w:spacing w:after="40"/>
+                  </w:pPr>
+                  <w:r>
+                    <w:rPr>
+                      <w:rFonts w:ascii="Inter" w:hAnsi="Inter"/>
+                      <w:b/>
+                      <w:i w:val="0"/>
+                      <w:color w:val="BE123C"/>
+                      <w:sz w:val="18"/>
+                    </w:rPr>
+                    <w:t>ARA II</w:t>
+                  </w:r>
+                </w:p>
+              </w:tc>
+              <w:tc>
+                <w:tcPr>
+                  <w:tcW w:type="dxa" w:w="1644"/>
+                  <w:shd w:val="clear" w:color="auto" w:fill="FCFBF7"/>
+                </w:tcPr>
+                <w:p>
+                  <w:pPr>
+                    <w:spacing w:after="40"/>
+                  </w:pPr>
+                  <w:r>
+                    <w:rPr>
+                      <w:rFonts w:ascii="Inter" w:hAnsi="Inter"/>
+                      <w:b w:val="0"/>
+                      <w:i w:val="0"/>
+                      <w:color w:val="1F2937"/>
+                      <w:sz w:val="18"/>
+                    </w:rPr>
+                    <w:t>Losartan</w:t>
+                  </w:r>
+                </w:p>
+              </w:tc>
+              <w:tc>
+                <w:tcPr>
+                  <w:tcW w:type="dxa" w:w="1644"/>
+                  <w:shd w:val="clear" w:color="auto" w:fill="FCFBF7"/>
+                </w:tcPr>
+                <w:p>
+                  <w:pPr>
+                    <w:spacing w:after="40"/>
+                  </w:pPr>
+                  <w:r>
+                    <w:rPr>
+                      <w:rFonts w:ascii="Inter" w:hAnsi="Inter"/>
+                      <w:b w:val="0"/>
+                      <w:i w:val="0"/>
+                      <w:color w:val="1F2937"/>
+                      <w:sz w:val="18"/>
+                    </w:rPr>
+                    <w:t>Intolérance aux IEC (toux)</w:t>
+                  </w:r>
+                </w:p>
+              </w:tc>
+            </w:tr>
+            <w:tr>
+              <w:tc>
+                <w:tcPr>
+                  <w:tcW w:type="dxa" w:w="1644"/>
+                </w:tcPr>
+                <w:p>
+                  <w:pPr>
+                    <w:spacing w:after="40"/>
+                  </w:pPr>
+                  <w:r>
+                    <w:rPr>
+                      <w:rFonts w:ascii="Inter" w:hAnsi="Inter"/>
+                      <w:b/>
+                      <w:i w:val="0"/>
+                      <w:color w:val="BE123C"/>
+                      <w:sz w:val="18"/>
+                    </w:rPr>
+                    <w:t>Inhibiteur calcique</w:t>
+                  </w:r>
+                </w:p>
+              </w:tc>
+              <w:tc>
+                <w:tcPr>
+                  <w:tcW w:type="dxa" w:w="1644"/>
+                </w:tcPr>
+                <w:p>
+                  <w:pPr>
+                    <w:spacing w:after="40"/>
+                  </w:pPr>
+                  <w:r>
+                    <w:rPr>
+                      <w:rFonts w:ascii="Inter" w:hAnsi="Inter"/>
+                      <w:b w:val="0"/>
+                      <w:i w:val="0"/>
+                      <w:color w:val="1F2937"/>
+                      <w:sz w:val="18"/>
+                    </w:rPr>
+                    <w:t>Amlodipine</w:t>
+                  </w:r>
+                </w:p>
+              </w:tc>
+              <w:tc>
+                <w:tcPr>
+                  <w:tcW w:type="dxa" w:w="1644"/>
+                </w:tcPr>
+                <w:p>
+                  <w:pPr>
+                    <w:spacing w:after="40"/>
+                  </w:pPr>
+                  <w:r>
+                    <w:rPr>
+                      <w:rFonts w:ascii="Inter" w:hAnsi="Inter"/>
+                      <w:b w:val="0"/>
+                      <w:i w:val="0"/>
+                      <w:color w:val="1F2937"/>
+                      <w:sz w:val="18"/>
+                    </w:rPr>
+                    <w:t>Sujet âgé</w:t>
+                  </w:r>
+                </w:p>
+              </w:tc>
+            </w:tr>
+            <w:tr>
+              <w:tc>
+                <w:tcPr>
+                  <w:tcW w:type="dxa" w:w="1644"/>
+                  <w:shd w:val="clear" w:color="auto" w:fill="FCFBF7"/>
+                </w:tcPr>
+                <w:p>
+                  <w:pPr>
+                    <w:spacing w:after="40"/>
+                  </w:pPr>
+                  <w:r>
+                    <w:rPr>
+                      <w:rFonts w:ascii="Inter" w:hAnsi="Inter"/>
+                      <w:b/>
+                      <w:i w:val="0"/>
+                      <w:color w:val="BE123C"/>
+                      <w:sz w:val="18"/>
+                    </w:rPr>
+                    <w:t>Diurétique thiazidique</w:t>
+                  </w:r>
+                </w:p>
+              </w:tc>
+              <w:tc>
+                <w:tcPr>
+                  <w:tcW w:type="dxa" w:w="1644"/>
+                  <w:shd w:val="clear" w:color="auto" w:fill="FCFBF7"/>
+                </w:tcPr>
+                <w:p>
+                  <w:pPr>
+                    <w:spacing w:after="40"/>
+                  </w:pPr>
+                  <w:r>
+                    <w:rPr>
+                      <w:rFonts w:ascii="Inter" w:hAnsi="Inter"/>
+                      <w:b w:val="0"/>
+                      <w:i w:val="0"/>
+                      <w:color w:val="1F2937"/>
+                      <w:sz w:val="18"/>
+                    </w:rPr>
+                    <w:t>HCTZ</w:t>
+                  </w:r>
+                </w:p>
+              </w:tc>
+              <w:tc>
+                <w:tcPr>
+                  <w:tcW w:type="dxa" w:w="1644"/>
+                  <w:shd w:val="clear" w:color="auto" w:fill="FCFBF7"/>
+                </w:tcPr>
+                <w:p>
+                  <w:pPr>
+                    <w:spacing w:after="40"/>
+                  </w:pPr>
+                  <w:r>
+                    <w:rPr>
+                      <w:rFonts w:ascii="Inter" w:hAnsi="Inter"/>
+                      <w:b w:val="0"/>
+                      <w:i w:val="0"/>
+                      <w:color w:val="1F2937"/>
+                      <w:sz w:val="18"/>
+                    </w:rPr>
+                    <w:t>Sujet âgé</w:t>
+                  </w:r>
+                </w:p>
+              </w:tc>
+            </w:tr>
+          </w:tbl>
+          <w:p/>
+          <w:p>
+            <w:pPr>
+              <w:spacing w:after="80"/>
+            </w:pPr>
+          </w:p>
+        </w:tc>
+      </w:tr>
+      <w:tr>
+        <w:tc>
+          <w:tcPr>
+            <w:tcW w:type="dxa" w:w="2663"/>
+            <w:shd w:val="clear" w:color="auto" w:fill="FAF7F2"/>
+            <w:vAlign w:val="center"/>
+          </w:tcPr>
+          <w:p>
+            <w:pPr>
+              <w:jc w:val="center"/>
+            </w:pPr>
+            <w:r>
+              <w:rPr>
+                <w:rFonts w:ascii="Inter" w:hAnsi="Inter"/>
+                <w:b/>
+                <w:i w:val="0"/>
+                <w:color w:val="E11D48"/>
+                <w:sz w:val="20"/>
+              </w:rPr>
+              <w:t>◆</w:t>
+            </w:r>
+            <w:r>
+              <w:rPr>
+                <w:rFonts w:ascii="Inter" w:hAnsi="Inter"/>
+                <w:b/>
+                <w:i w:val="0"/>
+                <w:color w:val="1F2937"/>
+                <w:sz w:val="20"/>
+              </w:rPr>
+              <w:t xml:space="preserve"> Stratégie thérapeutique</w:t>
+            </w:r>
+          </w:p>
+        </w:tc>
+        <w:tc>
+          <w:tcPr>
+            <w:tcW w:type="dxa" w:w="7201"/>
+            <w:vAlign w:val="top"/>
+          </w:tcPr>
+          <w:p>
+            <w:pPr>
+              <w:pStyle w:val="ListBullet"/>
+              <w:spacing w:after="40"/>
+            </w:pPr>
+            <w:r>
+              <w:rPr>
+                <w:rFonts w:ascii="Inter" w:hAnsi="Inter"/>
+                <w:b/>
+                <w:i w:val="0"/>
+                <w:color w:val="BE123C"/>
+                <w:sz w:val="20"/>
+              </w:rPr>
+              <w:t>bithérapie d'emblée</w:t>
             </w:r>
             <w:r>
               <w:rPr>
@@ -2618,7 +3214,23 @@
                 <w:color w:val="1F2937"/>
                 <w:sz w:val="20"/>
               </w:rPr>
-              <w:t xml:space="preserve">êtabloquants, </w:t>
+              <w:t xml:space="preserve"> souvent recommandée</w:t>
+            </w:r>
+          </w:p>
+          <w:p>
+            <w:pPr>
+              <w:pStyle w:val="ListBullet2"/>
+              <w:spacing w:after="40"/>
+            </w:pPr>
+            <w:r>
+              <w:rPr>
+                <w:rFonts w:ascii="Inter" w:hAnsi="Inter"/>
+                <w:b w:val="0"/>
+                <w:i w:val="0"/>
+                <w:color w:val="1F2937"/>
+                <w:sz w:val="20"/>
+              </w:rPr>
+              <w:t xml:space="preserve">privilégier les </w:t>
             </w:r>
             <w:r>
               <w:rPr>
@@ -2628,7 +3240,33 @@
                 <w:color w:val="BE123C"/>
                 <w:sz w:val="20"/>
               </w:rPr>
-              <w:t>C</w:t>
+              <w:t>associations fixes</w:t>
+            </w:r>
+          </w:p>
+          <w:p>
+            <w:pPr>
+              <w:pStyle w:val="ListBullet"/>
+              <w:spacing w:after="40"/>
+            </w:pPr>
+            <w:r>
+              <w:rPr>
+                <w:rFonts w:ascii="Inter" w:hAnsi="Inter"/>
+                <w:b w:val="0"/>
+                <w:i w:val="0"/>
+                <w:color w:val="1F2937"/>
+                <w:sz w:val="20"/>
+              </w:rPr>
+              <w:t xml:space="preserve">objectif : </w:t>
+            </w:r>
+            <w:r>
+              <w:rPr>
+                <w:rFonts w:ascii="Inter" w:hAnsi="Inter"/>
+                <w:b/>
+                <w:i w:val="0"/>
+                <w:color w:val="BE123C"/>
+                <w:sz w:val="20"/>
+              </w:rPr>
+              <w:t>&lt; 140/90 mmHg</w:t>
             </w:r>
             <w:r>
               <w:rPr>
@@ -2638,7 +3276,7 @@
                 <w:color w:val="1F2937"/>
                 <w:sz w:val="20"/>
               </w:rPr>
-              <w:t xml:space="preserve">alciques, </w:t>
+              <w:t xml:space="preserve">, voire </w:t>
             </w:r>
             <w:r>
               <w:rPr>
@@ -2648,7 +3286,7 @@
                 <w:color w:val="BE123C"/>
                 <w:sz w:val="20"/>
               </w:rPr>
-              <w:t>D</w:t>
+              <w:t>&lt; 130/80 mmHg</w:t>
             </w:r>
             <w:r>
               <w:rPr>
@@ -2658,7 +3296,7 @@
                 <w:color w:val="1F2937"/>
                 <w:sz w:val="20"/>
               </w:rPr>
-              <w:t>iurétiques.</w:t>
+              <w:t xml:space="preserve"> si bien toléré</w:t>
             </w:r>
           </w:p>
         </w:tc>
@@ -2676,8 +3314,8 @@
     </w:p>
     <w:p>
       <w:pPr>
+        <w:shd w:val="clear" w:color="auto" w:fill="E11D48"/>
         <w:spacing w:before="40" w:after="200"/>
-        <w:shd w:val="clear" w:color="auto" w:fill="E11D48"/>
       </w:pPr>
       <w:r>
         <w:rPr>
@@ -2707,8 +3345,6 @@
       <w:tblPr>
         <w:tblW w:type="auto" w:w="0"/>
         <w:jc w:val="center"/>
-        <w:tblLayout w:type="autofit"/>
-        <w:tblLook w:firstColumn="1" w:firstRow="1" w:lastColumn="0" w:lastRow="0" w:noHBand="0" w:noVBand="1" w:val="04A0"/>
         <w:tblBorders>
           <w:top w:val="single" w:sz="4" w:space="0" w:color="9CA3AF"/>
           <w:left w:val="single" w:sz="4" w:space="0" w:color="9CA3AF"/>
@@ -2717,6 +3353,8 @@
           <w:insideH w:val="single" w:sz="4" w:space="0" w:color="9CA3AF"/>
           <w:insideV w:val="single" w:sz="4" w:space="0" w:color="9CA3AF"/>
         </w:tblBorders>
+        <w:tblLayout w:type="autofit"/>
+        <w:tblLook w:firstColumn="1" w:firstRow="1" w:lastColumn="0" w:lastRow="0" w:noHBand="0" w:noVBand="1" w:val="04A0"/>
       </w:tblPr>
       <w:tblGrid>
         <w:gridCol w:w="3289"/>
@@ -3001,8 +3639,6 @@
       <w:tblPr>
         <w:tblW w:type="auto" w:w="0"/>
         <w:jc w:val="center"/>
-        <w:tblLayout w:type="autofit"/>
-        <w:tblLook w:firstColumn="1" w:firstRow="1" w:lastColumn="0" w:lastRow="0" w:noHBand="0" w:noVBand="1" w:val="04A0"/>
         <w:tblBorders>
           <w:top w:val="single" w:sz="4" w:space="0" w:color="9CA3AF"/>
           <w:left w:val="single" w:sz="4" w:space="0" w:color="9CA3AF"/>
@@ -3011,6 +3647,8 @@
           <w:insideH w:val="single" w:sz="4" w:space="0" w:color="9CA3AF"/>
           <w:insideV w:val="single" w:sz="4" w:space="0" w:color="9CA3AF"/>
         </w:tblBorders>
+        <w:tblLayout w:type="autofit"/>
+        <w:tblLook w:firstColumn="1" w:firstRow="1" w:lastColumn="0" w:lastRow="0" w:noHBand="0" w:noVBand="1" w:val="04A0"/>
       </w:tblPr>
       <w:tblGrid>
         <w:gridCol w:w="3289"/>
@@ -3418,8 +4056,8 @@
         <w:rPr>
           <w:rFonts w:ascii="Inter" w:hAnsi="Inter"/>
           <w:color w:val="C9A961"/>
+          <w:spacing w:val="60"/>
           <w:sz w:val="19"/>
-          <w:spacing w:val="60"/>
         </w:rPr>
         <w:t>L'ESSENTIEL</w:t>
       </w:r>
@@ -3797,8 +4435,8 @@
         <w:rPr>
           <w:rFonts w:ascii="Inter" w:hAnsi="Inter"/>
           <w:color w:val="9CA3AF"/>
+          <w:spacing w:val="36"/>
           <w:sz w:val="17"/>
-          <w:spacing w:val="36"/>
         </w:rPr>
         <w:t>MAJOR ECN  ·  2025-2026</w:t>
       </w:r>
@@ -3828,8 +4466,8 @@
       <w:rPr>
         <w:rFonts w:ascii="Inter" w:hAnsi="Inter"/>
         <w:color w:val="9CA3AF"/>
+        <w:spacing w:val="24"/>
         <w:sz w:val="16"/>
-        <w:spacing w:val="24"/>
       </w:rPr>
       <w:t>MAJOR ECN  ·  2025-2026</w:t>
     </w:r>
@@ -3842,12 +4480,12 @@
   <w:p>
     <w:pPr>
       <w:pStyle w:val="Header"/>
+      <w:pBdr>
+        <w:bottom w:val="single" w:sz="6" w:space="4" w:color="E11D48"/>
+      </w:pBdr>
       <w:tabs>
         <w:tab w:pos="9865" w:val="right"/>
       </w:tabs>
-      <w:pBdr>
-        <w:bottom w:val="single" w:sz="6" w:space="4" w:color="E11D48"/>
-      </w:pBdr>
     </w:pPr>
     <w:r/>
     <w:r>

</xml_diff>

<commit_message>
Enrichit les fiches : en-tête signalétique, catégories, algorithmes, fiche éclair
Axe 3 (contenu) : ajoute une fiche signalétique (objectifs, prérequis,
mots-clés, items liés, vignette clinique, durée de lecture), un tableau
de chiffres-clés, des algorithmes décisionnels, des lignes-réflexe
intégrées aux tableaux (à retenir / piège / mnémo) et une fiche éclair
de révision express.

Axe 4 (ergonomie) : catégorise chaque sous-partie avec un code couleur
sémantique, ajoute un en-tête de navigation indiquant la section
courante, des signets PDF et un sommaire cliquable.

Pipeline IA étendu à 4 étapes ; tout est activé par défaut.

https://claude.ai/code/session_019UxbrWiVNiHBdkHsxX6ghC
</commit_message>
<xml_diff>
--- a/examples/Cardiologie_Hypertension-Arterielle_2025-2026.docx
+++ b/examples/Cardiologie_Hypertension-Arterielle_2025-2026.docx
@@ -311,7 +311,476 @@
           <w:rFonts w:ascii="Playfair Display" w:hAnsi="Playfair Display"/>
           <w:b/>
           <w:color w:val="1F2937"/>
-          <w:sz w:val="48"/>
+          <w:sz w:val="46"/>
+        </w:rPr>
+        <w:t>Fiche signalétique</w:t>
+      </w:r>
+    </w:p>
+    <w:tbl>
+      <w:tblPr>
+        <w:tblW w:type="auto" w:w="0"/>
+        <w:jc w:val="center"/>
+        <w:tblBorders>
+          <w:top w:val="single" w:sz="4" w:space="0" w:color="9CA3AF"/>
+          <w:left w:val="single" w:sz="4" w:space="0" w:color="9CA3AF"/>
+          <w:bottom w:val="single" w:sz="4" w:space="0" w:color="9CA3AF"/>
+          <w:right w:val="single" w:sz="4" w:space="0" w:color="9CA3AF"/>
+          <w:insideH w:val="single" w:sz="4" w:space="0" w:color="9CA3AF"/>
+          <w:insideV w:val="single" w:sz="4" w:space="0" w:color="9CA3AF"/>
+        </w:tblBorders>
+        <w:tblLook w:firstColumn="1" w:firstRow="1" w:lastColumn="0" w:lastRow="0" w:noHBand="0" w:noVBand="1" w:val="04A0"/>
+      </w:tblPr>
+      <w:tblGrid>
+        <w:gridCol w:w="2466"/>
+        <w:gridCol w:w="2466"/>
+        <w:gridCol w:w="2466"/>
+        <w:gridCol w:w="2466"/>
+      </w:tblGrid>
+      <w:tr>
+        <w:tc>
+          <w:tcPr>
+            <w:tcW w:type="dxa" w:w="2466"/>
+            <w:shd w:val="clear" w:color="auto" w:fill="FAF7F2"/>
+          </w:tcPr>
+          <w:p>
+            <w:pPr>
+              <w:jc w:val="center"/>
+            </w:pPr>
+            <w:r>
+              <w:rPr>
+                <w:rFonts w:ascii="Inter" w:hAnsi="Inter"/>
+                <w:b/>
+                <w:color w:val="9CA3AF"/>
+                <w:sz w:val="15"/>
+              </w:rPr>
+              <w:t>ITEM ECN</w:t>
+            </w:r>
+          </w:p>
+        </w:tc>
+        <w:tc>
+          <w:tcPr>
+            <w:tcW w:type="dxa" w:w="2466"/>
+            <w:shd w:val="clear" w:color="auto" w:fill="FAF7F2"/>
+          </w:tcPr>
+          <w:p>
+            <w:pPr>
+              <w:jc w:val="center"/>
+            </w:pPr>
+            <w:r>
+              <w:rPr>
+                <w:rFonts w:ascii="Inter" w:hAnsi="Inter"/>
+                <w:b/>
+                <w:color w:val="9CA3AF"/>
+                <w:sz w:val="15"/>
+              </w:rPr>
+              <w:t>MATIÈRE</w:t>
+            </w:r>
+          </w:p>
+        </w:tc>
+        <w:tc>
+          <w:tcPr>
+            <w:tcW w:type="dxa" w:w="2466"/>
+            <w:shd w:val="clear" w:color="auto" w:fill="FAF7F2"/>
+          </w:tcPr>
+          <w:p>
+            <w:pPr>
+              <w:jc w:val="center"/>
+            </w:pPr>
+            <w:r>
+              <w:rPr>
+                <w:rFonts w:ascii="Inter" w:hAnsi="Inter"/>
+                <w:b/>
+                <w:color w:val="9CA3AF"/>
+                <w:sz w:val="15"/>
+              </w:rPr>
+              <w:t>LECTURE ESTIMÉE</w:t>
+            </w:r>
+          </w:p>
+        </w:tc>
+        <w:tc>
+          <w:tcPr>
+            <w:tcW w:type="dxa" w:w="2466"/>
+            <w:shd w:val="clear" w:color="auto" w:fill="FAF7F2"/>
+          </w:tcPr>
+          <w:p>
+            <w:pPr>
+              <w:jc w:val="center"/>
+            </w:pPr>
+            <w:r>
+              <w:rPr>
+                <w:rFonts w:ascii="Inter" w:hAnsi="Inter"/>
+                <w:b/>
+                <w:color w:val="9CA3AF"/>
+                <w:sz w:val="15"/>
+              </w:rPr>
+              <w:t>ANNÉE</w:t>
+            </w:r>
+          </w:p>
+        </w:tc>
+      </w:tr>
+      <w:tr>
+        <w:tc>
+          <w:tcPr>
+            <w:tcW w:type="dxa" w:w="2466"/>
+            <w:shd w:val="clear" w:color="auto" w:fill="FAF7F2"/>
+          </w:tcPr>
+          <w:p>
+            <w:pPr>
+              <w:jc w:val="center"/>
+            </w:pPr>
+            <w:r>
+              <w:rPr>
+                <w:rFonts w:ascii="Cormorant Garamond" w:hAnsi="Cormorant Garamond"/>
+                <w:b/>
+                <w:color w:val="E11D48"/>
+                <w:sz w:val="24"/>
+              </w:rPr>
+              <w:t>Item 224</w:t>
+            </w:r>
+          </w:p>
+        </w:tc>
+        <w:tc>
+          <w:tcPr>
+            <w:tcW w:type="dxa" w:w="2466"/>
+            <w:shd w:val="clear" w:color="auto" w:fill="FAF7F2"/>
+          </w:tcPr>
+          <w:p>
+            <w:pPr>
+              <w:jc w:val="center"/>
+            </w:pPr>
+            <w:r>
+              <w:rPr>
+                <w:rFonts w:ascii="Cormorant Garamond" w:hAnsi="Cormorant Garamond"/>
+                <w:b/>
+                <w:color w:val="E11D48"/>
+                <w:sz w:val="24"/>
+              </w:rPr>
+              <w:t>Cardiologie</w:t>
+            </w:r>
+          </w:p>
+        </w:tc>
+        <w:tc>
+          <w:tcPr>
+            <w:tcW w:type="dxa" w:w="2466"/>
+            <w:shd w:val="clear" w:color="auto" w:fill="FAF7F2"/>
+          </w:tcPr>
+          <w:p>
+            <w:pPr>
+              <w:jc w:val="center"/>
+            </w:pPr>
+            <w:r>
+              <w:rPr>
+                <w:rFonts w:ascii="Cormorant Garamond" w:hAnsi="Cormorant Garamond"/>
+                <w:b/>
+                <w:color w:val="E11D48"/>
+                <w:sz w:val="24"/>
+              </w:rPr>
+              <w:t>≈ 12 min</w:t>
+            </w:r>
+          </w:p>
+        </w:tc>
+        <w:tc>
+          <w:tcPr>
+            <w:tcW w:type="dxa" w:w="2466"/>
+            <w:shd w:val="clear" w:color="auto" w:fill="FAF7F2"/>
+          </w:tcPr>
+          <w:p>
+            <w:pPr>
+              <w:jc w:val="center"/>
+            </w:pPr>
+            <w:r>
+              <w:rPr>
+                <w:rFonts w:ascii="Cormorant Garamond" w:hAnsi="Cormorant Garamond"/>
+                <w:b/>
+                <w:color w:val="E11D48"/>
+                <w:sz w:val="24"/>
+              </w:rPr>
+              <w:t>2025-2026</w:t>
+            </w:r>
+          </w:p>
+        </w:tc>
+      </w:tr>
+    </w:tbl>
+    <w:tbl>
+      <w:tblPr>
+        <w:tblW w:type="auto" w:w="0"/>
+        <w:jc w:val="center"/>
+        <w:tblLayout w:type="fixed"/>
+        <w:tblLook w:firstColumn="1" w:firstRow="1" w:lastColumn="0" w:lastRow="0" w:noHBand="0" w:noVBand="1" w:val="04A0"/>
+      </w:tblPr>
+      <w:tblGrid>
+        <w:gridCol w:w="9866"/>
+      </w:tblGrid>
+      <w:tr>
+        <w:tc>
+          <w:tcPr>
+            <w:tcW w:type="dxa" w:w="9865"/>
+            <w:tcBorders>
+              <w:top w:val="single" w:sz="4" w:space="0" w:color="C9A961"/>
+              <w:left w:val="single" w:sz="22" w:space="0" w:color="C9A961"/>
+              <w:bottom w:val="single" w:sz="4" w:space="0" w:color="C9A961"/>
+              <w:right w:val="single" w:sz="4" w:space="0" w:color="C9A961"/>
+            </w:tcBorders>
+            <w:shd w:val="clear" w:color="auto" w:fill="FFFBF4"/>
+          </w:tcPr>
+          <w:p>
+            <w:pPr>
+              <w:spacing w:before="80"/>
+            </w:pPr>
+            <w:r>
+              <w:rPr>
+                <w:rFonts w:ascii="Inter" w:hAnsi="Inter"/>
+                <w:b/>
+                <w:color w:val="9A7B33"/>
+                <w:spacing w:val="28"/>
+                <w:sz w:val="16"/>
+              </w:rPr>
+              <w:t>VIGNETTE CLINIQUE</w:t>
+            </w:r>
+          </w:p>
+          <w:p>
+            <w:pPr>
+              <w:spacing w:after="80"/>
+            </w:pPr>
+            <w:r>
+              <w:rPr>
+                <w:rFonts w:ascii="Cormorant Garamond" w:hAnsi="Cormorant Garamond"/>
+                <w:i/>
+                <w:color w:val="1F2937"/>
+                <w:sz w:val="23"/>
+              </w:rPr>
+              <w:t>Un homme de 58 ans, sans antécédent, consulte pour un bilan systématique. La pression artérielle mesurée est de 158/96 mmHg, confirmée à deux reprises. Il est asymptomatique. Comment confirmer le diagnostic, évaluer le retentissement et instaurer la prise en charge ?</w:t>
+            </w:r>
+          </w:p>
+        </w:tc>
+      </w:tr>
+    </w:tbl>
+    <w:p>
+      <w:pPr>
+        <w:pBdr>
+          <w:bottom w:val="single" w:sz="4" w:space="4" w:color="C9A961"/>
+        </w:pBdr>
+        <w:spacing w:before="180" w:after="40"/>
+      </w:pPr>
+      <w:r>
+        <w:rPr>
+          <w:rFonts w:ascii="Cormorant Garamond" w:hAnsi="Cormorant Garamond"/>
+          <w:b/>
+          <w:color w:val="E11D48"/>
+          <w:sz w:val="26"/>
+        </w:rPr>
+        <w:t>Objectifs d'apprentissage</w:t>
+      </w:r>
+    </w:p>
+    <w:p>
+      <w:pPr>
+        <w:pStyle w:val="ListBullet"/>
+        <w:spacing w:after="40"/>
+      </w:pPr>
+      <w:r>
+        <w:rPr>
+          <w:rFonts w:ascii="Inter" w:hAnsi="Inter"/>
+          <w:b w:val="0"/>
+          <w:i w:val="0"/>
+          <w:color w:val="1F2937"/>
+          <w:sz w:val="21"/>
+        </w:rPr>
+        <w:t>Définir l'HTA et connaître ses seuils diagnostiques</w:t>
+      </w:r>
+    </w:p>
+    <w:p>
+      <w:pPr>
+        <w:pStyle w:val="ListBullet"/>
+        <w:spacing w:after="40"/>
+      </w:pPr>
+      <w:r>
+        <w:rPr>
+          <w:rFonts w:ascii="Inter" w:hAnsi="Inter"/>
+          <w:b w:val="0"/>
+          <w:i w:val="0"/>
+          <w:color w:val="1F2937"/>
+          <w:sz w:val="21"/>
+        </w:rPr>
+        <w:t>Conduire le bilan initial et rechercher le retentissement</w:t>
+      </w:r>
+    </w:p>
+    <w:p>
+      <w:pPr>
+        <w:pStyle w:val="ListBullet"/>
+        <w:spacing w:after="40"/>
+      </w:pPr>
+      <w:r>
+        <w:rPr>
+          <w:rFonts w:ascii="Inter" w:hAnsi="Inter"/>
+          <w:b w:val="0"/>
+          <w:i w:val="0"/>
+          <w:color w:val="1F2937"/>
+          <w:sz w:val="21"/>
+        </w:rPr>
+        <w:t>Hiérarchiser la prise en charge thérapeutique</w:t>
+      </w:r>
+    </w:p>
+    <w:p>
+      <w:pPr>
+        <w:pBdr>
+          <w:bottom w:val="single" w:sz="4" w:space="4" w:color="C9A961"/>
+        </w:pBdr>
+        <w:spacing w:before="180" w:after="40"/>
+      </w:pPr>
+      <w:r>
+        <w:rPr>
+          <w:rFonts w:ascii="Cormorant Garamond" w:hAnsi="Cormorant Garamond"/>
+          <w:b/>
+          <w:color w:val="E11D48"/>
+          <w:sz w:val="26"/>
+        </w:rPr>
+        <w:t>Prérequis</w:t>
+      </w:r>
+    </w:p>
+    <w:p>
+      <w:pPr>
+        <w:pStyle w:val="ListBullet"/>
+        <w:spacing w:after="40"/>
+      </w:pPr>
+      <w:r>
+        <w:rPr>
+          <w:rFonts w:ascii="Inter" w:hAnsi="Inter"/>
+          <w:b w:val="0"/>
+          <w:i w:val="0"/>
+          <w:color w:val="1F2937"/>
+          <w:sz w:val="21"/>
+        </w:rPr>
+        <w:t>Régulation de la pression artérielle</w:t>
+      </w:r>
+    </w:p>
+    <w:p>
+      <w:pPr>
+        <w:pStyle w:val="ListBullet"/>
+        <w:spacing w:after="40"/>
+      </w:pPr>
+      <w:r>
+        <w:rPr>
+          <w:rFonts w:ascii="Inter" w:hAnsi="Inter"/>
+          <w:b w:val="0"/>
+          <w:i w:val="0"/>
+          <w:color w:val="1F2937"/>
+          <w:sz w:val="21"/>
+        </w:rPr>
+        <w:t>Système rénine-angiotensine-aldostérone</w:t>
+      </w:r>
+    </w:p>
+    <w:p>
+      <w:pPr>
+        <w:pBdr>
+          <w:bottom w:val="single" w:sz="4" w:space="4" w:color="C9A961"/>
+        </w:pBdr>
+        <w:spacing w:before="180" w:after="40"/>
+      </w:pPr>
+      <w:r>
+        <w:rPr>
+          <w:rFonts w:ascii="Cormorant Garamond" w:hAnsi="Cormorant Garamond"/>
+          <w:b/>
+          <w:color w:val="E11D48"/>
+          <w:sz w:val="26"/>
+        </w:rPr>
+        <w:t>Items &amp; cours liés</w:t>
+      </w:r>
+    </w:p>
+    <w:p>
+      <w:pPr>
+        <w:pStyle w:val="ListBullet"/>
+        <w:spacing w:after="40"/>
+      </w:pPr>
+      <w:r>
+        <w:rPr>
+          <w:rFonts w:ascii="Inter" w:hAnsi="Inter"/>
+          <w:b w:val="0"/>
+          <w:i w:val="0"/>
+          <w:color w:val="1F2937"/>
+          <w:sz w:val="21"/>
+        </w:rPr>
+        <w:t>Item 222 — Facteurs de risque cardiovasculaire</w:t>
+      </w:r>
+    </w:p>
+    <w:p>
+      <w:pPr>
+        <w:pStyle w:val="ListBullet"/>
+        <w:spacing w:after="40"/>
+      </w:pPr>
+      <w:r>
+        <w:rPr>
+          <w:rFonts w:ascii="Inter" w:hAnsi="Inter"/>
+          <w:b w:val="0"/>
+          <w:i w:val="0"/>
+          <w:color w:val="1F2937"/>
+          <w:sz w:val="21"/>
+        </w:rPr>
+        <w:t>Item 232 — Insuffisance cardiaque</w:t>
+      </w:r>
+    </w:p>
+    <w:p>
+      <w:pPr>
+        <w:pStyle w:val="ListBullet"/>
+        <w:spacing w:after="40"/>
+      </w:pPr>
+      <w:r>
+        <w:rPr>
+          <w:rFonts w:ascii="Inter" w:hAnsi="Inter"/>
+          <w:b w:val="0"/>
+          <w:i w:val="0"/>
+          <w:color w:val="1F2937"/>
+          <w:sz w:val="21"/>
+        </w:rPr>
+        <w:t>Item 264 — Néphropathie vasculaire</w:t>
+      </w:r>
+    </w:p>
+    <w:p>
+      <w:pPr>
+        <w:pBdr>
+          <w:bottom w:val="single" w:sz="4" w:space="4" w:color="C9A961"/>
+        </w:pBdr>
+        <w:spacing w:before="180" w:after="40"/>
+      </w:pPr>
+      <w:r>
+        <w:rPr>
+          <w:rFonts w:ascii="Cormorant Garamond" w:hAnsi="Cormorant Garamond"/>
+          <w:b/>
+          <w:color w:val="E11D48"/>
+          <w:sz w:val="26"/>
+        </w:rPr>
+        <w:t>Mots-clés</w:t>
+      </w:r>
+    </w:p>
+    <w:p>
+      <w:r>
+        <w:rPr>
+          <w:rFonts w:ascii="Inter" w:hAnsi="Inter"/>
+          <w:color w:val="1F2937"/>
+          <w:sz w:val="20"/>
+        </w:rPr>
+        <w:t>HTA   ·   PAS / PAD   ·   MAPA   ·   Automesure   ·   Organes cibles   ·   IEC   ·   ARA II   ·   Bithérapie   ·   HTA secondaire</w:t>
+      </w:r>
+    </w:p>
+    <w:p>
+      <w:r>
+        <w:br w:type="page"/>
+      </w:r>
+    </w:p>
+    <w:p>
+      <w:pPr>
+        <w:pBdr>
+          <w:top w:val="single" w:sz="12" w:space="6" w:color="E11D48"/>
+          <w:bottom w:val="single" w:sz="12" w:space="6" w:color="E11D48"/>
+        </w:pBdr>
+        <w:spacing w:before="80"/>
+        <w:jc w:val="center"/>
+      </w:pPr>
+      <w:r>
+        <w:rPr>
+          <w:rFonts w:ascii="Playfair Display" w:hAnsi="Playfair Display"/>
+          <w:b/>
+          <w:color w:val="1F2937"/>
+          <w:sz w:val="46"/>
         </w:rPr>
         <w:t>Plan du cours</w:t>
       </w:r>
@@ -365,7 +834,7 @@
           <w:color w:val="9CA3AF"/>
           <w:sz w:val="21"/>
         </w:rPr>
-        <w:t>Cadre nosologique de l'HTA et poids de santé publique.</w:t>
+        <w:t>Cadre nosologique et poids de santé publique.</w:t>
       </w:r>
     </w:p>
     <w:p>
@@ -394,7 +863,7 @@
           <w:color w:val="9CA3AF"/>
           <w:sz w:val="20"/>
         </w:rPr>
-        <w:t xml:space="preserve"> — Seuils tensionnels et grades.</w:t>
+        <w:t xml:space="preserve"> — Seuils et grades.</w:t>
       </w:r>
     </w:p>
     <w:p>
@@ -423,7 +892,7 @@
           <w:color w:val="9CA3AF"/>
           <w:sz w:val="20"/>
         </w:rPr>
-        <w:t xml:space="preserve"> — Prévalence et facteurs de risque.</w:t>
+        <w:t xml:space="preserve"> — Prévalence et FdR.</w:t>
       </w:r>
     </w:p>
     <w:p>
@@ -460,7 +929,7 @@
           <w:color w:val="9CA3AF"/>
           <w:sz w:val="21"/>
         </w:rPr>
-        <w:t>Confirmation diagnostique et recherche du retentissement.</w:t>
+        <w:t>Confirmation et recherche du retentissement.</w:t>
       </w:r>
     </w:p>
     <w:p>
@@ -480,7 +949,7 @@
           <w:b/>
           <w:sz w:val="21"/>
         </w:rPr>
-        <w:t>Mesure de la pression artérielle</w:t>
+        <w:t>Mesure de la PA</w:t>
       </w:r>
       <w:r>
         <w:rPr>
@@ -489,7 +958,7 @@
           <w:color w:val="9CA3AF"/>
           <w:sz w:val="20"/>
         </w:rPr>
-        <w:t xml:space="preserve"> — Conditions de mesure et MAPA.</w:t>
+        <w:t xml:space="preserve"> — Conditions et MAPA.</w:t>
       </w:r>
     </w:p>
     <w:p>
@@ -518,7 +987,7 @@
           <w:color w:val="9CA3AF"/>
           <w:sz w:val="20"/>
         </w:rPr>
-        <w:t xml:space="preserve"> — Atteinte des organes cibles.</w:t>
+        <w:t xml:space="preserve"> — Organes cibles.</w:t>
       </w:r>
     </w:p>
     <w:p>
@@ -555,7 +1024,7 @@
           <w:color w:val="9CA3AF"/>
           <w:sz w:val="21"/>
         </w:rPr>
-        <w:t>Mesures hygiéno-diététiques et traitement médicamenteux.</w:t>
+        <w:t>Mesures hygiéno-diététiques et médicaments.</w:t>
       </w:r>
     </w:p>
     <w:p>
@@ -584,7 +1053,7 @@
           <w:color w:val="9CA3AF"/>
           <w:sz w:val="20"/>
         </w:rPr>
-        <w:t xml:space="preserve"> — Règles hygiéno-diététiques.</w:t>
+        <w:t xml:space="preserve"> — RHD.</w:t>
       </w:r>
     </w:p>
     <w:p>
@@ -613,7 +1082,7 @@
           <w:color w:val="9CA3AF"/>
           <w:sz w:val="20"/>
         </w:rPr>
-        <w:t xml:space="preserve"> — Classes et stratégie d'association.</w:t>
+        <w:t xml:space="preserve"> — Classes.</w:t>
       </w:r>
     </w:p>
     <w:p>
@@ -701,6 +1170,21 @@
               <w:t>A.  Définitions et seuils</w:t>
             </w:r>
           </w:p>
+          <w:p>
+            <w:pPr>
+              <w:jc w:val="center"/>
+            </w:pPr>
+            <w:r>
+              <w:rPr>
+                <w:rFonts w:ascii="Inter" w:hAnsi="Inter"/>
+                <w:b/>
+                <w:color w:val="64748B"/>
+                <w:spacing w:val="18"/>
+                <w:sz w:val="14"/>
+              </w:rPr>
+              <w:t>GÉNÉRALITÉS</w:t>
+            </w:r>
+          </w:p>
         </w:tc>
       </w:tr>
       <w:tr>
@@ -754,7 +1238,7 @@
                 <w:color w:val="BE123C"/>
                 <w:sz w:val="20"/>
               </w:rPr>
-              <w:t>Hypertension artérielle (HTA)</w:t>
+              <w:t>HTA</w:t>
             </w:r>
             <w:r>
               <w:rPr>
@@ -764,7 +1248,7 @@
                 <w:color w:val="1F2937"/>
                 <w:sz w:val="20"/>
               </w:rPr>
-              <w:t xml:space="preserve"> : pression artérielle systolique (</w:t>
+              <w:t xml:space="preserve"> : </w:t>
             </w:r>
             <w:r>
               <w:rPr>
@@ -784,7 +1268,7 @@
                 <w:color w:val="1F2937"/>
                 <w:sz w:val="20"/>
               </w:rPr>
-              <w:t xml:space="preserve">) ≥ </w:t>
+              <w:t xml:space="preserve"> ≥ </w:t>
             </w:r>
             <w:r>
               <w:rPr>
@@ -804,7 +1288,7 @@
                 <w:color w:val="1F2937"/>
                 <w:sz w:val="20"/>
               </w:rPr>
-              <w:t xml:space="preserve"> et/ou diastolique (</w:t>
+              <w:t xml:space="preserve"> et/ou </w:t>
             </w:r>
             <w:r>
               <w:rPr>
@@ -824,7 +1308,7 @@
                 <w:color w:val="1F2937"/>
                 <w:sz w:val="20"/>
               </w:rPr>
-              <w:t xml:space="preserve">) ≥ </w:t>
+              <w:t xml:space="preserve"> ≥ </w:t>
             </w:r>
             <w:r>
               <w:rPr>
@@ -872,16 +1356,6 @@
               </w:rPr>
               <w:t>deux consultations</w:t>
             </w:r>
-            <w:r>
-              <w:rPr>
-                <w:rFonts w:ascii="Inter" w:hAnsi="Inter"/>
-                <w:b w:val="0"/>
-                <w:i w:val="0"/>
-                <w:color w:val="1F2937"/>
-                <w:sz w:val="20"/>
-              </w:rPr>
-              <w:t xml:space="preserve"> distinctes</w:t>
-            </w:r>
           </w:p>
           <w:p>
             <w:pPr>
@@ -896,7 +1370,7 @@
                 <w:color w:val="1F2937"/>
                 <w:sz w:val="20"/>
               </w:rPr>
-              <w:t xml:space="preserve">en automesure, seuil abaissé à </w:t>
+              <w:t xml:space="preserve">automesure : seuil abaissé à </w:t>
             </w:r>
             <w:r>
               <w:rPr>
@@ -965,14 +1439,14 @@
               <w:tblLook w:firstColumn="1" w:firstRow="1" w:lastColumn="0" w:lastRow="0" w:noHBand="0" w:noVBand="1" w:val="04A0"/>
             </w:tblPr>
             <w:tblGrid>
-              <w:gridCol w:w="1644"/>
-              <w:gridCol w:w="1644"/>
-              <w:gridCol w:w="1644"/>
+              <w:gridCol w:w="2400"/>
+              <w:gridCol w:w="2400"/>
+              <w:gridCol w:w="2400"/>
             </w:tblGrid>
             <w:tr>
               <w:tc>
                 <w:tcPr>
-                  <w:tcW w:type="dxa" w:w="1644"/>
+                  <w:tcW w:type="dxa" w:w="2400"/>
                   <w:shd w:val="clear" w:color="auto" w:fill="FAF7F2"/>
                 </w:tcPr>
                 <w:p>
@@ -993,7 +1467,7 @@
               </w:tc>
               <w:tc>
                 <w:tcPr>
-                  <w:tcW w:type="dxa" w:w="1644"/>
+                  <w:tcW w:type="dxa" w:w="2400"/>
                   <w:shd w:val="clear" w:color="auto" w:fill="FAF7F2"/>
                 </w:tcPr>
                 <w:p>
@@ -1014,7 +1488,7 @@
               </w:tc>
               <w:tc>
                 <w:tcPr>
-                  <w:tcW w:type="dxa" w:w="1644"/>
+                  <w:tcW w:type="dxa" w:w="2400"/>
                   <w:shd w:val="clear" w:color="auto" w:fill="FAF7F2"/>
                 </w:tcPr>
                 <w:p>
@@ -1037,7 +1511,7 @@
             <w:tr>
               <w:tc>
                 <w:tcPr>
-                  <w:tcW w:type="dxa" w:w="1644"/>
+                  <w:tcW w:type="dxa" w:w="2400"/>
                 </w:tcPr>
                 <w:p>
                   <w:pPr>
@@ -1057,7 +1531,7 @@
               </w:tc>
               <w:tc>
                 <w:tcPr>
-                  <w:tcW w:type="dxa" w:w="1644"/>
+                  <w:tcW w:type="dxa" w:w="2400"/>
                 </w:tcPr>
                 <w:p>
                   <w:pPr>
@@ -1077,7 +1551,7 @@
               </w:tc>
               <w:tc>
                 <w:tcPr>
-                  <w:tcW w:type="dxa" w:w="1644"/>
+                  <w:tcW w:type="dxa" w:w="2400"/>
                 </w:tcPr>
                 <w:p>
                   <w:pPr>
@@ -1099,7 +1573,7 @@
             <w:tr>
               <w:tc>
                 <w:tcPr>
-                  <w:tcW w:type="dxa" w:w="1644"/>
+                  <w:tcW w:type="dxa" w:w="2400"/>
                   <w:shd w:val="clear" w:color="auto" w:fill="FCFBF7"/>
                 </w:tcPr>
                 <w:p>
@@ -1120,7 +1594,7 @@
               </w:tc>
               <w:tc>
                 <w:tcPr>
-                  <w:tcW w:type="dxa" w:w="1644"/>
+                  <w:tcW w:type="dxa" w:w="2400"/>
                   <w:shd w:val="clear" w:color="auto" w:fill="FCFBF7"/>
                 </w:tcPr>
                 <w:p>
@@ -1141,7 +1615,7 @@
               </w:tc>
               <w:tc>
                 <w:tcPr>
-                  <w:tcW w:type="dxa" w:w="1644"/>
+                  <w:tcW w:type="dxa" w:w="2400"/>
                   <w:shd w:val="clear" w:color="auto" w:fill="FCFBF7"/>
                 </w:tcPr>
                 <w:p>
@@ -1164,7 +1638,7 @@
             <w:tr>
               <w:tc>
                 <w:tcPr>
-                  <w:tcW w:type="dxa" w:w="1644"/>
+                  <w:tcW w:type="dxa" w:w="2400"/>
                 </w:tcPr>
                 <w:p>
                   <w:pPr>
@@ -1184,7 +1658,7 @@
               </w:tc>
               <w:tc>
                 <w:tcPr>
-                  <w:tcW w:type="dxa" w:w="1644"/>
+                  <w:tcW w:type="dxa" w:w="2400"/>
                 </w:tcPr>
                 <w:p>
                   <w:pPr>
@@ -1204,7 +1678,7 @@
               </w:tc>
               <w:tc>
                 <w:tcPr>
-                  <w:tcW w:type="dxa" w:w="1644"/>
+                  <w:tcW w:type="dxa" w:w="2400"/>
                 </w:tcPr>
                 <w:p>
                   <w:pPr>
@@ -1235,46 +1709,33 @@
       <w:tr>
         <w:tc>
           <w:tcPr>
-            <w:tcW w:type="dxa" w:w="2663"/>
-            <w:shd w:val="clear" w:color="auto" w:fill="FAF7F2"/>
-            <w:vAlign w:val="center"/>
+            <w:tcW w:type="dxa" w:w="9865"/>
+            <w:gridSpan w:val="2"/>
+            <w:tcBorders>
+              <w:top w:val="single" w:sz="4" w:space="0" w:color="B91C1C"/>
+              <w:left w:val="single" w:sz="22" w:space="0" w:color="B91C1C"/>
+              <w:bottom w:val="single" w:sz="4" w:space="0" w:color="B91C1C"/>
+              <w:right w:val="single" w:sz="4" w:space="0" w:color="B91C1C"/>
+            </w:tcBorders>
+            <w:shd w:val="clear" w:color="auto" w:fill="FDEDEC"/>
+            <w:vAlign w:val="top"/>
           </w:tcPr>
           <w:p>
             <w:pPr>
-              <w:jc w:val="center"/>
+              <w:spacing w:before="40"/>
             </w:pPr>
             <w:r>
               <w:rPr>
                 <w:rFonts w:ascii="Inter" w:hAnsi="Inter"/>
                 <w:b/>
-                <w:i w:val="0"/>
                 <w:color w:val="B91C1C"/>
-                <w:sz w:val="20"/>
+                <w:spacing w:val="14"/>
+                <w:sz w:val="16"/>
               </w:rPr>
-              <w:t>⚠</w:t>
-            </w:r>
-            <w:r>
-              <w:rPr>
-                <w:rFonts w:ascii="Inter" w:hAnsi="Inter"/>
-                <w:b/>
-                <w:i w:val="0"/>
-                <w:color w:val="1F2937"/>
-                <w:sz w:val="20"/>
-              </w:rPr>
-              <w:t xml:space="preserve"> HTA blouse blanche</w:t>
+              <w:t>PIÈGE</w:t>
             </w:r>
           </w:p>
-        </w:tc>
-        <w:tc>
-          <w:tcPr>
-            <w:tcW w:type="dxa" w:w="7201"/>
-            <w:vAlign w:val="top"/>
-          </w:tcPr>
           <w:p>
-            <w:pPr>
-              <w:pStyle w:val="ListBullet"/>
-              <w:spacing w:after="40"/>
-            </w:pPr>
             <w:r>
               <w:rPr>
                 <w:rFonts w:ascii="Inter" w:hAnsi="Inter"/>
@@ -1283,7 +1744,7 @@
                 <w:color w:val="1F2937"/>
                 <w:sz w:val="20"/>
               </w:rPr>
-              <w:t xml:space="preserve">élévation tensionnelle </w:t>
+              <w:t>Ne pas confondre l'</w:t>
             </w:r>
             <w:r>
               <w:rPr>
@@ -1293,33 +1754,7 @@
                 <w:color w:val="BE123C"/>
                 <w:sz w:val="20"/>
               </w:rPr>
-              <w:t>au cabinet uniquement</w:t>
-            </w:r>
-          </w:p>
-          <w:p>
-            <w:pPr>
-              <w:pStyle w:val="ListBullet"/>
-              <w:spacing w:after="40"/>
-            </w:pPr>
-            <w:r>
-              <w:rPr>
-                <w:rFonts w:ascii="Inter" w:hAnsi="Inter"/>
-                <w:b w:val="0"/>
-                <w:i w:val="0"/>
-                <w:color w:val="1F2937"/>
-                <w:sz w:val="20"/>
-              </w:rPr>
-              <w:t xml:space="preserve">à confirmer par </w:t>
-            </w:r>
-            <w:r>
-              <w:rPr>
-                <w:rFonts w:ascii="Inter" w:hAnsi="Inter"/>
-                <w:b/>
-                <w:i w:val="0"/>
-                <w:color w:val="BE123C"/>
-                <w:sz w:val="20"/>
-              </w:rPr>
-              <w:t>MAPA</w:t>
+              <w:t>HTA blouse blanche</w:t>
             </w:r>
             <w:r>
               <w:rPr>
@@ -1329,43 +1764,7 @@
                 <w:color w:val="1F2937"/>
                 <w:sz w:val="20"/>
               </w:rPr>
-              <w:t xml:space="preserve"> ou </w:t>
-            </w:r>
-            <w:r>
-              <w:rPr>
-                <w:rFonts w:ascii="Inter" w:hAnsi="Inter"/>
-                <w:b/>
-                <w:i w:val="0"/>
-                <w:color w:val="BE123C"/>
-                <w:sz w:val="20"/>
-              </w:rPr>
-              <w:t>automesure</w:t>
-            </w:r>
-          </w:p>
-          <w:p>
-            <w:pPr>
-              <w:pStyle w:val="ListBullet"/>
-              <w:spacing w:after="40"/>
-            </w:pPr>
-            <w:r>
-              <w:rPr>
-                <w:rFonts w:ascii="Inter" w:hAnsi="Inter"/>
-                <w:b/>
-                <w:i w:val="0"/>
-                <w:color w:val="B91C1C"/>
-                <w:sz w:val="20"/>
-              </w:rPr>
-              <w:t>⚠</w:t>
-            </w:r>
-            <w:r>
-              <w:rPr>
-                <w:rFonts w:ascii="Inter" w:hAnsi="Inter"/>
-                <w:b w:val="0"/>
-                <w:i w:val="0"/>
-                <w:color w:val="1F2937"/>
-                <w:sz w:val="20"/>
-              </w:rPr>
-              <w:t xml:space="preserve"> à ne pas confondre avec l'</w:t>
+              <w:t xml:space="preserve"> (PA élevée au cabinet uniquement) et l'</w:t>
             </w:r>
             <w:r>
               <w:rPr>
@@ -1385,7 +1784,7 @@
                 <w:color w:val="1F2937"/>
                 <w:sz w:val="20"/>
               </w:rPr>
-              <w:t xml:space="preserve"> (normale au cabinet, élevée en ambulatoire)</w:t>
+              <w:t xml:space="preserve"> (PA normale au cabinet, élevée en ambulatoire) : le pronostic diffère.</w:t>
             </w:r>
           </w:p>
         </w:tc>
@@ -1459,6 +1858,21 @@
                 <w:sz w:val="26"/>
               </w:rPr>
               <w:t>B.  Épidémiologie</w:t>
+            </w:r>
+          </w:p>
+          <w:p>
+            <w:pPr>
+              <w:jc w:val="center"/>
+            </w:pPr>
+            <w:r>
+              <w:rPr>
+                <w:rFonts w:ascii="Inter" w:hAnsi="Inter"/>
+                <w:b/>
+                <w:color w:val="64748B"/>
+                <w:spacing w:val="18"/>
+                <w:sz w:val="14"/>
+              </w:rPr>
+              <w:t>GÉNÉRALITÉS</w:t>
             </w:r>
           </w:p>
         </w:tc>
@@ -1658,7 +2072,7 @@
                 <w:color w:val="1F2937"/>
                 <w:sz w:val="20"/>
               </w:rPr>
-              <w:t xml:space="preserve"> : surpoids, sédentarité, consommation de </w:t>
+              <w:t xml:space="preserve"> : surpoids, sédentarité, </w:t>
             </w:r>
             <w:r>
               <w:rPr>
@@ -1679,6 +2093,69 @@
                 <w:sz w:val="20"/>
               </w:rPr>
               <w:t>, alcool, tabac</w:t>
+            </w:r>
+          </w:p>
+        </w:tc>
+      </w:tr>
+      <w:tr>
+        <w:tc>
+          <w:tcPr>
+            <w:tcW w:type="dxa" w:w="9865"/>
+            <w:gridSpan w:val="2"/>
+            <w:tcBorders>
+              <w:top w:val="single" w:sz="4" w:space="0" w:color="E11D48"/>
+              <w:left w:val="single" w:sz="22" w:space="0" w:color="E11D48"/>
+              <w:bottom w:val="single" w:sz="4" w:space="0" w:color="E11D48"/>
+              <w:right w:val="single" w:sz="4" w:space="0" w:color="E11D48"/>
+            </w:tcBorders>
+            <w:shd w:val="clear" w:color="auto" w:fill="FAF7F2"/>
+            <w:vAlign w:val="top"/>
+          </w:tcPr>
+          <w:p>
+            <w:pPr>
+              <w:spacing w:before="40"/>
+            </w:pPr>
+            <w:r>
+              <w:rPr>
+                <w:rFonts w:ascii="Inter" w:hAnsi="Inter"/>
+                <w:b/>
+                <w:color w:val="E11D48"/>
+                <w:spacing w:val="14"/>
+                <w:sz w:val="16"/>
+              </w:rPr>
+              <w:t>À RETENIR</w:t>
+            </w:r>
+          </w:p>
+          <w:p>
+            <w:r>
+              <w:rPr>
+                <w:rFonts w:ascii="Inter" w:hAnsi="Inter"/>
+                <w:b w:val="0"/>
+                <w:i w:val="0"/>
+                <w:color w:val="1F2937"/>
+                <w:sz w:val="20"/>
+              </w:rPr>
+              <w:t xml:space="preserve">L'HTA est un </w:t>
+            </w:r>
+            <w:r>
+              <w:rPr>
+                <w:rFonts w:ascii="Inter" w:hAnsi="Inter"/>
+                <w:b/>
+                <w:i w:val="0"/>
+                <w:color w:val="BE123C"/>
+                <w:sz w:val="20"/>
+              </w:rPr>
+              <w:t>facteur de risque cardiovasculaire majeur</w:t>
+            </w:r>
+            <w:r>
+              <w:rPr>
+                <w:rFonts w:ascii="Inter" w:hAnsi="Inter"/>
+                <w:b w:val="0"/>
+                <w:i w:val="0"/>
+                <w:color w:val="1F2937"/>
+                <w:sz w:val="20"/>
+              </w:rPr>
+              <w:t xml:space="preserve"> : AVC, insuffisance cardiaque, coronaropathie, néphropathie.</w:t>
             </w:r>
           </w:p>
         </w:tc>
@@ -1772,6 +2249,21 @@
                 <w:sz w:val="26"/>
               </w:rPr>
               <w:t>A.  Mesure de la pression artérielle</w:t>
+            </w:r>
+          </w:p>
+          <w:p>
+            <w:pPr>
+              <w:jc w:val="center"/>
+            </w:pPr>
+            <w:r>
+              <w:rPr>
+                <w:rFonts w:ascii="Inter" w:hAnsi="Inter"/>
+                <w:b/>
+                <w:color w:val="1D4ED8"/>
+                <w:spacing w:val="18"/>
+                <w:sz w:val="14"/>
+              </w:rPr>
+              <w:t>DIAGNOSTIC &amp; EXAMENS</w:t>
             </w:r>
           </w:p>
         </w:tc>
@@ -2035,36 +2527,43 @@
       <w:tr>
         <w:tc>
           <w:tcPr>
-            <w:tcW w:type="dxa" w:w="2663"/>
-            <w:shd w:val="clear" w:color="auto" w:fill="FAF7F2"/>
-            <w:vAlign w:val="center"/>
+            <w:tcW w:type="dxa" w:w="9865"/>
+            <w:gridSpan w:val="2"/>
+            <w:tcBorders>
+              <w:top w:val="single" w:sz="4" w:space="0" w:color="9A7B33"/>
+              <w:left w:val="single" w:sz="22" w:space="0" w:color="9A7B33"/>
+              <w:bottom w:val="single" w:sz="4" w:space="0" w:color="9A7B33"/>
+              <w:right w:val="single" w:sz="4" w:space="0" w:color="9A7B33"/>
+            </w:tcBorders>
+            <w:shd w:val="clear" w:color="auto" w:fill="FBF6E8"/>
+            <w:vAlign w:val="top"/>
           </w:tcPr>
           <w:p>
             <w:pPr>
-              <w:jc w:val="center"/>
+              <w:spacing w:before="40"/>
             </w:pPr>
             <w:r>
               <w:rPr>
                 <w:rFonts w:ascii="Inter" w:hAnsi="Inter"/>
                 <w:b/>
+                <w:color w:val="9A7B33"/>
+                <w:spacing w:val="14"/>
+                <w:sz w:val="16"/>
+              </w:rPr>
+              <w:t>MOYEN MNÉMOTECHNIQUE</w:t>
+            </w:r>
+          </w:p>
+          <w:p>
+            <w:r>
+              <w:rPr>
+                <w:rFonts w:ascii="Inter" w:hAnsi="Inter"/>
+                <w:b w:val="0"/>
                 <w:i w:val="0"/>
                 <w:color w:val="1F2937"/>
                 <w:sz w:val="20"/>
               </w:rPr>
-              <w:t>Automesure</w:t>
+              <w:t xml:space="preserve">Automesure — </w:t>
             </w:r>
-          </w:p>
-        </w:tc>
-        <w:tc>
-          <w:tcPr>
-            <w:tcW w:type="dxa" w:w="7201"/>
-            <w:vAlign w:val="top"/>
-          </w:tcPr>
-          <w:p>
-            <w:pPr>
-              <w:pStyle w:val="ListBullet"/>
-              <w:spacing w:after="40"/>
-            </w:pPr>
             <w:r>
               <w:rPr>
                 <w:rFonts w:ascii="Inter" w:hAnsi="Inter"/>
@@ -2083,7 +2582,7 @@
                 <w:color w:val="1F2937"/>
                 <w:sz w:val="20"/>
               </w:rPr>
-              <w:t xml:space="preserve"> : 3 mesures matin et soir, 3 jours de suite</w:t>
+              <w:t xml:space="preserve"> : 3 mesures matin et soir, 3 jours de suite.</w:t>
             </w:r>
           </w:p>
         </w:tc>
@@ -2157,6 +2656,21 @@
                 <w:sz w:val="26"/>
               </w:rPr>
               <w:t>B.  Bilan de retentissement</w:t>
+            </w:r>
+          </w:p>
+          <w:p>
+            <w:pPr>
+              <w:jc w:val="center"/>
+            </w:pPr>
+            <w:r>
+              <w:rPr>
+                <w:rFonts w:ascii="Inter" w:hAnsi="Inter"/>
+                <w:b/>
+                <w:color w:val="B45309"/>
+                <w:spacing w:val="18"/>
+                <w:sz w:val="14"/>
+              </w:rPr>
+              <w:t>CLINIQUE</w:t>
             </w:r>
           </w:p>
         </w:tc>
@@ -2364,14 +2878,33 @@
       <w:tr>
         <w:tc>
           <w:tcPr>
-            <w:tcW w:type="dxa" w:w="2663"/>
-            <w:shd w:val="clear" w:color="auto" w:fill="FAF7F2"/>
-            <w:vAlign w:val="center"/>
+            <w:tcW w:type="dxa" w:w="9865"/>
+            <w:gridSpan w:val="2"/>
+            <w:tcBorders>
+              <w:top w:val="single" w:sz="4" w:space="0" w:color="B91C1C"/>
+              <w:left w:val="single" w:sz="22" w:space="0" w:color="B91C1C"/>
+              <w:bottom w:val="single" w:sz="4" w:space="0" w:color="B91C1C"/>
+              <w:right w:val="single" w:sz="4" w:space="0" w:color="B91C1C"/>
+            </w:tcBorders>
+            <w:shd w:val="clear" w:color="auto" w:fill="FDEDEC"/>
+            <w:vAlign w:val="top"/>
           </w:tcPr>
           <w:p>
             <w:pPr>
-              <w:jc w:val="center"/>
+              <w:spacing w:before="40"/>
             </w:pPr>
+            <w:r>
+              <w:rPr>
+                <w:rFonts w:ascii="Inter" w:hAnsi="Inter"/>
+                <w:b/>
+                <w:color w:val="B91C1C"/>
+                <w:spacing w:val="14"/>
+                <w:sz w:val="16"/>
+              </w:rPr>
+              <w:t>PIÈGE</w:t>
+            </w:r>
+          </w:p>
+          <w:p>
             <w:r>
               <w:rPr>
                 <w:rFonts w:ascii="Inter" w:hAnsi="Inter"/>
@@ -2385,34 +2918,12 @@
             <w:r>
               <w:rPr>
                 <w:rFonts w:ascii="Inter" w:hAnsi="Inter"/>
-                <w:b/>
-                <w:i w:val="0"/>
-                <w:color w:val="1F2937"/>
-                <w:sz w:val="20"/>
-              </w:rPr>
-              <w:t xml:space="preserve"> HTA secondaire</w:t>
-            </w:r>
-          </w:p>
-        </w:tc>
-        <w:tc>
-          <w:tcPr>
-            <w:tcW w:type="dxa" w:w="7201"/>
-            <w:vAlign w:val="top"/>
-          </w:tcPr>
-          <w:p>
-            <w:pPr>
-              <w:pStyle w:val="ListBullet"/>
-              <w:spacing w:after="40"/>
-            </w:pPr>
-            <w:r>
-              <w:rPr>
-                <w:rFonts w:ascii="Inter" w:hAnsi="Inter"/>
                 <w:b w:val="0"/>
                 <w:i w:val="0"/>
                 <w:color w:val="1F2937"/>
                 <w:sz w:val="20"/>
               </w:rPr>
-              <w:t xml:space="preserve">à rechercher si </w:t>
+              <w:t xml:space="preserve"> Rechercher une </w:t>
             </w:r>
             <w:r>
               <w:rPr>
@@ -2422,7 +2933,7 @@
                 <w:color w:val="BE123C"/>
                 <w:sz w:val="20"/>
               </w:rPr>
-              <w:t>HTA résistante</w:t>
+              <w:t>HTA secondaire</w:t>
             </w:r>
             <w:r>
               <w:rPr>
@@ -2432,7 +2943,7 @@
                 <w:color w:val="1F2937"/>
                 <w:sz w:val="20"/>
               </w:rPr>
-              <w:t>, sujet jeune ou signes d'orientation</w:t>
+              <w:t xml:space="preserve"> si HTA résistante, sujet jeune ou signes d'orientation.</w:t>
             </w:r>
           </w:p>
         </w:tc>
@@ -2526,6 +3037,21 @@
                 <w:sz w:val="26"/>
               </w:rPr>
               <w:t>A.  Mesures non médicamenteuses</w:t>
+            </w:r>
+          </w:p>
+          <w:p>
+            <w:pPr>
+              <w:jc w:val="center"/>
+            </w:pPr>
+            <w:r>
+              <w:rPr>
+                <w:rFonts w:ascii="Inter" w:hAnsi="Inter"/>
+                <w:b/>
+                <w:color w:val="15803D"/>
+                <w:spacing w:val="18"/>
+                <w:sz w:val="14"/>
+              </w:rPr>
+              <w:t>PRISE EN CHARGE</w:t>
             </w:r>
           </w:p>
         </w:tc>
@@ -2765,6 +3291,21 @@
               <w:t>B.  Traitement médicamenteux</w:t>
             </w:r>
           </w:p>
+          <w:p>
+            <w:pPr>
+              <w:jc w:val="center"/>
+            </w:pPr>
+            <w:r>
+              <w:rPr>
+                <w:rFonts w:ascii="Inter" w:hAnsi="Inter"/>
+                <w:b/>
+                <w:color w:val="15803D"/>
+                <w:spacing w:val="18"/>
+                <w:sz w:val="14"/>
+              </w:rPr>
+              <w:t>PRISE EN CHARGE</w:t>
+            </w:r>
+          </w:p>
         </w:tc>
       </w:tr>
       <w:tr>
@@ -2821,14 +3362,14 @@
               <w:tblLook w:firstColumn="1" w:firstRow="1" w:lastColumn="0" w:lastRow="0" w:noHBand="0" w:noVBand="1" w:val="04A0"/>
             </w:tblPr>
             <w:tblGrid>
-              <w:gridCol w:w="1644"/>
-              <w:gridCol w:w="1644"/>
-              <w:gridCol w:w="1644"/>
+              <w:gridCol w:w="2400"/>
+              <w:gridCol w:w="2400"/>
+              <w:gridCol w:w="2400"/>
             </w:tblGrid>
             <w:tr>
               <w:tc>
                 <w:tcPr>
-                  <w:tcW w:type="dxa" w:w="1644"/>
+                  <w:tcW w:type="dxa" w:w="2400"/>
                   <w:shd w:val="clear" w:color="auto" w:fill="FAF7F2"/>
                 </w:tcPr>
                 <w:p>
@@ -2849,7 +3390,7 @@
               </w:tc>
               <w:tc>
                 <w:tcPr>
-                  <w:tcW w:type="dxa" w:w="1644"/>
+                  <w:tcW w:type="dxa" w:w="2400"/>
                   <w:shd w:val="clear" w:color="auto" w:fill="FAF7F2"/>
                 </w:tcPr>
                 <w:p>
@@ -2870,7 +3411,7 @@
               </w:tc>
               <w:tc>
                 <w:tcPr>
-                  <w:tcW w:type="dxa" w:w="1644"/>
+                  <w:tcW w:type="dxa" w:w="2400"/>
                   <w:shd w:val="clear" w:color="auto" w:fill="FAF7F2"/>
                 </w:tcPr>
                 <w:p>
@@ -2885,7 +3426,7 @@
                       <w:color w:val="1F2937"/>
                       <w:sz w:val="18"/>
                     </w:rPr>
-                    <w:t>Indication préférentielle</w:t>
+                    <w:t>Indication</w:t>
                   </w:r>
                 </w:p>
               </w:tc>
@@ -2893,7 +3434,7 @@
             <w:tr>
               <w:tc>
                 <w:tcPr>
-                  <w:tcW w:type="dxa" w:w="1644"/>
+                  <w:tcW w:type="dxa" w:w="2400"/>
                 </w:tcPr>
                 <w:p>
                   <w:pPr>
@@ -2913,7 +3454,7 @@
               </w:tc>
               <w:tc>
                 <w:tcPr>
-                  <w:tcW w:type="dxa" w:w="1644"/>
+                  <w:tcW w:type="dxa" w:w="2400"/>
                 </w:tcPr>
                 <w:p>
                   <w:pPr>
@@ -2933,7 +3474,7 @@
               </w:tc>
               <w:tc>
                 <w:tcPr>
-                  <w:tcW w:type="dxa" w:w="1644"/>
+                  <w:tcW w:type="dxa" w:w="2400"/>
                 </w:tcPr>
                 <w:p>
                   <w:pPr>
@@ -2947,7 +3488,7 @@
                       <w:color w:val="1F2937"/>
                       <w:sz w:val="18"/>
                     </w:rPr>
-                    <w:t>Diabète, insuffisance cardiaque</w:t>
+                    <w:t>Diabète, IC</w:t>
                   </w:r>
                 </w:p>
               </w:tc>
@@ -2955,7 +3496,7 @@
             <w:tr>
               <w:tc>
                 <w:tcPr>
-                  <w:tcW w:type="dxa" w:w="1644"/>
+                  <w:tcW w:type="dxa" w:w="2400"/>
                   <w:shd w:val="clear" w:color="auto" w:fill="FCFBF7"/>
                 </w:tcPr>
                 <w:p>
@@ -2976,7 +3517,7 @@
               </w:tc>
               <w:tc>
                 <w:tcPr>
-                  <w:tcW w:type="dxa" w:w="1644"/>
+                  <w:tcW w:type="dxa" w:w="2400"/>
                   <w:shd w:val="clear" w:color="auto" w:fill="FCFBF7"/>
                 </w:tcPr>
                 <w:p>
@@ -2997,7 +3538,7 @@
               </w:tc>
               <w:tc>
                 <w:tcPr>
-                  <w:tcW w:type="dxa" w:w="1644"/>
+                  <w:tcW w:type="dxa" w:w="2400"/>
                   <w:shd w:val="clear" w:color="auto" w:fill="FCFBF7"/>
                 </w:tcPr>
                 <w:p>
@@ -3012,7 +3553,7 @@
                       <w:color w:val="1F2937"/>
                       <w:sz w:val="18"/>
                     </w:rPr>
-                    <w:t>Intolérance aux IEC (toux)</w:t>
+                    <w:t>Intolérance aux IEC</w:t>
                   </w:r>
                 </w:p>
               </w:tc>
@@ -3020,7 +3561,7 @@
             <w:tr>
               <w:tc>
                 <w:tcPr>
-                  <w:tcW w:type="dxa" w:w="1644"/>
+                  <w:tcW w:type="dxa" w:w="2400"/>
                 </w:tcPr>
                 <w:p>
                   <w:pPr>
@@ -3034,13 +3575,13 @@
                       <w:color w:val="BE123C"/>
                       <w:sz w:val="18"/>
                     </w:rPr>
-                    <w:t>Inhibiteur calcique</w:t>
+                    <w:t>I. calcique</w:t>
                   </w:r>
                 </w:p>
               </w:tc>
               <w:tc>
                 <w:tcPr>
-                  <w:tcW w:type="dxa" w:w="1644"/>
+                  <w:tcW w:type="dxa" w:w="2400"/>
                 </w:tcPr>
                 <w:p>
                   <w:pPr>
@@ -3060,7 +3601,7 @@
               </w:tc>
               <w:tc>
                 <w:tcPr>
-                  <w:tcW w:type="dxa" w:w="1644"/>
+                  <w:tcW w:type="dxa" w:w="2400"/>
                 </w:tcPr>
                 <w:p>
                   <w:pPr>
@@ -3082,7 +3623,7 @@
             <w:tr>
               <w:tc>
                 <w:tcPr>
-                  <w:tcW w:type="dxa" w:w="1644"/>
+                  <w:tcW w:type="dxa" w:w="2400"/>
                   <w:shd w:val="clear" w:color="auto" w:fill="FCFBF7"/>
                 </w:tcPr>
                 <w:p>
@@ -3097,13 +3638,13 @@
                       <w:color w:val="BE123C"/>
                       <w:sz w:val="18"/>
                     </w:rPr>
-                    <w:t>Diurétique thiazidique</w:t>
+                    <w:t>Diurétique</w:t>
                   </w:r>
                 </w:p>
               </w:tc>
               <w:tc>
                 <w:tcPr>
-                  <w:tcW w:type="dxa" w:w="1644"/>
+                  <w:tcW w:type="dxa" w:w="2400"/>
                   <w:shd w:val="clear" w:color="auto" w:fill="FCFBF7"/>
                 </w:tcPr>
                 <w:p>
@@ -3124,7 +3665,7 @@
               </w:tc>
               <w:tc>
                 <w:tcPr>
-                  <w:tcW w:type="dxa" w:w="1644"/>
+                  <w:tcW w:type="dxa" w:w="2400"/>
                   <w:shd w:val="clear" w:color="auto" w:fill="FCFBF7"/>
                 </w:tcPr>
                 <w:p>
@@ -3182,7 +3723,7 @@
                 <w:color w:val="1F2937"/>
                 <w:sz w:val="20"/>
               </w:rPr>
-              <w:t xml:space="preserve"> Stratégie thérapeutique</w:t>
+              <w:t xml:space="preserve"> Stratégie</w:t>
             </w:r>
           </w:p>
         </w:tc>
@@ -3288,6 +3829,39 @@
               </w:rPr>
               <w:t>&lt; 130/80 mmHg</w:t>
             </w:r>
+          </w:p>
+        </w:tc>
+      </w:tr>
+      <w:tr>
+        <w:tc>
+          <w:tcPr>
+            <w:tcW w:type="dxa" w:w="9865"/>
+            <w:gridSpan w:val="2"/>
+            <w:tcBorders>
+              <w:top w:val="single" w:sz="4" w:space="0" w:color="9A7B33"/>
+              <w:left w:val="single" w:sz="22" w:space="0" w:color="9A7B33"/>
+              <w:bottom w:val="single" w:sz="4" w:space="0" w:color="9A7B33"/>
+              <w:right w:val="single" w:sz="4" w:space="0" w:color="9A7B33"/>
+            </w:tcBorders>
+            <w:shd w:val="clear" w:color="auto" w:fill="FBF6E8"/>
+            <w:vAlign w:val="top"/>
+          </w:tcPr>
+          <w:p>
+            <w:pPr>
+              <w:spacing w:before="40"/>
+            </w:pPr>
+            <w:r>
+              <w:rPr>
+                <w:rFonts w:ascii="Inter" w:hAnsi="Inter"/>
+                <w:b/>
+                <w:color w:val="9A7B33"/>
+                <w:spacing w:val="14"/>
+                <w:sz w:val="16"/>
+              </w:rPr>
+              <w:t>MOYEN MNÉMOTECHNIQUE</w:t>
+            </w:r>
+          </w:p>
+          <w:p>
             <w:r>
               <w:rPr>
                 <w:rFonts w:ascii="Inter" w:hAnsi="Inter"/>
@@ -3296,7 +3870,341 @@
                 <w:color w:val="1F2937"/>
                 <w:sz w:val="20"/>
               </w:rPr>
-              <w:t xml:space="preserve"> si bien toléré</w:t>
+              <w:t xml:space="preserve">Les 5 classes — moyen mnémotechnique </w:t>
+            </w:r>
+            <w:r>
+              <w:rPr>
+                <w:rFonts w:ascii="Inter" w:hAnsi="Inter"/>
+                <w:b/>
+                <w:i w:val="0"/>
+                <w:color w:val="BE123C"/>
+                <w:sz w:val="20"/>
+              </w:rPr>
+              <w:t>« A-B-C-D »</w:t>
+            </w:r>
+            <w:r>
+              <w:rPr>
+                <w:rFonts w:ascii="Inter" w:hAnsi="Inter"/>
+                <w:b w:val="0"/>
+                <w:i w:val="0"/>
+                <w:color w:val="1F2937"/>
+                <w:sz w:val="20"/>
+              </w:rPr>
+              <w:t xml:space="preserve"> : </w:t>
+            </w:r>
+            <w:r>
+              <w:rPr>
+                <w:rFonts w:ascii="Inter" w:hAnsi="Inter"/>
+                <w:b/>
+                <w:i w:val="0"/>
+                <w:color w:val="BE123C"/>
+                <w:sz w:val="20"/>
+              </w:rPr>
+              <w:t>A</w:t>
+            </w:r>
+            <w:r>
+              <w:rPr>
+                <w:rFonts w:ascii="Inter" w:hAnsi="Inter"/>
+                <w:b w:val="0"/>
+                <w:i w:val="0"/>
+                <w:color w:val="1F2937"/>
+                <w:sz w:val="20"/>
+              </w:rPr>
+              <w:t xml:space="preserve">RA II / IEC, </w:t>
+            </w:r>
+            <w:r>
+              <w:rPr>
+                <w:rFonts w:ascii="Inter" w:hAnsi="Inter"/>
+                <w:b/>
+                <w:i w:val="0"/>
+                <w:color w:val="BE123C"/>
+                <w:sz w:val="20"/>
+              </w:rPr>
+              <w:t>B</w:t>
+            </w:r>
+            <w:r>
+              <w:rPr>
+                <w:rFonts w:ascii="Inter" w:hAnsi="Inter"/>
+                <w:b w:val="0"/>
+                <w:i w:val="0"/>
+                <w:color w:val="1F2937"/>
+                <w:sz w:val="20"/>
+              </w:rPr>
+              <w:t xml:space="preserve">êtabloquants, </w:t>
+            </w:r>
+            <w:r>
+              <w:rPr>
+                <w:rFonts w:ascii="Inter" w:hAnsi="Inter"/>
+                <w:b/>
+                <w:i w:val="0"/>
+                <w:color w:val="BE123C"/>
+                <w:sz w:val="20"/>
+              </w:rPr>
+              <w:t>C</w:t>
+            </w:r>
+            <w:r>
+              <w:rPr>
+                <w:rFonts w:ascii="Inter" w:hAnsi="Inter"/>
+                <w:b w:val="0"/>
+                <w:i w:val="0"/>
+                <w:color w:val="1F2937"/>
+                <w:sz w:val="20"/>
+              </w:rPr>
+              <w:t xml:space="preserve">alciques, </w:t>
+            </w:r>
+            <w:r>
+              <w:rPr>
+                <w:rFonts w:ascii="Inter" w:hAnsi="Inter"/>
+                <w:b/>
+                <w:i w:val="0"/>
+                <w:color w:val="BE123C"/>
+                <w:sz w:val="20"/>
+              </w:rPr>
+              <w:t>D</w:t>
+            </w:r>
+            <w:r>
+              <w:rPr>
+                <w:rFonts w:ascii="Inter" w:hAnsi="Inter"/>
+                <w:b w:val="0"/>
+                <w:i w:val="0"/>
+                <w:color w:val="1F2937"/>
+                <w:sz w:val="20"/>
+              </w:rPr>
+              <w:t>iurétiques.</w:t>
+            </w:r>
+          </w:p>
+        </w:tc>
+      </w:tr>
+    </w:tbl>
+    <w:p>
+      <w:pPr>
+        <w:spacing w:after="80"/>
+      </w:pPr>
+    </w:p>
+    <w:p>
+      <w:r>
+        <w:br w:type="page"/>
+      </w:r>
+    </w:p>
+    <w:p>
+      <w:pPr>
+        <w:shd w:val="clear" w:color="auto" w:fill="E11D48"/>
+        <w:spacing w:before="40" w:after="200"/>
+      </w:pPr>
+      <w:r>
+        <w:rPr>
+          <w:rFonts w:ascii="Playfair Display" w:hAnsi="Playfair Display"/>
+          <w:b/>
+          <w:color w:val="FFFFFF"/>
+          <w:sz w:val="32"/>
+        </w:rPr>
+        <w:t>Algorithmes décisionnels</w:t>
+      </w:r>
+    </w:p>
+    <w:p>
+      <w:pPr>
+        <w:spacing w:before="160"/>
+      </w:pPr>
+      <w:r>
+        <w:rPr>
+          <w:rFonts w:ascii="Cormorant Garamond" w:hAnsi="Cormorant Garamond"/>
+          <w:b/>
+          <w:color w:val="E11D48"/>
+          <w:sz w:val="26"/>
+        </w:rPr>
+        <w:t>Démarche diagnostique devant une PA élevée</w:t>
+      </w:r>
+    </w:p>
+    <w:tbl>
+      <w:tblPr>
+        <w:tblW w:type="auto" w:w="0"/>
+        <w:jc w:val="center"/>
+        <w:tblLayout w:type="fixed"/>
+        <w:tblLook w:firstColumn="1" w:firstRow="1" w:lastColumn="0" w:lastRow="0" w:noHBand="0" w:noVBand="1" w:val="04A0"/>
+      </w:tblPr>
+      <w:tblGrid>
+        <w:gridCol w:w="9866"/>
+      </w:tblGrid>
+      <w:tr>
+        <w:tc>
+          <w:tcPr>
+            <w:tcW w:type="dxa" w:w="9865"/>
+            <w:tcBorders>
+              <w:top w:val="single" w:sz="4" w:space="0" w:color="E11D48"/>
+              <w:left w:val="single" w:sz="22" w:space="0" w:color="E11D48"/>
+              <w:bottom w:val="single" w:sz="4" w:space="0" w:color="E11D48"/>
+              <w:right w:val="single" w:sz="4" w:space="0" w:color="E11D48"/>
+            </w:tcBorders>
+            <w:shd w:val="clear" w:color="auto" w:fill="FAF7F2"/>
+          </w:tcPr>
+          <w:p>
+            <w:pPr>
+              <w:pStyle w:val="ListBullet"/>
+              <w:spacing w:after="40"/>
+            </w:pPr>
+            <w:r>
+              <w:rPr>
+                <w:rFonts w:ascii="Inter" w:hAnsi="Inter"/>
+                <w:b w:val="0"/>
+                <w:i w:val="0"/>
+                <w:color w:val="1F2937"/>
+                <w:sz w:val="20"/>
+              </w:rPr>
+              <w:t>PA ≥ 140/90 mmHg au cabinet</w:t>
+            </w:r>
+          </w:p>
+          <w:p>
+            <w:pPr>
+              <w:pStyle w:val="ListBullet2"/>
+              <w:spacing w:after="40"/>
+            </w:pPr>
+            <w:r>
+              <w:rPr>
+                <w:rFonts w:ascii="Inter" w:hAnsi="Inter"/>
+                <w:b w:val="0"/>
+                <w:i w:val="0"/>
+                <w:color w:val="1F2937"/>
+                <w:sz w:val="20"/>
+              </w:rPr>
+              <w:t xml:space="preserve">OUI → confirmer par </w:t>
+            </w:r>
+            <w:r>
+              <w:rPr>
+                <w:rFonts w:ascii="Inter" w:hAnsi="Inter"/>
+                <w:b/>
+                <w:i w:val="0"/>
+                <w:color w:val="BE123C"/>
+                <w:sz w:val="20"/>
+              </w:rPr>
+              <w:t>MAPA</w:t>
+            </w:r>
+            <w:r>
+              <w:rPr>
+                <w:rFonts w:ascii="Inter" w:hAnsi="Inter"/>
+                <w:b w:val="0"/>
+                <w:i w:val="0"/>
+                <w:color w:val="1F2937"/>
+                <w:sz w:val="20"/>
+              </w:rPr>
+              <w:t xml:space="preserve"> ou </w:t>
+            </w:r>
+            <w:r>
+              <w:rPr>
+                <w:rFonts w:ascii="Inter" w:hAnsi="Inter"/>
+                <w:b/>
+                <w:i w:val="0"/>
+                <w:color w:val="BE123C"/>
+                <w:sz w:val="20"/>
+              </w:rPr>
+              <w:t>automesure</w:t>
+            </w:r>
+          </w:p>
+          <w:p>
+            <w:pPr>
+              <w:pStyle w:val="ListBullet3"/>
+              <w:spacing w:after="40"/>
+            </w:pPr>
+            <w:r>
+              <w:rPr>
+                <w:rFonts w:ascii="Inter" w:hAnsi="Inter"/>
+                <w:b w:val="0"/>
+                <w:i w:val="0"/>
+                <w:color w:val="1F2937"/>
+                <w:sz w:val="20"/>
+              </w:rPr>
+              <w:t xml:space="preserve">MAPA ≥ 135/85 → </w:t>
+            </w:r>
+            <w:r>
+              <w:rPr>
+                <w:rFonts w:ascii="Inter" w:hAnsi="Inter"/>
+                <w:b/>
+                <w:i w:val="0"/>
+                <w:color w:val="BE123C"/>
+                <w:sz w:val="20"/>
+              </w:rPr>
+              <w:t>HTA confirmée</w:t>
+            </w:r>
+            <w:r>
+              <w:rPr>
+                <w:rFonts w:ascii="Inter" w:hAnsi="Inter"/>
+                <w:b w:val="0"/>
+                <w:i w:val="0"/>
+                <w:color w:val="1F2937"/>
+                <w:sz w:val="20"/>
+              </w:rPr>
+              <w:t xml:space="preserve"> → bilan + traitement</w:t>
+            </w:r>
+          </w:p>
+          <w:p>
+            <w:pPr>
+              <w:pStyle w:val="ListBullet3"/>
+              <w:spacing w:after="40"/>
+            </w:pPr>
+            <w:r>
+              <w:rPr>
+                <w:rFonts w:ascii="Inter" w:hAnsi="Inter"/>
+                <w:b w:val="0"/>
+                <w:i w:val="0"/>
+                <w:color w:val="1F2937"/>
+                <w:sz w:val="20"/>
+              </w:rPr>
+              <w:t xml:space="preserve">MAPA &lt; 135/85 → </w:t>
+            </w:r>
+            <w:r>
+              <w:rPr>
+                <w:rFonts w:ascii="Inter" w:hAnsi="Inter"/>
+                <w:b/>
+                <w:i w:val="0"/>
+                <w:color w:val="BE123C"/>
+                <w:sz w:val="20"/>
+              </w:rPr>
+              <w:t>HTA blouse blanche</w:t>
+            </w:r>
+            <w:r>
+              <w:rPr>
+                <w:rFonts w:ascii="Inter" w:hAnsi="Inter"/>
+                <w:b w:val="0"/>
+                <w:i w:val="0"/>
+                <w:color w:val="1F2937"/>
+                <w:sz w:val="20"/>
+              </w:rPr>
+              <w:t xml:space="preserve"> → surveillance</w:t>
+            </w:r>
+          </w:p>
+          <w:p>
+            <w:pPr>
+              <w:pStyle w:val="ListBullet2"/>
+              <w:spacing w:after="40"/>
+            </w:pPr>
+            <w:r>
+              <w:rPr>
+                <w:rFonts w:ascii="Inter" w:hAnsi="Inter"/>
+                <w:b w:val="0"/>
+                <w:i w:val="0"/>
+                <w:color w:val="1F2937"/>
+                <w:sz w:val="20"/>
+              </w:rPr>
+              <w:t xml:space="preserve">NON → </w:t>
+            </w:r>
+            <w:r>
+              <w:rPr>
+                <w:rFonts w:ascii="Inter" w:hAnsi="Inter"/>
+                <w:b/>
+                <w:i w:val="0"/>
+                <w:color w:val="BE123C"/>
+                <w:sz w:val="20"/>
+              </w:rPr>
+              <w:t>pas d'HTA</w:t>
+            </w:r>
+            <w:r>
+              <w:rPr>
+                <w:rFonts w:ascii="Inter" w:hAnsi="Inter"/>
+                <w:b w:val="0"/>
+                <w:i w:val="0"/>
+                <w:color w:val="1F2937"/>
+                <w:sz w:val="20"/>
+              </w:rPr>
+              <w:t xml:space="preserve"> → contrôle annuel</w:t>
             </w:r>
           </w:p>
         </w:tc>
@@ -3326,6 +4234,427 @@
         </w:rPr>
         <w:t>Synthèse — Tableaux de révision</w:t>
       </w:r>
+    </w:p>
+    <w:p>
+      <w:pPr>
+        <w:spacing w:before="160"/>
+      </w:pPr>
+      <w:r>
+        <w:rPr>
+          <w:rFonts w:ascii="Cormorant Garamond" w:hAnsi="Cormorant Garamond"/>
+          <w:b/>
+          <w:color w:val="E11D48"/>
+          <w:sz w:val="26"/>
+        </w:rPr>
+        <w:t>Chiffres-clés à connaître</w:t>
+      </w:r>
+    </w:p>
+    <w:tbl>
+      <w:tblPr>
+        <w:tblW w:type="auto" w:w="0"/>
+        <w:jc w:val="center"/>
+        <w:tblBorders>
+          <w:top w:val="single" w:sz="4" w:space="0" w:color="9CA3AF"/>
+          <w:left w:val="single" w:sz="4" w:space="0" w:color="9CA3AF"/>
+          <w:bottom w:val="single" w:sz="4" w:space="0" w:color="9CA3AF"/>
+          <w:right w:val="single" w:sz="4" w:space="0" w:color="9CA3AF"/>
+          <w:insideH w:val="single" w:sz="4" w:space="0" w:color="9CA3AF"/>
+          <w:insideV w:val="single" w:sz="4" w:space="0" w:color="9CA3AF"/>
+        </w:tblBorders>
+        <w:tblLayout w:type="autofit"/>
+        <w:tblLook w:firstColumn="1" w:firstRow="1" w:lastColumn="0" w:lastRow="0" w:noHBand="0" w:noVBand="1" w:val="04A0"/>
+      </w:tblPr>
+      <w:tblGrid>
+        <w:gridCol w:w="3289"/>
+        <w:gridCol w:w="3289"/>
+        <w:gridCol w:w="3289"/>
+      </w:tblGrid>
+      <w:tr>
+        <w:tc>
+          <w:tcPr>
+            <w:tcW w:type="dxa" w:w="3289"/>
+            <w:shd w:val="clear" w:color="auto" w:fill="E11D48"/>
+          </w:tcPr>
+          <w:p>
+            <w:pPr>
+              <w:spacing w:after="40"/>
+            </w:pPr>
+            <w:r>
+              <w:rPr>
+                <w:rFonts w:ascii="Inter" w:hAnsi="Inter"/>
+                <w:b/>
+                <w:i w:val="0"/>
+                <w:color w:val="FFFFFF"/>
+                <w:sz w:val="18"/>
+              </w:rPr>
+              <w:t>Paramètre</w:t>
+            </w:r>
+          </w:p>
+        </w:tc>
+        <w:tc>
+          <w:tcPr>
+            <w:tcW w:type="dxa" w:w="3289"/>
+            <w:shd w:val="clear" w:color="auto" w:fill="E11D48"/>
+          </w:tcPr>
+          <w:p>
+            <w:pPr>
+              <w:spacing w:after="40"/>
+            </w:pPr>
+            <w:r>
+              <w:rPr>
+                <w:rFonts w:ascii="Inter" w:hAnsi="Inter"/>
+                <w:b/>
+                <w:i w:val="0"/>
+                <w:color w:val="FFFFFF"/>
+                <w:sz w:val="18"/>
+              </w:rPr>
+              <w:t>Valeur</w:t>
+            </w:r>
+          </w:p>
+        </w:tc>
+        <w:tc>
+          <w:tcPr>
+            <w:tcW w:type="dxa" w:w="3289"/>
+            <w:shd w:val="clear" w:color="auto" w:fill="E11D48"/>
+          </w:tcPr>
+          <w:p>
+            <w:pPr>
+              <w:spacing w:after="40"/>
+            </w:pPr>
+            <w:r>
+              <w:rPr>
+                <w:rFonts w:ascii="Inter" w:hAnsi="Inter"/>
+                <w:b/>
+                <w:i w:val="0"/>
+                <w:color w:val="FFFFFF"/>
+                <w:sz w:val="18"/>
+              </w:rPr>
+              <w:t>Précision</w:t>
+            </w:r>
+          </w:p>
+        </w:tc>
+      </w:tr>
+      <w:tr>
+        <w:tc>
+          <w:tcPr>
+            <w:tcW w:type="dxa" w:w="3289"/>
+          </w:tcPr>
+          <w:p>
+            <w:pPr>
+              <w:spacing w:after="40"/>
+            </w:pPr>
+            <w:r>
+              <w:rPr>
+                <w:rFonts w:ascii="Inter" w:hAnsi="Inter"/>
+                <w:b w:val="0"/>
+                <w:i w:val="0"/>
+                <w:color w:val="1F2937"/>
+                <w:sz w:val="18"/>
+              </w:rPr>
+              <w:t>Seuil HTA au cabinet</w:t>
+            </w:r>
+          </w:p>
+        </w:tc>
+        <w:tc>
+          <w:tcPr>
+            <w:tcW w:type="dxa" w:w="3289"/>
+          </w:tcPr>
+          <w:p>
+            <w:pPr>
+              <w:spacing w:after="40"/>
+            </w:pPr>
+            <w:r>
+              <w:rPr>
+                <w:rFonts w:ascii="Inter" w:hAnsi="Inter"/>
+                <w:b/>
+                <w:i w:val="0"/>
+                <w:color w:val="BE123C"/>
+                <w:sz w:val="18"/>
+              </w:rPr>
+              <w:t>140/90 mmHg</w:t>
+            </w:r>
+          </w:p>
+        </w:tc>
+        <w:tc>
+          <w:tcPr>
+            <w:tcW w:type="dxa" w:w="3289"/>
+          </w:tcPr>
+          <w:p>
+            <w:pPr>
+              <w:spacing w:after="40"/>
+            </w:pPr>
+            <w:r>
+              <w:rPr>
+                <w:rFonts w:ascii="Inter" w:hAnsi="Inter"/>
+                <w:b w:val="0"/>
+                <w:i w:val="0"/>
+                <w:color w:val="1F2937"/>
+                <w:sz w:val="18"/>
+              </w:rPr>
+              <w:t>sur 2 consultations</w:t>
+            </w:r>
+          </w:p>
+        </w:tc>
+      </w:tr>
+      <w:tr>
+        <w:tc>
+          <w:tcPr>
+            <w:tcW w:type="dxa" w:w="3289"/>
+            <w:shd w:val="clear" w:color="auto" w:fill="FAF7F2"/>
+          </w:tcPr>
+          <w:p>
+            <w:pPr>
+              <w:spacing w:after="40"/>
+            </w:pPr>
+            <w:r>
+              <w:rPr>
+                <w:rFonts w:ascii="Inter" w:hAnsi="Inter"/>
+                <w:b w:val="0"/>
+                <w:i w:val="0"/>
+                <w:color w:val="1F2937"/>
+                <w:sz w:val="18"/>
+              </w:rPr>
+              <w:t>Seuil en automesure</w:t>
+            </w:r>
+          </w:p>
+        </w:tc>
+        <w:tc>
+          <w:tcPr>
+            <w:tcW w:type="dxa" w:w="3289"/>
+            <w:shd w:val="clear" w:color="auto" w:fill="FAF7F2"/>
+          </w:tcPr>
+          <w:p>
+            <w:pPr>
+              <w:spacing w:after="40"/>
+            </w:pPr>
+            <w:r>
+              <w:rPr>
+                <w:rFonts w:ascii="Inter" w:hAnsi="Inter"/>
+                <w:b/>
+                <w:i w:val="0"/>
+                <w:color w:val="BE123C"/>
+                <w:sz w:val="18"/>
+              </w:rPr>
+              <w:t>135/85 mmHg</w:t>
+            </w:r>
+          </w:p>
+        </w:tc>
+        <w:tc>
+          <w:tcPr>
+            <w:tcW w:type="dxa" w:w="3289"/>
+            <w:shd w:val="clear" w:color="auto" w:fill="FAF7F2"/>
+          </w:tcPr>
+          <w:p>
+            <w:pPr>
+              <w:spacing w:after="40"/>
+            </w:pPr>
+            <w:r>
+              <w:rPr>
+                <w:rFonts w:ascii="Inter" w:hAnsi="Inter"/>
+                <w:b w:val="0"/>
+                <w:i w:val="0"/>
+                <w:color w:val="1F2937"/>
+                <w:sz w:val="18"/>
+              </w:rPr>
+              <w:t>règle des 3</w:t>
+            </w:r>
+          </w:p>
+        </w:tc>
+      </w:tr>
+      <w:tr>
+        <w:tc>
+          <w:tcPr>
+            <w:tcW w:type="dxa" w:w="3289"/>
+          </w:tcPr>
+          <w:p>
+            <w:pPr>
+              <w:spacing w:after="40"/>
+            </w:pPr>
+            <w:r>
+              <w:rPr>
+                <w:rFonts w:ascii="Inter" w:hAnsi="Inter"/>
+                <w:b w:val="0"/>
+                <w:i w:val="0"/>
+                <w:color w:val="1F2937"/>
+                <w:sz w:val="18"/>
+              </w:rPr>
+              <w:t>Apports en sel conseillés</w:t>
+            </w:r>
+          </w:p>
+        </w:tc>
+        <w:tc>
+          <w:tcPr>
+            <w:tcW w:type="dxa" w:w="3289"/>
+          </w:tcPr>
+          <w:p>
+            <w:pPr>
+              <w:spacing w:after="40"/>
+            </w:pPr>
+            <w:r>
+              <w:rPr>
+                <w:rFonts w:ascii="Inter" w:hAnsi="Inter"/>
+                <w:b/>
+                <w:i w:val="0"/>
+                <w:color w:val="BE123C"/>
+                <w:sz w:val="18"/>
+              </w:rPr>
+              <w:t>&lt; 6 g/j</w:t>
+            </w:r>
+          </w:p>
+        </w:tc>
+        <w:tc>
+          <w:tcPr>
+            <w:tcW w:type="dxa" w:w="3289"/>
+          </w:tcPr>
+          <w:p>
+            <w:pPr>
+              <w:spacing w:after="40"/>
+            </w:pPr>
+            <w:r>
+              <w:rPr>
+                <w:rFonts w:ascii="Inter" w:hAnsi="Inter"/>
+                <w:b w:val="0"/>
+                <w:i w:val="0"/>
+                <w:color w:val="1F2937"/>
+                <w:sz w:val="18"/>
+              </w:rPr>
+              <w:t>mesure hygiéno-diététique</w:t>
+            </w:r>
+          </w:p>
+        </w:tc>
+      </w:tr>
+      <w:tr>
+        <w:tc>
+          <w:tcPr>
+            <w:tcW w:type="dxa" w:w="3289"/>
+            <w:shd w:val="clear" w:color="auto" w:fill="FAF7F2"/>
+          </w:tcPr>
+          <w:p>
+            <w:pPr>
+              <w:spacing w:after="40"/>
+            </w:pPr>
+            <w:r>
+              <w:rPr>
+                <w:rFonts w:ascii="Inter" w:hAnsi="Inter"/>
+                <w:b w:val="0"/>
+                <w:i w:val="0"/>
+                <w:color w:val="1F2937"/>
+                <w:sz w:val="18"/>
+              </w:rPr>
+              <w:t>Objectif tensionnel</w:t>
+            </w:r>
+          </w:p>
+        </w:tc>
+        <w:tc>
+          <w:tcPr>
+            <w:tcW w:type="dxa" w:w="3289"/>
+            <w:shd w:val="clear" w:color="auto" w:fill="FAF7F2"/>
+          </w:tcPr>
+          <w:p>
+            <w:pPr>
+              <w:spacing w:after="40"/>
+            </w:pPr>
+            <w:r>
+              <w:rPr>
+                <w:rFonts w:ascii="Inter" w:hAnsi="Inter"/>
+                <w:b/>
+                <w:i w:val="0"/>
+                <w:color w:val="BE123C"/>
+                <w:sz w:val="18"/>
+              </w:rPr>
+              <w:t>&lt; 140/90 mmHg</w:t>
+            </w:r>
+          </w:p>
+        </w:tc>
+        <w:tc>
+          <w:tcPr>
+            <w:tcW w:type="dxa" w:w="3289"/>
+            <w:shd w:val="clear" w:color="auto" w:fill="FAF7F2"/>
+          </w:tcPr>
+          <w:p>
+            <w:pPr>
+              <w:spacing w:after="40"/>
+            </w:pPr>
+            <w:r>
+              <w:rPr>
+                <w:rFonts w:ascii="Inter" w:hAnsi="Inter"/>
+                <w:b w:val="0"/>
+                <w:i w:val="0"/>
+                <w:color w:val="1F2937"/>
+                <w:sz w:val="18"/>
+              </w:rPr>
+              <w:t>voire &lt; 130/80 si toléré</w:t>
+            </w:r>
+          </w:p>
+        </w:tc>
+      </w:tr>
+      <w:tr>
+        <w:tc>
+          <w:tcPr>
+            <w:tcW w:type="dxa" w:w="3289"/>
+          </w:tcPr>
+          <w:p>
+            <w:pPr>
+              <w:spacing w:after="40"/>
+            </w:pPr>
+            <w:r>
+              <w:rPr>
+                <w:rFonts w:ascii="Inter" w:hAnsi="Inter"/>
+                <w:b w:val="0"/>
+                <w:i w:val="0"/>
+                <w:color w:val="1F2937"/>
+                <w:sz w:val="18"/>
+              </w:rPr>
+              <w:t>Prévalence de l'HTA</w:t>
+            </w:r>
+          </w:p>
+        </w:tc>
+        <w:tc>
+          <w:tcPr>
+            <w:tcW w:type="dxa" w:w="3289"/>
+          </w:tcPr>
+          <w:p>
+            <w:pPr>
+              <w:spacing w:after="40"/>
+            </w:pPr>
+            <w:r>
+              <w:rPr>
+                <w:rFonts w:ascii="Inter" w:hAnsi="Inter"/>
+                <w:b/>
+                <w:i w:val="0"/>
+                <w:color w:val="BE123C"/>
+                <w:sz w:val="18"/>
+              </w:rPr>
+              <w:t>≈ 30 %</w:t>
+            </w:r>
+          </w:p>
+        </w:tc>
+        <w:tc>
+          <w:tcPr>
+            <w:tcW w:type="dxa" w:w="3289"/>
+          </w:tcPr>
+          <w:p>
+            <w:pPr>
+              <w:spacing w:after="40"/>
+            </w:pPr>
+            <w:r>
+              <w:rPr>
+                <w:rFonts w:ascii="Inter" w:hAnsi="Inter"/>
+                <w:b w:val="0"/>
+                <w:i w:val="0"/>
+                <w:color w:val="1F2937"/>
+                <w:sz w:val="18"/>
+              </w:rPr>
+              <w:t>population adulte</w:t>
+            </w:r>
+          </w:p>
+        </w:tc>
+      </w:tr>
+    </w:tbl>
+    <w:p>
+      <w:pPr>
+        <w:spacing w:after="80"/>
+      </w:pPr>
     </w:p>
     <w:p>
       <w:pPr>
@@ -3904,7 +5233,7 @@
                 <w:color w:val="1F2937"/>
                 <w:sz w:val="18"/>
               </w:rPr>
-              <w:t>Sujet âgé, sujet noir</w:t>
+              <w:t>Sujet âgé</w:t>
             </w:r>
           </w:p>
         </w:tc>
@@ -3948,7 +5277,7 @@
                 <w:color w:val="1F2937"/>
                 <w:sz w:val="18"/>
               </w:rPr>
-              <w:t>Hydrochlorothiazide</w:t>
+              <w:t>HCTZ</w:t>
             </w:r>
           </w:p>
         </w:tc>
@@ -4049,17 +5378,17 @@
     </w:p>
     <w:p>
       <w:pPr>
-        <w:spacing w:before="400"/>
+        <w:spacing w:before="320"/>
         <w:jc w:val="center"/>
       </w:pPr>
       <w:r>
         <w:rPr>
           <w:rFonts w:ascii="Inter" w:hAnsi="Inter"/>
           <w:color w:val="C9A961"/>
-          <w:spacing w:val="60"/>
-          <w:sz w:val="19"/>
+          <w:spacing w:val="56"/>
+          <w:sz w:val="18"/>
         </w:rPr>
-        <w:t>L'ESSENTIEL</w:t>
+        <w:t>RÉVISION EXPRESS</w:t>
       </w:r>
     </w:p>
     <w:p>
@@ -4073,12 +5402,12 @@
           <w:color w:val="1F2937"/>
           <w:sz w:val="52"/>
         </w:rPr>
-        <w:t>À retenir absolument</w:t>
+        <w:t>Fiche éclair</w:t>
       </w:r>
     </w:p>
     <w:p>
       <w:pPr>
-        <w:spacing w:after="280"/>
+        <w:spacing w:after="240"/>
         <w:jc w:val="center"/>
       </w:pPr>
       <w:r>
@@ -4092,9 +5421,114 @@
       </w:r>
     </w:p>
     <w:p>
+      <w:r>
+        <w:rPr>
+          <w:rFonts w:ascii="Inter" w:hAnsi="Inter"/>
+          <w:b/>
+          <w:i w:val="0"/>
+          <w:color w:val="BE123C"/>
+          <w:sz w:val="20"/>
+        </w:rPr>
+        <w:t>Définition</w:t>
+      </w:r>
+      <w:r>
+        <w:rPr>
+          <w:rFonts w:ascii="Inter" w:hAnsi="Inter"/>
+          <w:b w:val="0"/>
+          <w:i w:val="0"/>
+          <w:color w:val="1F2937"/>
+          <w:sz w:val="20"/>
+        </w:rPr>
+        <w:t xml:space="preserve"> : PA ≥ 140/90 mmHg au cabinet (135/85 en automesure), confirmée sur 2 consultations.</w:t>
+      </w:r>
+    </w:p>
+    <w:p>
+      <w:r>
+        <w:rPr>
+          <w:rFonts w:ascii="Inter" w:hAnsi="Inter"/>
+          <w:b/>
+          <w:i w:val="0"/>
+          <w:color w:val="BE123C"/>
+          <w:sz w:val="20"/>
+        </w:rPr>
+        <w:t>Diagnostic</w:t>
+      </w:r>
+      <w:r>
+        <w:rPr>
+          <w:rFonts w:ascii="Inter" w:hAnsi="Inter"/>
+          <w:b w:val="0"/>
+          <w:i w:val="0"/>
+          <w:color w:val="1F2937"/>
+          <w:sz w:val="20"/>
+        </w:rPr>
+        <w:t xml:space="preserve"> : MAPA = examen de référence ; rechercher HTA blouse blanche et HTA masquée.</w:t>
+      </w:r>
+    </w:p>
+    <w:p>
+      <w:r>
+        <w:rPr>
+          <w:rFonts w:ascii="Inter" w:hAnsi="Inter"/>
+          <w:b/>
+          <w:i w:val="0"/>
+          <w:color w:val="BE123C"/>
+          <w:sz w:val="20"/>
+        </w:rPr>
+        <w:t>Bilan</w:t>
+      </w:r>
+      <w:r>
+        <w:rPr>
+          <w:rFonts w:ascii="Inter" w:hAnsi="Inter"/>
+          <w:b w:val="0"/>
+          <w:i w:val="0"/>
+          <w:color w:val="1F2937"/>
+          <w:sz w:val="20"/>
+        </w:rPr>
+        <w:t xml:space="preserve"> : organes cibles (cœur, rein, œil) + bilan biologique minimal ; évoquer une HTA secondaire si résistance ou sujet jeune.</w:t>
+      </w:r>
+    </w:p>
+    <w:p>
+      <w:r>
+        <w:rPr>
+          <w:rFonts w:ascii="Inter" w:hAnsi="Inter"/>
+          <w:b/>
+          <w:i w:val="0"/>
+          <w:color w:val="BE123C"/>
+          <w:sz w:val="20"/>
+        </w:rPr>
+        <w:t>Traitement</w:t>
+      </w:r>
+      <w:r>
+        <w:rPr>
+          <w:rFonts w:ascii="Inter" w:hAnsi="Inter"/>
+          <w:b w:val="0"/>
+          <w:i w:val="0"/>
+          <w:color w:val="1F2937"/>
+          <w:sz w:val="20"/>
+        </w:rPr>
+        <w:t xml:space="preserve"> : RHD systématiques + 5 classes (IEC, ARA II, calciques, diurétiques, bêtabloquants) ; bithérapie d'emblée fréquente ; objectif &lt; 140/90 mmHg.</w:t>
+      </w:r>
+    </w:p>
+    <w:p>
+      <w:pPr>
+        <w:pBdr>
+          <w:bottom w:val="single" w:sz="4" w:space="4" w:color="C9A961"/>
+        </w:pBdr>
+        <w:spacing w:before="180" w:after="40"/>
+      </w:pPr>
+      <w:r>
+        <w:rPr>
+          <w:rFonts w:ascii="Cormorant Garamond" w:hAnsi="Cormorant Garamond"/>
+          <w:b/>
+          <w:color w:val="E11D48"/>
+          <w:sz w:val="26"/>
+        </w:rPr>
+        <w:t>À retenir absolument</w:t>
+      </w:r>
+    </w:p>
+    <w:p>
       <w:pPr>
         <w:pStyle w:val="ListBullet"/>
-        <w:spacing w:after="120"/>
+        <w:spacing w:after="80"/>
       </w:pPr>
       <w:r>
         <w:rPr>
@@ -4102,7 +5536,7 @@
           <w:b w:val="0"/>
           <w:i w:val="0"/>
           <w:color w:val="1F2937"/>
-          <w:sz w:val="22"/>
+          <w:sz w:val="21"/>
         </w:rPr>
         <w:t>L'</w:t>
       </w:r>
@@ -4112,7 +5546,7 @@
           <w:b/>
           <w:i w:val="0"/>
           <w:color w:val="BE123C"/>
-          <w:sz w:val="22"/>
+          <w:sz w:val="21"/>
         </w:rPr>
         <w:t>HTA</w:t>
       </w:r>
@@ -4122,7 +5556,7 @@
           <w:b w:val="0"/>
           <w:i w:val="0"/>
           <w:color w:val="1F2937"/>
-          <w:sz w:val="22"/>
+          <w:sz w:val="21"/>
         </w:rPr>
         <w:t xml:space="preserve"> est définie par une PA </w:t>
       </w:r>
@@ -4132,7 +5566,7 @@
           <w:b/>
           <w:i w:val="0"/>
           <w:color w:val="BE123C"/>
-          <w:sz w:val="22"/>
+          <w:sz w:val="21"/>
         </w:rPr>
         <w:t>≥ 140/90 mmHg</w:t>
       </w:r>
@@ -4142,7 +5576,7 @@
           <w:b w:val="0"/>
           <w:i w:val="0"/>
           <w:color w:val="1F2937"/>
-          <w:sz w:val="22"/>
+          <w:sz w:val="21"/>
         </w:rPr>
         <w:t xml:space="preserve"> au cabinet, confirmée sur des mesures répétées.</w:t>
       </w:r>
@@ -4150,7 +5584,7 @@
     <w:p>
       <w:pPr>
         <w:pStyle w:val="ListBullet"/>
-        <w:spacing w:after="120"/>
+        <w:spacing w:after="80"/>
       </w:pPr>
       <w:r>
         <w:rPr>
@@ -4158,7 +5592,7 @@
           <w:b w:val="0"/>
           <w:i w:val="0"/>
           <w:color w:val="1F2937"/>
-          <w:sz w:val="22"/>
+          <w:sz w:val="21"/>
         </w:rPr>
         <w:t xml:space="preserve">La </w:t>
       </w:r>
@@ -4168,7 +5602,7 @@
           <w:b/>
           <w:i w:val="0"/>
           <w:color w:val="BE123C"/>
-          <w:sz w:val="22"/>
+          <w:sz w:val="21"/>
         </w:rPr>
         <w:t>MAPA</w:t>
       </w:r>
@@ -4178,7 +5612,7 @@
           <w:b w:val="0"/>
           <w:i w:val="0"/>
           <w:color w:val="1F2937"/>
-          <w:sz w:val="22"/>
+          <w:sz w:val="21"/>
         </w:rPr>
         <w:t xml:space="preserve"> et l'</w:t>
       </w:r>
@@ -4188,7 +5622,7 @@
           <w:b/>
           <w:i w:val="0"/>
           <w:color w:val="BE123C"/>
-          <w:sz w:val="22"/>
+          <w:sz w:val="21"/>
         </w:rPr>
         <w:t>automesure</w:t>
       </w:r>
@@ -4198,7 +5632,7 @@
           <w:b w:val="0"/>
           <w:i w:val="0"/>
           <w:color w:val="1F2937"/>
-          <w:sz w:val="22"/>
+          <w:sz w:val="21"/>
         </w:rPr>
         <w:t xml:space="preserve"> confirment le diagnostic et dépistent l'HTA blouse blanche et l'HTA masquée.</w:t>
       </w:r>
@@ -4206,7 +5640,7 @@
     <w:p>
       <w:pPr>
         <w:pStyle w:val="ListBullet"/>
-        <w:spacing w:after="120"/>
+        <w:spacing w:after="80"/>
       </w:pPr>
       <w:r>
         <w:rPr>
@@ -4214,9 +5648,9 @@
           <w:b w:val="0"/>
           <w:i w:val="0"/>
           <w:color w:val="1F2937"/>
-          <w:sz w:val="22"/>
+          <w:sz w:val="21"/>
         </w:rPr>
-        <w:t xml:space="preserve">Le bilan initial recherche systématiquement une </w:t>
+        <w:t xml:space="preserve">Le bilan initial recherche une </w:t>
       </w:r>
       <w:r>
         <w:rPr>
@@ -4224,7 +5658,7 @@
           <w:b/>
           <w:i w:val="0"/>
           <w:color w:val="BE123C"/>
-          <w:sz w:val="22"/>
+          <w:sz w:val="21"/>
         </w:rPr>
         <w:t>atteinte des organes cibles</w:t>
       </w:r>
@@ -4234,7 +5668,7 @@
           <w:b w:val="0"/>
           <w:i w:val="0"/>
           <w:color w:val="1F2937"/>
-          <w:sz w:val="22"/>
+          <w:sz w:val="21"/>
         </w:rPr>
         <w:t xml:space="preserve"> et une </w:t>
       </w:r>
@@ -4244,7 +5678,7 @@
           <w:b/>
           <w:i w:val="0"/>
           <w:color w:val="BE123C"/>
-          <w:sz w:val="22"/>
+          <w:sz w:val="21"/>
         </w:rPr>
         <w:t>HTA secondaire</w:t>
       </w:r>
@@ -4254,7 +5688,7 @@
           <w:b w:val="0"/>
           <w:i w:val="0"/>
           <w:color w:val="1F2937"/>
-          <w:sz w:val="22"/>
+          <w:sz w:val="21"/>
         </w:rPr>
         <w:t>.</w:t>
       </w:r>
@@ -4262,7 +5696,7 @@
     <w:p>
       <w:pPr>
         <w:pStyle w:val="ListBullet"/>
-        <w:spacing w:after="120"/>
+        <w:spacing w:after="80"/>
       </w:pPr>
       <w:r>
         <w:rPr>
@@ -4270,7 +5704,7 @@
           <w:b w:val="0"/>
           <w:i w:val="0"/>
           <w:color w:val="1F2937"/>
-          <w:sz w:val="22"/>
+          <w:sz w:val="21"/>
         </w:rPr>
         <w:t xml:space="preserve">Les </w:t>
       </w:r>
@@ -4280,7 +5714,7 @@
           <w:b/>
           <w:i w:val="0"/>
           <w:color w:val="BE123C"/>
-          <w:sz w:val="22"/>
+          <w:sz w:val="21"/>
         </w:rPr>
         <w:t>règles hygiéno-diététiques</w:t>
       </w:r>
@@ -4290,15 +5724,15 @@
           <w:b w:val="0"/>
           <w:i w:val="0"/>
           <w:color w:val="1F2937"/>
-          <w:sz w:val="22"/>
+          <w:sz w:val="21"/>
         </w:rPr>
-        <w:t xml:space="preserve"> sont la base du traitement, toujours associées aux médicaments.</w:t>
+        <w:t xml:space="preserve"> sont la base du traitement.</w:t>
       </w:r>
     </w:p>
     <w:p>
       <w:pPr>
         <w:pStyle w:val="ListBullet"/>
-        <w:spacing w:after="120"/>
+        <w:spacing w:after="80"/>
       </w:pPr>
       <w:r>
         <w:rPr>
@@ -4306,9 +5740,9 @@
           <w:b w:val="0"/>
           <w:i w:val="0"/>
           <w:color w:val="1F2937"/>
-          <w:sz w:val="22"/>
+          <w:sz w:val="21"/>
         </w:rPr>
-        <w:t xml:space="preserve">Cinq classes de première intention ; la </w:t>
+        <w:t xml:space="preserve">Cinq classes de 1re intention ; la </w:t>
       </w:r>
       <w:r>
         <w:rPr>
@@ -4316,7 +5750,7 @@
           <w:b/>
           <w:i w:val="0"/>
           <w:color w:val="BE123C"/>
-          <w:sz w:val="22"/>
+          <w:sz w:val="21"/>
         </w:rPr>
         <w:t>bithérapie</w:t>
       </w:r>
@@ -4326,15 +5760,15 @@
           <w:b w:val="0"/>
           <w:i w:val="0"/>
           <w:color w:val="1F2937"/>
-          <w:sz w:val="22"/>
+          <w:sz w:val="21"/>
         </w:rPr>
-        <w:t xml:space="preserve"> est souvent instaurée d'emblée.</w:t>
+        <w:t xml:space="preserve"> est souvent d'emblée.</w:t>
       </w:r>
     </w:p>
     <w:p>
       <w:pPr>
         <w:pStyle w:val="ListBullet"/>
-        <w:spacing w:after="120"/>
+        <w:spacing w:after="80"/>
       </w:pPr>
       <w:r>
         <w:rPr>
@@ -4342,9 +5776,9 @@
           <w:b w:val="0"/>
           <w:i w:val="0"/>
           <w:color w:val="1F2937"/>
-          <w:sz w:val="22"/>
+          <w:sz w:val="21"/>
         </w:rPr>
-        <w:t xml:space="preserve">L'objectif tensionnel est </w:t>
+        <w:t xml:space="preserve">Objectif : </w:t>
       </w:r>
       <w:r>
         <w:rPr>
@@ -4352,7 +5786,7 @@
           <w:b/>
           <w:i w:val="0"/>
           <w:color w:val="BE123C"/>
-          <w:sz w:val="22"/>
+          <w:sz w:val="21"/>
         </w:rPr>
         <w:t>&lt; 140/90 mmHg</w:t>
       </w:r>
@@ -4362,7 +5796,7 @@
           <w:b w:val="0"/>
           <w:i w:val="0"/>
           <w:color w:val="1F2937"/>
-          <w:sz w:val="22"/>
+          <w:sz w:val="21"/>
         </w:rPr>
         <w:t xml:space="preserve">, idéalement </w:t>
       </w:r>
@@ -4372,7 +5806,7 @@
           <w:b/>
           <w:i w:val="0"/>
           <w:color w:val="BE123C"/>
-          <w:sz w:val="22"/>
+          <w:sz w:val="21"/>
         </w:rPr>
         <w:t>&lt; 130/80 mmHg</w:t>
       </w:r>
@@ -4382,20 +5816,20 @@
           <w:b w:val="0"/>
           <w:i w:val="0"/>
           <w:color w:val="1F2937"/>
-          <w:sz w:val="22"/>
+          <w:sz w:val="21"/>
         </w:rPr>
-        <w:t xml:space="preserve"> si la tolérance le permet.</w:t>
+        <w:t xml:space="preserve"> si toléré.</w:t>
       </w:r>
     </w:p>
     <w:p>
       <w:pPr>
-        <w:spacing w:before="400"/>
+        <w:spacing w:before="320"/>
         <w:jc w:val="center"/>
       </w:pPr>
       <w:r>
         <w:drawing>
           <wp:inline xmlns:a="http://schemas.openxmlformats.org/drawingml/2006/main" xmlns:pic="http://schemas.openxmlformats.org/drawingml/2006/picture">
-            <wp:extent cx="864000" cy="432000"/>
+            <wp:extent cx="792000" cy="396000"/>
             <wp:docPr id="2" name="Picture 2"/>
             <wp:cNvGraphicFramePr>
               <a:graphicFrameLocks noChangeAspect="1"/>
@@ -4416,7 +5850,7 @@
                   <pic:spPr>
                     <a:xfrm>
                       <a:off x="0" y="0"/>
-                      <a:ext cx="864000" cy="432000"/>
+                      <a:ext cx="792000" cy="396000"/>
                     </a:xfrm>
                     <a:prstGeom prst="rect"/>
                   </pic:spPr>

</xml_diff>

<commit_message>
Retire la page signalétique et les catégories colorées, ajoute des images
Supprime la page « Fiche signalétique » (en-tête) et le système de
catégories sémantiques colorées (chips Diagnostic / Prise en charge…),
jugés peu esthétiques. Le pipeline IA repasse l'étape 1 au plan seul.
Ajoute deux schémas de démonstration dans la fiche d'exemple pour
illustrer le rendu des images (cadre or + légende).

Les lignes-réflexe (à retenir / piège / mnémo) sont conservées.

https://claude.ai/code/session_019UxbrWiVNiHBdkHsxX6ghC
</commit_message>
<xml_diff>
--- a/examples/Cardiologie_Hypertension-Arterielle_2025-2026.docx
+++ b/examples/Cardiologie_Hypertension-Arterielle_2025-2026.docx
@@ -292,475 +292,6 @@
         </w:tc>
       </w:tr>
     </w:tbl>
-    <w:p>
-      <w:r>
-        <w:br w:type="page"/>
-      </w:r>
-    </w:p>
-    <w:p>
-      <w:pPr>
-        <w:pBdr>
-          <w:top w:val="single" w:sz="12" w:space="6" w:color="E11D48"/>
-          <w:bottom w:val="single" w:sz="12" w:space="6" w:color="E11D48"/>
-        </w:pBdr>
-        <w:spacing w:before="80"/>
-        <w:jc w:val="center"/>
-      </w:pPr>
-      <w:r>
-        <w:rPr>
-          <w:rFonts w:ascii="Playfair Display" w:hAnsi="Playfair Display"/>
-          <w:b/>
-          <w:color w:val="1F2937"/>
-          <w:sz w:val="46"/>
-        </w:rPr>
-        <w:t>Fiche signalétique</w:t>
-      </w:r>
-    </w:p>
-    <w:tbl>
-      <w:tblPr>
-        <w:tblW w:type="auto" w:w="0"/>
-        <w:jc w:val="center"/>
-        <w:tblBorders>
-          <w:top w:val="single" w:sz="4" w:space="0" w:color="9CA3AF"/>
-          <w:left w:val="single" w:sz="4" w:space="0" w:color="9CA3AF"/>
-          <w:bottom w:val="single" w:sz="4" w:space="0" w:color="9CA3AF"/>
-          <w:right w:val="single" w:sz="4" w:space="0" w:color="9CA3AF"/>
-          <w:insideH w:val="single" w:sz="4" w:space="0" w:color="9CA3AF"/>
-          <w:insideV w:val="single" w:sz="4" w:space="0" w:color="9CA3AF"/>
-        </w:tblBorders>
-        <w:tblLook w:firstColumn="1" w:firstRow="1" w:lastColumn="0" w:lastRow="0" w:noHBand="0" w:noVBand="1" w:val="04A0"/>
-      </w:tblPr>
-      <w:tblGrid>
-        <w:gridCol w:w="2466"/>
-        <w:gridCol w:w="2466"/>
-        <w:gridCol w:w="2466"/>
-        <w:gridCol w:w="2466"/>
-      </w:tblGrid>
-      <w:tr>
-        <w:tc>
-          <w:tcPr>
-            <w:tcW w:type="dxa" w:w="2466"/>
-            <w:shd w:val="clear" w:color="auto" w:fill="FAF7F2"/>
-          </w:tcPr>
-          <w:p>
-            <w:pPr>
-              <w:jc w:val="center"/>
-            </w:pPr>
-            <w:r>
-              <w:rPr>
-                <w:rFonts w:ascii="Inter" w:hAnsi="Inter"/>
-                <w:b/>
-                <w:color w:val="9CA3AF"/>
-                <w:sz w:val="15"/>
-              </w:rPr>
-              <w:t>ITEM ECN</w:t>
-            </w:r>
-          </w:p>
-        </w:tc>
-        <w:tc>
-          <w:tcPr>
-            <w:tcW w:type="dxa" w:w="2466"/>
-            <w:shd w:val="clear" w:color="auto" w:fill="FAF7F2"/>
-          </w:tcPr>
-          <w:p>
-            <w:pPr>
-              <w:jc w:val="center"/>
-            </w:pPr>
-            <w:r>
-              <w:rPr>
-                <w:rFonts w:ascii="Inter" w:hAnsi="Inter"/>
-                <w:b/>
-                <w:color w:val="9CA3AF"/>
-                <w:sz w:val="15"/>
-              </w:rPr>
-              <w:t>MATIÈRE</w:t>
-            </w:r>
-          </w:p>
-        </w:tc>
-        <w:tc>
-          <w:tcPr>
-            <w:tcW w:type="dxa" w:w="2466"/>
-            <w:shd w:val="clear" w:color="auto" w:fill="FAF7F2"/>
-          </w:tcPr>
-          <w:p>
-            <w:pPr>
-              <w:jc w:val="center"/>
-            </w:pPr>
-            <w:r>
-              <w:rPr>
-                <w:rFonts w:ascii="Inter" w:hAnsi="Inter"/>
-                <w:b/>
-                <w:color w:val="9CA3AF"/>
-                <w:sz w:val="15"/>
-              </w:rPr>
-              <w:t>LECTURE ESTIMÉE</w:t>
-            </w:r>
-          </w:p>
-        </w:tc>
-        <w:tc>
-          <w:tcPr>
-            <w:tcW w:type="dxa" w:w="2466"/>
-            <w:shd w:val="clear" w:color="auto" w:fill="FAF7F2"/>
-          </w:tcPr>
-          <w:p>
-            <w:pPr>
-              <w:jc w:val="center"/>
-            </w:pPr>
-            <w:r>
-              <w:rPr>
-                <w:rFonts w:ascii="Inter" w:hAnsi="Inter"/>
-                <w:b/>
-                <w:color w:val="9CA3AF"/>
-                <w:sz w:val="15"/>
-              </w:rPr>
-              <w:t>ANNÉE</w:t>
-            </w:r>
-          </w:p>
-        </w:tc>
-      </w:tr>
-      <w:tr>
-        <w:tc>
-          <w:tcPr>
-            <w:tcW w:type="dxa" w:w="2466"/>
-            <w:shd w:val="clear" w:color="auto" w:fill="FAF7F2"/>
-          </w:tcPr>
-          <w:p>
-            <w:pPr>
-              <w:jc w:val="center"/>
-            </w:pPr>
-            <w:r>
-              <w:rPr>
-                <w:rFonts w:ascii="Cormorant Garamond" w:hAnsi="Cormorant Garamond"/>
-                <w:b/>
-                <w:color w:val="E11D48"/>
-                <w:sz w:val="24"/>
-              </w:rPr>
-              <w:t>Item 224</w:t>
-            </w:r>
-          </w:p>
-        </w:tc>
-        <w:tc>
-          <w:tcPr>
-            <w:tcW w:type="dxa" w:w="2466"/>
-            <w:shd w:val="clear" w:color="auto" w:fill="FAF7F2"/>
-          </w:tcPr>
-          <w:p>
-            <w:pPr>
-              <w:jc w:val="center"/>
-            </w:pPr>
-            <w:r>
-              <w:rPr>
-                <w:rFonts w:ascii="Cormorant Garamond" w:hAnsi="Cormorant Garamond"/>
-                <w:b/>
-                <w:color w:val="E11D48"/>
-                <w:sz w:val="24"/>
-              </w:rPr>
-              <w:t>Cardiologie</w:t>
-            </w:r>
-          </w:p>
-        </w:tc>
-        <w:tc>
-          <w:tcPr>
-            <w:tcW w:type="dxa" w:w="2466"/>
-            <w:shd w:val="clear" w:color="auto" w:fill="FAF7F2"/>
-          </w:tcPr>
-          <w:p>
-            <w:pPr>
-              <w:jc w:val="center"/>
-            </w:pPr>
-            <w:r>
-              <w:rPr>
-                <w:rFonts w:ascii="Cormorant Garamond" w:hAnsi="Cormorant Garamond"/>
-                <w:b/>
-                <w:color w:val="E11D48"/>
-                <w:sz w:val="24"/>
-              </w:rPr>
-              <w:t>≈ 12 min</w:t>
-            </w:r>
-          </w:p>
-        </w:tc>
-        <w:tc>
-          <w:tcPr>
-            <w:tcW w:type="dxa" w:w="2466"/>
-            <w:shd w:val="clear" w:color="auto" w:fill="FAF7F2"/>
-          </w:tcPr>
-          <w:p>
-            <w:pPr>
-              <w:jc w:val="center"/>
-            </w:pPr>
-            <w:r>
-              <w:rPr>
-                <w:rFonts w:ascii="Cormorant Garamond" w:hAnsi="Cormorant Garamond"/>
-                <w:b/>
-                <w:color w:val="E11D48"/>
-                <w:sz w:val="24"/>
-              </w:rPr>
-              <w:t>2025-2026</w:t>
-            </w:r>
-          </w:p>
-        </w:tc>
-      </w:tr>
-    </w:tbl>
-    <w:tbl>
-      <w:tblPr>
-        <w:tblW w:type="auto" w:w="0"/>
-        <w:jc w:val="center"/>
-        <w:tblLayout w:type="fixed"/>
-        <w:tblLook w:firstColumn="1" w:firstRow="1" w:lastColumn="0" w:lastRow="0" w:noHBand="0" w:noVBand="1" w:val="04A0"/>
-      </w:tblPr>
-      <w:tblGrid>
-        <w:gridCol w:w="9866"/>
-      </w:tblGrid>
-      <w:tr>
-        <w:tc>
-          <w:tcPr>
-            <w:tcW w:type="dxa" w:w="9865"/>
-            <w:tcBorders>
-              <w:top w:val="single" w:sz="4" w:space="0" w:color="C9A961"/>
-              <w:left w:val="single" w:sz="22" w:space="0" w:color="C9A961"/>
-              <w:bottom w:val="single" w:sz="4" w:space="0" w:color="C9A961"/>
-              <w:right w:val="single" w:sz="4" w:space="0" w:color="C9A961"/>
-            </w:tcBorders>
-            <w:shd w:val="clear" w:color="auto" w:fill="FFFBF4"/>
-          </w:tcPr>
-          <w:p>
-            <w:pPr>
-              <w:spacing w:before="80"/>
-            </w:pPr>
-            <w:r>
-              <w:rPr>
-                <w:rFonts w:ascii="Inter" w:hAnsi="Inter"/>
-                <w:b/>
-                <w:color w:val="9A7B33"/>
-                <w:spacing w:val="28"/>
-                <w:sz w:val="16"/>
-              </w:rPr>
-              <w:t>VIGNETTE CLINIQUE</w:t>
-            </w:r>
-          </w:p>
-          <w:p>
-            <w:pPr>
-              <w:spacing w:after="80"/>
-            </w:pPr>
-            <w:r>
-              <w:rPr>
-                <w:rFonts w:ascii="Cormorant Garamond" w:hAnsi="Cormorant Garamond"/>
-                <w:i/>
-                <w:color w:val="1F2937"/>
-                <w:sz w:val="23"/>
-              </w:rPr>
-              <w:t>Un homme de 58 ans, sans antécédent, consulte pour un bilan systématique. La pression artérielle mesurée est de 158/96 mmHg, confirmée à deux reprises. Il est asymptomatique. Comment confirmer le diagnostic, évaluer le retentissement et instaurer la prise en charge ?</w:t>
-            </w:r>
-          </w:p>
-        </w:tc>
-      </w:tr>
-    </w:tbl>
-    <w:p>
-      <w:pPr>
-        <w:pBdr>
-          <w:bottom w:val="single" w:sz="4" w:space="4" w:color="C9A961"/>
-        </w:pBdr>
-        <w:spacing w:before="180" w:after="40"/>
-      </w:pPr>
-      <w:r>
-        <w:rPr>
-          <w:rFonts w:ascii="Cormorant Garamond" w:hAnsi="Cormorant Garamond"/>
-          <w:b/>
-          <w:color w:val="E11D48"/>
-          <w:sz w:val="26"/>
-        </w:rPr>
-        <w:t>Objectifs d'apprentissage</w:t>
-      </w:r>
-    </w:p>
-    <w:p>
-      <w:pPr>
-        <w:pStyle w:val="ListBullet"/>
-        <w:spacing w:after="40"/>
-      </w:pPr>
-      <w:r>
-        <w:rPr>
-          <w:rFonts w:ascii="Inter" w:hAnsi="Inter"/>
-          <w:b w:val="0"/>
-          <w:i w:val="0"/>
-          <w:color w:val="1F2937"/>
-          <w:sz w:val="21"/>
-        </w:rPr>
-        <w:t>Définir l'HTA et connaître ses seuils diagnostiques</w:t>
-      </w:r>
-    </w:p>
-    <w:p>
-      <w:pPr>
-        <w:pStyle w:val="ListBullet"/>
-        <w:spacing w:after="40"/>
-      </w:pPr>
-      <w:r>
-        <w:rPr>
-          <w:rFonts w:ascii="Inter" w:hAnsi="Inter"/>
-          <w:b w:val="0"/>
-          <w:i w:val="0"/>
-          <w:color w:val="1F2937"/>
-          <w:sz w:val="21"/>
-        </w:rPr>
-        <w:t>Conduire le bilan initial et rechercher le retentissement</w:t>
-      </w:r>
-    </w:p>
-    <w:p>
-      <w:pPr>
-        <w:pStyle w:val="ListBullet"/>
-        <w:spacing w:after="40"/>
-      </w:pPr>
-      <w:r>
-        <w:rPr>
-          <w:rFonts w:ascii="Inter" w:hAnsi="Inter"/>
-          <w:b w:val="0"/>
-          <w:i w:val="0"/>
-          <w:color w:val="1F2937"/>
-          <w:sz w:val="21"/>
-        </w:rPr>
-        <w:t>Hiérarchiser la prise en charge thérapeutique</w:t>
-      </w:r>
-    </w:p>
-    <w:p>
-      <w:pPr>
-        <w:pBdr>
-          <w:bottom w:val="single" w:sz="4" w:space="4" w:color="C9A961"/>
-        </w:pBdr>
-        <w:spacing w:before="180" w:after="40"/>
-      </w:pPr>
-      <w:r>
-        <w:rPr>
-          <w:rFonts w:ascii="Cormorant Garamond" w:hAnsi="Cormorant Garamond"/>
-          <w:b/>
-          <w:color w:val="E11D48"/>
-          <w:sz w:val="26"/>
-        </w:rPr>
-        <w:t>Prérequis</w:t>
-      </w:r>
-    </w:p>
-    <w:p>
-      <w:pPr>
-        <w:pStyle w:val="ListBullet"/>
-        <w:spacing w:after="40"/>
-      </w:pPr>
-      <w:r>
-        <w:rPr>
-          <w:rFonts w:ascii="Inter" w:hAnsi="Inter"/>
-          <w:b w:val="0"/>
-          <w:i w:val="0"/>
-          <w:color w:val="1F2937"/>
-          <w:sz w:val="21"/>
-        </w:rPr>
-        <w:t>Régulation de la pression artérielle</w:t>
-      </w:r>
-    </w:p>
-    <w:p>
-      <w:pPr>
-        <w:pStyle w:val="ListBullet"/>
-        <w:spacing w:after="40"/>
-      </w:pPr>
-      <w:r>
-        <w:rPr>
-          <w:rFonts w:ascii="Inter" w:hAnsi="Inter"/>
-          <w:b w:val="0"/>
-          <w:i w:val="0"/>
-          <w:color w:val="1F2937"/>
-          <w:sz w:val="21"/>
-        </w:rPr>
-        <w:t>Système rénine-angiotensine-aldostérone</w:t>
-      </w:r>
-    </w:p>
-    <w:p>
-      <w:pPr>
-        <w:pBdr>
-          <w:bottom w:val="single" w:sz="4" w:space="4" w:color="C9A961"/>
-        </w:pBdr>
-        <w:spacing w:before="180" w:after="40"/>
-      </w:pPr>
-      <w:r>
-        <w:rPr>
-          <w:rFonts w:ascii="Cormorant Garamond" w:hAnsi="Cormorant Garamond"/>
-          <w:b/>
-          <w:color w:val="E11D48"/>
-          <w:sz w:val="26"/>
-        </w:rPr>
-        <w:t>Items &amp; cours liés</w:t>
-      </w:r>
-    </w:p>
-    <w:p>
-      <w:pPr>
-        <w:pStyle w:val="ListBullet"/>
-        <w:spacing w:after="40"/>
-      </w:pPr>
-      <w:r>
-        <w:rPr>
-          <w:rFonts w:ascii="Inter" w:hAnsi="Inter"/>
-          <w:b w:val="0"/>
-          <w:i w:val="0"/>
-          <w:color w:val="1F2937"/>
-          <w:sz w:val="21"/>
-        </w:rPr>
-        <w:t>Item 222 — Facteurs de risque cardiovasculaire</w:t>
-      </w:r>
-    </w:p>
-    <w:p>
-      <w:pPr>
-        <w:pStyle w:val="ListBullet"/>
-        <w:spacing w:after="40"/>
-      </w:pPr>
-      <w:r>
-        <w:rPr>
-          <w:rFonts w:ascii="Inter" w:hAnsi="Inter"/>
-          <w:b w:val="0"/>
-          <w:i w:val="0"/>
-          <w:color w:val="1F2937"/>
-          <w:sz w:val="21"/>
-        </w:rPr>
-        <w:t>Item 232 — Insuffisance cardiaque</w:t>
-      </w:r>
-    </w:p>
-    <w:p>
-      <w:pPr>
-        <w:pStyle w:val="ListBullet"/>
-        <w:spacing w:after="40"/>
-      </w:pPr>
-      <w:r>
-        <w:rPr>
-          <w:rFonts w:ascii="Inter" w:hAnsi="Inter"/>
-          <w:b w:val="0"/>
-          <w:i w:val="0"/>
-          <w:color w:val="1F2937"/>
-          <w:sz w:val="21"/>
-        </w:rPr>
-        <w:t>Item 264 — Néphropathie vasculaire</w:t>
-      </w:r>
-    </w:p>
-    <w:p>
-      <w:pPr>
-        <w:pBdr>
-          <w:bottom w:val="single" w:sz="4" w:space="4" w:color="C9A961"/>
-        </w:pBdr>
-        <w:spacing w:before="180" w:after="40"/>
-      </w:pPr>
-      <w:r>
-        <w:rPr>
-          <w:rFonts w:ascii="Cormorant Garamond" w:hAnsi="Cormorant Garamond"/>
-          <w:b/>
-          <w:color w:val="E11D48"/>
-          <w:sz w:val="26"/>
-        </w:rPr>
-        <w:t>Mots-clés</w:t>
-      </w:r>
-    </w:p>
-    <w:p>
-      <w:r>
-        <w:rPr>
-          <w:rFonts w:ascii="Inter" w:hAnsi="Inter"/>
-          <w:color w:val="1F2937"/>
-          <w:sz w:val="20"/>
-        </w:rPr>
-        <w:t>HTA   ·   PAS / PAD   ·   MAPA   ·   Automesure   ·   Organes cibles   ·   IEC   ·   ARA II   ·   Bithérapie   ·   HTA secondaire</w:t>
-      </w:r>
-    </w:p>
     <w:p>
       <w:r>
         <w:br w:type="page"/>
@@ -1168,21 +699,6 @@
                 <w:sz w:val="26"/>
               </w:rPr>
               <w:t>A.  Définitions et seuils</w:t>
-            </w:r>
-          </w:p>
-          <w:p>
-            <w:pPr>
-              <w:jc w:val="center"/>
-            </w:pPr>
-            <w:r>
-              <w:rPr>
-                <w:rFonts w:ascii="Inter" w:hAnsi="Inter"/>
-                <w:b/>
-                <w:color w:val="64748B"/>
-                <w:spacing w:val="18"/>
-                <w:sz w:val="14"/>
-              </w:rPr>
-              <w:t>GÉNÉRALITÉS</w:t>
             </w:r>
           </w:p>
         </w:tc>
@@ -1795,6 +1311,61 @@
         <w:spacing w:after="80"/>
       </w:pPr>
     </w:p>
+    <w:p>
+      <w:pPr>
+        <w:spacing w:before="160"/>
+        <w:jc w:val="center"/>
+      </w:pPr>
+      <w:r>
+        <w:drawing>
+          <wp:inline xmlns:a="http://schemas.openxmlformats.org/drawingml/2006/main" xmlns:pic="http://schemas.openxmlformats.org/drawingml/2006/picture">
+            <wp:extent cx="5400000" cy="2418750"/>
+            <wp:docPr id="2" name="Picture 2"/>
+            <wp:cNvGraphicFramePr>
+              <a:graphicFrameLocks noChangeAspect="1"/>
+            </wp:cNvGraphicFramePr>
+            <a:graphic>
+              <a:graphicData uri="http://schemas.openxmlformats.org/drawingml/2006/picture">
+                <pic:pic>
+                  <pic:nvPicPr>
+                    <pic:cNvPr id="0" name="figure_01.png"/>
+                    <pic:cNvPicPr/>
+                  </pic:nvPicPr>
+                  <pic:blipFill>
+                    <a:blip r:embed="rId12"/>
+                    <a:stretch>
+                      <a:fillRect/>
+                    </a:stretch>
+                  </pic:blipFill>
+                  <pic:spPr>
+                    <a:xfrm>
+                      <a:off x="0" y="0"/>
+                      <a:ext cx="5400000" cy="2418750"/>
+                    </a:xfrm>
+                    <a:prstGeom prst="rect"/>
+                  </pic:spPr>
+                </pic:pic>
+              </a:graphicData>
+            </a:graphic>
+          </wp:inline>
+        </w:drawing>
+      </w:r>
+    </w:p>
+    <w:p>
+      <w:pPr>
+        <w:spacing w:after="160"/>
+        <w:jc w:val="center"/>
+      </w:pPr>
+      <w:r>
+        <w:rPr>
+          <w:rFonts w:ascii="Cormorant Garamond" w:hAnsi="Cormorant Garamond"/>
+          <w:i/>
+          <w:color w:val="9CA3AF"/>
+          <w:sz w:val="19"/>
+        </w:rPr>
+        <w:t>Figure 1 — Étapes de la démarche diagnostique devant une pression artérielle élevée.</w:t>
+      </w:r>
+    </w:p>
     <w:tbl>
       <w:tblPr>
         <w:tblW w:type="auto" w:w="0"/>
@@ -1858,21 +1429,6 @@
                 <w:sz w:val="26"/>
               </w:rPr>
               <w:t>B.  Épidémiologie</w:t>
-            </w:r>
-          </w:p>
-          <w:p>
-            <w:pPr>
-              <w:jc w:val="center"/>
-            </w:pPr>
-            <w:r>
-              <w:rPr>
-                <w:rFonts w:ascii="Inter" w:hAnsi="Inter"/>
-                <w:b/>
-                <w:color w:val="64748B"/>
-                <w:spacing w:val="18"/>
-                <w:sz w:val="14"/>
-              </w:rPr>
-              <w:t>GÉNÉRALITÉS</w:t>
             </w:r>
           </w:p>
         </w:tc>
@@ -2249,21 +1805,6 @@
                 <w:sz w:val="26"/>
               </w:rPr>
               <w:t>A.  Mesure de la pression artérielle</w:t>
-            </w:r>
-          </w:p>
-          <w:p>
-            <w:pPr>
-              <w:jc w:val="center"/>
-            </w:pPr>
-            <w:r>
-              <w:rPr>
-                <w:rFonts w:ascii="Inter" w:hAnsi="Inter"/>
-                <w:b/>
-                <w:color w:val="1D4ED8"/>
-                <w:spacing w:val="18"/>
-                <w:sz w:val="14"/>
-              </w:rPr>
-              <w:t>DIAGNOSTIC &amp; EXAMENS</w:t>
             </w:r>
           </w:p>
         </w:tc>
@@ -2658,21 +2199,6 @@
               <w:t>B.  Bilan de retentissement</w:t>
             </w:r>
           </w:p>
-          <w:p>
-            <w:pPr>
-              <w:jc w:val="center"/>
-            </w:pPr>
-            <w:r>
-              <w:rPr>
-                <w:rFonts w:ascii="Inter" w:hAnsi="Inter"/>
-                <w:b/>
-                <w:color w:val="B45309"/>
-                <w:spacing w:val="18"/>
-                <w:sz w:val="14"/>
-              </w:rPr>
-              <w:t>CLINIQUE</w:t>
-            </w:r>
-          </w:p>
         </w:tc>
       </w:tr>
       <w:tr>
@@ -2955,6 +2481,61 @@
       </w:pPr>
     </w:p>
     <w:p>
+      <w:pPr>
+        <w:spacing w:before="160"/>
+        <w:jc w:val="center"/>
+      </w:pPr>
+      <w:r>
+        <w:drawing>
+          <wp:inline xmlns:a="http://schemas.openxmlformats.org/drawingml/2006/main" xmlns:pic="http://schemas.openxmlformats.org/drawingml/2006/picture">
+            <wp:extent cx="5400000" cy="2418750"/>
+            <wp:docPr id="3" name="Picture 3"/>
+            <wp:cNvGraphicFramePr>
+              <a:graphicFrameLocks noChangeAspect="1"/>
+            </wp:cNvGraphicFramePr>
+            <a:graphic>
+              <a:graphicData uri="http://schemas.openxmlformats.org/drawingml/2006/picture">
+                <pic:pic>
+                  <pic:nvPicPr>
+                    <pic:cNvPr id="0" name="figure_02.png"/>
+                    <pic:cNvPicPr/>
+                  </pic:nvPicPr>
+                  <pic:blipFill>
+                    <a:blip r:embed="rId13"/>
+                    <a:stretch>
+                      <a:fillRect/>
+                    </a:stretch>
+                  </pic:blipFill>
+                  <pic:spPr>
+                    <a:xfrm>
+                      <a:off x="0" y="0"/>
+                      <a:ext cx="5400000" cy="2418750"/>
+                    </a:xfrm>
+                    <a:prstGeom prst="rect"/>
+                  </pic:spPr>
+                </pic:pic>
+              </a:graphicData>
+            </a:graphic>
+          </wp:inline>
+        </w:drawing>
+      </w:r>
+    </w:p>
+    <w:p>
+      <w:pPr>
+        <w:spacing w:after="160"/>
+        <w:jc w:val="center"/>
+      </w:pPr>
+      <w:r>
+        <w:rPr>
+          <w:rFonts w:ascii="Cormorant Garamond" w:hAnsi="Cormorant Garamond"/>
+          <w:i/>
+          <w:color w:val="9CA3AF"/>
+          <w:sz w:val="19"/>
+        </w:rPr>
+        <w:t>Figure 2 — Principaux organes cibles atteints par l'hypertension artérielle.</w:t>
+      </w:r>
+    </w:p>
+    <w:p>
       <w:r>
         <w:br w:type="page"/>
       </w:r>
@@ -3037,21 +2618,6 @@
                 <w:sz w:val="26"/>
               </w:rPr>
               <w:t>A.  Mesures non médicamenteuses</w:t>
-            </w:r>
-          </w:p>
-          <w:p>
-            <w:pPr>
-              <w:jc w:val="center"/>
-            </w:pPr>
-            <w:r>
-              <w:rPr>
-                <w:rFonts w:ascii="Inter" w:hAnsi="Inter"/>
-                <w:b/>
-                <w:color w:val="15803D"/>
-                <w:spacing w:val="18"/>
-                <w:sz w:val="14"/>
-              </w:rPr>
-              <w:t>PRISE EN CHARGE</w:t>
             </w:r>
           </w:p>
         </w:tc>
@@ -3289,21 +2855,6 @@
                 <w:sz w:val="26"/>
               </w:rPr>
               <w:t>B.  Traitement médicamenteux</w:t>
-            </w:r>
-          </w:p>
-          <w:p>
-            <w:pPr>
-              <w:jc w:val="center"/>
-            </w:pPr>
-            <w:r>
-              <w:rPr>
-                <w:rFonts w:ascii="Inter" w:hAnsi="Inter"/>
-                <w:b/>
-                <w:color w:val="15803D"/>
-                <w:spacing w:val="18"/>
-                <w:sz w:val="14"/>
-              </w:rPr>
-              <w:t>PRISE EN CHARGE</w:t>
             </w:r>
           </w:p>
         </w:tc>
@@ -5830,7 +5381,7 @@
         <w:drawing>
           <wp:inline xmlns:a="http://schemas.openxmlformats.org/drawingml/2006/main" xmlns:pic="http://schemas.openxmlformats.org/drawingml/2006/picture">
             <wp:extent cx="792000" cy="396000"/>
-            <wp:docPr id="2" name="Picture 2"/>
+            <wp:docPr id="4" name="Picture 4"/>
             <wp:cNvGraphicFramePr>
               <a:graphicFrameLocks noChangeAspect="1"/>
             </wp:cNvGraphicFramePr>

</xml_diff>

<commit_message>
Corrige la pagination : plan/fiche éclair sur 1 page, figures et bannières intégrées
- Plan et fiche éclair : mise en page compacte garantissant une seule page.
- Pagination : pastille numéro de page en bas à droite de chaque page.
- Figures : taille réduite et intégrées comme lignes de tableau (jamais une
  page réduite à une seule image).
- Bannières de partie : converties en première ligne de tableau et corps en
  flux continu — plus jamais de page réduite à un seul en-tête.

https://claude.ai/code/session_019UxbrWiVNiHBdkHsxX6ghC
</commit_message>
<xml_diff>
--- a/examples/Cardiologie_Hypertension-Arterielle_2025-2026.docx
+++ b/examples/Cardiologie_Hypertension-Arterielle_2025-2026.docx
@@ -623,6 +623,7 @@
     </w:p>
     <w:p>
       <w:pPr>
+        <w:keepNext/>
         <w:shd w:val="clear" w:color="auto" w:fill="E11D48"/>
         <w:spacing w:before="40" w:after="200"/>
       </w:pPr>
@@ -1305,66 +1306,75 @@
           </w:p>
         </w:tc>
       </w:tr>
+      <w:tr>
+        <w:tc>
+          <w:tcPr>
+            <w:tcW w:type="dxa" w:w="9865"/>
+            <w:gridSpan w:val="2"/>
+            <w:vAlign w:val="center"/>
+          </w:tcPr>
+          <w:p>
+            <w:pPr>
+              <w:spacing w:before="60"/>
+              <w:jc w:val="center"/>
+            </w:pPr>
+            <w:r>
+              <w:drawing>
+                <wp:inline xmlns:a="http://schemas.openxmlformats.org/drawingml/2006/main" xmlns:pic="http://schemas.openxmlformats.org/drawingml/2006/picture">
+                  <wp:extent cx="4752000" cy="2128500"/>
+                  <wp:docPr id="2" name="Picture 2"/>
+                  <wp:cNvGraphicFramePr>
+                    <a:graphicFrameLocks noChangeAspect="1"/>
+                  </wp:cNvGraphicFramePr>
+                  <a:graphic>
+                    <a:graphicData uri="http://schemas.openxmlformats.org/drawingml/2006/picture">
+                      <pic:pic>
+                        <pic:nvPicPr>
+                          <pic:cNvPr id="0" name="figure_01.png"/>
+                          <pic:cNvPicPr/>
+                        </pic:nvPicPr>
+                        <pic:blipFill>
+                          <a:blip r:embed="rId12"/>
+                          <a:stretch>
+                            <a:fillRect/>
+                          </a:stretch>
+                        </pic:blipFill>
+                        <pic:spPr>
+                          <a:xfrm>
+                            <a:off x="0" y="0"/>
+                            <a:ext cx="4752000" cy="2128500"/>
+                          </a:xfrm>
+                          <a:prstGeom prst="rect"/>
+                        </pic:spPr>
+                      </pic:pic>
+                    </a:graphicData>
+                  </a:graphic>
+                </wp:inline>
+              </w:drawing>
+            </w:r>
+          </w:p>
+          <w:p>
+            <w:pPr>
+              <w:spacing w:before="20" w:after="60"/>
+              <w:jc w:val="center"/>
+            </w:pPr>
+            <w:r>
+              <w:rPr>
+                <w:rFonts w:ascii="Cormorant Garamond" w:hAnsi="Cormorant Garamond"/>
+                <w:i/>
+                <w:color w:val="9CA3AF"/>
+                <w:sz w:val="18"/>
+              </w:rPr>
+              <w:t>Figure 1 — Étapes de la démarche diagnostique devant une pression artérielle élevée.</w:t>
+            </w:r>
+          </w:p>
+        </w:tc>
+      </w:tr>
     </w:tbl>
     <w:p>
       <w:pPr>
         <w:spacing w:after="80"/>
       </w:pPr>
-    </w:p>
-    <w:p>
-      <w:pPr>
-        <w:spacing w:before="160"/>
-        <w:jc w:val="center"/>
-      </w:pPr>
-      <w:r>
-        <w:drawing>
-          <wp:inline xmlns:a="http://schemas.openxmlformats.org/drawingml/2006/main" xmlns:pic="http://schemas.openxmlformats.org/drawingml/2006/picture">
-            <wp:extent cx="5400000" cy="2418750"/>
-            <wp:docPr id="2" name="Picture 2"/>
-            <wp:cNvGraphicFramePr>
-              <a:graphicFrameLocks noChangeAspect="1"/>
-            </wp:cNvGraphicFramePr>
-            <a:graphic>
-              <a:graphicData uri="http://schemas.openxmlformats.org/drawingml/2006/picture">
-                <pic:pic>
-                  <pic:nvPicPr>
-                    <pic:cNvPr id="0" name="figure_01.png"/>
-                    <pic:cNvPicPr/>
-                  </pic:nvPicPr>
-                  <pic:blipFill>
-                    <a:blip r:embed="rId12"/>
-                    <a:stretch>
-                      <a:fillRect/>
-                    </a:stretch>
-                  </pic:blipFill>
-                  <pic:spPr>
-                    <a:xfrm>
-                      <a:off x="0" y="0"/>
-                      <a:ext cx="5400000" cy="2418750"/>
-                    </a:xfrm>
-                    <a:prstGeom prst="rect"/>
-                  </pic:spPr>
-                </pic:pic>
-              </a:graphicData>
-            </a:graphic>
-          </wp:inline>
-        </w:drawing>
-      </w:r>
-    </w:p>
-    <w:p>
-      <w:pPr>
-        <w:spacing w:after="160"/>
-        <w:jc w:val="center"/>
-      </w:pPr>
-      <w:r>
-        <w:rPr>
-          <w:rFonts w:ascii="Cormorant Garamond" w:hAnsi="Cormorant Garamond"/>
-          <w:i/>
-          <w:color w:val="9CA3AF"/>
-          <w:sz w:val="19"/>
-        </w:rPr>
-        <w:t>Figure 1 — Étapes de la démarche diagnostique devant une pression artérielle élevée.</w:t>
-      </w:r>
     </w:p>
     <w:tbl>
       <w:tblPr>
@@ -1729,6 +1739,7 @@
     </w:p>
     <w:p>
       <w:pPr>
+        <w:keepNext/>
         <w:shd w:val="clear" w:color="auto" w:fill="E11D48"/>
         <w:spacing w:before="40" w:after="200"/>
       </w:pPr>
@@ -2474,66 +2485,75 @@
           </w:p>
         </w:tc>
       </w:tr>
+      <w:tr>
+        <w:tc>
+          <w:tcPr>
+            <w:tcW w:type="dxa" w:w="9865"/>
+            <w:gridSpan w:val="2"/>
+            <w:vAlign w:val="center"/>
+          </w:tcPr>
+          <w:p>
+            <w:pPr>
+              <w:spacing w:before="60"/>
+              <w:jc w:val="center"/>
+            </w:pPr>
+            <w:r>
+              <w:drawing>
+                <wp:inline xmlns:a="http://schemas.openxmlformats.org/drawingml/2006/main" xmlns:pic="http://schemas.openxmlformats.org/drawingml/2006/picture">
+                  <wp:extent cx="4752000" cy="2128500"/>
+                  <wp:docPr id="3" name="Picture 3"/>
+                  <wp:cNvGraphicFramePr>
+                    <a:graphicFrameLocks noChangeAspect="1"/>
+                  </wp:cNvGraphicFramePr>
+                  <a:graphic>
+                    <a:graphicData uri="http://schemas.openxmlformats.org/drawingml/2006/picture">
+                      <pic:pic>
+                        <pic:nvPicPr>
+                          <pic:cNvPr id="0" name="figure_02.png"/>
+                          <pic:cNvPicPr/>
+                        </pic:nvPicPr>
+                        <pic:blipFill>
+                          <a:blip r:embed="rId13"/>
+                          <a:stretch>
+                            <a:fillRect/>
+                          </a:stretch>
+                        </pic:blipFill>
+                        <pic:spPr>
+                          <a:xfrm>
+                            <a:off x="0" y="0"/>
+                            <a:ext cx="4752000" cy="2128500"/>
+                          </a:xfrm>
+                          <a:prstGeom prst="rect"/>
+                        </pic:spPr>
+                      </pic:pic>
+                    </a:graphicData>
+                  </a:graphic>
+                </wp:inline>
+              </w:drawing>
+            </w:r>
+          </w:p>
+          <w:p>
+            <w:pPr>
+              <w:spacing w:before="20" w:after="60"/>
+              <w:jc w:val="center"/>
+            </w:pPr>
+            <w:r>
+              <w:rPr>
+                <w:rFonts w:ascii="Cormorant Garamond" w:hAnsi="Cormorant Garamond"/>
+                <w:i/>
+                <w:color w:val="9CA3AF"/>
+                <w:sz w:val="18"/>
+              </w:rPr>
+              <w:t>Figure 2 — Principaux organes cibles atteints par l'hypertension artérielle.</w:t>
+            </w:r>
+          </w:p>
+        </w:tc>
+      </w:tr>
     </w:tbl>
     <w:p>
       <w:pPr>
         <w:spacing w:after="80"/>
       </w:pPr>
-    </w:p>
-    <w:p>
-      <w:pPr>
-        <w:spacing w:before="160"/>
-        <w:jc w:val="center"/>
-      </w:pPr>
-      <w:r>
-        <w:drawing>
-          <wp:inline xmlns:a="http://schemas.openxmlformats.org/drawingml/2006/main" xmlns:pic="http://schemas.openxmlformats.org/drawingml/2006/picture">
-            <wp:extent cx="5400000" cy="2418750"/>
-            <wp:docPr id="3" name="Picture 3"/>
-            <wp:cNvGraphicFramePr>
-              <a:graphicFrameLocks noChangeAspect="1"/>
-            </wp:cNvGraphicFramePr>
-            <a:graphic>
-              <a:graphicData uri="http://schemas.openxmlformats.org/drawingml/2006/picture">
-                <pic:pic>
-                  <pic:nvPicPr>
-                    <pic:cNvPr id="0" name="figure_02.png"/>
-                    <pic:cNvPicPr/>
-                  </pic:nvPicPr>
-                  <pic:blipFill>
-                    <a:blip r:embed="rId13"/>
-                    <a:stretch>
-                      <a:fillRect/>
-                    </a:stretch>
-                  </pic:blipFill>
-                  <pic:spPr>
-                    <a:xfrm>
-                      <a:off x="0" y="0"/>
-                      <a:ext cx="5400000" cy="2418750"/>
-                    </a:xfrm>
-                    <a:prstGeom prst="rect"/>
-                  </pic:spPr>
-                </pic:pic>
-              </a:graphicData>
-            </a:graphic>
-          </wp:inline>
-        </w:drawing>
-      </w:r>
-    </w:p>
-    <w:p>
-      <w:pPr>
-        <w:spacing w:after="160"/>
-        <w:jc w:val="center"/>
-      </w:pPr>
-      <w:r>
-        <w:rPr>
-          <w:rFonts w:ascii="Cormorant Garamond" w:hAnsi="Cormorant Garamond"/>
-          <w:i/>
-          <w:color w:val="9CA3AF"/>
-          <w:sz w:val="19"/>
-        </w:rPr>
-        <w:t>Figure 2 — Principaux organes cibles atteints par l'hypertension artérielle.</w:t>
-      </w:r>
     </w:p>
     <w:p>
       <w:r>
@@ -2542,6 +2562,7 @@
     </w:p>
     <w:p>
       <w:pPr>
+        <w:keepNext/>
         <w:shd w:val="clear" w:color="auto" w:fill="E11D48"/>
         <w:spacing w:before="40" w:after="200"/>
       </w:pPr>
@@ -3539,6 +3560,7 @@
     </w:p>
     <w:p>
       <w:pPr>
+        <w:keepNext/>
         <w:shd w:val="clear" w:color="auto" w:fill="E11D48"/>
         <w:spacing w:before="40" w:after="200"/>
       </w:pPr>
@@ -3773,6 +3795,7 @@
     </w:p>
     <w:p>
       <w:pPr>
+        <w:keepNext/>
         <w:shd w:val="clear" w:color="auto" w:fill="E11D48"/>
         <w:spacing w:before="40" w:after="200"/>
       </w:pPr>
@@ -5444,7 +5467,9 @@
   <w:p>
     <w:pPr>
       <w:pStyle w:val="Footer"/>
-      <w:jc w:val="center"/>
+      <w:tabs>
+        <w:tab w:pos="9865" w:val="right"/>
+      </w:tabs>
     </w:pPr>
     <w:r/>
     <w:r>
@@ -5455,6 +5480,38 @@
         <w:sz w:val="16"/>
       </w:rPr>
       <w:t>MAJOR ECN  ·  2025-2026</w:t>
+      <w:tab/>
+    </w:r>
+    <w:r>
+      <w:rPr>
+        <w:rFonts w:ascii="Inter" w:hAnsi="Inter"/>
+        <w:b/>
+        <w:color w:val="E11D48"/>
+        <w:sz w:val="17"/>
+      </w:rPr>
+      <w:fldChar w:fldCharType="begin"/>
+      <w:instrText xml:space="preserve">PAGE</w:instrText>
+      <w:fldChar w:fldCharType="end"/>
+    </w:r>
+    <w:r>
+      <w:rPr>
+        <w:rFonts w:ascii="Inter" w:hAnsi="Inter"/>
+        <w:b/>
+        <w:color w:val="E11D48"/>
+        <w:sz w:val="17"/>
+      </w:rPr>
+      <w:t xml:space="preserve">  /  </w:t>
+    </w:r>
+    <w:r>
+      <w:rPr>
+        <w:rFonts w:ascii="Inter" w:hAnsi="Inter"/>
+        <w:b/>
+        <w:color w:val="E11D48"/>
+        <w:sz w:val="17"/>
+      </w:rPr>
+      <w:fldChar w:fldCharType="begin"/>
+      <w:instrText xml:space="preserve">NUMPAGES</w:instrText>
+      <w:fldChar w:fldCharType="end"/>
     </w:r>
   </w:p>
 </w:ftr>
@@ -5468,21 +5525,8 @@
       <w:pBdr>
         <w:bottom w:val="single" w:sz="6" w:space="4" w:color="E11D48"/>
       </w:pBdr>
-      <w:tabs>
-        <w:tab w:pos="9865" w:val="right"/>
-      </w:tabs>
     </w:pPr>
     <w:r/>
-    <w:r>
-      <w:rPr>
-        <w:rFonts w:ascii="Inter" w:hAnsi="Inter"/>
-        <w:color w:val="9CA3AF"/>
-        <w:sz w:val="16"/>
-      </w:rPr>
-      <w:fldChar w:fldCharType="begin"/>
-      <w:instrText xml:space="preserve">PAGE</w:instrText>
-      <w:fldChar w:fldCharType="end"/>
-    </w:r>
     <w:r>
       <w:rPr>
         <w:rFonts w:ascii="Inter" w:hAnsi="Inter"/>
@@ -5490,7 +5534,6 @@
         <w:color w:val="9CA3AF"/>
         <w:sz w:val="16"/>
       </w:rPr>
-      <w:tab/>
       <w:t>Hypertension Artérielle</w:t>
     </w:r>
   </w:p>

</xml_diff>

<commit_message>
Retire la section algorithmes et empêche tout bloc de se couper entre deux pages
- Supprime entièrement la section « Algorithmes décisionnels » du pipeline,
  du modèle, des rendus et des fiches.
- Aucun bloc ne se coupe désormais entre deux pages : les lignes de tableau
  (dont les encadrés-réflexe) ne se fractionnent plus (CSS break-inside +
  OOXML cantSplit).
- Les figures sont intégrées dans la cellule de la dernière ligne de chaque
  sous-partie, donc ni isolées sur une page ni coupées.

https://claude.ai/code/session_019UxbrWiVNiHBdkHsxX6ghC
</commit_message>
<xml_diff>
--- a/examples/Cardiologie_Hypertension-Arterielle_2025-2026.docx
+++ b/examples/Cardiologie_Hypertension-Arterielle_2025-2026.docx
@@ -658,6 +658,7 @@
       </w:tblGrid>
       <w:tr>
         <w:trPr>
+          <w:cantSplit/>
           <w:tblHeader w:val="true"/>
         </w:trPr>
         <w:tc>
@@ -705,6 +706,9 @@
         </w:tc>
       </w:tr>
       <w:tr>
+        <w:trPr>
+          <w:cantSplit/>
+        </w:trPr>
         <w:tc>
           <w:tcPr>
             <w:tcW w:type="dxa" w:w="2663"/>
@@ -903,6 +907,9 @@
         </w:tc>
       </w:tr>
       <w:tr>
+        <w:trPr>
+          <w:cantSplit/>
+        </w:trPr>
         <w:tc>
           <w:tcPr>
             <w:tcW w:type="dxa" w:w="2663"/>
@@ -961,6 +968,9 @@
               <w:gridCol w:w="2400"/>
             </w:tblGrid>
             <w:tr>
+              <w:trPr>
+                <w:cantSplit/>
+              </w:trPr>
               <w:tc>
                 <w:tcPr>
                   <w:tcW w:type="dxa" w:w="2400"/>
@@ -1026,6 +1036,9 @@
               </w:tc>
             </w:tr>
             <w:tr>
+              <w:trPr>
+                <w:cantSplit/>
+              </w:trPr>
               <w:tc>
                 <w:tcPr>
                   <w:tcW w:type="dxa" w:w="2400"/>
@@ -1088,6 +1101,9 @@
               </w:tc>
             </w:tr>
             <w:tr>
+              <w:trPr>
+                <w:cantSplit/>
+              </w:trPr>
               <w:tc>
                 <w:tcPr>
                   <w:tcW w:type="dxa" w:w="2400"/>
@@ -1153,6 +1169,9 @@
               </w:tc>
             </w:tr>
             <w:tr>
+              <w:trPr>
+                <w:cantSplit/>
+              </w:trPr>
               <w:tc>
                 <w:tcPr>
                   <w:tcW w:type="dxa" w:w="2400"/>
@@ -1221,9 +1240,67 @@
               <w:spacing w:after="80"/>
             </w:pPr>
           </w:p>
+          <w:p>
+            <w:pPr>
+              <w:spacing w:before="80"/>
+              <w:jc w:val="center"/>
+            </w:pPr>
+            <w:r>
+              <w:drawing>
+                <wp:inline xmlns:a="http://schemas.openxmlformats.org/drawingml/2006/main" xmlns:pic="http://schemas.openxmlformats.org/drawingml/2006/picture">
+                  <wp:extent cx="4248000" cy="1902750"/>
+                  <wp:docPr id="2" name="Picture 2"/>
+                  <wp:cNvGraphicFramePr>
+                    <a:graphicFrameLocks noChangeAspect="1"/>
+                  </wp:cNvGraphicFramePr>
+                  <a:graphic>
+                    <a:graphicData uri="http://schemas.openxmlformats.org/drawingml/2006/picture">
+                      <pic:pic>
+                        <pic:nvPicPr>
+                          <pic:cNvPr id="0" name="figure_01.png"/>
+                          <pic:cNvPicPr/>
+                        </pic:nvPicPr>
+                        <pic:blipFill>
+                          <a:blip r:embed="rId12"/>
+                          <a:stretch>
+                            <a:fillRect/>
+                          </a:stretch>
+                        </pic:blipFill>
+                        <pic:spPr>
+                          <a:xfrm>
+                            <a:off x="0" y="0"/>
+                            <a:ext cx="4248000" cy="1902750"/>
+                          </a:xfrm>
+                          <a:prstGeom prst="rect"/>
+                        </pic:spPr>
+                      </pic:pic>
+                    </a:graphicData>
+                  </a:graphic>
+                </wp:inline>
+              </w:drawing>
+            </w:r>
+          </w:p>
+          <w:p>
+            <w:pPr>
+              <w:spacing w:before="20" w:after="60"/>
+              <w:jc w:val="center"/>
+            </w:pPr>
+            <w:r>
+              <w:rPr>
+                <w:rFonts w:ascii="Cormorant Garamond" w:hAnsi="Cormorant Garamond"/>
+                <w:i/>
+                <w:color w:val="9CA3AF"/>
+                <w:sz w:val="18"/>
+              </w:rPr>
+              <w:t>Figure 1 — Étapes de la démarche diagnostique devant une pression artérielle élevée.</w:t>
+            </w:r>
+          </w:p>
         </w:tc>
       </w:tr>
       <w:tr>
+        <w:trPr>
+          <w:cantSplit/>
+        </w:trPr>
         <w:tc>
           <w:tcPr>
             <w:tcW w:type="dxa" w:w="9865"/>
@@ -1306,70 +1383,6 @@
           </w:p>
         </w:tc>
       </w:tr>
-      <w:tr>
-        <w:tc>
-          <w:tcPr>
-            <w:tcW w:type="dxa" w:w="9865"/>
-            <w:gridSpan w:val="2"/>
-            <w:vAlign w:val="center"/>
-          </w:tcPr>
-          <w:p>
-            <w:pPr>
-              <w:spacing w:before="60"/>
-              <w:jc w:val="center"/>
-            </w:pPr>
-            <w:r>
-              <w:drawing>
-                <wp:inline xmlns:a="http://schemas.openxmlformats.org/drawingml/2006/main" xmlns:pic="http://schemas.openxmlformats.org/drawingml/2006/picture">
-                  <wp:extent cx="4752000" cy="2128500"/>
-                  <wp:docPr id="2" name="Picture 2"/>
-                  <wp:cNvGraphicFramePr>
-                    <a:graphicFrameLocks noChangeAspect="1"/>
-                  </wp:cNvGraphicFramePr>
-                  <a:graphic>
-                    <a:graphicData uri="http://schemas.openxmlformats.org/drawingml/2006/picture">
-                      <pic:pic>
-                        <pic:nvPicPr>
-                          <pic:cNvPr id="0" name="figure_01.png"/>
-                          <pic:cNvPicPr/>
-                        </pic:nvPicPr>
-                        <pic:blipFill>
-                          <a:blip r:embed="rId12"/>
-                          <a:stretch>
-                            <a:fillRect/>
-                          </a:stretch>
-                        </pic:blipFill>
-                        <pic:spPr>
-                          <a:xfrm>
-                            <a:off x="0" y="0"/>
-                            <a:ext cx="4752000" cy="2128500"/>
-                          </a:xfrm>
-                          <a:prstGeom prst="rect"/>
-                        </pic:spPr>
-                      </pic:pic>
-                    </a:graphicData>
-                  </a:graphic>
-                </wp:inline>
-              </w:drawing>
-            </w:r>
-          </w:p>
-          <w:p>
-            <w:pPr>
-              <w:spacing w:before="20" w:after="60"/>
-              <w:jc w:val="center"/>
-            </w:pPr>
-            <w:r>
-              <w:rPr>
-                <w:rFonts w:ascii="Cormorant Garamond" w:hAnsi="Cormorant Garamond"/>
-                <w:i/>
-                <w:color w:val="9CA3AF"/>
-                <w:sz w:val="18"/>
-              </w:rPr>
-              <w:t>Figure 1 — Étapes de la démarche diagnostique devant une pression artérielle élevée.</w:t>
-            </w:r>
-          </w:p>
-        </w:tc>
-      </w:tr>
     </w:tbl>
     <w:p>
       <w:pPr>
@@ -1397,6 +1410,7 @@
       </w:tblGrid>
       <w:tr>
         <w:trPr>
+          <w:cantSplit/>
           <w:tblHeader w:val="true"/>
         </w:trPr>
         <w:tc>
@@ -1444,6 +1458,9 @@
         </w:tc>
       </w:tr>
       <w:tr>
+        <w:trPr>
+          <w:cantSplit/>
+        </w:trPr>
         <w:tc>
           <w:tcPr>
             <w:tcW w:type="dxa" w:w="2663"/>
@@ -1552,6 +1569,9 @@
         </w:tc>
       </w:tr>
       <w:tr>
+        <w:trPr>
+          <w:cantSplit/>
+        </w:trPr>
         <w:tc>
           <w:tcPr>
             <w:tcW w:type="dxa" w:w="2663"/>
@@ -1664,6 +1684,9 @@
         </w:tc>
       </w:tr>
       <w:tr>
+        <w:trPr>
+          <w:cantSplit/>
+        </w:trPr>
         <w:tc>
           <w:tcPr>
             <w:tcW w:type="dxa" w:w="9865"/>
@@ -1774,6 +1797,7 @@
       </w:tblGrid>
       <w:tr>
         <w:trPr>
+          <w:cantSplit/>
           <w:tblHeader w:val="true"/>
         </w:trPr>
         <w:tc>
@@ -1821,6 +1845,9 @@
         </w:tc>
       </w:tr>
       <w:tr>
+        <w:trPr>
+          <w:cantSplit/>
+        </w:trPr>
         <w:tc>
           <w:tcPr>
             <w:tcW w:type="dxa" w:w="2663"/>
@@ -1939,6 +1966,9 @@
         </w:tc>
       </w:tr>
       <w:tr>
+        <w:trPr>
+          <w:cantSplit/>
+        </w:trPr>
         <w:tc>
           <w:tcPr>
             <w:tcW w:type="dxa" w:w="2663"/>
@@ -2077,6 +2107,9 @@
         </w:tc>
       </w:tr>
       <w:tr>
+        <w:trPr>
+          <w:cantSplit/>
+        </w:trPr>
         <w:tc>
           <w:tcPr>
             <w:tcW w:type="dxa" w:w="9865"/>
@@ -2166,6 +2199,7 @@
       </w:tblGrid>
       <w:tr>
         <w:trPr>
+          <w:cantSplit/>
           <w:tblHeader w:val="true"/>
         </w:trPr>
         <w:tc>
@@ -2213,6 +2247,9 @@
         </w:tc>
       </w:tr>
       <w:tr>
+        <w:trPr>
+          <w:cantSplit/>
+        </w:trPr>
         <w:tc>
           <w:tcPr>
             <w:tcW w:type="dxa" w:w="2663"/>
@@ -2351,6 +2388,9 @@
         </w:tc>
       </w:tr>
       <w:tr>
+        <w:trPr>
+          <w:cantSplit/>
+        </w:trPr>
         <w:tc>
           <w:tcPr>
             <w:tcW w:type="dxa" w:w="2663"/>
@@ -2410,9 +2450,67 @@
               <w:t>bilan lipidique, créatininémie</w:t>
             </w:r>
           </w:p>
+          <w:p>
+            <w:pPr>
+              <w:spacing w:before="80"/>
+              <w:jc w:val="center"/>
+            </w:pPr>
+            <w:r>
+              <w:drawing>
+                <wp:inline xmlns:a="http://schemas.openxmlformats.org/drawingml/2006/main" xmlns:pic="http://schemas.openxmlformats.org/drawingml/2006/picture">
+                  <wp:extent cx="4248000" cy="1902750"/>
+                  <wp:docPr id="3" name="Picture 3"/>
+                  <wp:cNvGraphicFramePr>
+                    <a:graphicFrameLocks noChangeAspect="1"/>
+                  </wp:cNvGraphicFramePr>
+                  <a:graphic>
+                    <a:graphicData uri="http://schemas.openxmlformats.org/drawingml/2006/picture">
+                      <pic:pic>
+                        <pic:nvPicPr>
+                          <pic:cNvPr id="0" name="figure_02.png"/>
+                          <pic:cNvPicPr/>
+                        </pic:nvPicPr>
+                        <pic:blipFill>
+                          <a:blip r:embed="rId13"/>
+                          <a:stretch>
+                            <a:fillRect/>
+                          </a:stretch>
+                        </pic:blipFill>
+                        <pic:spPr>
+                          <a:xfrm>
+                            <a:off x="0" y="0"/>
+                            <a:ext cx="4248000" cy="1902750"/>
+                          </a:xfrm>
+                          <a:prstGeom prst="rect"/>
+                        </pic:spPr>
+                      </pic:pic>
+                    </a:graphicData>
+                  </a:graphic>
+                </wp:inline>
+              </w:drawing>
+            </w:r>
+          </w:p>
+          <w:p>
+            <w:pPr>
+              <w:spacing w:before="20" w:after="60"/>
+              <w:jc w:val="center"/>
+            </w:pPr>
+            <w:r>
+              <w:rPr>
+                <w:rFonts w:ascii="Cormorant Garamond" w:hAnsi="Cormorant Garamond"/>
+                <w:i/>
+                <w:color w:val="9CA3AF"/>
+                <w:sz w:val="18"/>
+              </w:rPr>
+              <w:t>Figure 2 — Principaux organes cibles atteints par l'hypertension artérielle.</w:t>
+            </w:r>
+          </w:p>
         </w:tc>
       </w:tr>
       <w:tr>
+        <w:trPr>
+          <w:cantSplit/>
+        </w:trPr>
         <w:tc>
           <w:tcPr>
             <w:tcW w:type="dxa" w:w="9865"/>
@@ -2485,70 +2583,6 @@
           </w:p>
         </w:tc>
       </w:tr>
-      <w:tr>
-        <w:tc>
-          <w:tcPr>
-            <w:tcW w:type="dxa" w:w="9865"/>
-            <w:gridSpan w:val="2"/>
-            <w:vAlign w:val="center"/>
-          </w:tcPr>
-          <w:p>
-            <w:pPr>
-              <w:spacing w:before="60"/>
-              <w:jc w:val="center"/>
-            </w:pPr>
-            <w:r>
-              <w:drawing>
-                <wp:inline xmlns:a="http://schemas.openxmlformats.org/drawingml/2006/main" xmlns:pic="http://schemas.openxmlformats.org/drawingml/2006/picture">
-                  <wp:extent cx="4752000" cy="2128500"/>
-                  <wp:docPr id="3" name="Picture 3"/>
-                  <wp:cNvGraphicFramePr>
-                    <a:graphicFrameLocks noChangeAspect="1"/>
-                  </wp:cNvGraphicFramePr>
-                  <a:graphic>
-                    <a:graphicData uri="http://schemas.openxmlformats.org/drawingml/2006/picture">
-                      <pic:pic>
-                        <pic:nvPicPr>
-                          <pic:cNvPr id="0" name="figure_02.png"/>
-                          <pic:cNvPicPr/>
-                        </pic:nvPicPr>
-                        <pic:blipFill>
-                          <a:blip r:embed="rId13"/>
-                          <a:stretch>
-                            <a:fillRect/>
-                          </a:stretch>
-                        </pic:blipFill>
-                        <pic:spPr>
-                          <a:xfrm>
-                            <a:off x="0" y="0"/>
-                            <a:ext cx="4752000" cy="2128500"/>
-                          </a:xfrm>
-                          <a:prstGeom prst="rect"/>
-                        </pic:spPr>
-                      </pic:pic>
-                    </a:graphicData>
-                  </a:graphic>
-                </wp:inline>
-              </w:drawing>
-            </w:r>
-          </w:p>
-          <w:p>
-            <w:pPr>
-              <w:spacing w:before="20" w:after="60"/>
-              <w:jc w:val="center"/>
-            </w:pPr>
-            <w:r>
-              <w:rPr>
-                <w:rFonts w:ascii="Cormorant Garamond" w:hAnsi="Cormorant Garamond"/>
-                <w:i/>
-                <w:color w:val="9CA3AF"/>
-                <w:sz w:val="18"/>
-              </w:rPr>
-              <w:t>Figure 2 — Principaux organes cibles atteints par l'hypertension artérielle.</w:t>
-            </w:r>
-          </w:p>
-        </w:tc>
-      </w:tr>
     </w:tbl>
     <w:p>
       <w:pPr>
@@ -2597,6 +2631,7 @@
       </w:tblGrid>
       <w:tr>
         <w:trPr>
+          <w:cantSplit/>
           <w:tblHeader w:val="true"/>
         </w:trPr>
         <w:tc>
@@ -2644,6 +2679,9 @@
         </w:tc>
       </w:tr>
       <w:tr>
+        <w:trPr>
+          <w:cantSplit/>
+        </w:trPr>
         <w:tc>
           <w:tcPr>
             <w:tcW w:type="dxa" w:w="2663"/>
@@ -2834,6 +2872,7 @@
       </w:tblGrid>
       <w:tr>
         <w:trPr>
+          <w:cantSplit/>
           <w:tblHeader w:val="true"/>
         </w:trPr>
         <w:tc>
@@ -2881,6 +2920,9 @@
         </w:tc>
       </w:tr>
       <w:tr>
+        <w:trPr>
+          <w:cantSplit/>
+        </w:trPr>
         <w:tc>
           <w:tcPr>
             <w:tcW w:type="dxa" w:w="2663"/>
@@ -2939,6 +2981,9 @@
               <w:gridCol w:w="2400"/>
             </w:tblGrid>
             <w:tr>
+              <w:trPr>
+                <w:cantSplit/>
+              </w:trPr>
               <w:tc>
                 <w:tcPr>
                   <w:tcW w:type="dxa" w:w="2400"/>
@@ -3004,6 +3049,9 @@
               </w:tc>
             </w:tr>
             <w:tr>
+              <w:trPr>
+                <w:cantSplit/>
+              </w:trPr>
               <w:tc>
                 <w:tcPr>
                   <w:tcW w:type="dxa" w:w="2400"/>
@@ -3066,6 +3114,9 @@
               </w:tc>
             </w:tr>
             <w:tr>
+              <w:trPr>
+                <w:cantSplit/>
+              </w:trPr>
               <w:tc>
                 <w:tcPr>
                   <w:tcW w:type="dxa" w:w="2400"/>
@@ -3131,6 +3182,9 @@
               </w:tc>
             </w:tr>
             <w:tr>
+              <w:trPr>
+                <w:cantSplit/>
+              </w:trPr>
               <w:tc>
                 <w:tcPr>
                   <w:tcW w:type="dxa" w:w="2400"/>
@@ -3193,6 +3247,9 @@
               </w:tc>
             </w:tr>
             <w:tr>
+              <w:trPr>
+                <w:cantSplit/>
+              </w:trPr>
               <w:tc>
                 <w:tcPr>
                   <w:tcW w:type="dxa" w:w="2400"/>
@@ -3267,6 +3324,9 @@
         </w:tc>
       </w:tr>
       <w:tr>
+        <w:trPr>
+          <w:cantSplit/>
+        </w:trPr>
         <w:tc>
           <w:tcPr>
             <w:tcW w:type="dxa" w:w="2663"/>
@@ -3405,6 +3465,9 @@
         </w:tc>
       </w:tr>
       <w:tr>
+        <w:trPr>
+          <w:cantSplit/>
+        </w:trPr>
         <w:tc>
           <w:tcPr>
             <w:tcW w:type="dxa" w:w="9865"/>
@@ -3571,241 +3634,6 @@
           <w:color w:val="FFFFFF"/>
           <w:sz w:val="32"/>
         </w:rPr>
-        <w:t>Algorithmes décisionnels</w:t>
-      </w:r>
-    </w:p>
-    <w:p>
-      <w:pPr>
-        <w:spacing w:before="160"/>
-      </w:pPr>
-      <w:r>
-        <w:rPr>
-          <w:rFonts w:ascii="Cormorant Garamond" w:hAnsi="Cormorant Garamond"/>
-          <w:b/>
-          <w:color w:val="E11D48"/>
-          <w:sz w:val="26"/>
-        </w:rPr>
-        <w:t>Démarche diagnostique devant une PA élevée</w:t>
-      </w:r>
-    </w:p>
-    <w:tbl>
-      <w:tblPr>
-        <w:tblW w:type="auto" w:w="0"/>
-        <w:jc w:val="center"/>
-        <w:tblLayout w:type="fixed"/>
-        <w:tblLook w:firstColumn="1" w:firstRow="1" w:lastColumn="0" w:lastRow="0" w:noHBand="0" w:noVBand="1" w:val="04A0"/>
-      </w:tblPr>
-      <w:tblGrid>
-        <w:gridCol w:w="9866"/>
-      </w:tblGrid>
-      <w:tr>
-        <w:tc>
-          <w:tcPr>
-            <w:tcW w:type="dxa" w:w="9865"/>
-            <w:tcBorders>
-              <w:top w:val="single" w:sz="4" w:space="0" w:color="E11D48"/>
-              <w:left w:val="single" w:sz="22" w:space="0" w:color="E11D48"/>
-              <w:bottom w:val="single" w:sz="4" w:space="0" w:color="E11D48"/>
-              <w:right w:val="single" w:sz="4" w:space="0" w:color="E11D48"/>
-            </w:tcBorders>
-            <w:shd w:val="clear" w:color="auto" w:fill="FAF7F2"/>
-          </w:tcPr>
-          <w:p>
-            <w:pPr>
-              <w:pStyle w:val="ListBullet"/>
-              <w:spacing w:after="40"/>
-            </w:pPr>
-            <w:r>
-              <w:rPr>
-                <w:rFonts w:ascii="Inter" w:hAnsi="Inter"/>
-                <w:b w:val="0"/>
-                <w:i w:val="0"/>
-                <w:color w:val="1F2937"/>
-                <w:sz w:val="20"/>
-              </w:rPr>
-              <w:t>PA ≥ 140/90 mmHg au cabinet</w:t>
-            </w:r>
-          </w:p>
-          <w:p>
-            <w:pPr>
-              <w:pStyle w:val="ListBullet2"/>
-              <w:spacing w:after="40"/>
-            </w:pPr>
-            <w:r>
-              <w:rPr>
-                <w:rFonts w:ascii="Inter" w:hAnsi="Inter"/>
-                <w:b w:val="0"/>
-                <w:i w:val="0"/>
-                <w:color w:val="1F2937"/>
-                <w:sz w:val="20"/>
-              </w:rPr>
-              <w:t xml:space="preserve">OUI → confirmer par </w:t>
-            </w:r>
-            <w:r>
-              <w:rPr>
-                <w:rFonts w:ascii="Inter" w:hAnsi="Inter"/>
-                <w:b/>
-                <w:i w:val="0"/>
-                <w:color w:val="BE123C"/>
-                <w:sz w:val="20"/>
-              </w:rPr>
-              <w:t>MAPA</w:t>
-            </w:r>
-            <w:r>
-              <w:rPr>
-                <w:rFonts w:ascii="Inter" w:hAnsi="Inter"/>
-                <w:b w:val="0"/>
-                <w:i w:val="0"/>
-                <w:color w:val="1F2937"/>
-                <w:sz w:val="20"/>
-              </w:rPr>
-              <w:t xml:space="preserve"> ou </w:t>
-            </w:r>
-            <w:r>
-              <w:rPr>
-                <w:rFonts w:ascii="Inter" w:hAnsi="Inter"/>
-                <w:b/>
-                <w:i w:val="0"/>
-                <w:color w:val="BE123C"/>
-                <w:sz w:val="20"/>
-              </w:rPr>
-              <w:t>automesure</w:t>
-            </w:r>
-          </w:p>
-          <w:p>
-            <w:pPr>
-              <w:pStyle w:val="ListBullet3"/>
-              <w:spacing w:after="40"/>
-            </w:pPr>
-            <w:r>
-              <w:rPr>
-                <w:rFonts w:ascii="Inter" w:hAnsi="Inter"/>
-                <w:b w:val="0"/>
-                <w:i w:val="0"/>
-                <w:color w:val="1F2937"/>
-                <w:sz w:val="20"/>
-              </w:rPr>
-              <w:t xml:space="preserve">MAPA ≥ 135/85 → </w:t>
-            </w:r>
-            <w:r>
-              <w:rPr>
-                <w:rFonts w:ascii="Inter" w:hAnsi="Inter"/>
-                <w:b/>
-                <w:i w:val="0"/>
-                <w:color w:val="BE123C"/>
-                <w:sz w:val="20"/>
-              </w:rPr>
-              <w:t>HTA confirmée</w:t>
-            </w:r>
-            <w:r>
-              <w:rPr>
-                <w:rFonts w:ascii="Inter" w:hAnsi="Inter"/>
-                <w:b w:val="0"/>
-                <w:i w:val="0"/>
-                <w:color w:val="1F2937"/>
-                <w:sz w:val="20"/>
-              </w:rPr>
-              <w:t xml:space="preserve"> → bilan + traitement</w:t>
-            </w:r>
-          </w:p>
-          <w:p>
-            <w:pPr>
-              <w:pStyle w:val="ListBullet3"/>
-              <w:spacing w:after="40"/>
-            </w:pPr>
-            <w:r>
-              <w:rPr>
-                <w:rFonts w:ascii="Inter" w:hAnsi="Inter"/>
-                <w:b w:val="0"/>
-                <w:i w:val="0"/>
-                <w:color w:val="1F2937"/>
-                <w:sz w:val="20"/>
-              </w:rPr>
-              <w:t xml:space="preserve">MAPA &lt; 135/85 → </w:t>
-            </w:r>
-            <w:r>
-              <w:rPr>
-                <w:rFonts w:ascii="Inter" w:hAnsi="Inter"/>
-                <w:b/>
-                <w:i w:val="0"/>
-                <w:color w:val="BE123C"/>
-                <w:sz w:val="20"/>
-              </w:rPr>
-              <w:t>HTA blouse blanche</w:t>
-            </w:r>
-            <w:r>
-              <w:rPr>
-                <w:rFonts w:ascii="Inter" w:hAnsi="Inter"/>
-                <w:b w:val="0"/>
-                <w:i w:val="0"/>
-                <w:color w:val="1F2937"/>
-                <w:sz w:val="20"/>
-              </w:rPr>
-              <w:t xml:space="preserve"> → surveillance</w:t>
-            </w:r>
-          </w:p>
-          <w:p>
-            <w:pPr>
-              <w:pStyle w:val="ListBullet2"/>
-              <w:spacing w:after="40"/>
-            </w:pPr>
-            <w:r>
-              <w:rPr>
-                <w:rFonts w:ascii="Inter" w:hAnsi="Inter"/>
-                <w:b w:val="0"/>
-                <w:i w:val="0"/>
-                <w:color w:val="1F2937"/>
-                <w:sz w:val="20"/>
-              </w:rPr>
-              <w:t xml:space="preserve">NON → </w:t>
-            </w:r>
-            <w:r>
-              <w:rPr>
-                <w:rFonts w:ascii="Inter" w:hAnsi="Inter"/>
-                <w:b/>
-                <w:i w:val="0"/>
-                <w:color w:val="BE123C"/>
-                <w:sz w:val="20"/>
-              </w:rPr>
-              <w:t>pas d'HTA</w:t>
-            </w:r>
-            <w:r>
-              <w:rPr>
-                <w:rFonts w:ascii="Inter" w:hAnsi="Inter"/>
-                <w:b w:val="0"/>
-                <w:i w:val="0"/>
-                <w:color w:val="1F2937"/>
-                <w:sz w:val="20"/>
-              </w:rPr>
-              <w:t xml:space="preserve"> → contrôle annuel</w:t>
-            </w:r>
-          </w:p>
-        </w:tc>
-      </w:tr>
-    </w:tbl>
-    <w:p>
-      <w:pPr>
-        <w:spacing w:after="80"/>
-      </w:pPr>
-    </w:p>
-    <w:p>
-      <w:r>
-        <w:br w:type="page"/>
-      </w:r>
-    </w:p>
-    <w:p>
-      <w:pPr>
-        <w:keepNext/>
-        <w:shd w:val="clear" w:color="auto" w:fill="E11D48"/>
-        <w:spacing w:before="40" w:after="200"/>
-      </w:pPr>
-      <w:r>
-        <w:rPr>
-          <w:rFonts w:ascii="Playfair Display" w:hAnsi="Playfair Display"/>
-          <w:b/>
-          <w:color w:val="FFFFFF"/>
-          <w:sz w:val="32"/>
-        </w:rPr>
         <w:t>Synthèse — Tableaux de révision</w:t>
       </w:r>
     </w:p>
@@ -3844,6 +3672,9 @@
         <w:gridCol w:w="3289"/>
       </w:tblGrid>
       <w:tr>
+        <w:trPr>
+          <w:cantSplit/>
+        </w:trPr>
         <w:tc>
           <w:tcPr>
             <w:tcW w:type="dxa" w:w="3289"/>
@@ -3909,6 +3740,9 @@
         </w:tc>
       </w:tr>
       <w:tr>
+        <w:trPr>
+          <w:cantSplit/>
+        </w:trPr>
         <w:tc>
           <w:tcPr>
             <w:tcW w:type="dxa" w:w="3289"/>
@@ -3971,6 +3805,9 @@
         </w:tc>
       </w:tr>
       <w:tr>
+        <w:trPr>
+          <w:cantSplit/>
+        </w:trPr>
         <w:tc>
           <w:tcPr>
             <w:tcW w:type="dxa" w:w="3289"/>
@@ -4036,6 +3873,9 @@
         </w:tc>
       </w:tr>
       <w:tr>
+        <w:trPr>
+          <w:cantSplit/>
+        </w:trPr>
         <w:tc>
           <w:tcPr>
             <w:tcW w:type="dxa" w:w="3289"/>
@@ -4098,6 +3938,9 @@
         </w:tc>
       </w:tr>
       <w:tr>
+        <w:trPr>
+          <w:cantSplit/>
+        </w:trPr>
         <w:tc>
           <w:tcPr>
             <w:tcW w:type="dxa" w:w="3289"/>
@@ -4163,6 +4006,9 @@
         </w:tc>
       </w:tr>
       <w:tr>
+        <w:trPr>
+          <w:cantSplit/>
+        </w:trPr>
         <w:tc>
           <w:tcPr>
             <w:tcW w:type="dxa" w:w="3289"/>
@@ -4265,6 +4111,9 @@
         <w:gridCol w:w="3289"/>
       </w:tblGrid>
       <w:tr>
+        <w:trPr>
+          <w:cantSplit/>
+        </w:trPr>
         <w:tc>
           <w:tcPr>
             <w:tcW w:type="dxa" w:w="3289"/>
@@ -4330,6 +4179,9 @@
         </w:tc>
       </w:tr>
       <w:tr>
+        <w:trPr>
+          <w:cantSplit/>
+        </w:trPr>
         <w:tc>
           <w:tcPr>
             <w:tcW w:type="dxa" w:w="3289"/>
@@ -4392,6 +4244,9 @@
         </w:tc>
       </w:tr>
       <w:tr>
+        <w:trPr>
+          <w:cantSplit/>
+        </w:trPr>
         <w:tc>
           <w:tcPr>
             <w:tcW w:type="dxa" w:w="3289"/>
@@ -4457,6 +4312,9 @@
         </w:tc>
       </w:tr>
       <w:tr>
+        <w:trPr>
+          <w:cantSplit/>
+        </w:trPr>
         <w:tc>
           <w:tcPr>
             <w:tcW w:type="dxa" w:w="3289"/>
@@ -4559,6 +4417,9 @@
         <w:gridCol w:w="3289"/>
       </w:tblGrid>
       <w:tr>
+        <w:trPr>
+          <w:cantSplit/>
+        </w:trPr>
         <w:tc>
           <w:tcPr>
             <w:tcW w:type="dxa" w:w="3289"/>
@@ -4624,6 +4485,9 @@
         </w:tc>
       </w:tr>
       <w:tr>
+        <w:trPr>
+          <w:cantSplit/>
+        </w:trPr>
         <w:tc>
           <w:tcPr>
             <w:tcW w:type="dxa" w:w="3289"/>
@@ -4686,6 +4550,9 @@
         </w:tc>
       </w:tr>
       <w:tr>
+        <w:trPr>
+          <w:cantSplit/>
+        </w:trPr>
         <w:tc>
           <w:tcPr>
             <w:tcW w:type="dxa" w:w="3289"/>
@@ -4751,6 +4618,9 @@
         </w:tc>
       </w:tr>
       <w:tr>
+        <w:trPr>
+          <w:cantSplit/>
+        </w:trPr>
         <w:tc>
           <w:tcPr>
             <w:tcW w:type="dxa" w:w="3289"/>
@@ -4813,6 +4683,9 @@
         </w:tc>
       </w:tr>
       <w:tr>
+        <w:trPr>
+          <w:cantSplit/>
+        </w:trPr>
         <w:tc>
           <w:tcPr>
             <w:tcW w:type="dxa" w:w="3289"/>
@@ -4878,6 +4751,9 @@
         </w:tc>
       </w:tr>
       <w:tr>
+        <w:trPr>
+          <w:cantSplit/>
+        </w:trPr>
         <w:tc>
           <w:tcPr>
             <w:tcW w:type="dxa" w:w="3289"/>

</xml_diff>

<commit_message>
Pagination « page/total », en-têtes de tableau répétés à chaque page
- La pagination affiche désormais « n/total » (le total est le nombre réel
  de pages) ; corrige l'échappement HTML du CSS qui cassait le contenu des
  boîtes de marge.
- La bannière de grande partie et l'en-tête de sous-partie sont placés dans
  un <thead> (PDF) et marqués comme lignes d'en-tête (DOCX) : ils se
  répètent en haut de chaque page occupée par le tableau.
- Les tableaux Markdown sont normalisés avant rendu (ligne vide avant/après,
  désindentation) pour qu'ils ne s'affichent plus jamais en texte brut.

https://claude.ai/code/session_019UxbrWiVNiHBdkHsxX6ghC
</commit_message>
<xml_diff>
--- a/examples/Cardiologie_Hypertension-Arterielle_2025-2026.docx
+++ b/examples/Cardiologie_Hypertension-Arterielle_2025-2026.docx
@@ -621,22 +621,6 @@
         <w:br w:type="page"/>
       </w:r>
     </w:p>
-    <w:p>
-      <w:pPr>
-        <w:keepNext/>
-        <w:shd w:val="clear" w:color="auto" w:fill="E11D48"/>
-        <w:spacing w:before="40" w:after="200"/>
-      </w:pPr>
-      <w:r>
-        <w:rPr>
-          <w:rFonts w:ascii="Playfair Display" w:hAnsi="Playfair Display"/>
-          <w:b/>
-          <w:color w:val="FFFFFF"/>
-          <w:sz w:val="32"/>
-        </w:rPr>
-        <w:t>I.  Définition et épidémiologie</w:t>
-      </w:r>
-    </w:p>
     <w:tbl>
       <w:tblPr>
         <w:tblW w:type="auto" w:w="0"/>
@@ -656,6 +640,49 @@
         <w:gridCol w:w="4933"/>
         <w:gridCol w:w="4933"/>
       </w:tblGrid>
+      <w:tr>
+        <w:trPr>
+          <w:cantSplit/>
+          <w:tblHeader w:val="true"/>
+        </w:trPr>
+        <w:tc>
+          <w:tcPr>
+            <w:tcW w:type="dxa" w:w="9865"/>
+            <w:gridSpan w:val="2"/>
+            <w:tcBorders>
+              <w:top w:val="single" w:sz="4" w:space="0" w:color="E11D48"/>
+              <w:left w:val="single" w:sz="4" w:space="0" w:color="E11D48"/>
+              <w:bottom w:val="single" w:sz="4" w:space="0" w:color="E11D48"/>
+              <w:right w:val="single" w:sz="4" w:space="0" w:color="E11D48"/>
+            </w:tcBorders>
+            <w:shd w:val="clear" w:color="auto" w:fill="E11D48"/>
+            <w:vAlign w:val="center"/>
+          </w:tcPr>
+          <w:p>
+            <w:pPr>
+              <w:spacing w:before="60" w:after="60"/>
+            </w:pPr>
+            <w:r>
+              <w:rPr>
+                <w:rFonts w:ascii="Playfair Display" w:hAnsi="Playfair Display"/>
+                <w:b/>
+                <w:color w:val="C9A961"/>
+                <w:sz w:val="30"/>
+              </w:rPr>
+              <w:t xml:space="preserve">I  </w:t>
+            </w:r>
+            <w:r>
+              <w:rPr>
+                <w:rFonts w:ascii="Playfair Display" w:hAnsi="Playfair Display"/>
+                <w:b/>
+                <w:color w:val="FFFFFF"/>
+                <w:sz w:val="28"/>
+              </w:rPr>
+              <w:t>Définition et épidémiologie</w:t>
+            </w:r>
+          </w:p>
+        </w:tc>
+      </w:tr>
       <w:tr>
         <w:trPr>
           <w:cantSplit/>
@@ -1415,6 +1442,49 @@
         </w:trPr>
         <w:tc>
           <w:tcPr>
+            <w:tcW w:type="dxa" w:w="9865"/>
+            <w:gridSpan w:val="2"/>
+            <w:tcBorders>
+              <w:top w:val="single" w:sz="4" w:space="0" w:color="E11D48"/>
+              <w:left w:val="single" w:sz="4" w:space="0" w:color="E11D48"/>
+              <w:bottom w:val="single" w:sz="4" w:space="0" w:color="E11D48"/>
+              <w:right w:val="single" w:sz="4" w:space="0" w:color="E11D48"/>
+            </w:tcBorders>
+            <w:shd w:val="clear" w:color="auto" w:fill="E11D48"/>
+            <w:vAlign w:val="center"/>
+          </w:tcPr>
+          <w:p>
+            <w:pPr>
+              <w:spacing w:before="60" w:after="60"/>
+            </w:pPr>
+            <w:r>
+              <w:rPr>
+                <w:rFonts w:ascii="Playfair Display" w:hAnsi="Playfair Display"/>
+                <w:b/>
+                <w:color w:val="C9A961"/>
+                <w:sz w:val="30"/>
+              </w:rPr>
+              <w:t xml:space="preserve">I  </w:t>
+            </w:r>
+            <w:r>
+              <w:rPr>
+                <w:rFonts w:ascii="Playfair Display" w:hAnsi="Playfair Display"/>
+                <w:b/>
+                <w:color w:val="FFFFFF"/>
+                <w:sz w:val="28"/>
+              </w:rPr>
+              <w:t>Définition et épidémiologie</w:t>
+            </w:r>
+          </w:p>
+        </w:tc>
+      </w:tr>
+      <w:tr>
+        <w:trPr>
+          <w:cantSplit/>
+          <w:tblHeader w:val="true"/>
+        </w:trPr>
+        <w:tc>
+          <w:tcPr>
             <w:tcW w:type="dxa" w:w="2663"/>
             <w:shd w:val="clear" w:color="auto" w:fill="E11D48"/>
             <w:vAlign w:val="center"/>
@@ -1760,22 +1830,6 @@
         <w:br w:type="page"/>
       </w:r>
     </w:p>
-    <w:p>
-      <w:pPr>
-        <w:keepNext/>
-        <w:shd w:val="clear" w:color="auto" w:fill="E11D48"/>
-        <w:spacing w:before="40" w:after="200"/>
-      </w:pPr>
-      <w:r>
-        <w:rPr>
-          <w:rFonts w:ascii="Playfair Display" w:hAnsi="Playfair Display"/>
-          <w:b/>
-          <w:color w:val="FFFFFF"/>
-          <w:sz w:val="32"/>
-        </w:rPr>
-        <w:t>II.  Diagnostic et bilan initial</w:t>
-      </w:r>
-    </w:p>
     <w:tbl>
       <w:tblPr>
         <w:tblW w:type="auto" w:w="0"/>
@@ -1795,6 +1849,49 @@
         <w:gridCol w:w="4933"/>
         <w:gridCol w:w="4933"/>
       </w:tblGrid>
+      <w:tr>
+        <w:trPr>
+          <w:cantSplit/>
+          <w:tblHeader w:val="true"/>
+        </w:trPr>
+        <w:tc>
+          <w:tcPr>
+            <w:tcW w:type="dxa" w:w="9865"/>
+            <w:gridSpan w:val="2"/>
+            <w:tcBorders>
+              <w:top w:val="single" w:sz="4" w:space="0" w:color="E11D48"/>
+              <w:left w:val="single" w:sz="4" w:space="0" w:color="E11D48"/>
+              <w:bottom w:val="single" w:sz="4" w:space="0" w:color="E11D48"/>
+              <w:right w:val="single" w:sz="4" w:space="0" w:color="E11D48"/>
+            </w:tcBorders>
+            <w:shd w:val="clear" w:color="auto" w:fill="E11D48"/>
+            <w:vAlign w:val="center"/>
+          </w:tcPr>
+          <w:p>
+            <w:pPr>
+              <w:spacing w:before="60" w:after="60"/>
+            </w:pPr>
+            <w:r>
+              <w:rPr>
+                <w:rFonts w:ascii="Playfair Display" w:hAnsi="Playfair Display"/>
+                <w:b/>
+                <w:color w:val="C9A961"/>
+                <w:sz w:val="30"/>
+              </w:rPr>
+              <w:t xml:space="preserve">II  </w:t>
+            </w:r>
+            <w:r>
+              <w:rPr>
+                <w:rFonts w:ascii="Playfair Display" w:hAnsi="Playfair Display"/>
+                <w:b/>
+                <w:color w:val="FFFFFF"/>
+                <w:sz w:val="28"/>
+              </w:rPr>
+              <w:t>Diagnostic et bilan initial</w:t>
+            </w:r>
+          </w:p>
+        </w:tc>
+      </w:tr>
       <w:tr>
         <w:trPr>
           <w:cantSplit/>
@@ -2204,6 +2301,49 @@
         </w:trPr>
         <w:tc>
           <w:tcPr>
+            <w:tcW w:type="dxa" w:w="9865"/>
+            <w:gridSpan w:val="2"/>
+            <w:tcBorders>
+              <w:top w:val="single" w:sz="4" w:space="0" w:color="E11D48"/>
+              <w:left w:val="single" w:sz="4" w:space="0" w:color="E11D48"/>
+              <w:bottom w:val="single" w:sz="4" w:space="0" w:color="E11D48"/>
+              <w:right w:val="single" w:sz="4" w:space="0" w:color="E11D48"/>
+            </w:tcBorders>
+            <w:shd w:val="clear" w:color="auto" w:fill="E11D48"/>
+            <w:vAlign w:val="center"/>
+          </w:tcPr>
+          <w:p>
+            <w:pPr>
+              <w:spacing w:before="60" w:after="60"/>
+            </w:pPr>
+            <w:r>
+              <w:rPr>
+                <w:rFonts w:ascii="Playfair Display" w:hAnsi="Playfair Display"/>
+                <w:b/>
+                <w:color w:val="C9A961"/>
+                <w:sz w:val="30"/>
+              </w:rPr>
+              <w:t xml:space="preserve">II  </w:t>
+            </w:r>
+            <w:r>
+              <w:rPr>
+                <w:rFonts w:ascii="Playfair Display" w:hAnsi="Playfair Display"/>
+                <w:b/>
+                <w:color w:val="FFFFFF"/>
+                <w:sz w:val="28"/>
+              </w:rPr>
+              <w:t>Diagnostic et bilan initial</w:t>
+            </w:r>
+          </w:p>
+        </w:tc>
+      </w:tr>
+      <w:tr>
+        <w:trPr>
+          <w:cantSplit/>
+          <w:tblHeader w:val="true"/>
+        </w:trPr>
+        <w:tc>
+          <w:tcPr>
             <w:tcW w:type="dxa" w:w="2663"/>
             <w:shd w:val="clear" w:color="auto" w:fill="E11D48"/>
             <w:vAlign w:val="center"/>
@@ -2594,22 +2734,6 @@
         <w:br w:type="page"/>
       </w:r>
     </w:p>
-    <w:p>
-      <w:pPr>
-        <w:keepNext/>
-        <w:shd w:val="clear" w:color="auto" w:fill="E11D48"/>
-        <w:spacing w:before="40" w:after="200"/>
-      </w:pPr>
-      <w:r>
-        <w:rPr>
-          <w:rFonts w:ascii="Playfair Display" w:hAnsi="Playfair Display"/>
-          <w:b/>
-          <w:color w:val="FFFFFF"/>
-          <w:sz w:val="32"/>
-        </w:rPr>
-        <w:t>III.  Prise en charge thérapeutique</w:t>
-      </w:r>
-    </w:p>
     <w:tbl>
       <w:tblPr>
         <w:tblW w:type="auto" w:w="0"/>
@@ -2629,6 +2753,49 @@
         <w:gridCol w:w="4933"/>
         <w:gridCol w:w="4933"/>
       </w:tblGrid>
+      <w:tr>
+        <w:trPr>
+          <w:cantSplit/>
+          <w:tblHeader w:val="true"/>
+        </w:trPr>
+        <w:tc>
+          <w:tcPr>
+            <w:tcW w:type="dxa" w:w="9865"/>
+            <w:gridSpan w:val="2"/>
+            <w:tcBorders>
+              <w:top w:val="single" w:sz="4" w:space="0" w:color="E11D48"/>
+              <w:left w:val="single" w:sz="4" w:space="0" w:color="E11D48"/>
+              <w:bottom w:val="single" w:sz="4" w:space="0" w:color="E11D48"/>
+              <w:right w:val="single" w:sz="4" w:space="0" w:color="E11D48"/>
+            </w:tcBorders>
+            <w:shd w:val="clear" w:color="auto" w:fill="E11D48"/>
+            <w:vAlign w:val="center"/>
+          </w:tcPr>
+          <w:p>
+            <w:pPr>
+              <w:spacing w:before="60" w:after="60"/>
+            </w:pPr>
+            <w:r>
+              <w:rPr>
+                <w:rFonts w:ascii="Playfair Display" w:hAnsi="Playfair Display"/>
+                <w:b/>
+                <w:color w:val="C9A961"/>
+                <w:sz w:val="30"/>
+              </w:rPr>
+              <w:t xml:space="preserve">III  </w:t>
+            </w:r>
+            <w:r>
+              <w:rPr>
+                <w:rFonts w:ascii="Playfair Display" w:hAnsi="Playfair Display"/>
+                <w:b/>
+                <w:color w:val="FFFFFF"/>
+                <w:sz w:val="28"/>
+              </w:rPr>
+              <w:t>Prise en charge thérapeutique</w:t>
+            </w:r>
+          </w:p>
+        </w:tc>
+      </w:tr>
       <w:tr>
         <w:trPr>
           <w:cantSplit/>
@@ -2870,6 +3037,49 @@
         <w:gridCol w:w="4933"/>
         <w:gridCol w:w="4933"/>
       </w:tblGrid>
+      <w:tr>
+        <w:trPr>
+          <w:cantSplit/>
+          <w:tblHeader w:val="true"/>
+        </w:trPr>
+        <w:tc>
+          <w:tcPr>
+            <w:tcW w:type="dxa" w:w="9865"/>
+            <w:gridSpan w:val="2"/>
+            <w:tcBorders>
+              <w:top w:val="single" w:sz="4" w:space="0" w:color="E11D48"/>
+              <w:left w:val="single" w:sz="4" w:space="0" w:color="E11D48"/>
+              <w:bottom w:val="single" w:sz="4" w:space="0" w:color="E11D48"/>
+              <w:right w:val="single" w:sz="4" w:space="0" w:color="E11D48"/>
+            </w:tcBorders>
+            <w:shd w:val="clear" w:color="auto" w:fill="E11D48"/>
+            <w:vAlign w:val="center"/>
+          </w:tcPr>
+          <w:p>
+            <w:pPr>
+              <w:spacing w:before="60" w:after="60"/>
+            </w:pPr>
+            <w:r>
+              <w:rPr>
+                <w:rFonts w:ascii="Playfair Display" w:hAnsi="Playfair Display"/>
+                <w:b/>
+                <w:color w:val="C9A961"/>
+                <w:sz w:val="30"/>
+              </w:rPr>
+              <w:t xml:space="preserve">III  </w:t>
+            </w:r>
+            <w:r>
+              <w:rPr>
+                <w:rFonts w:ascii="Playfair Display" w:hAnsi="Playfair Display"/>
+                <w:b/>
+                <w:color w:val="FFFFFF"/>
+                <w:sz w:val="28"/>
+              </w:rPr>
+              <w:t>Prise en charge thérapeutique</w:t>
+            </w:r>
+          </w:p>
+        </w:tc>
+      </w:tr>
       <w:tr>
         <w:trPr>
           <w:cantSplit/>

</xml_diff>

<commit_message>
Adopte une charte médicale sobre : bleu nuit, blanc, rouge en accent
Remplace le combo crème + rouge vif par une palette plus sérieuse :
fond blanc, bannières et en-têtes en bleu nuit, surfaces en gris clair
froid, le rouge n'étant plus qu'un accent (mots-clés, marqueur ◆,
encadrés piège). Mise à jour du CSS, de la couverture, du générateur
DOCX et du schéma d'exemple.

https://claude.ai/code/session_019UxbrWiVNiHBdkHsxX6ghC
</commit_message>
<xml_diff>
--- a/examples/Cardiologie_Hypertension-Arterielle_2025-2026.docx
+++ b/examples/Cardiologie_Hypertension-Arterielle_2025-2026.docx
@@ -28,7 +28,7 @@
         <w:tc>
           <w:tcPr>
             <w:tcW w:type="dxa" w:w="1361"/>
-            <w:shd w:val="clear" w:color="auto" w:fill="E11D48"/>
+            <w:shd w:val="clear" w:color="auto" w:fill="0F1E33"/>
           </w:tcPr>
           <w:p/>
         </w:tc>
@@ -126,7 +126,7 @@
               <w:rPr>
                 <w:rFonts w:ascii="Playfair Display" w:hAnsi="Playfair Display"/>
                 <w:b/>
-                <w:color w:val="1F2937"/>
+                <w:color w:val="1B2433"/>
                 <w:sz w:val="68"/>
               </w:rPr>
               <w:t>Hypertension Artérielle</w:t>
@@ -153,7 +153,7 @@
               <w:rPr>
                 <w:rFonts w:ascii="Cormorant Garamond" w:hAnsi="Cormorant Garamond"/>
                 <w:i/>
-                <w:color w:val="1F2937"/>
+                <w:color w:val="1B2433"/>
                 <w:sz w:val="32"/>
               </w:rPr>
               <w:t>Année 2025-2026</w:t>
@@ -166,7 +166,7 @@
             <w:r>
               <w:rPr>
                 <w:rFonts w:ascii="Inter" w:hAnsi="Inter"/>
-                <w:color w:val="9CA3AF"/>
+                <w:color w:val="94A0B0"/>
                 <w:spacing w:val="40"/>
                 <w:sz w:val="18"/>
               </w:rPr>
@@ -195,7 +195,7 @@
               <w:rPr>
                 <w:rFonts w:ascii="Cormorant Garamond" w:hAnsi="Cormorant Garamond"/>
                 <w:i/>
-                <w:color w:val="E11D48"/>
+                <w:color w:val="0F1E33"/>
                 <w:sz w:val="24"/>
               </w:rPr>
               <w:t>Item 224</w:t>
@@ -239,7 +239,7 @@
             <w:r>
               <w:rPr>
                 <w:rFonts w:ascii="Inter" w:hAnsi="Inter"/>
-                <w:color w:val="1F2937"/>
+                <w:color w:val="1B2433"/>
                 <w:sz w:val="18"/>
               </w:rPr>
               <w:t>Déjà tombé aux ECN</w:t>
@@ -261,7 +261,7 @@
             <w:r>
               <w:rPr>
                 <w:rFonts w:ascii="Inter" w:hAnsi="Inter"/>
-                <w:color w:val="1F2937"/>
+                <w:color w:val="1B2433"/>
                 <w:sz w:val="18"/>
               </w:rPr>
               <w:t>Notion à haut rendement</w:t>
@@ -283,7 +283,7 @@
             <w:r>
               <w:rPr>
                 <w:rFonts w:ascii="Inter" w:hAnsi="Inter"/>
-                <w:color w:val="1F2937"/>
+                <w:color w:val="1B2433"/>
                 <w:sz w:val="18"/>
               </w:rPr>
               <w:t>Piège classique</w:t>
@@ -300,8 +300,8 @@
     <w:p>
       <w:pPr>
         <w:pBdr>
-          <w:top w:val="single" w:sz="12" w:space="6" w:color="E11D48"/>
-          <w:bottom w:val="single" w:sz="12" w:space="6" w:color="E11D48"/>
+          <w:top w:val="single" w:sz="12" w:space="6" w:color="0F1E33"/>
+          <w:bottom w:val="single" w:sz="12" w:space="6" w:color="0F1E33"/>
         </w:pBdr>
         <w:spacing w:before="80"/>
         <w:jc w:val="center"/>
@@ -310,7 +310,7 @@
         <w:rPr>
           <w:rFonts w:ascii="Playfair Display" w:hAnsi="Playfair Display"/>
           <w:b/>
-          <w:color w:val="1F2937"/>
+          <w:color w:val="1B2433"/>
           <w:sz w:val="46"/>
         </w:rPr>
         <w:t>Plan du cours</w:t>
@@ -339,7 +339,7 @@
         <w:rPr>
           <w:rFonts w:ascii="Playfair Display" w:hAnsi="Playfair Display"/>
           <w:b/>
-          <w:color w:val="E11D48"/>
+          <w:color w:val="0F1E33"/>
           <w:sz w:val="28"/>
         </w:rPr>
         <w:t xml:space="preserve">I.  </w:t>
@@ -348,7 +348,7 @@
         <w:rPr>
           <w:rFonts w:ascii="Cormorant Garamond" w:hAnsi="Cormorant Garamond"/>
           <w:b/>
-          <w:color w:val="1F2937"/>
+          <w:color w:val="1B2433"/>
           <w:sz w:val="27"/>
         </w:rPr>
         <w:t>Définition et épidémiologie</w:t>
@@ -362,7 +362,7 @@
         <w:rPr>
           <w:rFonts w:ascii="Cormorant Garamond" w:hAnsi="Cormorant Garamond"/>
           <w:i/>
-          <w:color w:val="9CA3AF"/>
+          <w:color w:val="94A0B0"/>
           <w:sz w:val="21"/>
         </w:rPr>
         <w:t>Cadre nosologique et poids de santé publique.</w:t>
@@ -391,7 +391,7 @@
         <w:rPr>
           <w:rFonts w:ascii="Cormorant Garamond" w:hAnsi="Cormorant Garamond"/>
           <w:i/>
-          <w:color w:val="9CA3AF"/>
+          <w:color w:val="94A0B0"/>
           <w:sz w:val="20"/>
         </w:rPr>
         <w:t xml:space="preserve"> — Seuils et grades.</w:t>
@@ -420,7 +420,7 @@
         <w:rPr>
           <w:rFonts w:ascii="Cormorant Garamond" w:hAnsi="Cormorant Garamond"/>
           <w:i/>
-          <w:color w:val="9CA3AF"/>
+          <w:color w:val="94A0B0"/>
           <w:sz w:val="20"/>
         </w:rPr>
         <w:t xml:space="preserve"> — Prévalence et FdR.</w:t>
@@ -434,7 +434,7 @@
         <w:rPr>
           <w:rFonts w:ascii="Playfair Display" w:hAnsi="Playfair Display"/>
           <w:b/>
-          <w:color w:val="E11D48"/>
+          <w:color w:val="0F1E33"/>
           <w:sz w:val="28"/>
         </w:rPr>
         <w:t xml:space="preserve">II.  </w:t>
@@ -443,7 +443,7 @@
         <w:rPr>
           <w:rFonts w:ascii="Cormorant Garamond" w:hAnsi="Cormorant Garamond"/>
           <w:b/>
-          <w:color w:val="1F2937"/>
+          <w:color w:val="1B2433"/>
           <w:sz w:val="27"/>
         </w:rPr>
         <w:t>Diagnostic et bilan initial</w:t>
@@ -457,7 +457,7 @@
         <w:rPr>
           <w:rFonts w:ascii="Cormorant Garamond" w:hAnsi="Cormorant Garamond"/>
           <w:i/>
-          <w:color w:val="9CA3AF"/>
+          <w:color w:val="94A0B0"/>
           <w:sz w:val="21"/>
         </w:rPr>
         <w:t>Confirmation et recherche du retentissement.</w:t>
@@ -486,7 +486,7 @@
         <w:rPr>
           <w:rFonts w:ascii="Cormorant Garamond" w:hAnsi="Cormorant Garamond"/>
           <w:i/>
-          <w:color w:val="9CA3AF"/>
+          <w:color w:val="94A0B0"/>
           <w:sz w:val="20"/>
         </w:rPr>
         <w:t xml:space="preserve"> — Conditions et MAPA.</w:t>
@@ -515,7 +515,7 @@
         <w:rPr>
           <w:rFonts w:ascii="Cormorant Garamond" w:hAnsi="Cormorant Garamond"/>
           <w:i/>
-          <w:color w:val="9CA3AF"/>
+          <w:color w:val="94A0B0"/>
           <w:sz w:val="20"/>
         </w:rPr>
         <w:t xml:space="preserve"> — Organes cibles.</w:t>
@@ -529,7 +529,7 @@
         <w:rPr>
           <w:rFonts w:ascii="Playfair Display" w:hAnsi="Playfair Display"/>
           <w:b/>
-          <w:color w:val="E11D48"/>
+          <w:color w:val="0F1E33"/>
           <w:sz w:val="28"/>
         </w:rPr>
         <w:t xml:space="preserve">III.  </w:t>
@@ -538,7 +538,7 @@
         <w:rPr>
           <w:rFonts w:ascii="Cormorant Garamond" w:hAnsi="Cormorant Garamond"/>
           <w:b/>
-          <w:color w:val="1F2937"/>
+          <w:color w:val="1B2433"/>
           <w:sz w:val="27"/>
         </w:rPr>
         <w:t>Prise en charge thérapeutique</w:t>
@@ -552,7 +552,7 @@
         <w:rPr>
           <w:rFonts w:ascii="Cormorant Garamond" w:hAnsi="Cormorant Garamond"/>
           <w:i/>
-          <w:color w:val="9CA3AF"/>
+          <w:color w:val="94A0B0"/>
           <w:sz w:val="21"/>
         </w:rPr>
         <w:t>Mesures hygiéno-diététiques et médicaments.</w:t>
@@ -581,7 +581,7 @@
         <w:rPr>
           <w:rFonts w:ascii="Cormorant Garamond" w:hAnsi="Cormorant Garamond"/>
           <w:i/>
-          <w:color w:val="9CA3AF"/>
+          <w:color w:val="94A0B0"/>
           <w:sz w:val="20"/>
         </w:rPr>
         <w:t xml:space="preserve"> — RHD.</w:t>
@@ -610,7 +610,7 @@
         <w:rPr>
           <w:rFonts w:ascii="Cormorant Garamond" w:hAnsi="Cormorant Garamond"/>
           <w:i/>
-          <w:color w:val="9CA3AF"/>
+          <w:color w:val="94A0B0"/>
           <w:sz w:val="20"/>
         </w:rPr>
         <w:t xml:space="preserve"> — Classes.</w:t>
@@ -626,12 +626,12 @@
         <w:tblW w:type="auto" w:w="0"/>
         <w:jc w:val="center"/>
         <w:tblBorders>
-          <w:top w:val="single" w:sz="4" w:space="0" w:color="9CA3AF"/>
-          <w:left w:val="single" w:sz="4" w:space="0" w:color="9CA3AF"/>
-          <w:bottom w:val="single" w:sz="4" w:space="0" w:color="9CA3AF"/>
-          <w:right w:val="single" w:sz="4" w:space="0" w:color="9CA3AF"/>
-          <w:insideH w:val="single" w:sz="4" w:space="0" w:color="9CA3AF"/>
-          <w:insideV w:val="single" w:sz="4" w:space="0" w:color="9CA3AF"/>
+          <w:top w:val="single" w:sz="4" w:space="0" w:color="94A0B0"/>
+          <w:left w:val="single" w:sz="4" w:space="0" w:color="94A0B0"/>
+          <w:bottom w:val="single" w:sz="4" w:space="0" w:color="94A0B0"/>
+          <w:right w:val="single" w:sz="4" w:space="0" w:color="94A0B0"/>
+          <w:insideH w:val="single" w:sz="4" w:space="0" w:color="94A0B0"/>
+          <w:insideV w:val="single" w:sz="4" w:space="0" w:color="94A0B0"/>
         </w:tblBorders>
         <w:tblLayout w:type="fixed"/>
         <w:tblLook w:firstColumn="1" w:firstRow="1" w:lastColumn="0" w:lastRow="0" w:noHBand="0" w:noVBand="1" w:val="04A0"/>
@@ -650,12 +650,12 @@
             <w:tcW w:type="dxa" w:w="9865"/>
             <w:gridSpan w:val="2"/>
             <w:tcBorders>
-              <w:top w:val="single" w:sz="4" w:space="0" w:color="E11D48"/>
-              <w:left w:val="single" w:sz="4" w:space="0" w:color="E11D48"/>
-              <w:bottom w:val="single" w:sz="4" w:space="0" w:color="E11D48"/>
-              <w:right w:val="single" w:sz="4" w:space="0" w:color="E11D48"/>
+              <w:top w:val="single" w:sz="4" w:space="0" w:color="0F1E33"/>
+              <w:left w:val="single" w:sz="4" w:space="0" w:color="0F1E33"/>
+              <w:bottom w:val="single" w:sz="4" w:space="0" w:color="0F1E33"/>
+              <w:right w:val="single" w:sz="4" w:space="0" w:color="0F1E33"/>
             </w:tcBorders>
-            <w:shd w:val="clear" w:color="auto" w:fill="E11D48"/>
+            <w:shd w:val="clear" w:color="auto" w:fill="0F1E33"/>
             <w:vAlign w:val="center"/>
           </w:tcPr>
           <w:p>
@@ -691,7 +691,7 @@
         <w:tc>
           <w:tcPr>
             <w:tcW w:type="dxa" w:w="2663"/>
-            <w:shd w:val="clear" w:color="auto" w:fill="E11D48"/>
+            <w:shd w:val="clear" w:color="auto" w:fill="0F1E33"/>
             <w:vAlign w:val="center"/>
           </w:tcPr>
           <w:p>
@@ -713,7 +713,7 @@
         <w:tc>
           <w:tcPr>
             <w:tcW w:type="dxa" w:w="7201"/>
-            <w:shd w:val="clear" w:color="auto" w:fill="FCE7EC"/>
+            <w:shd w:val="clear" w:color="auto" w:fill="E7ECF3"/>
             <w:vAlign w:val="center"/>
           </w:tcPr>
           <w:p>
@@ -724,7 +724,7 @@
               <w:rPr>
                 <w:rFonts w:ascii="Playfair Display" w:hAnsi="Playfair Display"/>
                 <w:b/>
-                <w:color w:val="9F1239"/>
+                <w:color w:val="0F1E33"/>
                 <w:sz w:val="26"/>
               </w:rPr>
               <w:t>A.  Définitions et seuils</w:t>
@@ -739,7 +739,7 @@
         <w:tc>
           <w:tcPr>
             <w:tcW w:type="dxa" w:w="2663"/>
-            <w:shd w:val="clear" w:color="auto" w:fill="FAF7F2"/>
+            <w:shd w:val="clear" w:color="auto" w:fill="EEF1F5"/>
             <w:vAlign w:val="center"/>
           </w:tcPr>
           <w:p>
@@ -761,7 +761,7 @@
                 <w:rFonts w:ascii="Inter" w:hAnsi="Inter"/>
                 <w:b/>
                 <w:i w:val="0"/>
-                <w:color w:val="1F2937"/>
+                <w:color w:val="1B2433"/>
                 <w:sz w:val="20"/>
               </w:rPr>
               <w:t xml:space="preserve"> Définition de l'HTA</w:t>
@@ -793,7 +793,7 @@
                 <w:rFonts w:ascii="Inter" w:hAnsi="Inter"/>
                 <w:b w:val="0"/>
                 <w:i w:val="0"/>
-                <w:color w:val="1F2937"/>
+                <w:color w:val="1B2433"/>
                 <w:sz w:val="20"/>
               </w:rPr>
               <w:t xml:space="preserve"> : </w:t>
@@ -813,7 +813,7 @@
                 <w:rFonts w:ascii="Inter" w:hAnsi="Inter"/>
                 <w:b w:val="0"/>
                 <w:i w:val="0"/>
-                <w:color w:val="1F2937"/>
+                <w:color w:val="1B2433"/>
                 <w:sz w:val="20"/>
               </w:rPr>
               <w:t xml:space="preserve"> ≥ </w:t>
@@ -833,7 +833,7 @@
                 <w:rFonts w:ascii="Inter" w:hAnsi="Inter"/>
                 <w:b w:val="0"/>
                 <w:i w:val="0"/>
-                <w:color w:val="1F2937"/>
+                <w:color w:val="1B2433"/>
                 <w:sz w:val="20"/>
               </w:rPr>
               <w:t xml:space="preserve"> et/ou </w:t>
@@ -853,7 +853,7 @@
                 <w:rFonts w:ascii="Inter" w:hAnsi="Inter"/>
                 <w:b w:val="0"/>
                 <w:i w:val="0"/>
-                <w:color w:val="1F2937"/>
+                <w:color w:val="1B2433"/>
                 <w:sz w:val="20"/>
               </w:rPr>
               <w:t xml:space="preserve"> ≥ </w:t>
@@ -873,7 +873,7 @@
                 <w:rFonts w:ascii="Inter" w:hAnsi="Inter"/>
                 <w:b w:val="0"/>
                 <w:i w:val="0"/>
-                <w:color w:val="1F2937"/>
+                <w:color w:val="1B2433"/>
                 <w:sz w:val="20"/>
               </w:rPr>
               <w:t xml:space="preserve"> au cabinet</w:t>
@@ -889,7 +889,7 @@
                 <w:rFonts w:ascii="Inter" w:hAnsi="Inter"/>
                 <w:b w:val="0"/>
                 <w:i w:val="0"/>
-                <w:color w:val="1F2937"/>
+                <w:color w:val="1B2433"/>
                 <w:sz w:val="20"/>
               </w:rPr>
               <w:t xml:space="preserve">diagnostic confirmé sur </w:t>
@@ -915,7 +915,7 @@
                 <w:rFonts w:ascii="Inter" w:hAnsi="Inter"/>
                 <w:b w:val="0"/>
                 <w:i w:val="0"/>
-                <w:color w:val="1F2937"/>
+                <w:color w:val="1B2433"/>
                 <w:sz w:val="20"/>
               </w:rPr>
               <w:t xml:space="preserve">automesure : seuil abaissé à </w:t>
@@ -940,7 +940,7 @@
         <w:tc>
           <w:tcPr>
             <w:tcW w:type="dxa" w:w="2663"/>
-            <w:shd w:val="clear" w:color="auto" w:fill="FAF7F2"/>
+            <w:shd w:val="clear" w:color="auto" w:fill="EEF1F5"/>
             <w:vAlign w:val="center"/>
           </w:tcPr>
           <w:p>
@@ -962,7 +962,7 @@
                 <w:rFonts w:ascii="Inter" w:hAnsi="Inter"/>
                 <w:b/>
                 <w:i w:val="0"/>
-                <w:color w:val="1F2937"/>
+                <w:color w:val="1B2433"/>
                 <w:sz w:val="20"/>
               </w:rPr>
               <w:t xml:space="preserve"> Grades de sévérité</w:t>
@@ -979,12 +979,12 @@
               <w:tblW w:type="auto" w:w="0"/>
               <w:jc w:val="center"/>
               <w:tblBorders>
-                <w:top w:val="single" w:sz="4" w:space="0" w:color="9CA3AF"/>
-                <w:left w:val="single" w:sz="4" w:space="0" w:color="9CA3AF"/>
-                <w:bottom w:val="single" w:sz="4" w:space="0" w:color="9CA3AF"/>
-                <w:right w:val="single" w:sz="4" w:space="0" w:color="9CA3AF"/>
-                <w:insideH w:val="single" w:sz="4" w:space="0" w:color="9CA3AF"/>
-                <w:insideV w:val="single" w:sz="4" w:space="0" w:color="9CA3AF"/>
+                <w:top w:val="single" w:sz="4" w:space="0" w:color="94A0B0"/>
+                <w:left w:val="single" w:sz="4" w:space="0" w:color="94A0B0"/>
+                <w:bottom w:val="single" w:sz="4" w:space="0" w:color="94A0B0"/>
+                <w:right w:val="single" w:sz="4" w:space="0" w:color="94A0B0"/>
+                <w:insideH w:val="single" w:sz="4" w:space="0" w:color="94A0B0"/>
+                <w:insideV w:val="single" w:sz="4" w:space="0" w:color="94A0B0"/>
               </w:tblBorders>
               <w:tblLayout w:type="autofit"/>
               <w:tblLook w:firstColumn="1" w:firstRow="1" w:lastColumn="0" w:lastRow="0" w:noHBand="0" w:noVBand="1" w:val="04A0"/>
@@ -1001,7 +1001,7 @@
               <w:tc>
                 <w:tcPr>
                   <w:tcW w:type="dxa" w:w="2400"/>
-                  <w:shd w:val="clear" w:color="auto" w:fill="FAF7F2"/>
+                  <w:shd w:val="clear" w:color="auto" w:fill="EEF1F5"/>
                 </w:tcPr>
                 <w:p>
                   <w:pPr>
@@ -1012,7 +1012,7 @@
                       <w:rFonts w:ascii="Inter" w:hAnsi="Inter"/>
                       <w:b/>
                       <w:i w:val="0"/>
-                      <w:color w:val="1F2937"/>
+                      <w:color w:val="1B2433"/>
                       <w:sz w:val="18"/>
                     </w:rPr>
                     <w:t>Grade</w:t>
@@ -1022,7 +1022,7 @@
               <w:tc>
                 <w:tcPr>
                   <w:tcW w:type="dxa" w:w="2400"/>
-                  <w:shd w:val="clear" w:color="auto" w:fill="FAF7F2"/>
+                  <w:shd w:val="clear" w:color="auto" w:fill="EEF1F5"/>
                 </w:tcPr>
                 <w:p>
                   <w:pPr>
@@ -1033,7 +1033,7 @@
                       <w:rFonts w:ascii="Inter" w:hAnsi="Inter"/>
                       <w:b/>
                       <w:i w:val="0"/>
-                      <w:color w:val="1F2937"/>
+                      <w:color w:val="1B2433"/>
                       <w:sz w:val="18"/>
                     </w:rPr>
                     <w:t>PAS (mmHg)</w:t>
@@ -1043,7 +1043,7 @@
               <w:tc>
                 <w:tcPr>
                   <w:tcW w:type="dxa" w:w="2400"/>
-                  <w:shd w:val="clear" w:color="auto" w:fill="FAF7F2"/>
+                  <w:shd w:val="clear" w:color="auto" w:fill="EEF1F5"/>
                 </w:tcPr>
                 <w:p>
                   <w:pPr>
@@ -1054,7 +1054,7 @@
                       <w:rFonts w:ascii="Inter" w:hAnsi="Inter"/>
                       <w:b/>
                       <w:i w:val="0"/>
-                      <w:color w:val="1F2937"/>
+                      <w:color w:val="1B2433"/>
                       <w:sz w:val="18"/>
                     </w:rPr>
                     <w:t>PAD (mmHg)</w:t>
@@ -1099,7 +1099,7 @@
                       <w:rFonts w:ascii="Inter" w:hAnsi="Inter"/>
                       <w:b w:val="0"/>
                       <w:i w:val="0"/>
-                      <w:color w:val="1F2937"/>
+                      <w:color w:val="1B2433"/>
                       <w:sz w:val="18"/>
                     </w:rPr>
                     <w:t>140-159</w:t>
@@ -1119,7 +1119,7 @@
                       <w:rFonts w:ascii="Inter" w:hAnsi="Inter"/>
                       <w:b w:val="0"/>
                       <w:i w:val="0"/>
-                      <w:color w:val="1F2937"/>
+                      <w:color w:val="1B2433"/>
                       <w:sz w:val="18"/>
                     </w:rPr>
                     <w:t>90-99</w:t>
@@ -1134,7 +1134,7 @@
               <w:tc>
                 <w:tcPr>
                   <w:tcW w:type="dxa" w:w="2400"/>
-                  <w:shd w:val="clear" w:color="auto" w:fill="FCFBF7"/>
+                  <w:shd w:val="clear" w:color="auto" w:fill="F5F6F9"/>
                 </w:tcPr>
                 <w:p>
                   <w:pPr>
@@ -1155,7 +1155,7 @@
               <w:tc>
                 <w:tcPr>
                   <w:tcW w:type="dxa" w:w="2400"/>
-                  <w:shd w:val="clear" w:color="auto" w:fill="FCFBF7"/>
+                  <w:shd w:val="clear" w:color="auto" w:fill="F5F6F9"/>
                 </w:tcPr>
                 <w:p>
                   <w:pPr>
@@ -1166,7 +1166,7 @@
                       <w:rFonts w:ascii="Inter" w:hAnsi="Inter"/>
                       <w:b w:val="0"/>
                       <w:i w:val="0"/>
-                      <w:color w:val="1F2937"/>
+                      <w:color w:val="1B2433"/>
                       <w:sz w:val="18"/>
                     </w:rPr>
                     <w:t>160-179</w:t>
@@ -1176,7 +1176,7 @@
               <w:tc>
                 <w:tcPr>
                   <w:tcW w:type="dxa" w:w="2400"/>
-                  <w:shd w:val="clear" w:color="auto" w:fill="FCFBF7"/>
+                  <w:shd w:val="clear" w:color="auto" w:fill="F5F6F9"/>
                 </w:tcPr>
                 <w:p>
                   <w:pPr>
@@ -1187,7 +1187,7 @@
                       <w:rFonts w:ascii="Inter" w:hAnsi="Inter"/>
                       <w:b w:val="0"/>
                       <w:i w:val="0"/>
-                      <w:color w:val="1F2937"/>
+                      <w:color w:val="1B2433"/>
                       <w:sz w:val="18"/>
                     </w:rPr>
                     <w:t>100-109</w:t>
@@ -1232,7 +1232,7 @@
                       <w:rFonts w:ascii="Inter" w:hAnsi="Inter"/>
                       <w:b w:val="0"/>
                       <w:i w:val="0"/>
-                      <w:color w:val="1F2937"/>
+                      <w:color w:val="1B2433"/>
                       <w:sz w:val="18"/>
                     </w:rPr>
                     <w:t>≥ 180</w:t>
@@ -1252,7 +1252,7 @@
                       <w:rFonts w:ascii="Inter" w:hAnsi="Inter"/>
                       <w:b w:val="0"/>
                       <w:i w:val="0"/>
-                      <w:color w:val="1F2937"/>
+                      <w:color w:val="1B2433"/>
                       <w:sz w:val="18"/>
                     </w:rPr>
                     <w:t>≥ 110</w:t>
@@ -1316,7 +1316,7 @@
               <w:rPr>
                 <w:rFonts w:ascii="Cormorant Garamond" w:hAnsi="Cormorant Garamond"/>
                 <w:i/>
-                <w:color w:val="9CA3AF"/>
+                <w:color w:val="94A0B0"/>
                 <w:sz w:val="18"/>
               </w:rPr>
               <w:t>Figure 1 — Étapes de la démarche diagnostique devant une pression artérielle élevée.</w:t>
@@ -1362,7 +1362,7 @@
                 <w:rFonts w:ascii="Inter" w:hAnsi="Inter"/>
                 <w:b w:val="0"/>
                 <w:i w:val="0"/>
-                <w:color w:val="1F2937"/>
+                <w:color w:val="1B2433"/>
                 <w:sz w:val="20"/>
               </w:rPr>
               <w:t>Ne pas confondre l'</w:t>
@@ -1382,7 +1382,7 @@
                 <w:rFonts w:ascii="Inter" w:hAnsi="Inter"/>
                 <w:b w:val="0"/>
                 <w:i w:val="0"/>
-                <w:color w:val="1F2937"/>
+                <w:color w:val="1B2433"/>
                 <w:sz w:val="20"/>
               </w:rPr>
               <w:t xml:space="preserve"> (PA élevée au cabinet uniquement) et l'</w:t>
@@ -1402,7 +1402,7 @@
                 <w:rFonts w:ascii="Inter" w:hAnsi="Inter"/>
                 <w:b w:val="0"/>
                 <w:i w:val="0"/>
-                <w:color w:val="1F2937"/>
+                <w:color w:val="1B2433"/>
                 <w:sz w:val="20"/>
               </w:rPr>
               <w:t xml:space="preserve"> (PA normale au cabinet, élevée en ambulatoire) : le pronostic diffère.</w:t>
@@ -1421,12 +1421,12 @@
         <w:tblW w:type="auto" w:w="0"/>
         <w:jc w:val="center"/>
         <w:tblBorders>
-          <w:top w:val="single" w:sz="4" w:space="0" w:color="9CA3AF"/>
-          <w:left w:val="single" w:sz="4" w:space="0" w:color="9CA3AF"/>
-          <w:bottom w:val="single" w:sz="4" w:space="0" w:color="9CA3AF"/>
-          <w:right w:val="single" w:sz="4" w:space="0" w:color="9CA3AF"/>
-          <w:insideH w:val="single" w:sz="4" w:space="0" w:color="9CA3AF"/>
-          <w:insideV w:val="single" w:sz="4" w:space="0" w:color="9CA3AF"/>
+          <w:top w:val="single" w:sz="4" w:space="0" w:color="94A0B0"/>
+          <w:left w:val="single" w:sz="4" w:space="0" w:color="94A0B0"/>
+          <w:bottom w:val="single" w:sz="4" w:space="0" w:color="94A0B0"/>
+          <w:right w:val="single" w:sz="4" w:space="0" w:color="94A0B0"/>
+          <w:insideH w:val="single" w:sz="4" w:space="0" w:color="94A0B0"/>
+          <w:insideV w:val="single" w:sz="4" w:space="0" w:color="94A0B0"/>
         </w:tblBorders>
         <w:tblLayout w:type="fixed"/>
         <w:tblLook w:firstColumn="1" w:firstRow="1" w:lastColumn="0" w:lastRow="0" w:noHBand="0" w:noVBand="1" w:val="04A0"/>
@@ -1445,12 +1445,12 @@
             <w:tcW w:type="dxa" w:w="9865"/>
             <w:gridSpan w:val="2"/>
             <w:tcBorders>
-              <w:top w:val="single" w:sz="4" w:space="0" w:color="E11D48"/>
-              <w:left w:val="single" w:sz="4" w:space="0" w:color="E11D48"/>
-              <w:bottom w:val="single" w:sz="4" w:space="0" w:color="E11D48"/>
-              <w:right w:val="single" w:sz="4" w:space="0" w:color="E11D48"/>
+              <w:top w:val="single" w:sz="4" w:space="0" w:color="0F1E33"/>
+              <w:left w:val="single" w:sz="4" w:space="0" w:color="0F1E33"/>
+              <w:bottom w:val="single" w:sz="4" w:space="0" w:color="0F1E33"/>
+              <w:right w:val="single" w:sz="4" w:space="0" w:color="0F1E33"/>
             </w:tcBorders>
-            <w:shd w:val="clear" w:color="auto" w:fill="E11D48"/>
+            <w:shd w:val="clear" w:color="auto" w:fill="0F1E33"/>
             <w:vAlign w:val="center"/>
           </w:tcPr>
           <w:p>
@@ -1486,7 +1486,7 @@
         <w:tc>
           <w:tcPr>
             <w:tcW w:type="dxa" w:w="2663"/>
-            <w:shd w:val="clear" w:color="auto" w:fill="E11D48"/>
+            <w:shd w:val="clear" w:color="auto" w:fill="0F1E33"/>
             <w:vAlign w:val="center"/>
           </w:tcPr>
           <w:p>
@@ -1508,7 +1508,7 @@
         <w:tc>
           <w:tcPr>
             <w:tcW w:type="dxa" w:w="7201"/>
-            <w:shd w:val="clear" w:color="auto" w:fill="FCE7EC"/>
+            <w:shd w:val="clear" w:color="auto" w:fill="E7ECF3"/>
             <w:vAlign w:val="center"/>
           </w:tcPr>
           <w:p>
@@ -1519,7 +1519,7 @@
               <w:rPr>
                 <w:rFonts w:ascii="Playfair Display" w:hAnsi="Playfair Display"/>
                 <w:b/>
-                <w:color w:val="9F1239"/>
+                <w:color w:val="0F1E33"/>
                 <w:sz w:val="26"/>
               </w:rPr>
               <w:t>B.  Épidémiologie</w:t>
@@ -1534,7 +1534,7 @@
         <w:tc>
           <w:tcPr>
             <w:tcW w:type="dxa" w:w="2663"/>
-            <w:shd w:val="clear" w:color="auto" w:fill="FAF7F2"/>
+            <w:shd w:val="clear" w:color="auto" w:fill="EEF1F5"/>
             <w:vAlign w:val="center"/>
           </w:tcPr>
           <w:p>
@@ -1546,7 +1546,7 @@
                 <w:rFonts w:ascii="Inter" w:hAnsi="Inter"/>
                 <w:b/>
                 <w:i w:val="0"/>
-                <w:color w:val="1F2937"/>
+                <w:color w:val="1B2433"/>
                 <w:sz w:val="20"/>
               </w:rPr>
               <w:t>Prévalence</w:t>
@@ -1568,7 +1568,7 @@
                 <w:rFonts w:ascii="Inter" w:hAnsi="Inter"/>
                 <w:b w:val="0"/>
                 <w:i w:val="0"/>
-                <w:color w:val="1F2937"/>
+                <w:color w:val="1B2433"/>
                 <w:sz w:val="20"/>
               </w:rPr>
               <w:t xml:space="preserve">environ </w:t>
@@ -1588,7 +1588,7 @@
                 <w:rFonts w:ascii="Inter" w:hAnsi="Inter"/>
                 <w:b w:val="0"/>
                 <w:i w:val="0"/>
-                <w:color w:val="1F2937"/>
+                <w:color w:val="1B2433"/>
                 <w:sz w:val="20"/>
               </w:rPr>
               <w:t xml:space="preserve"> de la population adulte</w:t>
@@ -1604,7 +1604,7 @@
                 <w:rFonts w:ascii="Inter" w:hAnsi="Inter"/>
                 <w:b w:val="0"/>
                 <w:i w:val="0"/>
-                <w:color w:val="1F2937"/>
+                <w:color w:val="1B2433"/>
                 <w:sz w:val="20"/>
               </w:rPr>
               <w:t>augmente avec l'</w:t>
@@ -1630,7 +1630,7 @@
                 <w:rFonts w:ascii="Inter" w:hAnsi="Inter"/>
                 <w:b w:val="0"/>
                 <w:i w:val="0"/>
-                <w:color w:val="1F2937"/>
+                <w:color w:val="1B2433"/>
                 <w:sz w:val="20"/>
               </w:rPr>
               <w:t>premier motif de consultation en médecine générale</w:t>
@@ -1645,7 +1645,7 @@
         <w:tc>
           <w:tcPr>
             <w:tcW w:type="dxa" w:w="2663"/>
-            <w:shd w:val="clear" w:color="auto" w:fill="FAF7F2"/>
+            <w:shd w:val="clear" w:color="auto" w:fill="EEF1F5"/>
             <w:vAlign w:val="center"/>
           </w:tcPr>
           <w:p>
@@ -1667,7 +1667,7 @@
                 <w:rFonts w:ascii="Inter" w:hAnsi="Inter"/>
                 <w:b/>
                 <w:i w:val="0"/>
-                <w:color w:val="1F2937"/>
+                <w:color w:val="1B2433"/>
                 <w:sz w:val="20"/>
               </w:rPr>
               <w:t xml:space="preserve"> Facteurs de risque</w:t>
@@ -1699,7 +1699,7 @@
                 <w:rFonts w:ascii="Inter" w:hAnsi="Inter"/>
                 <w:b w:val="0"/>
                 <w:i w:val="0"/>
-                <w:color w:val="1F2937"/>
+                <w:color w:val="1B2433"/>
                 <w:sz w:val="20"/>
               </w:rPr>
               <w:t xml:space="preserve"> : âge, sexe masculin, hérédité</w:t>
@@ -1725,7 +1725,7 @@
                 <w:rFonts w:ascii="Inter" w:hAnsi="Inter"/>
                 <w:b w:val="0"/>
                 <w:i w:val="0"/>
-                <w:color w:val="1F2937"/>
+                <w:color w:val="1B2433"/>
                 <w:sz w:val="20"/>
               </w:rPr>
               <w:t xml:space="preserve"> : surpoids, sédentarité, </w:t>
@@ -1745,7 +1745,7 @@
                 <w:rFonts w:ascii="Inter" w:hAnsi="Inter"/>
                 <w:b w:val="0"/>
                 <w:i w:val="0"/>
-                <w:color w:val="1F2937"/>
+                <w:color w:val="1B2433"/>
                 <w:sz w:val="20"/>
               </w:rPr>
               <w:t>, alcool, tabac</w:t>
@@ -1762,12 +1762,12 @@
             <w:tcW w:type="dxa" w:w="9865"/>
             <w:gridSpan w:val="2"/>
             <w:tcBorders>
-              <w:top w:val="single" w:sz="4" w:space="0" w:color="E11D48"/>
-              <w:left w:val="single" w:sz="22" w:space="0" w:color="E11D48"/>
-              <w:bottom w:val="single" w:sz="4" w:space="0" w:color="E11D48"/>
-              <w:right w:val="single" w:sz="4" w:space="0" w:color="E11D48"/>
+              <w:top w:val="single" w:sz="4" w:space="0" w:color="0F1E33"/>
+              <w:left w:val="single" w:sz="22" w:space="0" w:color="0F1E33"/>
+              <w:bottom w:val="single" w:sz="4" w:space="0" w:color="0F1E33"/>
+              <w:right w:val="single" w:sz="4" w:space="0" w:color="0F1E33"/>
             </w:tcBorders>
-            <w:shd w:val="clear" w:color="auto" w:fill="FAF7F2"/>
+            <w:shd w:val="clear" w:color="auto" w:fill="EEF1F5"/>
             <w:vAlign w:val="top"/>
           </w:tcPr>
           <w:p>
@@ -1778,7 +1778,7 @@
               <w:rPr>
                 <w:rFonts w:ascii="Inter" w:hAnsi="Inter"/>
                 <w:b/>
-                <w:color w:val="E11D48"/>
+                <w:color w:val="0F1E33"/>
                 <w:spacing w:val="14"/>
                 <w:sz w:val="16"/>
               </w:rPr>
@@ -1791,7 +1791,7 @@
                 <w:rFonts w:ascii="Inter" w:hAnsi="Inter"/>
                 <w:b w:val="0"/>
                 <w:i w:val="0"/>
-                <w:color w:val="1F2937"/>
+                <w:color w:val="1B2433"/>
                 <w:sz w:val="20"/>
               </w:rPr>
               <w:t xml:space="preserve">L'HTA est un </w:t>
@@ -1811,7 +1811,7 @@
                 <w:rFonts w:ascii="Inter" w:hAnsi="Inter"/>
                 <w:b w:val="0"/>
                 <w:i w:val="0"/>
-                <w:color w:val="1F2937"/>
+                <w:color w:val="1B2433"/>
                 <w:sz w:val="20"/>
               </w:rPr>
               <w:t xml:space="preserve"> : AVC, insuffisance cardiaque, coronaropathie, néphropathie.</w:t>
@@ -1835,12 +1835,12 @@
         <w:tblW w:type="auto" w:w="0"/>
         <w:jc w:val="center"/>
         <w:tblBorders>
-          <w:top w:val="single" w:sz="4" w:space="0" w:color="9CA3AF"/>
-          <w:left w:val="single" w:sz="4" w:space="0" w:color="9CA3AF"/>
-          <w:bottom w:val="single" w:sz="4" w:space="0" w:color="9CA3AF"/>
-          <w:right w:val="single" w:sz="4" w:space="0" w:color="9CA3AF"/>
-          <w:insideH w:val="single" w:sz="4" w:space="0" w:color="9CA3AF"/>
-          <w:insideV w:val="single" w:sz="4" w:space="0" w:color="9CA3AF"/>
+          <w:top w:val="single" w:sz="4" w:space="0" w:color="94A0B0"/>
+          <w:left w:val="single" w:sz="4" w:space="0" w:color="94A0B0"/>
+          <w:bottom w:val="single" w:sz="4" w:space="0" w:color="94A0B0"/>
+          <w:right w:val="single" w:sz="4" w:space="0" w:color="94A0B0"/>
+          <w:insideH w:val="single" w:sz="4" w:space="0" w:color="94A0B0"/>
+          <w:insideV w:val="single" w:sz="4" w:space="0" w:color="94A0B0"/>
         </w:tblBorders>
         <w:tblLayout w:type="fixed"/>
         <w:tblLook w:firstColumn="1" w:firstRow="1" w:lastColumn="0" w:lastRow="0" w:noHBand="0" w:noVBand="1" w:val="04A0"/>
@@ -1859,12 +1859,12 @@
             <w:tcW w:type="dxa" w:w="9865"/>
             <w:gridSpan w:val="2"/>
             <w:tcBorders>
-              <w:top w:val="single" w:sz="4" w:space="0" w:color="E11D48"/>
-              <w:left w:val="single" w:sz="4" w:space="0" w:color="E11D48"/>
-              <w:bottom w:val="single" w:sz="4" w:space="0" w:color="E11D48"/>
-              <w:right w:val="single" w:sz="4" w:space="0" w:color="E11D48"/>
+              <w:top w:val="single" w:sz="4" w:space="0" w:color="0F1E33"/>
+              <w:left w:val="single" w:sz="4" w:space="0" w:color="0F1E33"/>
+              <w:bottom w:val="single" w:sz="4" w:space="0" w:color="0F1E33"/>
+              <w:right w:val="single" w:sz="4" w:space="0" w:color="0F1E33"/>
             </w:tcBorders>
-            <w:shd w:val="clear" w:color="auto" w:fill="E11D48"/>
+            <w:shd w:val="clear" w:color="auto" w:fill="0F1E33"/>
             <w:vAlign w:val="center"/>
           </w:tcPr>
           <w:p>
@@ -1900,7 +1900,7 @@
         <w:tc>
           <w:tcPr>
             <w:tcW w:type="dxa" w:w="2663"/>
-            <w:shd w:val="clear" w:color="auto" w:fill="E11D48"/>
+            <w:shd w:val="clear" w:color="auto" w:fill="0F1E33"/>
             <w:vAlign w:val="center"/>
           </w:tcPr>
           <w:p>
@@ -1922,7 +1922,7 @@
         <w:tc>
           <w:tcPr>
             <w:tcW w:type="dxa" w:w="7201"/>
-            <w:shd w:val="clear" w:color="auto" w:fill="FCE7EC"/>
+            <w:shd w:val="clear" w:color="auto" w:fill="E7ECF3"/>
             <w:vAlign w:val="center"/>
           </w:tcPr>
           <w:p>
@@ -1933,7 +1933,7 @@
               <w:rPr>
                 <w:rFonts w:ascii="Playfair Display" w:hAnsi="Playfair Display"/>
                 <w:b/>
-                <w:color w:val="9F1239"/>
+                <w:color w:val="0F1E33"/>
                 <w:sz w:val="26"/>
               </w:rPr>
               <w:t>A.  Mesure de la pression artérielle</w:t>
@@ -1948,7 +1948,7 @@
         <w:tc>
           <w:tcPr>
             <w:tcW w:type="dxa" w:w="2663"/>
-            <w:shd w:val="clear" w:color="auto" w:fill="FAF7F2"/>
+            <w:shd w:val="clear" w:color="auto" w:fill="EEF1F5"/>
             <w:vAlign w:val="center"/>
           </w:tcPr>
           <w:p>
@@ -1960,7 +1960,7 @@
                 <w:rFonts w:ascii="Inter" w:hAnsi="Inter"/>
                 <w:b/>
                 <w:i w:val="0"/>
-                <w:color w:val="1F2937"/>
+                <w:color w:val="1B2433"/>
                 <w:sz w:val="20"/>
               </w:rPr>
               <w:t>Conditions de mesure</w:t>
@@ -1982,7 +1982,7 @@
                 <w:rFonts w:ascii="Inter" w:hAnsi="Inter"/>
                 <w:b w:val="0"/>
                 <w:i w:val="0"/>
-                <w:color w:val="1F2937"/>
+                <w:color w:val="1B2433"/>
                 <w:sz w:val="20"/>
               </w:rPr>
               <w:t xml:space="preserve">patient au </w:t>
@@ -2002,7 +2002,7 @@
                 <w:rFonts w:ascii="Inter" w:hAnsi="Inter"/>
                 <w:b w:val="0"/>
                 <w:i w:val="0"/>
-                <w:color w:val="1F2937"/>
+                <w:color w:val="1B2433"/>
                 <w:sz w:val="20"/>
               </w:rPr>
               <w:t xml:space="preserve"> depuis 5 minutes, assis</w:t>
@@ -2018,7 +2018,7 @@
                 <w:rFonts w:ascii="Inter" w:hAnsi="Inter"/>
                 <w:b w:val="0"/>
                 <w:i w:val="0"/>
-                <w:color w:val="1F2937"/>
+                <w:color w:val="1B2433"/>
                 <w:sz w:val="20"/>
               </w:rPr>
               <w:t>brassard adapté à la circonférence du bras</w:t>
@@ -2034,7 +2034,7 @@
                 <w:rFonts w:ascii="Inter" w:hAnsi="Inter"/>
                 <w:b w:val="0"/>
                 <w:i w:val="0"/>
-                <w:color w:val="1F2937"/>
+                <w:color w:val="1B2433"/>
                 <w:sz w:val="20"/>
               </w:rPr>
               <w:t xml:space="preserve">mesure aux </w:t>
@@ -2054,7 +2054,7 @@
                 <w:rFonts w:ascii="Inter" w:hAnsi="Inter"/>
                 <w:b w:val="0"/>
                 <w:i w:val="0"/>
-                <w:color w:val="1F2937"/>
+                <w:color w:val="1B2433"/>
                 <w:sz w:val="20"/>
               </w:rPr>
               <w:t xml:space="preserve"> lors du bilan initial</w:t>
@@ -2069,7 +2069,7 @@
         <w:tc>
           <w:tcPr>
             <w:tcW w:type="dxa" w:w="2663"/>
-            <w:shd w:val="clear" w:color="auto" w:fill="FAF7F2"/>
+            <w:shd w:val="clear" w:color="auto" w:fill="EEF1F5"/>
             <w:vAlign w:val="center"/>
           </w:tcPr>
           <w:p>
@@ -2091,7 +2091,7 @@
                 <w:rFonts w:ascii="Inter" w:hAnsi="Inter"/>
                 <w:b/>
                 <w:i w:val="0"/>
-                <w:color w:val="1F2937"/>
+                <w:color w:val="1B2433"/>
                 <w:sz w:val="20"/>
               </w:rPr>
               <w:t xml:space="preserve"> MAPA</w:t>
@@ -2113,7 +2113,7 @@
                 <w:rFonts w:ascii="Inter" w:hAnsi="Inter"/>
                 <w:b w:val="0"/>
                 <w:i w:val="0"/>
-                <w:color w:val="1F2937"/>
+                <w:color w:val="1B2433"/>
                 <w:sz w:val="20"/>
               </w:rPr>
               <w:t xml:space="preserve">mesure </w:t>
@@ -2133,7 +2133,7 @@
                 <w:rFonts w:ascii="Inter" w:hAnsi="Inter"/>
                 <w:b w:val="0"/>
                 <w:i w:val="0"/>
-                <w:color w:val="1F2937"/>
+                <w:color w:val="1B2433"/>
                 <w:sz w:val="20"/>
               </w:rPr>
               <w:t xml:space="preserve"> de la PA sur 24 h</w:t>
@@ -2149,7 +2149,7 @@
                 <w:rFonts w:ascii="Inter" w:hAnsi="Inter"/>
                 <w:b w:val="0"/>
                 <w:i w:val="0"/>
-                <w:color w:val="1F2937"/>
+                <w:color w:val="1B2433"/>
                 <w:sz w:val="20"/>
               </w:rPr>
               <w:t xml:space="preserve">examen de </w:t>
@@ -2169,7 +2169,7 @@
                 <w:rFonts w:ascii="Inter" w:hAnsi="Inter"/>
                 <w:b w:val="0"/>
                 <w:i w:val="0"/>
-                <w:color w:val="1F2937"/>
+                <w:color w:val="1B2433"/>
                 <w:sz w:val="20"/>
               </w:rPr>
               <w:t xml:space="preserve"> pour confirmer le diagnostic</w:t>
@@ -2185,7 +2185,7 @@
                 <w:rFonts w:ascii="Inter" w:hAnsi="Inter"/>
                 <w:b w:val="0"/>
                 <w:i w:val="0"/>
-                <w:color w:val="1F2937"/>
+                <w:color w:val="1B2433"/>
                 <w:sz w:val="20"/>
               </w:rPr>
               <w:t>dépiste l'</w:t>
@@ -2241,7 +2241,7 @@
                 <w:rFonts w:ascii="Inter" w:hAnsi="Inter"/>
                 <w:b w:val="0"/>
                 <w:i w:val="0"/>
-                <w:color w:val="1F2937"/>
+                <w:color w:val="1B2433"/>
                 <w:sz w:val="20"/>
               </w:rPr>
               <w:t xml:space="preserve">Automesure — </w:t>
@@ -2261,7 +2261,7 @@
                 <w:rFonts w:ascii="Inter" w:hAnsi="Inter"/>
                 <w:b w:val="0"/>
                 <w:i w:val="0"/>
-                <w:color w:val="1F2937"/>
+                <w:color w:val="1B2433"/>
                 <w:sz w:val="20"/>
               </w:rPr>
               <w:t xml:space="preserve"> : 3 mesures matin et soir, 3 jours de suite.</w:t>
@@ -2280,12 +2280,12 @@
         <w:tblW w:type="auto" w:w="0"/>
         <w:jc w:val="center"/>
         <w:tblBorders>
-          <w:top w:val="single" w:sz="4" w:space="0" w:color="9CA3AF"/>
-          <w:left w:val="single" w:sz="4" w:space="0" w:color="9CA3AF"/>
-          <w:bottom w:val="single" w:sz="4" w:space="0" w:color="9CA3AF"/>
-          <w:right w:val="single" w:sz="4" w:space="0" w:color="9CA3AF"/>
-          <w:insideH w:val="single" w:sz="4" w:space="0" w:color="9CA3AF"/>
-          <w:insideV w:val="single" w:sz="4" w:space="0" w:color="9CA3AF"/>
+          <w:top w:val="single" w:sz="4" w:space="0" w:color="94A0B0"/>
+          <w:left w:val="single" w:sz="4" w:space="0" w:color="94A0B0"/>
+          <w:bottom w:val="single" w:sz="4" w:space="0" w:color="94A0B0"/>
+          <w:right w:val="single" w:sz="4" w:space="0" w:color="94A0B0"/>
+          <w:insideH w:val="single" w:sz="4" w:space="0" w:color="94A0B0"/>
+          <w:insideV w:val="single" w:sz="4" w:space="0" w:color="94A0B0"/>
         </w:tblBorders>
         <w:tblLayout w:type="fixed"/>
         <w:tblLook w:firstColumn="1" w:firstRow="1" w:lastColumn="0" w:lastRow="0" w:noHBand="0" w:noVBand="1" w:val="04A0"/>
@@ -2304,12 +2304,12 @@
             <w:tcW w:type="dxa" w:w="9865"/>
             <w:gridSpan w:val="2"/>
             <w:tcBorders>
-              <w:top w:val="single" w:sz="4" w:space="0" w:color="E11D48"/>
-              <w:left w:val="single" w:sz="4" w:space="0" w:color="E11D48"/>
-              <w:bottom w:val="single" w:sz="4" w:space="0" w:color="E11D48"/>
-              <w:right w:val="single" w:sz="4" w:space="0" w:color="E11D48"/>
+              <w:top w:val="single" w:sz="4" w:space="0" w:color="0F1E33"/>
+              <w:left w:val="single" w:sz="4" w:space="0" w:color="0F1E33"/>
+              <w:bottom w:val="single" w:sz="4" w:space="0" w:color="0F1E33"/>
+              <w:right w:val="single" w:sz="4" w:space="0" w:color="0F1E33"/>
             </w:tcBorders>
-            <w:shd w:val="clear" w:color="auto" w:fill="E11D48"/>
+            <w:shd w:val="clear" w:color="auto" w:fill="0F1E33"/>
             <w:vAlign w:val="center"/>
           </w:tcPr>
           <w:p>
@@ -2345,7 +2345,7 @@
         <w:tc>
           <w:tcPr>
             <w:tcW w:type="dxa" w:w="2663"/>
-            <w:shd w:val="clear" w:color="auto" w:fill="E11D48"/>
+            <w:shd w:val="clear" w:color="auto" w:fill="0F1E33"/>
             <w:vAlign w:val="center"/>
           </w:tcPr>
           <w:p>
@@ -2367,7 +2367,7 @@
         <w:tc>
           <w:tcPr>
             <w:tcW w:type="dxa" w:w="7201"/>
-            <w:shd w:val="clear" w:color="auto" w:fill="FCE7EC"/>
+            <w:shd w:val="clear" w:color="auto" w:fill="E7ECF3"/>
             <w:vAlign w:val="center"/>
           </w:tcPr>
           <w:p>
@@ -2378,7 +2378,7 @@
               <w:rPr>
                 <w:rFonts w:ascii="Playfair Display" w:hAnsi="Playfair Display"/>
                 <w:b/>
-                <w:color w:val="9F1239"/>
+                <w:color w:val="0F1E33"/>
                 <w:sz w:val="26"/>
               </w:rPr>
               <w:t>B.  Bilan de retentissement</w:t>
@@ -2393,7 +2393,7 @@
         <w:tc>
           <w:tcPr>
             <w:tcW w:type="dxa" w:w="2663"/>
-            <w:shd w:val="clear" w:color="auto" w:fill="FAF7F2"/>
+            <w:shd w:val="clear" w:color="auto" w:fill="EEF1F5"/>
             <w:vAlign w:val="center"/>
           </w:tcPr>
           <w:p>
@@ -2415,7 +2415,7 @@
                 <w:rFonts w:ascii="Inter" w:hAnsi="Inter"/>
                 <w:b/>
                 <w:i w:val="0"/>
-                <w:color w:val="1F2937"/>
+                <w:color w:val="1B2433"/>
                 <w:sz w:val="20"/>
               </w:rPr>
               <w:t xml:space="preserve"> Organes cibles</w:t>
@@ -2447,7 +2447,7 @@
                 <w:rFonts w:ascii="Inter" w:hAnsi="Inter"/>
                 <w:b w:val="0"/>
                 <w:i w:val="0"/>
-                <w:color w:val="1F2937"/>
+                <w:color w:val="1B2433"/>
                 <w:sz w:val="20"/>
               </w:rPr>
               <w:t xml:space="preserve"> : ECG, hypertrophie ventriculaire gauche</w:t>
@@ -2473,7 +2473,7 @@
                 <w:rFonts w:ascii="Inter" w:hAnsi="Inter"/>
                 <w:b w:val="0"/>
                 <w:i w:val="0"/>
-                <w:color w:val="1F2937"/>
+                <w:color w:val="1B2433"/>
                 <w:sz w:val="20"/>
               </w:rPr>
               <w:t xml:space="preserve"> : créatininémie, </w:t>
@@ -2493,7 +2493,7 @@
                 <w:rFonts w:ascii="Inter" w:hAnsi="Inter"/>
                 <w:b w:val="0"/>
                 <w:i w:val="0"/>
-                <w:color w:val="1F2937"/>
+                <w:color w:val="1B2433"/>
                 <w:sz w:val="20"/>
               </w:rPr>
               <w:t>, protéinurie</w:t>
@@ -2519,7 +2519,7 @@
                 <w:rFonts w:ascii="Inter" w:hAnsi="Inter"/>
                 <w:b w:val="0"/>
                 <w:i w:val="0"/>
-                <w:color w:val="1F2937"/>
+                <w:color w:val="1B2433"/>
                 <w:sz w:val="20"/>
               </w:rPr>
               <w:t xml:space="preserve"> : rétinopathie hypertensive si HTA sévère</w:t>
@@ -2534,7 +2534,7 @@
         <w:tc>
           <w:tcPr>
             <w:tcW w:type="dxa" w:w="2663"/>
-            <w:shd w:val="clear" w:color="auto" w:fill="FAF7F2"/>
+            <w:shd w:val="clear" w:color="auto" w:fill="EEF1F5"/>
             <w:vAlign w:val="center"/>
           </w:tcPr>
           <w:p>
@@ -2546,7 +2546,7 @@
                 <w:rFonts w:ascii="Inter" w:hAnsi="Inter"/>
                 <w:b/>
                 <w:i w:val="0"/>
-                <w:color w:val="1F2937"/>
+                <w:color w:val="1B2433"/>
                 <w:sz w:val="20"/>
               </w:rPr>
               <w:t>Bilan biologique</w:t>
@@ -2568,7 +2568,7 @@
                 <w:rFonts w:ascii="Inter" w:hAnsi="Inter"/>
                 <w:b w:val="0"/>
                 <w:i w:val="0"/>
-                <w:color w:val="1F2937"/>
+                <w:color w:val="1B2433"/>
                 <w:sz w:val="20"/>
               </w:rPr>
               <w:t>kaliémie, glycémie à jeun</w:t>
@@ -2584,7 +2584,7 @@
                 <w:rFonts w:ascii="Inter" w:hAnsi="Inter"/>
                 <w:b w:val="0"/>
                 <w:i w:val="0"/>
-                <w:color w:val="1F2937"/>
+                <w:color w:val="1B2433"/>
                 <w:sz w:val="20"/>
               </w:rPr>
               <w:t>bilan lipidique, créatininémie</w:t>
@@ -2639,7 +2639,7 @@
               <w:rPr>
                 <w:rFonts w:ascii="Cormorant Garamond" w:hAnsi="Cormorant Garamond"/>
                 <w:i/>
-                <w:color w:val="9CA3AF"/>
+                <w:color w:val="94A0B0"/>
                 <w:sz w:val="18"/>
               </w:rPr>
               <w:t>Figure 2 — Principaux organes cibles atteints par l'hypertension artérielle.</w:t>
@@ -2695,7 +2695,7 @@
                 <w:rFonts w:ascii="Inter" w:hAnsi="Inter"/>
                 <w:b w:val="0"/>
                 <w:i w:val="0"/>
-                <w:color w:val="1F2937"/>
+                <w:color w:val="1B2433"/>
                 <w:sz w:val="20"/>
               </w:rPr>
               <w:t xml:space="preserve"> Rechercher une </w:t>
@@ -2715,7 +2715,7 @@
                 <w:rFonts w:ascii="Inter" w:hAnsi="Inter"/>
                 <w:b w:val="0"/>
                 <w:i w:val="0"/>
-                <w:color w:val="1F2937"/>
+                <w:color w:val="1B2433"/>
                 <w:sz w:val="20"/>
               </w:rPr>
               <w:t xml:space="preserve"> si HTA résistante, sujet jeune ou signes d'orientation.</w:t>
@@ -2739,12 +2739,12 @@
         <w:tblW w:type="auto" w:w="0"/>
         <w:jc w:val="center"/>
         <w:tblBorders>
-          <w:top w:val="single" w:sz="4" w:space="0" w:color="9CA3AF"/>
-          <w:left w:val="single" w:sz="4" w:space="0" w:color="9CA3AF"/>
-          <w:bottom w:val="single" w:sz="4" w:space="0" w:color="9CA3AF"/>
-          <w:right w:val="single" w:sz="4" w:space="0" w:color="9CA3AF"/>
-          <w:insideH w:val="single" w:sz="4" w:space="0" w:color="9CA3AF"/>
-          <w:insideV w:val="single" w:sz="4" w:space="0" w:color="9CA3AF"/>
+          <w:top w:val="single" w:sz="4" w:space="0" w:color="94A0B0"/>
+          <w:left w:val="single" w:sz="4" w:space="0" w:color="94A0B0"/>
+          <w:bottom w:val="single" w:sz="4" w:space="0" w:color="94A0B0"/>
+          <w:right w:val="single" w:sz="4" w:space="0" w:color="94A0B0"/>
+          <w:insideH w:val="single" w:sz="4" w:space="0" w:color="94A0B0"/>
+          <w:insideV w:val="single" w:sz="4" w:space="0" w:color="94A0B0"/>
         </w:tblBorders>
         <w:tblLayout w:type="fixed"/>
         <w:tblLook w:firstColumn="1" w:firstRow="1" w:lastColumn="0" w:lastRow="0" w:noHBand="0" w:noVBand="1" w:val="04A0"/>
@@ -2763,12 +2763,12 @@
             <w:tcW w:type="dxa" w:w="9865"/>
             <w:gridSpan w:val="2"/>
             <w:tcBorders>
-              <w:top w:val="single" w:sz="4" w:space="0" w:color="E11D48"/>
-              <w:left w:val="single" w:sz="4" w:space="0" w:color="E11D48"/>
-              <w:bottom w:val="single" w:sz="4" w:space="0" w:color="E11D48"/>
-              <w:right w:val="single" w:sz="4" w:space="0" w:color="E11D48"/>
+              <w:top w:val="single" w:sz="4" w:space="0" w:color="0F1E33"/>
+              <w:left w:val="single" w:sz="4" w:space="0" w:color="0F1E33"/>
+              <w:bottom w:val="single" w:sz="4" w:space="0" w:color="0F1E33"/>
+              <w:right w:val="single" w:sz="4" w:space="0" w:color="0F1E33"/>
             </w:tcBorders>
-            <w:shd w:val="clear" w:color="auto" w:fill="E11D48"/>
+            <w:shd w:val="clear" w:color="auto" w:fill="0F1E33"/>
             <w:vAlign w:val="center"/>
           </w:tcPr>
           <w:p>
@@ -2804,7 +2804,7 @@
         <w:tc>
           <w:tcPr>
             <w:tcW w:type="dxa" w:w="2663"/>
-            <w:shd w:val="clear" w:color="auto" w:fill="E11D48"/>
+            <w:shd w:val="clear" w:color="auto" w:fill="0F1E33"/>
             <w:vAlign w:val="center"/>
           </w:tcPr>
           <w:p>
@@ -2826,7 +2826,7 @@
         <w:tc>
           <w:tcPr>
             <w:tcW w:type="dxa" w:w="7201"/>
-            <w:shd w:val="clear" w:color="auto" w:fill="FCE7EC"/>
+            <w:shd w:val="clear" w:color="auto" w:fill="E7ECF3"/>
             <w:vAlign w:val="center"/>
           </w:tcPr>
           <w:p>
@@ -2837,7 +2837,7 @@
               <w:rPr>
                 <w:rFonts w:ascii="Playfair Display" w:hAnsi="Playfair Display"/>
                 <w:b/>
-                <w:color w:val="9F1239"/>
+                <w:color w:val="0F1E33"/>
                 <w:sz w:val="26"/>
               </w:rPr>
               <w:t>A.  Mesures non médicamenteuses</w:t>
@@ -2852,7 +2852,7 @@
         <w:tc>
           <w:tcPr>
             <w:tcW w:type="dxa" w:w="2663"/>
-            <w:shd w:val="clear" w:color="auto" w:fill="FAF7F2"/>
+            <w:shd w:val="clear" w:color="auto" w:fill="EEF1F5"/>
             <w:vAlign w:val="center"/>
           </w:tcPr>
           <w:p>
@@ -2864,7 +2864,7 @@
                 <w:rFonts w:ascii="Inter" w:hAnsi="Inter"/>
                 <w:b/>
                 <w:i w:val="0"/>
-                <w:color w:val="1F2937"/>
+                <w:color w:val="1B2433"/>
                 <w:sz w:val="20"/>
               </w:rPr>
               <w:t>Règles hygiéno-diététiques</w:t>
@@ -2886,7 +2886,7 @@
                 <w:rFonts w:ascii="Inter" w:hAnsi="Inter"/>
                 <w:b w:val="0"/>
                 <w:i w:val="0"/>
-                <w:color w:val="1F2937"/>
+                <w:color w:val="1B2433"/>
                 <w:sz w:val="20"/>
               </w:rPr>
               <w:t xml:space="preserve">réduction des apports en </w:t>
@@ -2906,7 +2906,7 @@
                 <w:rFonts w:ascii="Inter" w:hAnsi="Inter"/>
                 <w:b w:val="0"/>
                 <w:i w:val="0"/>
-                <w:color w:val="1F2937"/>
+                <w:color w:val="1B2433"/>
                 <w:sz w:val="20"/>
               </w:rPr>
               <w:t xml:space="preserve"> (&lt; 6 g/j)</w:t>
@@ -2932,7 +2932,7 @@
                 <w:rFonts w:ascii="Inter" w:hAnsi="Inter"/>
                 <w:b w:val="0"/>
                 <w:i w:val="0"/>
-                <w:color w:val="1F2937"/>
+                <w:color w:val="1B2433"/>
                 <w:sz w:val="20"/>
               </w:rPr>
               <w:t xml:space="preserve"> en cas de surpoids</w:t>
@@ -2958,7 +2958,7 @@
                 <w:rFonts w:ascii="Inter" w:hAnsi="Inter"/>
                 <w:b w:val="0"/>
                 <w:i w:val="0"/>
-                <w:color w:val="1F2937"/>
+                <w:color w:val="1B2433"/>
                 <w:sz w:val="20"/>
               </w:rPr>
               <w:t xml:space="preserve"> régulière (30 min/j)</w:t>
@@ -2974,7 +2974,7 @@
                 <w:rFonts w:ascii="Inter" w:hAnsi="Inter"/>
                 <w:b w:val="0"/>
                 <w:i w:val="0"/>
-                <w:color w:val="1F2937"/>
+                <w:color w:val="1B2433"/>
                 <w:sz w:val="20"/>
               </w:rPr>
               <w:t>limitation de l'</w:t>
@@ -2994,7 +2994,7 @@
                 <w:rFonts w:ascii="Inter" w:hAnsi="Inter"/>
                 <w:b w:val="0"/>
                 <w:i w:val="0"/>
-                <w:color w:val="1F2937"/>
+                <w:color w:val="1B2433"/>
                 <w:sz w:val="20"/>
               </w:rPr>
               <w:t xml:space="preserve">, arrêt du </w:t>
@@ -3023,12 +3023,12 @@
         <w:tblW w:type="auto" w:w="0"/>
         <w:jc w:val="center"/>
         <w:tblBorders>
-          <w:top w:val="single" w:sz="4" w:space="0" w:color="9CA3AF"/>
-          <w:left w:val="single" w:sz="4" w:space="0" w:color="9CA3AF"/>
-          <w:bottom w:val="single" w:sz="4" w:space="0" w:color="9CA3AF"/>
-          <w:right w:val="single" w:sz="4" w:space="0" w:color="9CA3AF"/>
-          <w:insideH w:val="single" w:sz="4" w:space="0" w:color="9CA3AF"/>
-          <w:insideV w:val="single" w:sz="4" w:space="0" w:color="9CA3AF"/>
+          <w:top w:val="single" w:sz="4" w:space="0" w:color="94A0B0"/>
+          <w:left w:val="single" w:sz="4" w:space="0" w:color="94A0B0"/>
+          <w:bottom w:val="single" w:sz="4" w:space="0" w:color="94A0B0"/>
+          <w:right w:val="single" w:sz="4" w:space="0" w:color="94A0B0"/>
+          <w:insideH w:val="single" w:sz="4" w:space="0" w:color="94A0B0"/>
+          <w:insideV w:val="single" w:sz="4" w:space="0" w:color="94A0B0"/>
         </w:tblBorders>
         <w:tblLayout w:type="fixed"/>
         <w:tblLook w:firstColumn="1" w:firstRow="1" w:lastColumn="0" w:lastRow="0" w:noHBand="0" w:noVBand="1" w:val="04A0"/>
@@ -3047,12 +3047,12 @@
             <w:tcW w:type="dxa" w:w="9865"/>
             <w:gridSpan w:val="2"/>
             <w:tcBorders>
-              <w:top w:val="single" w:sz="4" w:space="0" w:color="E11D48"/>
-              <w:left w:val="single" w:sz="4" w:space="0" w:color="E11D48"/>
-              <w:bottom w:val="single" w:sz="4" w:space="0" w:color="E11D48"/>
-              <w:right w:val="single" w:sz="4" w:space="0" w:color="E11D48"/>
+              <w:top w:val="single" w:sz="4" w:space="0" w:color="0F1E33"/>
+              <w:left w:val="single" w:sz="4" w:space="0" w:color="0F1E33"/>
+              <w:bottom w:val="single" w:sz="4" w:space="0" w:color="0F1E33"/>
+              <w:right w:val="single" w:sz="4" w:space="0" w:color="0F1E33"/>
             </w:tcBorders>
-            <w:shd w:val="clear" w:color="auto" w:fill="E11D48"/>
+            <w:shd w:val="clear" w:color="auto" w:fill="0F1E33"/>
             <w:vAlign w:val="center"/>
           </w:tcPr>
           <w:p>
@@ -3088,7 +3088,7 @@
         <w:tc>
           <w:tcPr>
             <w:tcW w:type="dxa" w:w="2663"/>
-            <w:shd w:val="clear" w:color="auto" w:fill="E11D48"/>
+            <w:shd w:val="clear" w:color="auto" w:fill="0F1E33"/>
             <w:vAlign w:val="center"/>
           </w:tcPr>
           <w:p>
@@ -3110,7 +3110,7 @@
         <w:tc>
           <w:tcPr>
             <w:tcW w:type="dxa" w:w="7201"/>
-            <w:shd w:val="clear" w:color="auto" w:fill="FCE7EC"/>
+            <w:shd w:val="clear" w:color="auto" w:fill="E7ECF3"/>
             <w:vAlign w:val="center"/>
           </w:tcPr>
           <w:p>
@@ -3121,7 +3121,7 @@
               <w:rPr>
                 <w:rFonts w:ascii="Playfair Display" w:hAnsi="Playfair Display"/>
                 <w:b/>
-                <w:color w:val="9F1239"/>
+                <w:color w:val="0F1E33"/>
                 <w:sz w:val="26"/>
               </w:rPr>
               <w:t>B.  Traitement médicamenteux</w:t>
@@ -3136,7 +3136,7 @@
         <w:tc>
           <w:tcPr>
             <w:tcW w:type="dxa" w:w="2663"/>
-            <w:shd w:val="clear" w:color="auto" w:fill="FAF7F2"/>
+            <w:shd w:val="clear" w:color="auto" w:fill="EEF1F5"/>
             <w:vAlign w:val="center"/>
           </w:tcPr>
           <w:p>
@@ -3158,7 +3158,7 @@
                 <w:rFonts w:ascii="Inter" w:hAnsi="Inter"/>
                 <w:b/>
                 <w:i w:val="0"/>
-                <w:color w:val="1F2937"/>
+                <w:color w:val="1B2433"/>
                 <w:sz w:val="20"/>
               </w:rPr>
               <w:t xml:space="preserve"> Classes de 1re intention</w:t>
@@ -3175,12 +3175,12 @@
               <w:tblW w:type="auto" w:w="0"/>
               <w:jc w:val="center"/>
               <w:tblBorders>
-                <w:top w:val="single" w:sz="4" w:space="0" w:color="9CA3AF"/>
-                <w:left w:val="single" w:sz="4" w:space="0" w:color="9CA3AF"/>
-                <w:bottom w:val="single" w:sz="4" w:space="0" w:color="9CA3AF"/>
-                <w:right w:val="single" w:sz="4" w:space="0" w:color="9CA3AF"/>
-                <w:insideH w:val="single" w:sz="4" w:space="0" w:color="9CA3AF"/>
-                <w:insideV w:val="single" w:sz="4" w:space="0" w:color="9CA3AF"/>
+                <w:top w:val="single" w:sz="4" w:space="0" w:color="94A0B0"/>
+                <w:left w:val="single" w:sz="4" w:space="0" w:color="94A0B0"/>
+                <w:bottom w:val="single" w:sz="4" w:space="0" w:color="94A0B0"/>
+                <w:right w:val="single" w:sz="4" w:space="0" w:color="94A0B0"/>
+                <w:insideH w:val="single" w:sz="4" w:space="0" w:color="94A0B0"/>
+                <w:insideV w:val="single" w:sz="4" w:space="0" w:color="94A0B0"/>
               </w:tblBorders>
               <w:tblLayout w:type="autofit"/>
               <w:tblLook w:firstColumn="1" w:firstRow="1" w:lastColumn="0" w:lastRow="0" w:noHBand="0" w:noVBand="1" w:val="04A0"/>
@@ -3197,7 +3197,7 @@
               <w:tc>
                 <w:tcPr>
                   <w:tcW w:type="dxa" w:w="2400"/>
-                  <w:shd w:val="clear" w:color="auto" w:fill="FAF7F2"/>
+                  <w:shd w:val="clear" w:color="auto" w:fill="EEF1F5"/>
                 </w:tcPr>
                 <w:p>
                   <w:pPr>
@@ -3208,7 +3208,7 @@
                       <w:rFonts w:ascii="Inter" w:hAnsi="Inter"/>
                       <w:b/>
                       <w:i w:val="0"/>
-                      <w:color w:val="1F2937"/>
+                      <w:color w:val="1B2433"/>
                       <w:sz w:val="18"/>
                     </w:rPr>
                     <w:t>Classe</w:t>
@@ -3218,7 +3218,7 @@
               <w:tc>
                 <w:tcPr>
                   <w:tcW w:type="dxa" w:w="2400"/>
-                  <w:shd w:val="clear" w:color="auto" w:fill="FAF7F2"/>
+                  <w:shd w:val="clear" w:color="auto" w:fill="EEF1F5"/>
                 </w:tcPr>
                 <w:p>
                   <w:pPr>
@@ -3229,7 +3229,7 @@
                       <w:rFonts w:ascii="Inter" w:hAnsi="Inter"/>
                       <w:b/>
                       <w:i w:val="0"/>
-                      <w:color w:val="1F2937"/>
+                      <w:color w:val="1B2433"/>
                       <w:sz w:val="18"/>
                     </w:rPr>
                     <w:t>Exemple</w:t>
@@ -3239,7 +3239,7 @@
               <w:tc>
                 <w:tcPr>
                   <w:tcW w:type="dxa" w:w="2400"/>
-                  <w:shd w:val="clear" w:color="auto" w:fill="FAF7F2"/>
+                  <w:shd w:val="clear" w:color="auto" w:fill="EEF1F5"/>
                 </w:tcPr>
                 <w:p>
                   <w:pPr>
@@ -3250,7 +3250,7 @@
                       <w:rFonts w:ascii="Inter" w:hAnsi="Inter"/>
                       <w:b/>
                       <w:i w:val="0"/>
-                      <w:color w:val="1F2937"/>
+                      <w:color w:val="1B2433"/>
                       <w:sz w:val="18"/>
                     </w:rPr>
                     <w:t>Indication</w:t>
@@ -3295,7 +3295,7 @@
                       <w:rFonts w:ascii="Inter" w:hAnsi="Inter"/>
                       <w:b w:val="0"/>
                       <w:i w:val="0"/>
-                      <w:color w:val="1F2937"/>
+                      <w:color w:val="1B2433"/>
                       <w:sz w:val="18"/>
                     </w:rPr>
                     <w:t>Ramipril</w:t>
@@ -3315,7 +3315,7 @@
                       <w:rFonts w:ascii="Inter" w:hAnsi="Inter"/>
                       <w:b w:val="0"/>
                       <w:i w:val="0"/>
-                      <w:color w:val="1F2937"/>
+                      <w:color w:val="1B2433"/>
                       <w:sz w:val="18"/>
                     </w:rPr>
                     <w:t>Diabète, IC</w:t>
@@ -3330,7 +3330,7 @@
               <w:tc>
                 <w:tcPr>
                   <w:tcW w:type="dxa" w:w="2400"/>
-                  <w:shd w:val="clear" w:color="auto" w:fill="FCFBF7"/>
+                  <w:shd w:val="clear" w:color="auto" w:fill="F5F6F9"/>
                 </w:tcPr>
                 <w:p>
                   <w:pPr>
@@ -3351,7 +3351,7 @@
               <w:tc>
                 <w:tcPr>
                   <w:tcW w:type="dxa" w:w="2400"/>
-                  <w:shd w:val="clear" w:color="auto" w:fill="FCFBF7"/>
+                  <w:shd w:val="clear" w:color="auto" w:fill="F5F6F9"/>
                 </w:tcPr>
                 <w:p>
                   <w:pPr>
@@ -3362,7 +3362,7 @@
                       <w:rFonts w:ascii="Inter" w:hAnsi="Inter"/>
                       <w:b w:val="0"/>
                       <w:i w:val="0"/>
-                      <w:color w:val="1F2937"/>
+                      <w:color w:val="1B2433"/>
                       <w:sz w:val="18"/>
                     </w:rPr>
                     <w:t>Losartan</w:t>
@@ -3372,7 +3372,7 @@
               <w:tc>
                 <w:tcPr>
                   <w:tcW w:type="dxa" w:w="2400"/>
-                  <w:shd w:val="clear" w:color="auto" w:fill="FCFBF7"/>
+                  <w:shd w:val="clear" w:color="auto" w:fill="F5F6F9"/>
                 </w:tcPr>
                 <w:p>
                   <w:pPr>
@@ -3383,7 +3383,7 @@
                       <w:rFonts w:ascii="Inter" w:hAnsi="Inter"/>
                       <w:b w:val="0"/>
                       <w:i w:val="0"/>
-                      <w:color w:val="1F2937"/>
+                      <w:color w:val="1B2433"/>
                       <w:sz w:val="18"/>
                     </w:rPr>
                     <w:t>Intolérance aux IEC</w:t>
@@ -3428,7 +3428,7 @@
                       <w:rFonts w:ascii="Inter" w:hAnsi="Inter"/>
                       <w:b w:val="0"/>
                       <w:i w:val="0"/>
-                      <w:color w:val="1F2937"/>
+                      <w:color w:val="1B2433"/>
                       <w:sz w:val="18"/>
                     </w:rPr>
                     <w:t>Amlodipine</w:t>
@@ -3448,7 +3448,7 @@
                       <w:rFonts w:ascii="Inter" w:hAnsi="Inter"/>
                       <w:b w:val="0"/>
                       <w:i w:val="0"/>
-                      <w:color w:val="1F2937"/>
+                      <w:color w:val="1B2433"/>
                       <w:sz w:val="18"/>
                     </w:rPr>
                     <w:t>Sujet âgé</w:t>
@@ -3463,7 +3463,7 @@
               <w:tc>
                 <w:tcPr>
                   <w:tcW w:type="dxa" w:w="2400"/>
-                  <w:shd w:val="clear" w:color="auto" w:fill="FCFBF7"/>
+                  <w:shd w:val="clear" w:color="auto" w:fill="F5F6F9"/>
                 </w:tcPr>
                 <w:p>
                   <w:pPr>
@@ -3484,7 +3484,7 @@
               <w:tc>
                 <w:tcPr>
                   <w:tcW w:type="dxa" w:w="2400"/>
-                  <w:shd w:val="clear" w:color="auto" w:fill="FCFBF7"/>
+                  <w:shd w:val="clear" w:color="auto" w:fill="F5F6F9"/>
                 </w:tcPr>
                 <w:p>
                   <w:pPr>
@@ -3495,7 +3495,7 @@
                       <w:rFonts w:ascii="Inter" w:hAnsi="Inter"/>
                       <w:b w:val="0"/>
                       <w:i w:val="0"/>
-                      <w:color w:val="1F2937"/>
+                      <w:color w:val="1B2433"/>
                       <w:sz w:val="18"/>
                     </w:rPr>
                     <w:t>HCTZ</w:t>
@@ -3505,7 +3505,7 @@
               <w:tc>
                 <w:tcPr>
                   <w:tcW w:type="dxa" w:w="2400"/>
-                  <w:shd w:val="clear" w:color="auto" w:fill="FCFBF7"/>
+                  <w:shd w:val="clear" w:color="auto" w:fill="F5F6F9"/>
                 </w:tcPr>
                 <w:p>
                   <w:pPr>
@@ -3516,7 +3516,7 @@
                       <w:rFonts w:ascii="Inter" w:hAnsi="Inter"/>
                       <w:b w:val="0"/>
                       <w:i w:val="0"/>
-                      <w:color w:val="1F2937"/>
+                      <w:color w:val="1B2433"/>
                       <w:sz w:val="18"/>
                     </w:rPr>
                     <w:t>Sujet âgé</w:t>
@@ -3540,7 +3540,7 @@
         <w:tc>
           <w:tcPr>
             <w:tcW w:type="dxa" w:w="2663"/>
-            <w:shd w:val="clear" w:color="auto" w:fill="FAF7F2"/>
+            <w:shd w:val="clear" w:color="auto" w:fill="EEF1F5"/>
             <w:vAlign w:val="center"/>
           </w:tcPr>
           <w:p>
@@ -3562,7 +3562,7 @@
                 <w:rFonts w:ascii="Inter" w:hAnsi="Inter"/>
                 <w:b/>
                 <w:i w:val="0"/>
-                <w:color w:val="1F2937"/>
+                <w:color w:val="1B2433"/>
                 <w:sz w:val="20"/>
               </w:rPr>
               <w:t xml:space="preserve"> Stratégie</w:t>
@@ -3594,7 +3594,7 @@
                 <w:rFonts w:ascii="Inter" w:hAnsi="Inter"/>
                 <w:b w:val="0"/>
                 <w:i w:val="0"/>
-                <w:color w:val="1F2937"/>
+                <w:color w:val="1B2433"/>
                 <w:sz w:val="20"/>
               </w:rPr>
               <w:t xml:space="preserve"> souvent recommandée</w:t>
@@ -3610,7 +3610,7 @@
                 <w:rFonts w:ascii="Inter" w:hAnsi="Inter"/>
                 <w:b w:val="0"/>
                 <w:i w:val="0"/>
-                <w:color w:val="1F2937"/>
+                <w:color w:val="1B2433"/>
                 <w:sz w:val="20"/>
               </w:rPr>
               <w:t xml:space="preserve">privilégier les </w:t>
@@ -3636,7 +3636,7 @@
                 <w:rFonts w:ascii="Inter" w:hAnsi="Inter"/>
                 <w:b w:val="0"/>
                 <w:i w:val="0"/>
-                <w:color w:val="1F2937"/>
+                <w:color w:val="1B2433"/>
                 <w:sz w:val="20"/>
               </w:rPr>
               <w:t xml:space="preserve">objectif : </w:t>
@@ -3656,7 +3656,7 @@
                 <w:rFonts w:ascii="Inter" w:hAnsi="Inter"/>
                 <w:b w:val="0"/>
                 <w:i w:val="0"/>
-                <w:color w:val="1F2937"/>
+                <w:color w:val="1B2433"/>
                 <w:sz w:val="20"/>
               </w:rPr>
               <w:t xml:space="preserve">, voire </w:t>
@@ -3712,7 +3712,7 @@
                 <w:rFonts w:ascii="Inter" w:hAnsi="Inter"/>
                 <w:b w:val="0"/>
                 <w:i w:val="0"/>
-                <w:color w:val="1F2937"/>
+                <w:color w:val="1B2433"/>
                 <w:sz w:val="20"/>
               </w:rPr>
               <w:t xml:space="preserve">Les 5 classes — moyen mnémotechnique </w:t>
@@ -3732,7 +3732,7 @@
                 <w:rFonts w:ascii="Inter" w:hAnsi="Inter"/>
                 <w:b w:val="0"/>
                 <w:i w:val="0"/>
-                <w:color w:val="1F2937"/>
+                <w:color w:val="1B2433"/>
                 <w:sz w:val="20"/>
               </w:rPr>
               <w:t xml:space="preserve"> : </w:t>
@@ -3752,7 +3752,7 @@
                 <w:rFonts w:ascii="Inter" w:hAnsi="Inter"/>
                 <w:b w:val="0"/>
                 <w:i w:val="0"/>
-                <w:color w:val="1F2937"/>
+                <w:color w:val="1B2433"/>
                 <w:sz w:val="20"/>
               </w:rPr>
               <w:t xml:space="preserve">RA II / IEC, </w:t>
@@ -3772,7 +3772,7 @@
                 <w:rFonts w:ascii="Inter" w:hAnsi="Inter"/>
                 <w:b w:val="0"/>
                 <w:i w:val="0"/>
-                <w:color w:val="1F2937"/>
+                <w:color w:val="1B2433"/>
                 <w:sz w:val="20"/>
               </w:rPr>
               <w:t xml:space="preserve">êtabloquants, </w:t>
@@ -3792,7 +3792,7 @@
                 <w:rFonts w:ascii="Inter" w:hAnsi="Inter"/>
                 <w:b w:val="0"/>
                 <w:i w:val="0"/>
-                <w:color w:val="1F2937"/>
+                <w:color w:val="1B2433"/>
                 <w:sz w:val="20"/>
               </w:rPr>
               <w:t xml:space="preserve">alciques, </w:t>
@@ -3812,7 +3812,7 @@
                 <w:rFonts w:ascii="Inter" w:hAnsi="Inter"/>
                 <w:b w:val="0"/>
                 <w:i w:val="0"/>
-                <w:color w:val="1F2937"/>
+                <w:color w:val="1B2433"/>
                 <w:sz w:val="20"/>
               </w:rPr>
               <w:t>iurétiques.</w:t>
@@ -3834,7 +3834,7 @@
     <w:p>
       <w:pPr>
         <w:keepNext/>
-        <w:shd w:val="clear" w:color="auto" w:fill="E11D48"/>
+        <w:shd w:val="clear" w:color="auto" w:fill="0F1E33"/>
         <w:spacing w:before="40" w:after="200"/>
       </w:pPr>
       <w:r>
@@ -3855,7 +3855,7 @@
         <w:rPr>
           <w:rFonts w:ascii="Cormorant Garamond" w:hAnsi="Cormorant Garamond"/>
           <w:b/>
-          <w:color w:val="E11D48"/>
+          <w:color w:val="0F1E33"/>
           <w:sz w:val="26"/>
         </w:rPr>
         <w:t>Chiffres-clés à connaître</w:t>
@@ -3866,12 +3866,12 @@
         <w:tblW w:type="auto" w:w="0"/>
         <w:jc w:val="center"/>
         <w:tblBorders>
-          <w:top w:val="single" w:sz="4" w:space="0" w:color="9CA3AF"/>
-          <w:left w:val="single" w:sz="4" w:space="0" w:color="9CA3AF"/>
-          <w:bottom w:val="single" w:sz="4" w:space="0" w:color="9CA3AF"/>
-          <w:right w:val="single" w:sz="4" w:space="0" w:color="9CA3AF"/>
-          <w:insideH w:val="single" w:sz="4" w:space="0" w:color="9CA3AF"/>
-          <w:insideV w:val="single" w:sz="4" w:space="0" w:color="9CA3AF"/>
+          <w:top w:val="single" w:sz="4" w:space="0" w:color="94A0B0"/>
+          <w:left w:val="single" w:sz="4" w:space="0" w:color="94A0B0"/>
+          <w:bottom w:val="single" w:sz="4" w:space="0" w:color="94A0B0"/>
+          <w:right w:val="single" w:sz="4" w:space="0" w:color="94A0B0"/>
+          <w:insideH w:val="single" w:sz="4" w:space="0" w:color="94A0B0"/>
+          <w:insideV w:val="single" w:sz="4" w:space="0" w:color="94A0B0"/>
         </w:tblBorders>
         <w:tblLayout w:type="autofit"/>
         <w:tblLook w:firstColumn="1" w:firstRow="1" w:lastColumn="0" w:lastRow="0" w:noHBand="0" w:noVBand="1" w:val="04A0"/>
@@ -3888,7 +3888,7 @@
         <w:tc>
           <w:tcPr>
             <w:tcW w:type="dxa" w:w="3289"/>
-            <w:shd w:val="clear" w:color="auto" w:fill="E11D48"/>
+            <w:shd w:val="clear" w:color="auto" w:fill="0F1E33"/>
           </w:tcPr>
           <w:p>
             <w:pPr>
@@ -3909,7 +3909,7 @@
         <w:tc>
           <w:tcPr>
             <w:tcW w:type="dxa" w:w="3289"/>
-            <w:shd w:val="clear" w:color="auto" w:fill="E11D48"/>
+            <w:shd w:val="clear" w:color="auto" w:fill="0F1E33"/>
           </w:tcPr>
           <w:p>
             <w:pPr>
@@ -3930,7 +3930,7 @@
         <w:tc>
           <w:tcPr>
             <w:tcW w:type="dxa" w:w="3289"/>
-            <w:shd w:val="clear" w:color="auto" w:fill="E11D48"/>
+            <w:shd w:val="clear" w:color="auto" w:fill="0F1E33"/>
           </w:tcPr>
           <w:p>
             <w:pPr>
@@ -3966,7 +3966,7 @@
                 <w:rFonts w:ascii="Inter" w:hAnsi="Inter"/>
                 <w:b w:val="0"/>
                 <w:i w:val="0"/>
-                <w:color w:val="1F2937"/>
+                <w:color w:val="1B2433"/>
                 <w:sz w:val="18"/>
               </w:rPr>
               <w:t>Seuil HTA au cabinet</w:t>
@@ -4006,7 +4006,7 @@
                 <w:rFonts w:ascii="Inter" w:hAnsi="Inter"/>
                 <w:b w:val="0"/>
                 <w:i w:val="0"/>
-                <w:color w:val="1F2937"/>
+                <w:color w:val="1B2433"/>
                 <w:sz w:val="18"/>
               </w:rPr>
               <w:t>sur 2 consultations</w:t>
@@ -4021,7 +4021,7 @@
         <w:tc>
           <w:tcPr>
             <w:tcW w:type="dxa" w:w="3289"/>
-            <w:shd w:val="clear" w:color="auto" w:fill="FAF7F2"/>
+            <w:shd w:val="clear" w:color="auto" w:fill="EEF1F5"/>
           </w:tcPr>
           <w:p>
             <w:pPr>
@@ -4032,7 +4032,7 @@
                 <w:rFonts w:ascii="Inter" w:hAnsi="Inter"/>
                 <w:b w:val="0"/>
                 <w:i w:val="0"/>
-                <w:color w:val="1F2937"/>
+                <w:color w:val="1B2433"/>
                 <w:sz w:val="18"/>
               </w:rPr>
               <w:t>Seuil en automesure</w:t>
@@ -4042,7 +4042,7 @@
         <w:tc>
           <w:tcPr>
             <w:tcW w:type="dxa" w:w="3289"/>
-            <w:shd w:val="clear" w:color="auto" w:fill="FAF7F2"/>
+            <w:shd w:val="clear" w:color="auto" w:fill="EEF1F5"/>
           </w:tcPr>
           <w:p>
             <w:pPr>
@@ -4063,7 +4063,7 @@
         <w:tc>
           <w:tcPr>
             <w:tcW w:type="dxa" w:w="3289"/>
-            <w:shd w:val="clear" w:color="auto" w:fill="FAF7F2"/>
+            <w:shd w:val="clear" w:color="auto" w:fill="EEF1F5"/>
           </w:tcPr>
           <w:p>
             <w:pPr>
@@ -4074,7 +4074,7 @@
                 <w:rFonts w:ascii="Inter" w:hAnsi="Inter"/>
                 <w:b w:val="0"/>
                 <w:i w:val="0"/>
-                <w:color w:val="1F2937"/>
+                <w:color w:val="1B2433"/>
                 <w:sz w:val="18"/>
               </w:rPr>
               <w:t>règle des 3</w:t>
@@ -4099,7 +4099,7 @@
                 <w:rFonts w:ascii="Inter" w:hAnsi="Inter"/>
                 <w:b w:val="0"/>
                 <w:i w:val="0"/>
-                <w:color w:val="1F2937"/>
+                <w:color w:val="1B2433"/>
                 <w:sz w:val="18"/>
               </w:rPr>
               <w:t>Apports en sel conseillés</w:t>
@@ -4139,7 +4139,7 @@
                 <w:rFonts w:ascii="Inter" w:hAnsi="Inter"/>
                 <w:b w:val="0"/>
                 <w:i w:val="0"/>
-                <w:color w:val="1F2937"/>
+                <w:color w:val="1B2433"/>
                 <w:sz w:val="18"/>
               </w:rPr>
               <w:t>mesure hygiéno-diététique</w:t>
@@ -4154,7 +4154,7 @@
         <w:tc>
           <w:tcPr>
             <w:tcW w:type="dxa" w:w="3289"/>
-            <w:shd w:val="clear" w:color="auto" w:fill="FAF7F2"/>
+            <w:shd w:val="clear" w:color="auto" w:fill="EEF1F5"/>
           </w:tcPr>
           <w:p>
             <w:pPr>
@@ -4165,7 +4165,7 @@
                 <w:rFonts w:ascii="Inter" w:hAnsi="Inter"/>
                 <w:b w:val="0"/>
                 <w:i w:val="0"/>
-                <w:color w:val="1F2937"/>
+                <w:color w:val="1B2433"/>
                 <w:sz w:val="18"/>
               </w:rPr>
               <w:t>Objectif tensionnel</w:t>
@@ -4175,7 +4175,7 @@
         <w:tc>
           <w:tcPr>
             <w:tcW w:type="dxa" w:w="3289"/>
-            <w:shd w:val="clear" w:color="auto" w:fill="FAF7F2"/>
+            <w:shd w:val="clear" w:color="auto" w:fill="EEF1F5"/>
           </w:tcPr>
           <w:p>
             <w:pPr>
@@ -4196,7 +4196,7 @@
         <w:tc>
           <w:tcPr>
             <w:tcW w:type="dxa" w:w="3289"/>
-            <w:shd w:val="clear" w:color="auto" w:fill="FAF7F2"/>
+            <w:shd w:val="clear" w:color="auto" w:fill="EEF1F5"/>
           </w:tcPr>
           <w:p>
             <w:pPr>
@@ -4207,7 +4207,7 @@
                 <w:rFonts w:ascii="Inter" w:hAnsi="Inter"/>
                 <w:b w:val="0"/>
                 <w:i w:val="0"/>
-                <w:color w:val="1F2937"/>
+                <w:color w:val="1B2433"/>
                 <w:sz w:val="18"/>
               </w:rPr>
               <w:t>voire &lt; 130/80 si toléré</w:t>
@@ -4232,7 +4232,7 @@
                 <w:rFonts w:ascii="Inter" w:hAnsi="Inter"/>
                 <w:b w:val="0"/>
                 <w:i w:val="0"/>
-                <w:color w:val="1F2937"/>
+                <w:color w:val="1B2433"/>
                 <w:sz w:val="18"/>
               </w:rPr>
               <w:t>Prévalence de l'HTA</w:t>
@@ -4272,7 +4272,7 @@
                 <w:rFonts w:ascii="Inter" w:hAnsi="Inter"/>
                 <w:b w:val="0"/>
                 <w:i w:val="0"/>
-                <w:color w:val="1F2937"/>
+                <w:color w:val="1B2433"/>
                 <w:sz w:val="18"/>
               </w:rPr>
               <w:t>population adulte</w:t>
@@ -4294,7 +4294,7 @@
         <w:rPr>
           <w:rFonts w:ascii="Cormorant Garamond" w:hAnsi="Cormorant Garamond"/>
           <w:b/>
-          <w:color w:val="E11D48"/>
+          <w:color w:val="0F1E33"/>
           <w:sz w:val="26"/>
         </w:rPr>
         <w:t>Grades de sévérité de l'HTA</w:t>
@@ -4305,12 +4305,12 @@
         <w:tblW w:type="auto" w:w="0"/>
         <w:jc w:val="center"/>
         <w:tblBorders>
-          <w:top w:val="single" w:sz="4" w:space="0" w:color="9CA3AF"/>
-          <w:left w:val="single" w:sz="4" w:space="0" w:color="9CA3AF"/>
-          <w:bottom w:val="single" w:sz="4" w:space="0" w:color="9CA3AF"/>
-          <w:right w:val="single" w:sz="4" w:space="0" w:color="9CA3AF"/>
-          <w:insideH w:val="single" w:sz="4" w:space="0" w:color="9CA3AF"/>
-          <w:insideV w:val="single" w:sz="4" w:space="0" w:color="9CA3AF"/>
+          <w:top w:val="single" w:sz="4" w:space="0" w:color="94A0B0"/>
+          <w:left w:val="single" w:sz="4" w:space="0" w:color="94A0B0"/>
+          <w:bottom w:val="single" w:sz="4" w:space="0" w:color="94A0B0"/>
+          <w:right w:val="single" w:sz="4" w:space="0" w:color="94A0B0"/>
+          <w:insideH w:val="single" w:sz="4" w:space="0" w:color="94A0B0"/>
+          <w:insideV w:val="single" w:sz="4" w:space="0" w:color="94A0B0"/>
         </w:tblBorders>
         <w:tblLayout w:type="autofit"/>
         <w:tblLook w:firstColumn="1" w:firstRow="1" w:lastColumn="0" w:lastRow="0" w:noHBand="0" w:noVBand="1" w:val="04A0"/>
@@ -4327,7 +4327,7 @@
         <w:tc>
           <w:tcPr>
             <w:tcW w:type="dxa" w:w="3289"/>
-            <w:shd w:val="clear" w:color="auto" w:fill="E11D48"/>
+            <w:shd w:val="clear" w:color="auto" w:fill="0F1E33"/>
           </w:tcPr>
           <w:p>
             <w:pPr>
@@ -4348,7 +4348,7 @@
         <w:tc>
           <w:tcPr>
             <w:tcW w:type="dxa" w:w="3289"/>
-            <w:shd w:val="clear" w:color="auto" w:fill="E11D48"/>
+            <w:shd w:val="clear" w:color="auto" w:fill="0F1E33"/>
           </w:tcPr>
           <w:p>
             <w:pPr>
@@ -4369,7 +4369,7 @@
         <w:tc>
           <w:tcPr>
             <w:tcW w:type="dxa" w:w="3289"/>
-            <w:shd w:val="clear" w:color="auto" w:fill="E11D48"/>
+            <w:shd w:val="clear" w:color="auto" w:fill="0F1E33"/>
           </w:tcPr>
           <w:p>
             <w:pPr>
@@ -4425,7 +4425,7 @@
                 <w:rFonts w:ascii="Inter" w:hAnsi="Inter"/>
                 <w:b w:val="0"/>
                 <w:i w:val="0"/>
-                <w:color w:val="1F2937"/>
+                <w:color w:val="1B2433"/>
                 <w:sz w:val="18"/>
               </w:rPr>
               <w:t>140-159</w:t>
@@ -4445,7 +4445,7 @@
                 <w:rFonts w:ascii="Inter" w:hAnsi="Inter"/>
                 <w:b w:val="0"/>
                 <w:i w:val="0"/>
-                <w:color w:val="1F2937"/>
+                <w:color w:val="1B2433"/>
                 <w:sz w:val="18"/>
               </w:rPr>
               <w:t>90-99</w:t>
@@ -4460,7 +4460,7 @@
         <w:tc>
           <w:tcPr>
             <w:tcW w:type="dxa" w:w="3289"/>
-            <w:shd w:val="clear" w:color="auto" w:fill="FAF7F2"/>
+            <w:shd w:val="clear" w:color="auto" w:fill="EEF1F5"/>
           </w:tcPr>
           <w:p>
             <w:pPr>
@@ -4481,7 +4481,7 @@
         <w:tc>
           <w:tcPr>
             <w:tcW w:type="dxa" w:w="3289"/>
-            <w:shd w:val="clear" w:color="auto" w:fill="FAF7F2"/>
+            <w:shd w:val="clear" w:color="auto" w:fill="EEF1F5"/>
           </w:tcPr>
           <w:p>
             <w:pPr>
@@ -4492,7 +4492,7 @@
                 <w:rFonts w:ascii="Inter" w:hAnsi="Inter"/>
                 <w:b w:val="0"/>
                 <w:i w:val="0"/>
-                <w:color w:val="1F2937"/>
+                <w:color w:val="1B2433"/>
                 <w:sz w:val="18"/>
               </w:rPr>
               <w:t>160-179</w:t>
@@ -4502,7 +4502,7 @@
         <w:tc>
           <w:tcPr>
             <w:tcW w:type="dxa" w:w="3289"/>
-            <w:shd w:val="clear" w:color="auto" w:fill="FAF7F2"/>
+            <w:shd w:val="clear" w:color="auto" w:fill="EEF1F5"/>
           </w:tcPr>
           <w:p>
             <w:pPr>
@@ -4513,7 +4513,7 @@
                 <w:rFonts w:ascii="Inter" w:hAnsi="Inter"/>
                 <w:b w:val="0"/>
                 <w:i w:val="0"/>
-                <w:color w:val="1F2937"/>
+                <w:color w:val="1B2433"/>
                 <w:sz w:val="18"/>
               </w:rPr>
               <w:t>100-109</w:t>
@@ -4558,7 +4558,7 @@
                 <w:rFonts w:ascii="Inter" w:hAnsi="Inter"/>
                 <w:b w:val="0"/>
                 <w:i w:val="0"/>
-                <w:color w:val="1F2937"/>
+                <w:color w:val="1B2433"/>
                 <w:sz w:val="18"/>
               </w:rPr>
               <w:t>≥ 180</w:t>
@@ -4578,7 +4578,7 @@
                 <w:rFonts w:ascii="Inter" w:hAnsi="Inter"/>
                 <w:b w:val="0"/>
                 <w:i w:val="0"/>
-                <w:color w:val="1F2937"/>
+                <w:color w:val="1B2433"/>
                 <w:sz w:val="18"/>
               </w:rPr>
               <w:t>≥ 110</w:t>
@@ -4600,7 +4600,7 @@
         <w:rPr>
           <w:rFonts w:ascii="Cormorant Garamond" w:hAnsi="Cormorant Garamond"/>
           <w:b/>
-          <w:color w:val="E11D48"/>
+          <w:color w:val="0F1E33"/>
           <w:sz w:val="26"/>
         </w:rPr>
         <w:t>Classes thérapeutiques de première intention</w:t>
@@ -4611,12 +4611,12 @@
         <w:tblW w:type="auto" w:w="0"/>
         <w:jc w:val="center"/>
         <w:tblBorders>
-          <w:top w:val="single" w:sz="4" w:space="0" w:color="9CA3AF"/>
-          <w:left w:val="single" w:sz="4" w:space="0" w:color="9CA3AF"/>
-          <w:bottom w:val="single" w:sz="4" w:space="0" w:color="9CA3AF"/>
-          <w:right w:val="single" w:sz="4" w:space="0" w:color="9CA3AF"/>
-          <w:insideH w:val="single" w:sz="4" w:space="0" w:color="9CA3AF"/>
-          <w:insideV w:val="single" w:sz="4" w:space="0" w:color="9CA3AF"/>
+          <w:top w:val="single" w:sz="4" w:space="0" w:color="94A0B0"/>
+          <w:left w:val="single" w:sz="4" w:space="0" w:color="94A0B0"/>
+          <w:bottom w:val="single" w:sz="4" w:space="0" w:color="94A0B0"/>
+          <w:right w:val="single" w:sz="4" w:space="0" w:color="94A0B0"/>
+          <w:insideH w:val="single" w:sz="4" w:space="0" w:color="94A0B0"/>
+          <w:insideV w:val="single" w:sz="4" w:space="0" w:color="94A0B0"/>
         </w:tblBorders>
         <w:tblLayout w:type="autofit"/>
         <w:tblLook w:firstColumn="1" w:firstRow="1" w:lastColumn="0" w:lastRow="0" w:noHBand="0" w:noVBand="1" w:val="04A0"/>
@@ -4633,7 +4633,7 @@
         <w:tc>
           <w:tcPr>
             <w:tcW w:type="dxa" w:w="3289"/>
-            <w:shd w:val="clear" w:color="auto" w:fill="E11D48"/>
+            <w:shd w:val="clear" w:color="auto" w:fill="0F1E33"/>
           </w:tcPr>
           <w:p>
             <w:pPr>
@@ -4654,7 +4654,7 @@
         <w:tc>
           <w:tcPr>
             <w:tcW w:type="dxa" w:w="3289"/>
-            <w:shd w:val="clear" w:color="auto" w:fill="E11D48"/>
+            <w:shd w:val="clear" w:color="auto" w:fill="0F1E33"/>
           </w:tcPr>
           <w:p>
             <w:pPr>
@@ -4675,7 +4675,7 @@
         <w:tc>
           <w:tcPr>
             <w:tcW w:type="dxa" w:w="3289"/>
-            <w:shd w:val="clear" w:color="auto" w:fill="E11D48"/>
+            <w:shd w:val="clear" w:color="auto" w:fill="0F1E33"/>
           </w:tcPr>
           <w:p>
             <w:pPr>
@@ -4731,7 +4731,7 @@
                 <w:rFonts w:ascii="Inter" w:hAnsi="Inter"/>
                 <w:b w:val="0"/>
                 <w:i w:val="0"/>
-                <w:color w:val="1F2937"/>
+                <w:color w:val="1B2433"/>
                 <w:sz w:val="18"/>
               </w:rPr>
               <w:t>Ramipril</w:t>
@@ -4751,7 +4751,7 @@
                 <w:rFonts w:ascii="Inter" w:hAnsi="Inter"/>
                 <w:b w:val="0"/>
                 <w:i w:val="0"/>
-                <w:color w:val="1F2937"/>
+                <w:color w:val="1B2433"/>
                 <w:sz w:val="18"/>
               </w:rPr>
               <w:t>Diabète, insuffisance cardiaque</w:t>
@@ -4766,7 +4766,7 @@
         <w:tc>
           <w:tcPr>
             <w:tcW w:type="dxa" w:w="3289"/>
-            <w:shd w:val="clear" w:color="auto" w:fill="FAF7F2"/>
+            <w:shd w:val="clear" w:color="auto" w:fill="EEF1F5"/>
           </w:tcPr>
           <w:p>
             <w:pPr>
@@ -4787,7 +4787,7 @@
         <w:tc>
           <w:tcPr>
             <w:tcW w:type="dxa" w:w="3289"/>
-            <w:shd w:val="clear" w:color="auto" w:fill="FAF7F2"/>
+            <w:shd w:val="clear" w:color="auto" w:fill="EEF1F5"/>
           </w:tcPr>
           <w:p>
             <w:pPr>
@@ -4798,7 +4798,7 @@
                 <w:rFonts w:ascii="Inter" w:hAnsi="Inter"/>
                 <w:b w:val="0"/>
                 <w:i w:val="0"/>
-                <w:color w:val="1F2937"/>
+                <w:color w:val="1B2433"/>
                 <w:sz w:val="18"/>
               </w:rPr>
               <w:t>Losartan</w:t>
@@ -4808,7 +4808,7 @@
         <w:tc>
           <w:tcPr>
             <w:tcW w:type="dxa" w:w="3289"/>
-            <w:shd w:val="clear" w:color="auto" w:fill="FAF7F2"/>
+            <w:shd w:val="clear" w:color="auto" w:fill="EEF1F5"/>
           </w:tcPr>
           <w:p>
             <w:pPr>
@@ -4819,7 +4819,7 @@
                 <w:rFonts w:ascii="Inter" w:hAnsi="Inter"/>
                 <w:b w:val="0"/>
                 <w:i w:val="0"/>
-                <w:color w:val="1F2937"/>
+                <w:color w:val="1B2433"/>
                 <w:sz w:val="18"/>
               </w:rPr>
               <w:t>Intolérance aux IEC (toux)</w:t>
@@ -4864,7 +4864,7 @@
                 <w:rFonts w:ascii="Inter" w:hAnsi="Inter"/>
                 <w:b w:val="0"/>
                 <w:i w:val="0"/>
-                <w:color w:val="1F2937"/>
+                <w:color w:val="1B2433"/>
                 <w:sz w:val="18"/>
               </w:rPr>
               <w:t>Amlodipine</w:t>
@@ -4884,7 +4884,7 @@
                 <w:rFonts w:ascii="Inter" w:hAnsi="Inter"/>
                 <w:b w:val="0"/>
                 <w:i w:val="0"/>
-                <w:color w:val="1F2937"/>
+                <w:color w:val="1B2433"/>
                 <w:sz w:val="18"/>
               </w:rPr>
               <w:t>Sujet âgé</w:t>
@@ -4899,7 +4899,7 @@
         <w:tc>
           <w:tcPr>
             <w:tcW w:type="dxa" w:w="3289"/>
-            <w:shd w:val="clear" w:color="auto" w:fill="FAF7F2"/>
+            <w:shd w:val="clear" w:color="auto" w:fill="EEF1F5"/>
           </w:tcPr>
           <w:p>
             <w:pPr>
@@ -4920,7 +4920,7 @@
         <w:tc>
           <w:tcPr>
             <w:tcW w:type="dxa" w:w="3289"/>
-            <w:shd w:val="clear" w:color="auto" w:fill="FAF7F2"/>
+            <w:shd w:val="clear" w:color="auto" w:fill="EEF1F5"/>
           </w:tcPr>
           <w:p>
             <w:pPr>
@@ -4931,7 +4931,7 @@
                 <w:rFonts w:ascii="Inter" w:hAnsi="Inter"/>
                 <w:b w:val="0"/>
                 <w:i w:val="0"/>
-                <w:color w:val="1F2937"/>
+                <w:color w:val="1B2433"/>
                 <w:sz w:val="18"/>
               </w:rPr>
               <w:t>HCTZ</w:t>
@@ -4941,7 +4941,7 @@
         <w:tc>
           <w:tcPr>
             <w:tcW w:type="dxa" w:w="3289"/>
-            <w:shd w:val="clear" w:color="auto" w:fill="FAF7F2"/>
+            <w:shd w:val="clear" w:color="auto" w:fill="EEF1F5"/>
           </w:tcPr>
           <w:p>
             <w:pPr>
@@ -4952,7 +4952,7 @@
                 <w:rFonts w:ascii="Inter" w:hAnsi="Inter"/>
                 <w:b w:val="0"/>
                 <w:i w:val="0"/>
-                <w:color w:val="1F2937"/>
+                <w:color w:val="1B2433"/>
                 <w:sz w:val="18"/>
               </w:rPr>
               <w:t>Sujet âgé</w:t>
@@ -4997,7 +4997,7 @@
                 <w:rFonts w:ascii="Inter" w:hAnsi="Inter"/>
                 <w:b w:val="0"/>
                 <w:i w:val="0"/>
-                <w:color w:val="1F2937"/>
+                <w:color w:val="1B2433"/>
                 <w:sz w:val="18"/>
               </w:rPr>
               <w:t>Bisoprolol</w:t>
@@ -5017,7 +5017,7 @@
                 <w:rFonts w:ascii="Inter" w:hAnsi="Inter"/>
                 <w:b w:val="0"/>
                 <w:i w:val="0"/>
-                <w:color w:val="1F2937"/>
+                <w:color w:val="1B2433"/>
                 <w:sz w:val="18"/>
               </w:rPr>
               <w:t>Coronaropathie associée</w:t>
@@ -5059,7 +5059,7 @@
         <w:rPr>
           <w:rFonts w:ascii="Playfair Display" w:hAnsi="Playfair Display"/>
           <w:b/>
-          <w:color w:val="1F2937"/>
+          <w:color w:val="1B2433"/>
           <w:sz w:val="52"/>
         </w:rPr>
         <w:t>Fiche éclair</w:t>
@@ -5074,7 +5074,7 @@
         <w:rPr>
           <w:rFonts w:ascii="Cormorant Garamond" w:hAnsi="Cormorant Garamond"/>
           <w:i/>
-          <w:color w:val="E11D48"/>
+          <w:color w:val="0F1E33"/>
           <w:sz w:val="26"/>
         </w:rPr>
         <w:t>Hypertension Artérielle</w:t>
@@ -5096,7 +5096,7 @@
           <w:rFonts w:ascii="Inter" w:hAnsi="Inter"/>
           <w:b w:val="0"/>
           <w:i w:val="0"/>
-          <w:color w:val="1F2937"/>
+          <w:color w:val="1B2433"/>
           <w:sz w:val="20"/>
         </w:rPr>
         <w:t xml:space="preserve"> : PA ≥ 140/90 mmHg au cabinet (135/85 en automesure), confirmée sur 2 consultations.</w:t>
@@ -5118,7 +5118,7 @@
           <w:rFonts w:ascii="Inter" w:hAnsi="Inter"/>
           <w:b w:val="0"/>
           <w:i w:val="0"/>
-          <w:color w:val="1F2937"/>
+          <w:color w:val="1B2433"/>
           <w:sz w:val="20"/>
         </w:rPr>
         <w:t xml:space="preserve"> : MAPA = examen de référence ; rechercher HTA blouse blanche et HTA masquée.</w:t>
@@ -5140,7 +5140,7 @@
           <w:rFonts w:ascii="Inter" w:hAnsi="Inter"/>
           <w:b w:val="0"/>
           <w:i w:val="0"/>
-          <w:color w:val="1F2937"/>
+          <w:color w:val="1B2433"/>
           <w:sz w:val="20"/>
         </w:rPr>
         <w:t xml:space="preserve"> : organes cibles (cœur, rein, œil) + bilan biologique minimal ; évoquer une HTA secondaire si résistance ou sujet jeune.</w:t>
@@ -5162,7 +5162,7 @@
           <w:rFonts w:ascii="Inter" w:hAnsi="Inter"/>
           <w:b w:val="0"/>
           <w:i w:val="0"/>
-          <w:color w:val="1F2937"/>
+          <w:color w:val="1B2433"/>
           <w:sz w:val="20"/>
         </w:rPr>
         <w:t xml:space="preserve"> : RHD systématiques + 5 classes (IEC, ARA II, calciques, diurétiques, bêtabloquants) ; bithérapie d'emblée fréquente ; objectif &lt; 140/90 mmHg.</w:t>
@@ -5179,7 +5179,7 @@
         <w:rPr>
           <w:rFonts w:ascii="Cormorant Garamond" w:hAnsi="Cormorant Garamond"/>
           <w:b/>
-          <w:color w:val="E11D48"/>
+          <w:color w:val="0F1E33"/>
           <w:sz w:val="26"/>
         </w:rPr>
         <w:t>À retenir absolument</w:t>
@@ -5195,7 +5195,7 @@
           <w:rFonts w:ascii="Inter" w:hAnsi="Inter"/>
           <w:b w:val="0"/>
           <w:i w:val="0"/>
-          <w:color w:val="1F2937"/>
+          <w:color w:val="1B2433"/>
           <w:sz w:val="21"/>
         </w:rPr>
         <w:t>L'</w:t>
@@ -5215,7 +5215,7 @@
           <w:rFonts w:ascii="Inter" w:hAnsi="Inter"/>
           <w:b w:val="0"/>
           <w:i w:val="0"/>
-          <w:color w:val="1F2937"/>
+          <w:color w:val="1B2433"/>
           <w:sz w:val="21"/>
         </w:rPr>
         <w:t xml:space="preserve"> est définie par une PA </w:t>
@@ -5235,7 +5235,7 @@
           <w:rFonts w:ascii="Inter" w:hAnsi="Inter"/>
           <w:b w:val="0"/>
           <w:i w:val="0"/>
-          <w:color w:val="1F2937"/>
+          <w:color w:val="1B2433"/>
           <w:sz w:val="21"/>
         </w:rPr>
         <w:t xml:space="preserve"> au cabinet, confirmée sur des mesures répétées.</w:t>
@@ -5251,7 +5251,7 @@
           <w:rFonts w:ascii="Inter" w:hAnsi="Inter"/>
           <w:b w:val="0"/>
           <w:i w:val="0"/>
-          <w:color w:val="1F2937"/>
+          <w:color w:val="1B2433"/>
           <w:sz w:val="21"/>
         </w:rPr>
         <w:t xml:space="preserve">La </w:t>
@@ -5271,7 +5271,7 @@
           <w:rFonts w:ascii="Inter" w:hAnsi="Inter"/>
           <w:b w:val="0"/>
           <w:i w:val="0"/>
-          <w:color w:val="1F2937"/>
+          <w:color w:val="1B2433"/>
           <w:sz w:val="21"/>
         </w:rPr>
         <w:t xml:space="preserve"> et l'</w:t>
@@ -5291,7 +5291,7 @@
           <w:rFonts w:ascii="Inter" w:hAnsi="Inter"/>
           <w:b w:val="0"/>
           <w:i w:val="0"/>
-          <w:color w:val="1F2937"/>
+          <w:color w:val="1B2433"/>
           <w:sz w:val="21"/>
         </w:rPr>
         <w:t xml:space="preserve"> confirment le diagnostic et dépistent l'HTA blouse blanche et l'HTA masquée.</w:t>
@@ -5307,7 +5307,7 @@
           <w:rFonts w:ascii="Inter" w:hAnsi="Inter"/>
           <w:b w:val="0"/>
           <w:i w:val="0"/>
-          <w:color w:val="1F2937"/>
+          <w:color w:val="1B2433"/>
           <w:sz w:val="21"/>
         </w:rPr>
         <w:t xml:space="preserve">Le bilan initial recherche une </w:t>
@@ -5327,7 +5327,7 @@
           <w:rFonts w:ascii="Inter" w:hAnsi="Inter"/>
           <w:b w:val="0"/>
           <w:i w:val="0"/>
-          <w:color w:val="1F2937"/>
+          <w:color w:val="1B2433"/>
           <w:sz w:val="21"/>
         </w:rPr>
         <w:t xml:space="preserve"> et une </w:t>
@@ -5347,7 +5347,7 @@
           <w:rFonts w:ascii="Inter" w:hAnsi="Inter"/>
           <w:b w:val="0"/>
           <w:i w:val="0"/>
-          <w:color w:val="1F2937"/>
+          <w:color w:val="1B2433"/>
           <w:sz w:val="21"/>
         </w:rPr>
         <w:t>.</w:t>
@@ -5363,7 +5363,7 @@
           <w:rFonts w:ascii="Inter" w:hAnsi="Inter"/>
           <w:b w:val="0"/>
           <w:i w:val="0"/>
-          <w:color w:val="1F2937"/>
+          <w:color w:val="1B2433"/>
           <w:sz w:val="21"/>
         </w:rPr>
         <w:t xml:space="preserve">Les </w:t>
@@ -5383,7 +5383,7 @@
           <w:rFonts w:ascii="Inter" w:hAnsi="Inter"/>
           <w:b w:val="0"/>
           <w:i w:val="0"/>
-          <w:color w:val="1F2937"/>
+          <w:color w:val="1B2433"/>
           <w:sz w:val="21"/>
         </w:rPr>
         <w:t xml:space="preserve"> sont la base du traitement.</w:t>
@@ -5399,7 +5399,7 @@
           <w:rFonts w:ascii="Inter" w:hAnsi="Inter"/>
           <w:b w:val="0"/>
           <w:i w:val="0"/>
-          <w:color w:val="1F2937"/>
+          <w:color w:val="1B2433"/>
           <w:sz w:val="21"/>
         </w:rPr>
         <w:t xml:space="preserve">Cinq classes de 1re intention ; la </w:t>
@@ -5419,7 +5419,7 @@
           <w:rFonts w:ascii="Inter" w:hAnsi="Inter"/>
           <w:b w:val="0"/>
           <w:i w:val="0"/>
-          <w:color w:val="1F2937"/>
+          <w:color w:val="1B2433"/>
           <w:sz w:val="21"/>
         </w:rPr>
         <w:t xml:space="preserve"> est souvent d'emblée.</w:t>
@@ -5435,7 +5435,7 @@
           <w:rFonts w:ascii="Inter" w:hAnsi="Inter"/>
           <w:b w:val="0"/>
           <w:i w:val="0"/>
-          <w:color w:val="1F2937"/>
+          <w:color w:val="1B2433"/>
           <w:sz w:val="21"/>
         </w:rPr>
         <w:t xml:space="preserve">Objectif : </w:t>
@@ -5455,7 +5455,7 @@
           <w:rFonts w:ascii="Inter" w:hAnsi="Inter"/>
           <w:b w:val="0"/>
           <w:i w:val="0"/>
-          <w:color w:val="1F2937"/>
+          <w:color w:val="1B2433"/>
           <w:sz w:val="21"/>
         </w:rPr>
         <w:t xml:space="preserve">, idéalement </w:t>
@@ -5475,7 +5475,7 @@
           <w:rFonts w:ascii="Inter" w:hAnsi="Inter"/>
           <w:b w:val="0"/>
           <w:i w:val="0"/>
-          <w:color w:val="1F2937"/>
+          <w:color w:val="1B2433"/>
           <w:sz w:val="21"/>
         </w:rPr>
         <w:t xml:space="preserve"> si toléré.</w:t>
@@ -5528,7 +5528,7 @@
       <w:r>
         <w:rPr>
           <w:rFonts w:ascii="Inter" w:hAnsi="Inter"/>
-          <w:color w:val="9CA3AF"/>
+          <w:color w:val="94A0B0"/>
           <w:spacing w:val="36"/>
           <w:sz w:val="17"/>
         </w:rPr>
@@ -5561,7 +5561,7 @@
     <w:r>
       <w:rPr>
         <w:rFonts w:ascii="Inter" w:hAnsi="Inter"/>
-        <w:color w:val="9CA3AF"/>
+        <w:color w:val="94A0B0"/>
         <w:spacing w:val="24"/>
         <w:sz w:val="16"/>
       </w:rPr>
@@ -5572,7 +5572,7 @@
       <w:rPr>
         <w:rFonts w:ascii="Inter" w:hAnsi="Inter"/>
         <w:b/>
-        <w:color w:val="E11D48"/>
+        <w:color w:val="0F1E33"/>
         <w:sz w:val="17"/>
       </w:rPr>
       <w:fldChar w:fldCharType="begin"/>
@@ -5583,7 +5583,7 @@
       <w:rPr>
         <w:rFonts w:ascii="Inter" w:hAnsi="Inter"/>
         <w:b/>
-        <w:color w:val="E11D48"/>
+        <w:color w:val="0F1E33"/>
         <w:sz w:val="17"/>
       </w:rPr>
       <w:t xml:space="preserve">  /  </w:t>
@@ -5592,7 +5592,7 @@
       <w:rPr>
         <w:rFonts w:ascii="Inter" w:hAnsi="Inter"/>
         <w:b/>
-        <w:color w:val="E11D48"/>
+        <w:color w:val="0F1E33"/>
         <w:sz w:val="17"/>
       </w:rPr>
       <w:fldChar w:fldCharType="begin"/>
@@ -5609,7 +5609,7 @@
     <w:pPr>
       <w:pStyle w:val="Header"/>
       <w:pBdr>
-        <w:bottom w:val="single" w:sz="6" w:space="4" w:color="E11D48"/>
+        <w:bottom w:val="single" w:sz="6" w:space="4" w:color="0F1E33"/>
       </w:pBdr>
     </w:pPr>
     <w:r/>
@@ -5617,7 +5617,7 @@
       <w:rPr>
         <w:rFonts w:ascii="Inter" w:hAnsi="Inter"/>
         <w:i/>
-        <w:color w:val="9CA3AF"/>
+        <w:color w:val="94A0B0"/>
         <w:sz w:val="16"/>
       </w:rPr>
       <w:t>Hypertension Artérielle</w:t>
@@ -5994,7 +5994,7 @@
     </w:pPr>
     <w:rPr>
       <w:rFonts w:ascii="Inter" w:hAnsi="Inter"/>
-      <w:color w:val="1F2937"/>
+      <w:color w:val="1B2433"/>
       <w:sz w:val="21"/>
     </w:rPr>
   </w:style>

</xml_diff>

<commit_message>
Harmonise la palette : bleu nuit + bordeaux feutré + ocre
Le rouge vif détonnait contre le bleu nuit (forte saturation). Remplace
l'accent par un bordeaux profond et peu saturé, qui s'accorde avec le
bleu nuit ; l'ocre est légèrement assourdi. Triade cohérente et calme
appliquée au CSS, à la couverture, au générateur DOCX et au schéma
d'exemple.

https://claude.ai/code/session_019UxbrWiVNiHBdkHsxX6ghC
</commit_message>
<xml_diff>
--- a/examples/Cardiologie_Hypertension-Arterielle_2025-2026.docx
+++ b/examples/Cardiologie_Hypertension-Arterielle_2025-2026.docx
@@ -28,7 +28,7 @@
         <w:tc>
           <w:tcPr>
             <w:tcW w:type="dxa" w:w="1361"/>
-            <w:shd w:val="clear" w:color="auto" w:fill="0F1E33"/>
+            <w:shd w:val="clear" w:color="auto" w:fill="1C2E49"/>
           </w:tcPr>
           <w:p/>
         </w:tc>
@@ -98,7 +98,7 @@
               <w:rPr>
                 <w:rFonts w:ascii="Inter" w:hAnsi="Inter"/>
                 <w:b/>
-                <w:color w:val="C9A961"/>
+                <w:color w:val="B5934A"/>
                 <w:spacing w:val="80"/>
                 <w:sz w:val="26"/>
               </w:rPr>
@@ -112,7 +112,7 @@
             <w:r>
               <w:rPr>
                 <w:rFonts w:ascii="Cormorant Garamond" w:hAnsi="Cormorant Garamond"/>
-                <w:color w:val="C9A961"/>
+                <w:color w:val="B5934A"/>
                 <w:sz w:val="24"/>
               </w:rPr>
               <w:t>— · —</w:t>
@@ -126,7 +126,7 @@
               <w:rPr>
                 <w:rFonts w:ascii="Playfair Display" w:hAnsi="Playfair Display"/>
                 <w:b/>
-                <w:color w:val="1B2433"/>
+                <w:color w:val="1F2A38"/>
                 <w:sz w:val="68"/>
               </w:rPr>
               <w:t>Hypertension Artérielle</w:t>
@@ -139,7 +139,7 @@
             <w:r>
               <w:rPr>
                 <w:rFonts w:ascii="Cormorant Garamond" w:hAnsi="Cormorant Garamond"/>
-                <w:color w:val="C9A961"/>
+                <w:color w:val="B5934A"/>
                 <w:sz w:val="24"/>
               </w:rPr>
               <w:t>— · —</w:t>
@@ -153,7 +153,7 @@
               <w:rPr>
                 <w:rFonts w:ascii="Cormorant Garamond" w:hAnsi="Cormorant Garamond"/>
                 <w:i/>
-                <w:color w:val="1B2433"/>
+                <w:color w:val="1F2A38"/>
                 <w:sz w:val="32"/>
               </w:rPr>
               <w:t>Année 2025-2026</w:t>
@@ -166,7 +166,7 @@
             <w:r>
               <w:rPr>
                 <w:rFonts w:ascii="Inter" w:hAnsi="Inter"/>
-                <w:color w:val="94A0B0"/>
+                <w:color w:val="8E99A8"/>
                 <w:spacing w:val="40"/>
                 <w:sz w:val="18"/>
               </w:rPr>
@@ -195,7 +195,7 @@
               <w:rPr>
                 <w:rFonts w:ascii="Cormorant Garamond" w:hAnsi="Cormorant Garamond"/>
                 <w:i/>
-                <w:color w:val="0F1E33"/>
+                <w:color w:val="1C2E49"/>
                 <w:sz w:val="24"/>
               </w:rPr>
               <w:t>Item 224</w:t>
@@ -216,7 +216,7 @@
               <w:rPr>
                 <w:rFonts w:ascii="Inter" w:hAnsi="Inter"/>
                 <w:b/>
-                <w:color w:val="C9A961"/>
+                <w:color w:val="B5934A"/>
                 <w:spacing w:val="44"/>
                 <w:sz w:val="18"/>
               </w:rPr>
@@ -231,7 +231,7 @@
             <w:r>
               <w:rPr>
                 <w:b/>
-                <w:color w:val="C9A961"/>
+                <w:color w:val="B5934A"/>
                 <w:sz w:val="22"/>
               </w:rPr>
               <w:t xml:space="preserve">★  </w:t>
@@ -239,7 +239,7 @@
             <w:r>
               <w:rPr>
                 <w:rFonts w:ascii="Inter" w:hAnsi="Inter"/>
-                <w:color w:val="1B2433"/>
+                <w:color w:val="1F2A38"/>
                 <w:sz w:val="18"/>
               </w:rPr>
               <w:t>Déjà tombé aux ECN</w:t>
@@ -253,7 +253,7 @@
             <w:r>
               <w:rPr>
                 <w:b/>
-                <w:color w:val="E11D48"/>
+                <w:color w:val="1C2E49"/>
                 <w:sz w:val="22"/>
               </w:rPr>
               <w:t xml:space="preserve">◆  </w:t>
@@ -261,7 +261,7 @@
             <w:r>
               <w:rPr>
                 <w:rFonts w:ascii="Inter" w:hAnsi="Inter"/>
-                <w:color w:val="1B2433"/>
+                <w:color w:val="1F2A38"/>
                 <w:sz w:val="18"/>
               </w:rPr>
               <w:t>Notion à haut rendement</w:t>
@@ -275,7 +275,7 @@
             <w:r>
               <w:rPr>
                 <w:b/>
-                <w:color w:val="B91C1C"/>
+                <w:color w:val="8C2F39"/>
                 <w:sz w:val="22"/>
               </w:rPr>
               <w:t xml:space="preserve">⚠  </w:t>
@@ -283,7 +283,7 @@
             <w:r>
               <w:rPr>
                 <w:rFonts w:ascii="Inter" w:hAnsi="Inter"/>
-                <w:color w:val="1B2433"/>
+                <w:color w:val="1F2A38"/>
                 <w:sz w:val="18"/>
               </w:rPr>
               <w:t>Piège classique</w:t>
@@ -300,8 +300,8 @@
     <w:p>
       <w:pPr>
         <w:pBdr>
-          <w:top w:val="single" w:sz="12" w:space="6" w:color="0F1E33"/>
-          <w:bottom w:val="single" w:sz="12" w:space="6" w:color="0F1E33"/>
+          <w:top w:val="single" w:sz="12" w:space="6" w:color="1C2E49"/>
+          <w:bottom w:val="single" w:sz="12" w:space="6" w:color="1C2E49"/>
         </w:pBdr>
         <w:spacing w:before="80"/>
         <w:jc w:val="center"/>
@@ -310,7 +310,7 @@
         <w:rPr>
           <w:rFonts w:ascii="Playfair Display" w:hAnsi="Playfair Display"/>
           <w:b/>
-          <w:color w:val="1B2433"/>
+          <w:color w:val="1F2A38"/>
           <w:sz w:val="46"/>
         </w:rPr>
         <w:t>Plan du cours</w:t>
@@ -325,7 +325,7 @@
         <w:rPr>
           <w:rFonts w:ascii="Cormorant Garamond" w:hAnsi="Cormorant Garamond"/>
           <w:i/>
-          <w:color w:val="C9A961"/>
+          <w:color w:val="B5934A"/>
           <w:sz w:val="24"/>
         </w:rPr>
         <w:t>Cardiologie  ·  Hypertension Artérielle</w:t>
@@ -339,7 +339,7 @@
         <w:rPr>
           <w:rFonts w:ascii="Playfair Display" w:hAnsi="Playfair Display"/>
           <w:b/>
-          <w:color w:val="0F1E33"/>
+          <w:color w:val="1C2E49"/>
           <w:sz w:val="28"/>
         </w:rPr>
         <w:t xml:space="preserve">I.  </w:t>
@@ -348,7 +348,7 @@
         <w:rPr>
           <w:rFonts w:ascii="Cormorant Garamond" w:hAnsi="Cormorant Garamond"/>
           <w:b/>
-          <w:color w:val="1B2433"/>
+          <w:color w:val="1F2A38"/>
           <w:sz w:val="27"/>
         </w:rPr>
         <w:t>Définition et épidémiologie</w:t>
@@ -362,7 +362,7 @@
         <w:rPr>
           <w:rFonts w:ascii="Cormorant Garamond" w:hAnsi="Cormorant Garamond"/>
           <w:i/>
-          <w:color w:val="94A0B0"/>
+          <w:color w:val="8E99A8"/>
           <w:sz w:val="21"/>
         </w:rPr>
         <w:t>Cadre nosologique et poids de santé publique.</w:t>
@@ -375,7 +375,7 @@
       <w:r>
         <w:rPr>
           <w:b/>
-          <w:color w:val="C9A961"/>
+          <w:color w:val="B5934A"/>
           <w:sz w:val="21"/>
         </w:rPr>
         <w:t xml:space="preserve">A.  </w:t>
@@ -391,7 +391,7 @@
         <w:rPr>
           <w:rFonts w:ascii="Cormorant Garamond" w:hAnsi="Cormorant Garamond"/>
           <w:i/>
-          <w:color w:val="94A0B0"/>
+          <w:color w:val="8E99A8"/>
           <w:sz w:val="20"/>
         </w:rPr>
         <w:t xml:space="preserve"> — Seuils et grades.</w:t>
@@ -404,7 +404,7 @@
       <w:r>
         <w:rPr>
           <w:b/>
-          <w:color w:val="C9A961"/>
+          <w:color w:val="B5934A"/>
           <w:sz w:val="21"/>
         </w:rPr>
         <w:t xml:space="preserve">B.  </w:t>
@@ -420,7 +420,7 @@
         <w:rPr>
           <w:rFonts w:ascii="Cormorant Garamond" w:hAnsi="Cormorant Garamond"/>
           <w:i/>
-          <w:color w:val="94A0B0"/>
+          <w:color w:val="8E99A8"/>
           <w:sz w:val="20"/>
         </w:rPr>
         <w:t xml:space="preserve"> — Prévalence et FdR.</w:t>
@@ -434,7 +434,7 @@
         <w:rPr>
           <w:rFonts w:ascii="Playfair Display" w:hAnsi="Playfair Display"/>
           <w:b/>
-          <w:color w:val="0F1E33"/>
+          <w:color w:val="1C2E49"/>
           <w:sz w:val="28"/>
         </w:rPr>
         <w:t xml:space="preserve">II.  </w:t>
@@ -443,7 +443,7 @@
         <w:rPr>
           <w:rFonts w:ascii="Cormorant Garamond" w:hAnsi="Cormorant Garamond"/>
           <w:b/>
-          <w:color w:val="1B2433"/>
+          <w:color w:val="1F2A38"/>
           <w:sz w:val="27"/>
         </w:rPr>
         <w:t>Diagnostic et bilan initial</w:t>
@@ -457,7 +457,7 @@
         <w:rPr>
           <w:rFonts w:ascii="Cormorant Garamond" w:hAnsi="Cormorant Garamond"/>
           <w:i/>
-          <w:color w:val="94A0B0"/>
+          <w:color w:val="8E99A8"/>
           <w:sz w:val="21"/>
         </w:rPr>
         <w:t>Confirmation et recherche du retentissement.</w:t>
@@ -470,7 +470,7 @@
       <w:r>
         <w:rPr>
           <w:b/>
-          <w:color w:val="C9A961"/>
+          <w:color w:val="B5934A"/>
           <w:sz w:val="21"/>
         </w:rPr>
         <w:t xml:space="preserve">A.  </w:t>
@@ -486,7 +486,7 @@
         <w:rPr>
           <w:rFonts w:ascii="Cormorant Garamond" w:hAnsi="Cormorant Garamond"/>
           <w:i/>
-          <w:color w:val="94A0B0"/>
+          <w:color w:val="8E99A8"/>
           <w:sz w:val="20"/>
         </w:rPr>
         <w:t xml:space="preserve"> — Conditions et MAPA.</w:t>
@@ -499,7 +499,7 @@
       <w:r>
         <w:rPr>
           <w:b/>
-          <w:color w:val="C9A961"/>
+          <w:color w:val="B5934A"/>
           <w:sz w:val="21"/>
         </w:rPr>
         <w:t xml:space="preserve">B.  </w:t>
@@ -515,7 +515,7 @@
         <w:rPr>
           <w:rFonts w:ascii="Cormorant Garamond" w:hAnsi="Cormorant Garamond"/>
           <w:i/>
-          <w:color w:val="94A0B0"/>
+          <w:color w:val="8E99A8"/>
           <w:sz w:val="20"/>
         </w:rPr>
         <w:t xml:space="preserve"> — Organes cibles.</w:t>
@@ -529,7 +529,7 @@
         <w:rPr>
           <w:rFonts w:ascii="Playfair Display" w:hAnsi="Playfair Display"/>
           <w:b/>
-          <w:color w:val="0F1E33"/>
+          <w:color w:val="1C2E49"/>
           <w:sz w:val="28"/>
         </w:rPr>
         <w:t xml:space="preserve">III.  </w:t>
@@ -538,7 +538,7 @@
         <w:rPr>
           <w:rFonts w:ascii="Cormorant Garamond" w:hAnsi="Cormorant Garamond"/>
           <w:b/>
-          <w:color w:val="1B2433"/>
+          <w:color w:val="1F2A38"/>
           <w:sz w:val="27"/>
         </w:rPr>
         <w:t>Prise en charge thérapeutique</w:t>
@@ -552,7 +552,7 @@
         <w:rPr>
           <w:rFonts w:ascii="Cormorant Garamond" w:hAnsi="Cormorant Garamond"/>
           <w:i/>
-          <w:color w:val="94A0B0"/>
+          <w:color w:val="8E99A8"/>
           <w:sz w:val="21"/>
         </w:rPr>
         <w:t>Mesures hygiéno-diététiques et médicaments.</w:t>
@@ -565,7 +565,7 @@
       <w:r>
         <w:rPr>
           <w:b/>
-          <w:color w:val="C9A961"/>
+          <w:color w:val="B5934A"/>
           <w:sz w:val="21"/>
         </w:rPr>
         <w:t xml:space="preserve">A.  </w:t>
@@ -581,7 +581,7 @@
         <w:rPr>
           <w:rFonts w:ascii="Cormorant Garamond" w:hAnsi="Cormorant Garamond"/>
           <w:i/>
-          <w:color w:val="94A0B0"/>
+          <w:color w:val="8E99A8"/>
           <w:sz w:val="20"/>
         </w:rPr>
         <w:t xml:space="preserve"> — RHD.</w:t>
@@ -594,7 +594,7 @@
       <w:r>
         <w:rPr>
           <w:b/>
-          <w:color w:val="C9A961"/>
+          <w:color w:val="B5934A"/>
           <w:sz w:val="21"/>
         </w:rPr>
         <w:t xml:space="preserve">B.  </w:t>
@@ -610,7 +610,7 @@
         <w:rPr>
           <w:rFonts w:ascii="Cormorant Garamond" w:hAnsi="Cormorant Garamond"/>
           <w:i/>
-          <w:color w:val="94A0B0"/>
+          <w:color w:val="8E99A8"/>
           <w:sz w:val="20"/>
         </w:rPr>
         <w:t xml:space="preserve"> — Classes.</w:t>
@@ -626,12 +626,12 @@
         <w:tblW w:type="auto" w:w="0"/>
         <w:jc w:val="center"/>
         <w:tblBorders>
-          <w:top w:val="single" w:sz="4" w:space="0" w:color="94A0B0"/>
-          <w:left w:val="single" w:sz="4" w:space="0" w:color="94A0B0"/>
-          <w:bottom w:val="single" w:sz="4" w:space="0" w:color="94A0B0"/>
-          <w:right w:val="single" w:sz="4" w:space="0" w:color="94A0B0"/>
-          <w:insideH w:val="single" w:sz="4" w:space="0" w:color="94A0B0"/>
-          <w:insideV w:val="single" w:sz="4" w:space="0" w:color="94A0B0"/>
+          <w:top w:val="single" w:sz="4" w:space="0" w:color="8E99A8"/>
+          <w:left w:val="single" w:sz="4" w:space="0" w:color="8E99A8"/>
+          <w:bottom w:val="single" w:sz="4" w:space="0" w:color="8E99A8"/>
+          <w:right w:val="single" w:sz="4" w:space="0" w:color="8E99A8"/>
+          <w:insideH w:val="single" w:sz="4" w:space="0" w:color="8E99A8"/>
+          <w:insideV w:val="single" w:sz="4" w:space="0" w:color="8E99A8"/>
         </w:tblBorders>
         <w:tblLayout w:type="fixed"/>
         <w:tblLook w:firstColumn="1" w:firstRow="1" w:lastColumn="0" w:lastRow="0" w:noHBand="0" w:noVBand="1" w:val="04A0"/>
@@ -650,12 +650,12 @@
             <w:tcW w:type="dxa" w:w="9865"/>
             <w:gridSpan w:val="2"/>
             <w:tcBorders>
-              <w:top w:val="single" w:sz="4" w:space="0" w:color="0F1E33"/>
-              <w:left w:val="single" w:sz="4" w:space="0" w:color="0F1E33"/>
-              <w:bottom w:val="single" w:sz="4" w:space="0" w:color="0F1E33"/>
-              <w:right w:val="single" w:sz="4" w:space="0" w:color="0F1E33"/>
+              <w:top w:val="single" w:sz="4" w:space="0" w:color="1C2E49"/>
+              <w:left w:val="single" w:sz="4" w:space="0" w:color="1C2E49"/>
+              <w:bottom w:val="single" w:sz="4" w:space="0" w:color="1C2E49"/>
+              <w:right w:val="single" w:sz="4" w:space="0" w:color="1C2E49"/>
             </w:tcBorders>
-            <w:shd w:val="clear" w:color="auto" w:fill="0F1E33"/>
+            <w:shd w:val="clear" w:color="auto" w:fill="1C2E49"/>
             <w:vAlign w:val="center"/>
           </w:tcPr>
           <w:p>
@@ -666,7 +666,7 @@
               <w:rPr>
                 <w:rFonts w:ascii="Playfair Display" w:hAnsi="Playfair Display"/>
                 <w:b/>
-                <w:color w:val="C9A961"/>
+                <w:color w:val="B5934A"/>
                 <w:sz w:val="30"/>
               </w:rPr>
               <w:t xml:space="preserve">I  </w:t>
@@ -691,7 +691,7 @@
         <w:tc>
           <w:tcPr>
             <w:tcW w:type="dxa" w:w="2663"/>
-            <w:shd w:val="clear" w:color="auto" w:fill="0F1E33"/>
+            <w:shd w:val="clear" w:color="auto" w:fill="1C2E49"/>
             <w:vAlign w:val="center"/>
           </w:tcPr>
           <w:p>
@@ -713,7 +713,7 @@
         <w:tc>
           <w:tcPr>
             <w:tcW w:type="dxa" w:w="7201"/>
-            <w:shd w:val="clear" w:color="auto" w:fill="E7ECF3"/>
+            <w:shd w:val="clear" w:color="auto" w:fill="E7EBF1"/>
             <w:vAlign w:val="center"/>
           </w:tcPr>
           <w:p>
@@ -724,7 +724,7 @@
               <w:rPr>
                 <w:rFonts w:ascii="Playfair Display" w:hAnsi="Playfair Display"/>
                 <w:b/>
-                <w:color w:val="0F1E33"/>
+                <w:color w:val="1C2E49"/>
                 <w:sz w:val="26"/>
               </w:rPr>
               <w:t>A.  Définitions et seuils</w:t>
@@ -739,7 +739,7 @@
         <w:tc>
           <w:tcPr>
             <w:tcW w:type="dxa" w:w="2663"/>
-            <w:shd w:val="clear" w:color="auto" w:fill="EEF1F5"/>
+            <w:shd w:val="clear" w:color="auto" w:fill="EEF0F3"/>
             <w:vAlign w:val="center"/>
           </w:tcPr>
           <w:p>
@@ -751,7 +751,7 @@
                 <w:rFonts w:ascii="Inter" w:hAnsi="Inter"/>
                 <w:b/>
                 <w:i w:val="0"/>
-                <w:color w:val="C9A961"/>
+                <w:color w:val="B5934A"/>
                 <w:sz w:val="20"/>
               </w:rPr>
               <w:t>★</w:t>
@@ -761,7 +761,7 @@
                 <w:rFonts w:ascii="Inter" w:hAnsi="Inter"/>
                 <w:b/>
                 <w:i w:val="0"/>
-                <w:color w:val="1B2433"/>
+                <w:color w:val="1F2A38"/>
                 <w:sz w:val="20"/>
               </w:rPr>
               <w:t xml:space="preserve"> Définition de l'HTA</w:t>
@@ -783,7 +783,7 @@
                 <w:rFonts w:ascii="Inter" w:hAnsi="Inter"/>
                 <w:b/>
                 <w:i w:val="0"/>
-                <w:color w:val="BE123C"/>
+                <w:color w:val="8C2F39"/>
                 <w:sz w:val="20"/>
               </w:rPr>
               <w:t>HTA</w:t>
@@ -793,7 +793,7 @@
                 <w:rFonts w:ascii="Inter" w:hAnsi="Inter"/>
                 <w:b w:val="0"/>
                 <w:i w:val="0"/>
-                <w:color w:val="1B2433"/>
+                <w:color w:val="1F2A38"/>
                 <w:sz w:val="20"/>
               </w:rPr>
               <w:t xml:space="preserve"> : </w:t>
@@ -803,7 +803,7 @@
                 <w:rFonts w:ascii="Inter" w:hAnsi="Inter"/>
                 <w:b/>
                 <w:i w:val="0"/>
-                <w:color w:val="BE123C"/>
+                <w:color w:val="8C2F39"/>
                 <w:sz w:val="20"/>
               </w:rPr>
               <w:t>PAS</w:t>
@@ -813,7 +813,7 @@
                 <w:rFonts w:ascii="Inter" w:hAnsi="Inter"/>
                 <w:b w:val="0"/>
                 <w:i w:val="0"/>
-                <w:color w:val="1B2433"/>
+                <w:color w:val="1F2A38"/>
                 <w:sz w:val="20"/>
               </w:rPr>
               <w:t xml:space="preserve"> ≥ </w:t>
@@ -823,7 +823,7 @@
                 <w:rFonts w:ascii="Inter" w:hAnsi="Inter"/>
                 <w:b/>
                 <w:i w:val="0"/>
-                <w:color w:val="BE123C"/>
+                <w:color w:val="8C2F39"/>
                 <w:sz w:val="20"/>
               </w:rPr>
               <w:t>140 mmHg</w:t>
@@ -833,7 +833,7 @@
                 <w:rFonts w:ascii="Inter" w:hAnsi="Inter"/>
                 <w:b w:val="0"/>
                 <w:i w:val="0"/>
-                <w:color w:val="1B2433"/>
+                <w:color w:val="1F2A38"/>
                 <w:sz w:val="20"/>
               </w:rPr>
               <w:t xml:space="preserve"> et/ou </w:t>
@@ -843,7 +843,7 @@
                 <w:rFonts w:ascii="Inter" w:hAnsi="Inter"/>
                 <w:b/>
                 <w:i w:val="0"/>
-                <w:color w:val="BE123C"/>
+                <w:color w:val="8C2F39"/>
                 <w:sz w:val="20"/>
               </w:rPr>
               <w:t>PAD</w:t>
@@ -853,7 +853,7 @@
                 <w:rFonts w:ascii="Inter" w:hAnsi="Inter"/>
                 <w:b w:val="0"/>
                 <w:i w:val="0"/>
-                <w:color w:val="1B2433"/>
+                <w:color w:val="1F2A38"/>
                 <w:sz w:val="20"/>
               </w:rPr>
               <w:t xml:space="preserve"> ≥ </w:t>
@@ -863,7 +863,7 @@
                 <w:rFonts w:ascii="Inter" w:hAnsi="Inter"/>
                 <w:b/>
                 <w:i w:val="0"/>
-                <w:color w:val="BE123C"/>
+                <w:color w:val="8C2F39"/>
                 <w:sz w:val="20"/>
               </w:rPr>
               <w:t>90 mmHg</w:t>
@@ -873,7 +873,7 @@
                 <w:rFonts w:ascii="Inter" w:hAnsi="Inter"/>
                 <w:b w:val="0"/>
                 <w:i w:val="0"/>
-                <w:color w:val="1B2433"/>
+                <w:color w:val="1F2A38"/>
                 <w:sz w:val="20"/>
               </w:rPr>
               <w:t xml:space="preserve"> au cabinet</w:t>
@@ -889,7 +889,7 @@
                 <w:rFonts w:ascii="Inter" w:hAnsi="Inter"/>
                 <w:b w:val="0"/>
                 <w:i w:val="0"/>
-                <w:color w:val="1B2433"/>
+                <w:color w:val="1F2A38"/>
                 <w:sz w:val="20"/>
               </w:rPr>
               <w:t xml:space="preserve">diagnostic confirmé sur </w:t>
@@ -899,7 +899,7 @@
                 <w:rFonts w:ascii="Inter" w:hAnsi="Inter"/>
                 <w:b/>
                 <w:i w:val="0"/>
-                <w:color w:val="BE123C"/>
+                <w:color w:val="8C2F39"/>
                 <w:sz w:val="20"/>
               </w:rPr>
               <w:t>deux consultations</w:t>
@@ -915,7 +915,7 @@
                 <w:rFonts w:ascii="Inter" w:hAnsi="Inter"/>
                 <w:b w:val="0"/>
                 <w:i w:val="0"/>
-                <w:color w:val="1B2433"/>
+                <w:color w:val="1F2A38"/>
                 <w:sz w:val="20"/>
               </w:rPr>
               <w:t xml:space="preserve">automesure : seuil abaissé à </w:t>
@@ -925,7 +925,7 @@
                 <w:rFonts w:ascii="Inter" w:hAnsi="Inter"/>
                 <w:b/>
                 <w:i w:val="0"/>
-                <w:color w:val="BE123C"/>
+                <w:color w:val="8C2F39"/>
                 <w:sz w:val="20"/>
               </w:rPr>
               <w:t>≥ 135/85 mmHg</w:t>
@@ -940,7 +940,7 @@
         <w:tc>
           <w:tcPr>
             <w:tcW w:type="dxa" w:w="2663"/>
-            <w:shd w:val="clear" w:color="auto" w:fill="EEF1F5"/>
+            <w:shd w:val="clear" w:color="auto" w:fill="EEF0F3"/>
             <w:vAlign w:val="center"/>
           </w:tcPr>
           <w:p>
@@ -952,7 +952,7 @@
                 <w:rFonts w:ascii="Inter" w:hAnsi="Inter"/>
                 <w:b/>
                 <w:i w:val="0"/>
-                <w:color w:val="E11D48"/>
+                <w:color w:val="1C2E49"/>
                 <w:sz w:val="20"/>
               </w:rPr>
               <w:t>◆</w:t>
@@ -962,7 +962,7 @@
                 <w:rFonts w:ascii="Inter" w:hAnsi="Inter"/>
                 <w:b/>
                 <w:i w:val="0"/>
-                <w:color w:val="1B2433"/>
+                <w:color w:val="1F2A38"/>
                 <w:sz w:val="20"/>
               </w:rPr>
               <w:t xml:space="preserve"> Grades de sévérité</w:t>
@@ -979,12 +979,12 @@
               <w:tblW w:type="auto" w:w="0"/>
               <w:jc w:val="center"/>
               <w:tblBorders>
-                <w:top w:val="single" w:sz="4" w:space="0" w:color="94A0B0"/>
-                <w:left w:val="single" w:sz="4" w:space="0" w:color="94A0B0"/>
-                <w:bottom w:val="single" w:sz="4" w:space="0" w:color="94A0B0"/>
-                <w:right w:val="single" w:sz="4" w:space="0" w:color="94A0B0"/>
-                <w:insideH w:val="single" w:sz="4" w:space="0" w:color="94A0B0"/>
-                <w:insideV w:val="single" w:sz="4" w:space="0" w:color="94A0B0"/>
+                <w:top w:val="single" w:sz="4" w:space="0" w:color="8E99A8"/>
+                <w:left w:val="single" w:sz="4" w:space="0" w:color="8E99A8"/>
+                <w:bottom w:val="single" w:sz="4" w:space="0" w:color="8E99A8"/>
+                <w:right w:val="single" w:sz="4" w:space="0" w:color="8E99A8"/>
+                <w:insideH w:val="single" w:sz="4" w:space="0" w:color="8E99A8"/>
+                <w:insideV w:val="single" w:sz="4" w:space="0" w:color="8E99A8"/>
               </w:tblBorders>
               <w:tblLayout w:type="autofit"/>
               <w:tblLook w:firstColumn="1" w:firstRow="1" w:lastColumn="0" w:lastRow="0" w:noHBand="0" w:noVBand="1" w:val="04A0"/>
@@ -1001,7 +1001,7 @@
               <w:tc>
                 <w:tcPr>
                   <w:tcW w:type="dxa" w:w="2400"/>
-                  <w:shd w:val="clear" w:color="auto" w:fill="EEF1F5"/>
+                  <w:shd w:val="clear" w:color="auto" w:fill="EEF0F3"/>
                 </w:tcPr>
                 <w:p>
                   <w:pPr>
@@ -1012,7 +1012,7 @@
                       <w:rFonts w:ascii="Inter" w:hAnsi="Inter"/>
                       <w:b/>
                       <w:i w:val="0"/>
-                      <w:color w:val="1B2433"/>
+                      <w:color w:val="1F2A38"/>
                       <w:sz w:val="18"/>
                     </w:rPr>
                     <w:t>Grade</w:t>
@@ -1022,7 +1022,7 @@
               <w:tc>
                 <w:tcPr>
                   <w:tcW w:type="dxa" w:w="2400"/>
-                  <w:shd w:val="clear" w:color="auto" w:fill="EEF1F5"/>
+                  <w:shd w:val="clear" w:color="auto" w:fill="EEF0F3"/>
                 </w:tcPr>
                 <w:p>
                   <w:pPr>
@@ -1033,7 +1033,7 @@
                       <w:rFonts w:ascii="Inter" w:hAnsi="Inter"/>
                       <w:b/>
                       <w:i w:val="0"/>
-                      <w:color w:val="1B2433"/>
+                      <w:color w:val="1F2A38"/>
                       <w:sz w:val="18"/>
                     </w:rPr>
                     <w:t>PAS (mmHg)</w:t>
@@ -1043,7 +1043,7 @@
               <w:tc>
                 <w:tcPr>
                   <w:tcW w:type="dxa" w:w="2400"/>
-                  <w:shd w:val="clear" w:color="auto" w:fill="EEF1F5"/>
+                  <w:shd w:val="clear" w:color="auto" w:fill="EEF0F3"/>
                 </w:tcPr>
                 <w:p>
                   <w:pPr>
@@ -1054,7 +1054,7 @@
                       <w:rFonts w:ascii="Inter" w:hAnsi="Inter"/>
                       <w:b/>
                       <w:i w:val="0"/>
-                      <w:color w:val="1B2433"/>
+                      <w:color w:val="1F2A38"/>
                       <w:sz w:val="18"/>
                     </w:rPr>
                     <w:t>PAD (mmHg)</w:t>
@@ -1079,7 +1079,7 @@
                       <w:rFonts w:ascii="Inter" w:hAnsi="Inter"/>
                       <w:b/>
                       <w:i w:val="0"/>
-                      <w:color w:val="BE123C"/>
+                      <w:color w:val="8C2F39"/>
                       <w:sz w:val="18"/>
                     </w:rPr>
                     <w:t>Grade 1</w:t>
@@ -1099,7 +1099,7 @@
                       <w:rFonts w:ascii="Inter" w:hAnsi="Inter"/>
                       <w:b w:val="0"/>
                       <w:i w:val="0"/>
-                      <w:color w:val="1B2433"/>
+                      <w:color w:val="1F2A38"/>
                       <w:sz w:val="18"/>
                     </w:rPr>
                     <w:t>140-159</w:t>
@@ -1119,7 +1119,7 @@
                       <w:rFonts w:ascii="Inter" w:hAnsi="Inter"/>
                       <w:b w:val="0"/>
                       <w:i w:val="0"/>
-                      <w:color w:val="1B2433"/>
+                      <w:color w:val="1F2A38"/>
                       <w:sz w:val="18"/>
                     </w:rPr>
                     <w:t>90-99</w:t>
@@ -1134,7 +1134,7 @@
               <w:tc>
                 <w:tcPr>
                   <w:tcW w:type="dxa" w:w="2400"/>
-                  <w:shd w:val="clear" w:color="auto" w:fill="F5F6F9"/>
+                  <w:shd w:val="clear" w:color="auto" w:fill="F5F6F8"/>
                 </w:tcPr>
                 <w:p>
                   <w:pPr>
@@ -1145,7 +1145,7 @@
                       <w:rFonts w:ascii="Inter" w:hAnsi="Inter"/>
                       <w:b/>
                       <w:i w:val="0"/>
-                      <w:color w:val="BE123C"/>
+                      <w:color w:val="8C2F39"/>
                       <w:sz w:val="18"/>
                     </w:rPr>
                     <w:t>Grade 2</w:t>
@@ -1155,7 +1155,7 @@
               <w:tc>
                 <w:tcPr>
                   <w:tcW w:type="dxa" w:w="2400"/>
-                  <w:shd w:val="clear" w:color="auto" w:fill="F5F6F9"/>
+                  <w:shd w:val="clear" w:color="auto" w:fill="F5F6F8"/>
                 </w:tcPr>
                 <w:p>
                   <w:pPr>
@@ -1166,7 +1166,7 @@
                       <w:rFonts w:ascii="Inter" w:hAnsi="Inter"/>
                       <w:b w:val="0"/>
                       <w:i w:val="0"/>
-                      <w:color w:val="1B2433"/>
+                      <w:color w:val="1F2A38"/>
                       <w:sz w:val="18"/>
                     </w:rPr>
                     <w:t>160-179</w:t>
@@ -1176,7 +1176,7 @@
               <w:tc>
                 <w:tcPr>
                   <w:tcW w:type="dxa" w:w="2400"/>
-                  <w:shd w:val="clear" w:color="auto" w:fill="F5F6F9"/>
+                  <w:shd w:val="clear" w:color="auto" w:fill="F5F6F8"/>
                 </w:tcPr>
                 <w:p>
                   <w:pPr>
@@ -1187,7 +1187,7 @@
                       <w:rFonts w:ascii="Inter" w:hAnsi="Inter"/>
                       <w:b w:val="0"/>
                       <w:i w:val="0"/>
-                      <w:color w:val="1B2433"/>
+                      <w:color w:val="1F2A38"/>
                       <w:sz w:val="18"/>
                     </w:rPr>
                     <w:t>100-109</w:t>
@@ -1212,7 +1212,7 @@
                       <w:rFonts w:ascii="Inter" w:hAnsi="Inter"/>
                       <w:b/>
                       <w:i w:val="0"/>
-                      <w:color w:val="BE123C"/>
+                      <w:color w:val="8C2F39"/>
                       <w:sz w:val="18"/>
                     </w:rPr>
                     <w:t>Grade 3</w:t>
@@ -1232,7 +1232,7 @@
                       <w:rFonts w:ascii="Inter" w:hAnsi="Inter"/>
                       <w:b w:val="0"/>
                       <w:i w:val="0"/>
-                      <w:color w:val="1B2433"/>
+                      <w:color w:val="1F2A38"/>
                       <w:sz w:val="18"/>
                     </w:rPr>
                     <w:t>≥ 180</w:t>
@@ -1252,7 +1252,7 @@
                       <w:rFonts w:ascii="Inter" w:hAnsi="Inter"/>
                       <w:b w:val="0"/>
                       <w:i w:val="0"/>
-                      <w:color w:val="1B2433"/>
+                      <w:color w:val="1F2A38"/>
                       <w:sz w:val="18"/>
                     </w:rPr>
                     <w:t>≥ 110</w:t>
@@ -1316,7 +1316,7 @@
               <w:rPr>
                 <w:rFonts w:ascii="Cormorant Garamond" w:hAnsi="Cormorant Garamond"/>
                 <w:i/>
-                <w:color w:val="94A0B0"/>
+                <w:color w:val="8E99A8"/>
                 <w:sz w:val="18"/>
               </w:rPr>
               <w:t>Figure 1 — Étapes de la démarche diagnostique devant une pression artérielle élevée.</w:t>
@@ -1333,12 +1333,12 @@
             <w:tcW w:type="dxa" w:w="9865"/>
             <w:gridSpan w:val="2"/>
             <w:tcBorders>
-              <w:top w:val="single" w:sz="4" w:space="0" w:color="B91C1C"/>
-              <w:left w:val="single" w:sz="22" w:space="0" w:color="B91C1C"/>
-              <w:bottom w:val="single" w:sz="4" w:space="0" w:color="B91C1C"/>
-              <w:right w:val="single" w:sz="4" w:space="0" w:color="B91C1C"/>
+              <w:top w:val="single" w:sz="4" w:space="0" w:color="8C2F39"/>
+              <w:left w:val="single" w:sz="22" w:space="0" w:color="8C2F39"/>
+              <w:bottom w:val="single" w:sz="4" w:space="0" w:color="8C2F39"/>
+              <w:right w:val="single" w:sz="4" w:space="0" w:color="8C2F39"/>
             </w:tcBorders>
-            <w:shd w:val="clear" w:color="auto" w:fill="FDEDEC"/>
+            <w:shd w:val="clear" w:color="auto" w:fill="F5E9EA"/>
             <w:vAlign w:val="top"/>
           </w:tcPr>
           <w:p>
@@ -1349,7 +1349,7 @@
               <w:rPr>
                 <w:rFonts w:ascii="Inter" w:hAnsi="Inter"/>
                 <w:b/>
-                <w:color w:val="B91C1C"/>
+                <w:color w:val="8C2F39"/>
                 <w:spacing w:val="14"/>
                 <w:sz w:val="16"/>
               </w:rPr>
@@ -1362,7 +1362,7 @@
                 <w:rFonts w:ascii="Inter" w:hAnsi="Inter"/>
                 <w:b w:val="0"/>
                 <w:i w:val="0"/>
-                <w:color w:val="1B2433"/>
+                <w:color w:val="1F2A38"/>
                 <w:sz w:val="20"/>
               </w:rPr>
               <w:t>Ne pas confondre l'</w:t>
@@ -1372,7 +1372,7 @@
                 <w:rFonts w:ascii="Inter" w:hAnsi="Inter"/>
                 <w:b/>
                 <w:i w:val="0"/>
-                <w:color w:val="BE123C"/>
+                <w:color w:val="8C2F39"/>
                 <w:sz w:val="20"/>
               </w:rPr>
               <w:t>HTA blouse blanche</w:t>
@@ -1382,7 +1382,7 @@
                 <w:rFonts w:ascii="Inter" w:hAnsi="Inter"/>
                 <w:b w:val="0"/>
                 <w:i w:val="0"/>
-                <w:color w:val="1B2433"/>
+                <w:color w:val="1F2A38"/>
                 <w:sz w:val="20"/>
               </w:rPr>
               <w:t xml:space="preserve"> (PA élevée au cabinet uniquement) et l'</w:t>
@@ -1392,7 +1392,7 @@
                 <w:rFonts w:ascii="Inter" w:hAnsi="Inter"/>
                 <w:b/>
                 <w:i w:val="0"/>
-                <w:color w:val="BE123C"/>
+                <w:color w:val="8C2F39"/>
                 <w:sz w:val="20"/>
               </w:rPr>
               <w:t>HTA masquée</w:t>
@@ -1402,7 +1402,7 @@
                 <w:rFonts w:ascii="Inter" w:hAnsi="Inter"/>
                 <w:b w:val="0"/>
                 <w:i w:val="0"/>
-                <w:color w:val="1B2433"/>
+                <w:color w:val="1F2A38"/>
                 <w:sz w:val="20"/>
               </w:rPr>
               <w:t xml:space="preserve"> (PA normale au cabinet, élevée en ambulatoire) : le pronostic diffère.</w:t>
@@ -1421,12 +1421,12 @@
         <w:tblW w:type="auto" w:w="0"/>
         <w:jc w:val="center"/>
         <w:tblBorders>
-          <w:top w:val="single" w:sz="4" w:space="0" w:color="94A0B0"/>
-          <w:left w:val="single" w:sz="4" w:space="0" w:color="94A0B0"/>
-          <w:bottom w:val="single" w:sz="4" w:space="0" w:color="94A0B0"/>
-          <w:right w:val="single" w:sz="4" w:space="0" w:color="94A0B0"/>
-          <w:insideH w:val="single" w:sz="4" w:space="0" w:color="94A0B0"/>
-          <w:insideV w:val="single" w:sz="4" w:space="0" w:color="94A0B0"/>
+          <w:top w:val="single" w:sz="4" w:space="0" w:color="8E99A8"/>
+          <w:left w:val="single" w:sz="4" w:space="0" w:color="8E99A8"/>
+          <w:bottom w:val="single" w:sz="4" w:space="0" w:color="8E99A8"/>
+          <w:right w:val="single" w:sz="4" w:space="0" w:color="8E99A8"/>
+          <w:insideH w:val="single" w:sz="4" w:space="0" w:color="8E99A8"/>
+          <w:insideV w:val="single" w:sz="4" w:space="0" w:color="8E99A8"/>
         </w:tblBorders>
         <w:tblLayout w:type="fixed"/>
         <w:tblLook w:firstColumn="1" w:firstRow="1" w:lastColumn="0" w:lastRow="0" w:noHBand="0" w:noVBand="1" w:val="04A0"/>
@@ -1445,12 +1445,12 @@
             <w:tcW w:type="dxa" w:w="9865"/>
             <w:gridSpan w:val="2"/>
             <w:tcBorders>
-              <w:top w:val="single" w:sz="4" w:space="0" w:color="0F1E33"/>
-              <w:left w:val="single" w:sz="4" w:space="0" w:color="0F1E33"/>
-              <w:bottom w:val="single" w:sz="4" w:space="0" w:color="0F1E33"/>
-              <w:right w:val="single" w:sz="4" w:space="0" w:color="0F1E33"/>
+              <w:top w:val="single" w:sz="4" w:space="0" w:color="1C2E49"/>
+              <w:left w:val="single" w:sz="4" w:space="0" w:color="1C2E49"/>
+              <w:bottom w:val="single" w:sz="4" w:space="0" w:color="1C2E49"/>
+              <w:right w:val="single" w:sz="4" w:space="0" w:color="1C2E49"/>
             </w:tcBorders>
-            <w:shd w:val="clear" w:color="auto" w:fill="0F1E33"/>
+            <w:shd w:val="clear" w:color="auto" w:fill="1C2E49"/>
             <w:vAlign w:val="center"/>
           </w:tcPr>
           <w:p>
@@ -1461,7 +1461,7 @@
               <w:rPr>
                 <w:rFonts w:ascii="Playfair Display" w:hAnsi="Playfair Display"/>
                 <w:b/>
-                <w:color w:val="C9A961"/>
+                <w:color w:val="B5934A"/>
                 <w:sz w:val="30"/>
               </w:rPr>
               <w:t xml:space="preserve">I  </w:t>
@@ -1486,7 +1486,7 @@
         <w:tc>
           <w:tcPr>
             <w:tcW w:type="dxa" w:w="2663"/>
-            <w:shd w:val="clear" w:color="auto" w:fill="0F1E33"/>
+            <w:shd w:val="clear" w:color="auto" w:fill="1C2E49"/>
             <w:vAlign w:val="center"/>
           </w:tcPr>
           <w:p>
@@ -1508,7 +1508,7 @@
         <w:tc>
           <w:tcPr>
             <w:tcW w:type="dxa" w:w="7201"/>
-            <w:shd w:val="clear" w:color="auto" w:fill="E7ECF3"/>
+            <w:shd w:val="clear" w:color="auto" w:fill="E7EBF1"/>
             <w:vAlign w:val="center"/>
           </w:tcPr>
           <w:p>
@@ -1519,7 +1519,7 @@
               <w:rPr>
                 <w:rFonts w:ascii="Playfair Display" w:hAnsi="Playfair Display"/>
                 <w:b/>
-                <w:color w:val="0F1E33"/>
+                <w:color w:val="1C2E49"/>
                 <w:sz w:val="26"/>
               </w:rPr>
               <w:t>B.  Épidémiologie</w:t>
@@ -1534,7 +1534,7 @@
         <w:tc>
           <w:tcPr>
             <w:tcW w:type="dxa" w:w="2663"/>
-            <w:shd w:val="clear" w:color="auto" w:fill="EEF1F5"/>
+            <w:shd w:val="clear" w:color="auto" w:fill="EEF0F3"/>
             <w:vAlign w:val="center"/>
           </w:tcPr>
           <w:p>
@@ -1546,7 +1546,7 @@
                 <w:rFonts w:ascii="Inter" w:hAnsi="Inter"/>
                 <w:b/>
                 <w:i w:val="0"/>
-                <w:color w:val="1B2433"/>
+                <w:color w:val="1F2A38"/>
                 <w:sz w:val="20"/>
               </w:rPr>
               <w:t>Prévalence</w:t>
@@ -1568,7 +1568,7 @@
                 <w:rFonts w:ascii="Inter" w:hAnsi="Inter"/>
                 <w:b w:val="0"/>
                 <w:i w:val="0"/>
-                <w:color w:val="1B2433"/>
+                <w:color w:val="1F2A38"/>
                 <w:sz w:val="20"/>
               </w:rPr>
               <w:t xml:space="preserve">environ </w:t>
@@ -1578,7 +1578,7 @@
                 <w:rFonts w:ascii="Inter" w:hAnsi="Inter"/>
                 <w:b/>
                 <w:i w:val="0"/>
-                <w:color w:val="BE123C"/>
+                <w:color w:val="8C2F39"/>
                 <w:sz w:val="20"/>
               </w:rPr>
               <w:t>30 %</w:t>
@@ -1588,7 +1588,7 @@
                 <w:rFonts w:ascii="Inter" w:hAnsi="Inter"/>
                 <w:b w:val="0"/>
                 <w:i w:val="0"/>
-                <w:color w:val="1B2433"/>
+                <w:color w:val="1F2A38"/>
                 <w:sz w:val="20"/>
               </w:rPr>
               <w:t xml:space="preserve"> de la population adulte</w:t>
@@ -1604,7 +1604,7 @@
                 <w:rFonts w:ascii="Inter" w:hAnsi="Inter"/>
                 <w:b w:val="0"/>
                 <w:i w:val="0"/>
-                <w:color w:val="1B2433"/>
+                <w:color w:val="1F2A38"/>
                 <w:sz w:val="20"/>
               </w:rPr>
               <w:t>augmente avec l'</w:t>
@@ -1614,7 +1614,7 @@
                 <w:rFonts w:ascii="Inter" w:hAnsi="Inter"/>
                 <w:b/>
                 <w:i w:val="0"/>
-                <w:color w:val="BE123C"/>
+                <w:color w:val="8C2F39"/>
                 <w:sz w:val="20"/>
               </w:rPr>
               <w:t>âge</w:t>
@@ -1630,7 +1630,7 @@
                 <w:rFonts w:ascii="Inter" w:hAnsi="Inter"/>
                 <w:b w:val="0"/>
                 <w:i w:val="0"/>
-                <w:color w:val="1B2433"/>
+                <w:color w:val="1F2A38"/>
                 <w:sz w:val="20"/>
               </w:rPr>
               <w:t>premier motif de consultation en médecine générale</w:t>
@@ -1645,7 +1645,7 @@
         <w:tc>
           <w:tcPr>
             <w:tcW w:type="dxa" w:w="2663"/>
-            <w:shd w:val="clear" w:color="auto" w:fill="EEF1F5"/>
+            <w:shd w:val="clear" w:color="auto" w:fill="EEF0F3"/>
             <w:vAlign w:val="center"/>
           </w:tcPr>
           <w:p>
@@ -1657,7 +1657,7 @@
                 <w:rFonts w:ascii="Inter" w:hAnsi="Inter"/>
                 <w:b/>
                 <w:i w:val="0"/>
-                <w:color w:val="E11D48"/>
+                <w:color w:val="1C2E49"/>
                 <w:sz w:val="20"/>
               </w:rPr>
               <w:t>◆</w:t>
@@ -1667,7 +1667,7 @@
                 <w:rFonts w:ascii="Inter" w:hAnsi="Inter"/>
                 <w:b/>
                 <w:i w:val="0"/>
-                <w:color w:val="1B2433"/>
+                <w:color w:val="1F2A38"/>
                 <w:sz w:val="20"/>
               </w:rPr>
               <w:t xml:space="preserve"> Facteurs de risque</w:t>
@@ -1689,7 +1689,7 @@
                 <w:rFonts w:ascii="Inter" w:hAnsi="Inter"/>
                 <w:b/>
                 <w:i w:val="0"/>
-                <w:color w:val="BE123C"/>
+                <w:color w:val="8C2F39"/>
                 <w:sz w:val="20"/>
               </w:rPr>
               <w:t>Non modifiables</w:t>
@@ -1699,7 +1699,7 @@
                 <w:rFonts w:ascii="Inter" w:hAnsi="Inter"/>
                 <w:b w:val="0"/>
                 <w:i w:val="0"/>
-                <w:color w:val="1B2433"/>
+                <w:color w:val="1F2A38"/>
                 <w:sz w:val="20"/>
               </w:rPr>
               <w:t xml:space="preserve"> : âge, sexe masculin, hérédité</w:t>
@@ -1715,7 +1715,7 @@
                 <w:rFonts w:ascii="Inter" w:hAnsi="Inter"/>
                 <w:b/>
                 <w:i w:val="0"/>
-                <w:color w:val="BE123C"/>
+                <w:color w:val="8C2F39"/>
                 <w:sz w:val="20"/>
               </w:rPr>
               <w:t>Modifiables</w:t>
@@ -1725,7 +1725,7 @@
                 <w:rFonts w:ascii="Inter" w:hAnsi="Inter"/>
                 <w:b w:val="0"/>
                 <w:i w:val="0"/>
-                <w:color w:val="1B2433"/>
+                <w:color w:val="1F2A38"/>
                 <w:sz w:val="20"/>
               </w:rPr>
               <w:t xml:space="preserve"> : surpoids, sédentarité, </w:t>
@@ -1735,7 +1735,7 @@
                 <w:rFonts w:ascii="Inter" w:hAnsi="Inter"/>
                 <w:b/>
                 <w:i w:val="0"/>
-                <w:color w:val="BE123C"/>
+                <w:color w:val="8C2F39"/>
                 <w:sz w:val="20"/>
               </w:rPr>
               <w:t>sel</w:t>
@@ -1745,7 +1745,7 @@
                 <w:rFonts w:ascii="Inter" w:hAnsi="Inter"/>
                 <w:b w:val="0"/>
                 <w:i w:val="0"/>
-                <w:color w:val="1B2433"/>
+                <w:color w:val="1F2A38"/>
                 <w:sz w:val="20"/>
               </w:rPr>
               <w:t>, alcool, tabac</w:t>
@@ -1762,12 +1762,12 @@
             <w:tcW w:type="dxa" w:w="9865"/>
             <w:gridSpan w:val="2"/>
             <w:tcBorders>
-              <w:top w:val="single" w:sz="4" w:space="0" w:color="0F1E33"/>
-              <w:left w:val="single" w:sz="22" w:space="0" w:color="0F1E33"/>
-              <w:bottom w:val="single" w:sz="4" w:space="0" w:color="0F1E33"/>
-              <w:right w:val="single" w:sz="4" w:space="0" w:color="0F1E33"/>
+              <w:top w:val="single" w:sz="4" w:space="0" w:color="1C2E49"/>
+              <w:left w:val="single" w:sz="22" w:space="0" w:color="1C2E49"/>
+              <w:bottom w:val="single" w:sz="4" w:space="0" w:color="1C2E49"/>
+              <w:right w:val="single" w:sz="4" w:space="0" w:color="1C2E49"/>
             </w:tcBorders>
-            <w:shd w:val="clear" w:color="auto" w:fill="EEF1F5"/>
+            <w:shd w:val="clear" w:color="auto" w:fill="EEF0F3"/>
             <w:vAlign w:val="top"/>
           </w:tcPr>
           <w:p>
@@ -1778,7 +1778,7 @@
               <w:rPr>
                 <w:rFonts w:ascii="Inter" w:hAnsi="Inter"/>
                 <w:b/>
-                <w:color w:val="0F1E33"/>
+                <w:color w:val="1C2E49"/>
                 <w:spacing w:val="14"/>
                 <w:sz w:val="16"/>
               </w:rPr>
@@ -1791,7 +1791,7 @@
                 <w:rFonts w:ascii="Inter" w:hAnsi="Inter"/>
                 <w:b w:val="0"/>
                 <w:i w:val="0"/>
-                <w:color w:val="1B2433"/>
+                <w:color w:val="1F2A38"/>
                 <w:sz w:val="20"/>
               </w:rPr>
               <w:t xml:space="preserve">L'HTA est un </w:t>
@@ -1801,7 +1801,7 @@
                 <w:rFonts w:ascii="Inter" w:hAnsi="Inter"/>
                 <w:b/>
                 <w:i w:val="0"/>
-                <w:color w:val="BE123C"/>
+                <w:color w:val="8C2F39"/>
                 <w:sz w:val="20"/>
               </w:rPr>
               <w:t>facteur de risque cardiovasculaire majeur</w:t>
@@ -1811,7 +1811,7 @@
                 <w:rFonts w:ascii="Inter" w:hAnsi="Inter"/>
                 <w:b w:val="0"/>
                 <w:i w:val="0"/>
-                <w:color w:val="1B2433"/>
+                <w:color w:val="1F2A38"/>
                 <w:sz w:val="20"/>
               </w:rPr>
               <w:t xml:space="preserve"> : AVC, insuffisance cardiaque, coronaropathie, néphropathie.</w:t>
@@ -1835,12 +1835,12 @@
         <w:tblW w:type="auto" w:w="0"/>
         <w:jc w:val="center"/>
         <w:tblBorders>
-          <w:top w:val="single" w:sz="4" w:space="0" w:color="94A0B0"/>
-          <w:left w:val="single" w:sz="4" w:space="0" w:color="94A0B0"/>
-          <w:bottom w:val="single" w:sz="4" w:space="0" w:color="94A0B0"/>
-          <w:right w:val="single" w:sz="4" w:space="0" w:color="94A0B0"/>
-          <w:insideH w:val="single" w:sz="4" w:space="0" w:color="94A0B0"/>
-          <w:insideV w:val="single" w:sz="4" w:space="0" w:color="94A0B0"/>
+          <w:top w:val="single" w:sz="4" w:space="0" w:color="8E99A8"/>
+          <w:left w:val="single" w:sz="4" w:space="0" w:color="8E99A8"/>
+          <w:bottom w:val="single" w:sz="4" w:space="0" w:color="8E99A8"/>
+          <w:right w:val="single" w:sz="4" w:space="0" w:color="8E99A8"/>
+          <w:insideH w:val="single" w:sz="4" w:space="0" w:color="8E99A8"/>
+          <w:insideV w:val="single" w:sz="4" w:space="0" w:color="8E99A8"/>
         </w:tblBorders>
         <w:tblLayout w:type="fixed"/>
         <w:tblLook w:firstColumn="1" w:firstRow="1" w:lastColumn="0" w:lastRow="0" w:noHBand="0" w:noVBand="1" w:val="04A0"/>
@@ -1859,12 +1859,12 @@
             <w:tcW w:type="dxa" w:w="9865"/>
             <w:gridSpan w:val="2"/>
             <w:tcBorders>
-              <w:top w:val="single" w:sz="4" w:space="0" w:color="0F1E33"/>
-              <w:left w:val="single" w:sz="4" w:space="0" w:color="0F1E33"/>
-              <w:bottom w:val="single" w:sz="4" w:space="0" w:color="0F1E33"/>
-              <w:right w:val="single" w:sz="4" w:space="0" w:color="0F1E33"/>
+              <w:top w:val="single" w:sz="4" w:space="0" w:color="1C2E49"/>
+              <w:left w:val="single" w:sz="4" w:space="0" w:color="1C2E49"/>
+              <w:bottom w:val="single" w:sz="4" w:space="0" w:color="1C2E49"/>
+              <w:right w:val="single" w:sz="4" w:space="0" w:color="1C2E49"/>
             </w:tcBorders>
-            <w:shd w:val="clear" w:color="auto" w:fill="0F1E33"/>
+            <w:shd w:val="clear" w:color="auto" w:fill="1C2E49"/>
             <w:vAlign w:val="center"/>
           </w:tcPr>
           <w:p>
@@ -1875,7 +1875,7 @@
               <w:rPr>
                 <w:rFonts w:ascii="Playfair Display" w:hAnsi="Playfair Display"/>
                 <w:b/>
-                <w:color w:val="C9A961"/>
+                <w:color w:val="B5934A"/>
                 <w:sz w:val="30"/>
               </w:rPr>
               <w:t xml:space="preserve">II  </w:t>
@@ -1900,7 +1900,7 @@
         <w:tc>
           <w:tcPr>
             <w:tcW w:type="dxa" w:w="2663"/>
-            <w:shd w:val="clear" w:color="auto" w:fill="0F1E33"/>
+            <w:shd w:val="clear" w:color="auto" w:fill="1C2E49"/>
             <w:vAlign w:val="center"/>
           </w:tcPr>
           <w:p>
@@ -1922,7 +1922,7 @@
         <w:tc>
           <w:tcPr>
             <w:tcW w:type="dxa" w:w="7201"/>
-            <w:shd w:val="clear" w:color="auto" w:fill="E7ECF3"/>
+            <w:shd w:val="clear" w:color="auto" w:fill="E7EBF1"/>
             <w:vAlign w:val="center"/>
           </w:tcPr>
           <w:p>
@@ -1933,7 +1933,7 @@
               <w:rPr>
                 <w:rFonts w:ascii="Playfair Display" w:hAnsi="Playfair Display"/>
                 <w:b/>
-                <w:color w:val="0F1E33"/>
+                <w:color w:val="1C2E49"/>
                 <w:sz w:val="26"/>
               </w:rPr>
               <w:t>A.  Mesure de la pression artérielle</w:t>
@@ -1948,7 +1948,7 @@
         <w:tc>
           <w:tcPr>
             <w:tcW w:type="dxa" w:w="2663"/>
-            <w:shd w:val="clear" w:color="auto" w:fill="EEF1F5"/>
+            <w:shd w:val="clear" w:color="auto" w:fill="EEF0F3"/>
             <w:vAlign w:val="center"/>
           </w:tcPr>
           <w:p>
@@ -1960,7 +1960,7 @@
                 <w:rFonts w:ascii="Inter" w:hAnsi="Inter"/>
                 <w:b/>
                 <w:i w:val="0"/>
-                <w:color w:val="1B2433"/>
+                <w:color w:val="1F2A38"/>
                 <w:sz w:val="20"/>
               </w:rPr>
               <w:t>Conditions de mesure</w:t>
@@ -1982,7 +1982,7 @@
                 <w:rFonts w:ascii="Inter" w:hAnsi="Inter"/>
                 <w:b w:val="0"/>
                 <w:i w:val="0"/>
-                <w:color w:val="1B2433"/>
+                <w:color w:val="1F2A38"/>
                 <w:sz w:val="20"/>
               </w:rPr>
               <w:t xml:space="preserve">patient au </w:t>
@@ -1992,7 +1992,7 @@
                 <w:rFonts w:ascii="Inter" w:hAnsi="Inter"/>
                 <w:b/>
                 <w:i w:val="0"/>
-                <w:color w:val="BE123C"/>
+                <w:color w:val="8C2F39"/>
                 <w:sz w:val="20"/>
               </w:rPr>
               <w:t>repos</w:t>
@@ -2002,7 +2002,7 @@
                 <w:rFonts w:ascii="Inter" w:hAnsi="Inter"/>
                 <w:b w:val="0"/>
                 <w:i w:val="0"/>
-                <w:color w:val="1B2433"/>
+                <w:color w:val="1F2A38"/>
                 <w:sz w:val="20"/>
               </w:rPr>
               <w:t xml:space="preserve"> depuis 5 minutes, assis</w:t>
@@ -2018,7 +2018,7 @@
                 <w:rFonts w:ascii="Inter" w:hAnsi="Inter"/>
                 <w:b w:val="0"/>
                 <w:i w:val="0"/>
-                <w:color w:val="1B2433"/>
+                <w:color w:val="1F2A38"/>
                 <w:sz w:val="20"/>
               </w:rPr>
               <w:t>brassard adapté à la circonférence du bras</w:t>
@@ -2034,7 +2034,7 @@
                 <w:rFonts w:ascii="Inter" w:hAnsi="Inter"/>
                 <w:b w:val="0"/>
                 <w:i w:val="0"/>
-                <w:color w:val="1B2433"/>
+                <w:color w:val="1F2A38"/>
                 <w:sz w:val="20"/>
               </w:rPr>
               <w:t xml:space="preserve">mesure aux </w:t>
@@ -2044,7 +2044,7 @@
                 <w:rFonts w:ascii="Inter" w:hAnsi="Inter"/>
                 <w:b/>
                 <w:i w:val="0"/>
-                <w:color w:val="BE123C"/>
+                <w:color w:val="8C2F39"/>
                 <w:sz w:val="20"/>
               </w:rPr>
               <w:t>deux bras</w:t>
@@ -2054,7 +2054,7 @@
                 <w:rFonts w:ascii="Inter" w:hAnsi="Inter"/>
                 <w:b w:val="0"/>
                 <w:i w:val="0"/>
-                <w:color w:val="1B2433"/>
+                <w:color w:val="1F2A38"/>
                 <w:sz w:val="20"/>
               </w:rPr>
               <w:t xml:space="preserve"> lors du bilan initial</w:t>
@@ -2069,7 +2069,7 @@
         <w:tc>
           <w:tcPr>
             <w:tcW w:type="dxa" w:w="2663"/>
-            <w:shd w:val="clear" w:color="auto" w:fill="EEF1F5"/>
+            <w:shd w:val="clear" w:color="auto" w:fill="EEF0F3"/>
             <w:vAlign w:val="center"/>
           </w:tcPr>
           <w:p>
@@ -2081,7 +2081,7 @@
                 <w:rFonts w:ascii="Inter" w:hAnsi="Inter"/>
                 <w:b/>
                 <w:i w:val="0"/>
-                <w:color w:val="C9A961"/>
+                <w:color w:val="B5934A"/>
                 <w:sz w:val="20"/>
               </w:rPr>
               <w:t>★</w:t>
@@ -2091,7 +2091,7 @@
                 <w:rFonts w:ascii="Inter" w:hAnsi="Inter"/>
                 <w:b/>
                 <w:i w:val="0"/>
-                <w:color w:val="1B2433"/>
+                <w:color w:val="1F2A38"/>
                 <w:sz w:val="20"/>
               </w:rPr>
               <w:t xml:space="preserve"> MAPA</w:t>
@@ -2113,7 +2113,7 @@
                 <w:rFonts w:ascii="Inter" w:hAnsi="Inter"/>
                 <w:b w:val="0"/>
                 <w:i w:val="0"/>
-                <w:color w:val="1B2433"/>
+                <w:color w:val="1F2A38"/>
                 <w:sz w:val="20"/>
               </w:rPr>
               <w:t xml:space="preserve">mesure </w:t>
@@ -2123,7 +2123,7 @@
                 <w:rFonts w:ascii="Inter" w:hAnsi="Inter"/>
                 <w:b/>
                 <w:i w:val="0"/>
-                <w:color w:val="BE123C"/>
+                <w:color w:val="8C2F39"/>
                 <w:sz w:val="20"/>
               </w:rPr>
               <w:t>ambulatoire</w:t>
@@ -2133,7 +2133,7 @@
                 <w:rFonts w:ascii="Inter" w:hAnsi="Inter"/>
                 <w:b w:val="0"/>
                 <w:i w:val="0"/>
-                <w:color w:val="1B2433"/>
+                <w:color w:val="1F2A38"/>
                 <w:sz w:val="20"/>
               </w:rPr>
               <w:t xml:space="preserve"> de la PA sur 24 h</w:t>
@@ -2149,7 +2149,7 @@
                 <w:rFonts w:ascii="Inter" w:hAnsi="Inter"/>
                 <w:b w:val="0"/>
                 <w:i w:val="0"/>
-                <w:color w:val="1B2433"/>
+                <w:color w:val="1F2A38"/>
                 <w:sz w:val="20"/>
               </w:rPr>
               <w:t xml:space="preserve">examen de </w:t>
@@ -2159,7 +2159,7 @@
                 <w:rFonts w:ascii="Inter" w:hAnsi="Inter"/>
                 <w:b/>
                 <w:i w:val="0"/>
-                <w:color w:val="BE123C"/>
+                <w:color w:val="8C2F39"/>
                 <w:sz w:val="20"/>
               </w:rPr>
               <w:t>référence</w:t>
@@ -2169,7 +2169,7 @@
                 <w:rFonts w:ascii="Inter" w:hAnsi="Inter"/>
                 <w:b w:val="0"/>
                 <w:i w:val="0"/>
-                <w:color w:val="1B2433"/>
+                <w:color w:val="1F2A38"/>
                 <w:sz w:val="20"/>
               </w:rPr>
               <w:t xml:space="preserve"> pour confirmer le diagnostic</w:t>
@@ -2185,7 +2185,7 @@
                 <w:rFonts w:ascii="Inter" w:hAnsi="Inter"/>
                 <w:b w:val="0"/>
                 <w:i w:val="0"/>
-                <w:color w:val="1B2433"/>
+                <w:color w:val="1F2A38"/>
                 <w:sz w:val="20"/>
               </w:rPr>
               <w:t>dépiste l'</w:t>
@@ -2195,7 +2195,7 @@
                 <w:rFonts w:ascii="Inter" w:hAnsi="Inter"/>
                 <w:b/>
                 <w:i w:val="0"/>
-                <w:color w:val="BE123C"/>
+                <w:color w:val="8C2F39"/>
                 <w:sz w:val="20"/>
               </w:rPr>
               <w:t>HTA masquée</w:t>
@@ -2212,12 +2212,12 @@
             <w:tcW w:type="dxa" w:w="9865"/>
             <w:gridSpan w:val="2"/>
             <w:tcBorders>
-              <w:top w:val="single" w:sz="4" w:space="0" w:color="9A7B33"/>
-              <w:left w:val="single" w:sz="22" w:space="0" w:color="9A7B33"/>
-              <w:bottom w:val="single" w:sz="4" w:space="0" w:color="9A7B33"/>
-              <w:right w:val="single" w:sz="4" w:space="0" w:color="9A7B33"/>
+              <w:top w:val="single" w:sz="4" w:space="0" w:color="8A6D2E"/>
+              <w:left w:val="single" w:sz="22" w:space="0" w:color="8A6D2E"/>
+              <w:bottom w:val="single" w:sz="4" w:space="0" w:color="8A6D2E"/>
+              <w:right w:val="single" w:sz="4" w:space="0" w:color="8A6D2E"/>
             </w:tcBorders>
-            <w:shd w:val="clear" w:color="auto" w:fill="FBF6E8"/>
+            <w:shd w:val="clear" w:color="auto" w:fill="F6F1E4"/>
             <w:vAlign w:val="top"/>
           </w:tcPr>
           <w:p>
@@ -2228,7 +2228,7 @@
               <w:rPr>
                 <w:rFonts w:ascii="Inter" w:hAnsi="Inter"/>
                 <w:b/>
-                <w:color w:val="9A7B33"/>
+                <w:color w:val="8A6D2E"/>
                 <w:spacing w:val="14"/>
                 <w:sz w:val="16"/>
               </w:rPr>
@@ -2241,7 +2241,7 @@
                 <w:rFonts w:ascii="Inter" w:hAnsi="Inter"/>
                 <w:b w:val="0"/>
                 <w:i w:val="0"/>
-                <w:color w:val="1B2433"/>
+                <w:color w:val="1F2A38"/>
                 <w:sz w:val="20"/>
               </w:rPr>
               <w:t xml:space="preserve">Automesure — </w:t>
@@ -2251,7 +2251,7 @@
                 <w:rFonts w:ascii="Inter" w:hAnsi="Inter"/>
                 <w:b/>
                 <w:i w:val="0"/>
-                <w:color w:val="BE123C"/>
+                <w:color w:val="8C2F39"/>
                 <w:sz w:val="20"/>
               </w:rPr>
               <w:t>règle des 3</w:t>
@@ -2261,7 +2261,7 @@
                 <w:rFonts w:ascii="Inter" w:hAnsi="Inter"/>
                 <w:b w:val="0"/>
                 <w:i w:val="0"/>
-                <w:color w:val="1B2433"/>
+                <w:color w:val="1F2A38"/>
                 <w:sz w:val="20"/>
               </w:rPr>
               <w:t xml:space="preserve"> : 3 mesures matin et soir, 3 jours de suite.</w:t>
@@ -2280,12 +2280,12 @@
         <w:tblW w:type="auto" w:w="0"/>
         <w:jc w:val="center"/>
         <w:tblBorders>
-          <w:top w:val="single" w:sz="4" w:space="0" w:color="94A0B0"/>
-          <w:left w:val="single" w:sz="4" w:space="0" w:color="94A0B0"/>
-          <w:bottom w:val="single" w:sz="4" w:space="0" w:color="94A0B0"/>
-          <w:right w:val="single" w:sz="4" w:space="0" w:color="94A0B0"/>
-          <w:insideH w:val="single" w:sz="4" w:space="0" w:color="94A0B0"/>
-          <w:insideV w:val="single" w:sz="4" w:space="0" w:color="94A0B0"/>
+          <w:top w:val="single" w:sz="4" w:space="0" w:color="8E99A8"/>
+          <w:left w:val="single" w:sz="4" w:space="0" w:color="8E99A8"/>
+          <w:bottom w:val="single" w:sz="4" w:space="0" w:color="8E99A8"/>
+          <w:right w:val="single" w:sz="4" w:space="0" w:color="8E99A8"/>
+          <w:insideH w:val="single" w:sz="4" w:space="0" w:color="8E99A8"/>
+          <w:insideV w:val="single" w:sz="4" w:space="0" w:color="8E99A8"/>
         </w:tblBorders>
         <w:tblLayout w:type="fixed"/>
         <w:tblLook w:firstColumn="1" w:firstRow="1" w:lastColumn="0" w:lastRow="0" w:noHBand="0" w:noVBand="1" w:val="04A0"/>
@@ -2304,12 +2304,12 @@
             <w:tcW w:type="dxa" w:w="9865"/>
             <w:gridSpan w:val="2"/>
             <w:tcBorders>
-              <w:top w:val="single" w:sz="4" w:space="0" w:color="0F1E33"/>
-              <w:left w:val="single" w:sz="4" w:space="0" w:color="0F1E33"/>
-              <w:bottom w:val="single" w:sz="4" w:space="0" w:color="0F1E33"/>
-              <w:right w:val="single" w:sz="4" w:space="0" w:color="0F1E33"/>
+              <w:top w:val="single" w:sz="4" w:space="0" w:color="1C2E49"/>
+              <w:left w:val="single" w:sz="4" w:space="0" w:color="1C2E49"/>
+              <w:bottom w:val="single" w:sz="4" w:space="0" w:color="1C2E49"/>
+              <w:right w:val="single" w:sz="4" w:space="0" w:color="1C2E49"/>
             </w:tcBorders>
-            <w:shd w:val="clear" w:color="auto" w:fill="0F1E33"/>
+            <w:shd w:val="clear" w:color="auto" w:fill="1C2E49"/>
             <w:vAlign w:val="center"/>
           </w:tcPr>
           <w:p>
@@ -2320,7 +2320,7 @@
               <w:rPr>
                 <w:rFonts w:ascii="Playfair Display" w:hAnsi="Playfair Display"/>
                 <w:b/>
-                <w:color w:val="C9A961"/>
+                <w:color w:val="B5934A"/>
                 <w:sz w:val="30"/>
               </w:rPr>
               <w:t xml:space="preserve">II  </w:t>
@@ -2345,7 +2345,7 @@
         <w:tc>
           <w:tcPr>
             <w:tcW w:type="dxa" w:w="2663"/>
-            <w:shd w:val="clear" w:color="auto" w:fill="0F1E33"/>
+            <w:shd w:val="clear" w:color="auto" w:fill="1C2E49"/>
             <w:vAlign w:val="center"/>
           </w:tcPr>
           <w:p>
@@ -2367,7 +2367,7 @@
         <w:tc>
           <w:tcPr>
             <w:tcW w:type="dxa" w:w="7201"/>
-            <w:shd w:val="clear" w:color="auto" w:fill="E7ECF3"/>
+            <w:shd w:val="clear" w:color="auto" w:fill="E7EBF1"/>
             <w:vAlign w:val="center"/>
           </w:tcPr>
           <w:p>
@@ -2378,7 +2378,7 @@
               <w:rPr>
                 <w:rFonts w:ascii="Playfair Display" w:hAnsi="Playfair Display"/>
                 <w:b/>
-                <w:color w:val="0F1E33"/>
+                <w:color w:val="1C2E49"/>
                 <w:sz w:val="26"/>
               </w:rPr>
               <w:t>B.  Bilan de retentissement</w:t>
@@ -2393,7 +2393,7 @@
         <w:tc>
           <w:tcPr>
             <w:tcW w:type="dxa" w:w="2663"/>
-            <w:shd w:val="clear" w:color="auto" w:fill="EEF1F5"/>
+            <w:shd w:val="clear" w:color="auto" w:fill="EEF0F3"/>
             <w:vAlign w:val="center"/>
           </w:tcPr>
           <w:p>
@@ -2405,7 +2405,7 @@
                 <w:rFonts w:ascii="Inter" w:hAnsi="Inter"/>
                 <w:b/>
                 <w:i w:val="0"/>
-                <w:color w:val="E11D48"/>
+                <w:color w:val="1C2E49"/>
                 <w:sz w:val="20"/>
               </w:rPr>
               <w:t>◆</w:t>
@@ -2415,7 +2415,7 @@
                 <w:rFonts w:ascii="Inter" w:hAnsi="Inter"/>
                 <w:b/>
                 <w:i w:val="0"/>
-                <w:color w:val="1B2433"/>
+                <w:color w:val="1F2A38"/>
                 <w:sz w:val="20"/>
               </w:rPr>
               <w:t xml:space="preserve"> Organes cibles</w:t>
@@ -2437,7 +2437,7 @@
                 <w:rFonts w:ascii="Inter" w:hAnsi="Inter"/>
                 <w:b/>
                 <w:i w:val="0"/>
-                <w:color w:val="BE123C"/>
+                <w:color w:val="8C2F39"/>
                 <w:sz w:val="20"/>
               </w:rPr>
               <w:t>Cœur</w:t>
@@ -2447,7 +2447,7 @@
                 <w:rFonts w:ascii="Inter" w:hAnsi="Inter"/>
                 <w:b w:val="0"/>
                 <w:i w:val="0"/>
-                <w:color w:val="1B2433"/>
+                <w:color w:val="1F2A38"/>
                 <w:sz w:val="20"/>
               </w:rPr>
               <w:t xml:space="preserve"> : ECG, hypertrophie ventriculaire gauche</w:t>
@@ -2463,7 +2463,7 @@
                 <w:rFonts w:ascii="Inter" w:hAnsi="Inter"/>
                 <w:b/>
                 <w:i w:val="0"/>
-                <w:color w:val="BE123C"/>
+                <w:color w:val="8C2F39"/>
                 <w:sz w:val="20"/>
               </w:rPr>
               <w:t>Rein</w:t>
@@ -2473,7 +2473,7 @@
                 <w:rFonts w:ascii="Inter" w:hAnsi="Inter"/>
                 <w:b w:val="0"/>
                 <w:i w:val="0"/>
-                <w:color w:val="1B2433"/>
+                <w:color w:val="1F2A38"/>
                 <w:sz w:val="20"/>
               </w:rPr>
               <w:t xml:space="preserve"> : créatininémie, </w:t>
@@ -2483,7 +2483,7 @@
                 <w:rFonts w:ascii="Inter" w:hAnsi="Inter"/>
                 <w:b/>
                 <w:i w:val="0"/>
-                <w:color w:val="BE123C"/>
+                <w:color w:val="8C2F39"/>
                 <w:sz w:val="20"/>
               </w:rPr>
               <w:t>DFG</w:t>
@@ -2493,7 +2493,7 @@
                 <w:rFonts w:ascii="Inter" w:hAnsi="Inter"/>
                 <w:b w:val="0"/>
                 <w:i w:val="0"/>
-                <w:color w:val="1B2433"/>
+                <w:color w:val="1F2A38"/>
                 <w:sz w:val="20"/>
               </w:rPr>
               <w:t>, protéinurie</w:t>
@@ -2509,7 +2509,7 @@
                 <w:rFonts w:ascii="Inter" w:hAnsi="Inter"/>
                 <w:b/>
                 <w:i w:val="0"/>
-                <w:color w:val="BE123C"/>
+                <w:color w:val="8C2F39"/>
                 <w:sz w:val="20"/>
               </w:rPr>
               <w:t>Œil</w:t>
@@ -2519,7 +2519,7 @@
                 <w:rFonts w:ascii="Inter" w:hAnsi="Inter"/>
                 <w:b w:val="0"/>
                 <w:i w:val="0"/>
-                <w:color w:val="1B2433"/>
+                <w:color w:val="1F2A38"/>
                 <w:sz w:val="20"/>
               </w:rPr>
               <w:t xml:space="preserve"> : rétinopathie hypertensive si HTA sévère</w:t>
@@ -2534,7 +2534,7 @@
         <w:tc>
           <w:tcPr>
             <w:tcW w:type="dxa" w:w="2663"/>
-            <w:shd w:val="clear" w:color="auto" w:fill="EEF1F5"/>
+            <w:shd w:val="clear" w:color="auto" w:fill="EEF0F3"/>
             <w:vAlign w:val="center"/>
           </w:tcPr>
           <w:p>
@@ -2546,7 +2546,7 @@
                 <w:rFonts w:ascii="Inter" w:hAnsi="Inter"/>
                 <w:b/>
                 <w:i w:val="0"/>
-                <w:color w:val="1B2433"/>
+                <w:color w:val="1F2A38"/>
                 <w:sz w:val="20"/>
               </w:rPr>
               <w:t>Bilan biologique</w:t>
@@ -2568,7 +2568,7 @@
                 <w:rFonts w:ascii="Inter" w:hAnsi="Inter"/>
                 <w:b w:val="0"/>
                 <w:i w:val="0"/>
-                <w:color w:val="1B2433"/>
+                <w:color w:val="1F2A38"/>
                 <w:sz w:val="20"/>
               </w:rPr>
               <w:t>kaliémie, glycémie à jeun</w:t>
@@ -2584,7 +2584,7 @@
                 <w:rFonts w:ascii="Inter" w:hAnsi="Inter"/>
                 <w:b w:val="0"/>
                 <w:i w:val="0"/>
-                <w:color w:val="1B2433"/>
+                <w:color w:val="1F2A38"/>
                 <w:sz w:val="20"/>
               </w:rPr>
               <w:t>bilan lipidique, créatininémie</w:t>
@@ -2639,7 +2639,7 @@
               <w:rPr>
                 <w:rFonts w:ascii="Cormorant Garamond" w:hAnsi="Cormorant Garamond"/>
                 <w:i/>
-                <w:color w:val="94A0B0"/>
+                <w:color w:val="8E99A8"/>
                 <w:sz w:val="18"/>
               </w:rPr>
               <w:t>Figure 2 — Principaux organes cibles atteints par l'hypertension artérielle.</w:t>
@@ -2656,12 +2656,12 @@
             <w:tcW w:type="dxa" w:w="9865"/>
             <w:gridSpan w:val="2"/>
             <w:tcBorders>
-              <w:top w:val="single" w:sz="4" w:space="0" w:color="B91C1C"/>
-              <w:left w:val="single" w:sz="22" w:space="0" w:color="B91C1C"/>
-              <w:bottom w:val="single" w:sz="4" w:space="0" w:color="B91C1C"/>
-              <w:right w:val="single" w:sz="4" w:space="0" w:color="B91C1C"/>
+              <w:top w:val="single" w:sz="4" w:space="0" w:color="8C2F39"/>
+              <w:left w:val="single" w:sz="22" w:space="0" w:color="8C2F39"/>
+              <w:bottom w:val="single" w:sz="4" w:space="0" w:color="8C2F39"/>
+              <w:right w:val="single" w:sz="4" w:space="0" w:color="8C2F39"/>
             </w:tcBorders>
-            <w:shd w:val="clear" w:color="auto" w:fill="FDEDEC"/>
+            <w:shd w:val="clear" w:color="auto" w:fill="F5E9EA"/>
             <w:vAlign w:val="top"/>
           </w:tcPr>
           <w:p>
@@ -2672,7 +2672,7 @@
               <w:rPr>
                 <w:rFonts w:ascii="Inter" w:hAnsi="Inter"/>
                 <w:b/>
-                <w:color w:val="B91C1C"/>
+                <w:color w:val="8C2F39"/>
                 <w:spacing w:val="14"/>
                 <w:sz w:val="16"/>
               </w:rPr>
@@ -2685,7 +2685,7 @@
                 <w:rFonts w:ascii="Inter" w:hAnsi="Inter"/>
                 <w:b/>
                 <w:i w:val="0"/>
-                <w:color w:val="B91C1C"/>
+                <w:color w:val="8C2F39"/>
                 <w:sz w:val="20"/>
               </w:rPr>
               <w:t>⚠</w:t>
@@ -2695,7 +2695,7 @@
                 <w:rFonts w:ascii="Inter" w:hAnsi="Inter"/>
                 <w:b w:val="0"/>
                 <w:i w:val="0"/>
-                <w:color w:val="1B2433"/>
+                <w:color w:val="1F2A38"/>
                 <w:sz w:val="20"/>
               </w:rPr>
               <w:t xml:space="preserve"> Rechercher une </w:t>
@@ -2705,7 +2705,7 @@
                 <w:rFonts w:ascii="Inter" w:hAnsi="Inter"/>
                 <w:b/>
                 <w:i w:val="0"/>
-                <w:color w:val="BE123C"/>
+                <w:color w:val="8C2F39"/>
                 <w:sz w:val="20"/>
               </w:rPr>
               <w:t>HTA secondaire</w:t>
@@ -2715,7 +2715,7 @@
                 <w:rFonts w:ascii="Inter" w:hAnsi="Inter"/>
                 <w:b w:val="0"/>
                 <w:i w:val="0"/>
-                <w:color w:val="1B2433"/>
+                <w:color w:val="1F2A38"/>
                 <w:sz w:val="20"/>
               </w:rPr>
               <w:t xml:space="preserve"> si HTA résistante, sujet jeune ou signes d'orientation.</w:t>
@@ -2739,12 +2739,12 @@
         <w:tblW w:type="auto" w:w="0"/>
         <w:jc w:val="center"/>
         <w:tblBorders>
-          <w:top w:val="single" w:sz="4" w:space="0" w:color="94A0B0"/>
-          <w:left w:val="single" w:sz="4" w:space="0" w:color="94A0B0"/>
-          <w:bottom w:val="single" w:sz="4" w:space="0" w:color="94A0B0"/>
-          <w:right w:val="single" w:sz="4" w:space="0" w:color="94A0B0"/>
-          <w:insideH w:val="single" w:sz="4" w:space="0" w:color="94A0B0"/>
-          <w:insideV w:val="single" w:sz="4" w:space="0" w:color="94A0B0"/>
+          <w:top w:val="single" w:sz="4" w:space="0" w:color="8E99A8"/>
+          <w:left w:val="single" w:sz="4" w:space="0" w:color="8E99A8"/>
+          <w:bottom w:val="single" w:sz="4" w:space="0" w:color="8E99A8"/>
+          <w:right w:val="single" w:sz="4" w:space="0" w:color="8E99A8"/>
+          <w:insideH w:val="single" w:sz="4" w:space="0" w:color="8E99A8"/>
+          <w:insideV w:val="single" w:sz="4" w:space="0" w:color="8E99A8"/>
         </w:tblBorders>
         <w:tblLayout w:type="fixed"/>
         <w:tblLook w:firstColumn="1" w:firstRow="1" w:lastColumn="0" w:lastRow="0" w:noHBand="0" w:noVBand="1" w:val="04A0"/>
@@ -2763,12 +2763,12 @@
             <w:tcW w:type="dxa" w:w="9865"/>
             <w:gridSpan w:val="2"/>
             <w:tcBorders>
-              <w:top w:val="single" w:sz="4" w:space="0" w:color="0F1E33"/>
-              <w:left w:val="single" w:sz="4" w:space="0" w:color="0F1E33"/>
-              <w:bottom w:val="single" w:sz="4" w:space="0" w:color="0F1E33"/>
-              <w:right w:val="single" w:sz="4" w:space="0" w:color="0F1E33"/>
+              <w:top w:val="single" w:sz="4" w:space="0" w:color="1C2E49"/>
+              <w:left w:val="single" w:sz="4" w:space="0" w:color="1C2E49"/>
+              <w:bottom w:val="single" w:sz="4" w:space="0" w:color="1C2E49"/>
+              <w:right w:val="single" w:sz="4" w:space="0" w:color="1C2E49"/>
             </w:tcBorders>
-            <w:shd w:val="clear" w:color="auto" w:fill="0F1E33"/>
+            <w:shd w:val="clear" w:color="auto" w:fill="1C2E49"/>
             <w:vAlign w:val="center"/>
           </w:tcPr>
           <w:p>
@@ -2779,7 +2779,7 @@
               <w:rPr>
                 <w:rFonts w:ascii="Playfair Display" w:hAnsi="Playfair Display"/>
                 <w:b/>
-                <w:color w:val="C9A961"/>
+                <w:color w:val="B5934A"/>
                 <w:sz w:val="30"/>
               </w:rPr>
               <w:t xml:space="preserve">III  </w:t>
@@ -2804,7 +2804,7 @@
         <w:tc>
           <w:tcPr>
             <w:tcW w:type="dxa" w:w="2663"/>
-            <w:shd w:val="clear" w:color="auto" w:fill="0F1E33"/>
+            <w:shd w:val="clear" w:color="auto" w:fill="1C2E49"/>
             <w:vAlign w:val="center"/>
           </w:tcPr>
           <w:p>
@@ -2826,7 +2826,7 @@
         <w:tc>
           <w:tcPr>
             <w:tcW w:type="dxa" w:w="7201"/>
-            <w:shd w:val="clear" w:color="auto" w:fill="E7ECF3"/>
+            <w:shd w:val="clear" w:color="auto" w:fill="E7EBF1"/>
             <w:vAlign w:val="center"/>
           </w:tcPr>
           <w:p>
@@ -2837,7 +2837,7 @@
               <w:rPr>
                 <w:rFonts w:ascii="Playfair Display" w:hAnsi="Playfair Display"/>
                 <w:b/>
-                <w:color w:val="0F1E33"/>
+                <w:color w:val="1C2E49"/>
                 <w:sz w:val="26"/>
               </w:rPr>
               <w:t>A.  Mesures non médicamenteuses</w:t>
@@ -2852,7 +2852,7 @@
         <w:tc>
           <w:tcPr>
             <w:tcW w:type="dxa" w:w="2663"/>
-            <w:shd w:val="clear" w:color="auto" w:fill="EEF1F5"/>
+            <w:shd w:val="clear" w:color="auto" w:fill="EEF0F3"/>
             <w:vAlign w:val="center"/>
           </w:tcPr>
           <w:p>
@@ -2864,7 +2864,7 @@
                 <w:rFonts w:ascii="Inter" w:hAnsi="Inter"/>
                 <w:b/>
                 <w:i w:val="0"/>
-                <w:color w:val="1B2433"/>
+                <w:color w:val="1F2A38"/>
                 <w:sz w:val="20"/>
               </w:rPr>
               <w:t>Règles hygiéno-diététiques</w:t>
@@ -2886,7 +2886,7 @@
                 <w:rFonts w:ascii="Inter" w:hAnsi="Inter"/>
                 <w:b w:val="0"/>
                 <w:i w:val="0"/>
-                <w:color w:val="1B2433"/>
+                <w:color w:val="1F2A38"/>
                 <w:sz w:val="20"/>
               </w:rPr>
               <w:t xml:space="preserve">réduction des apports en </w:t>
@@ -2896,7 +2896,7 @@
                 <w:rFonts w:ascii="Inter" w:hAnsi="Inter"/>
                 <w:b/>
                 <w:i w:val="0"/>
-                <w:color w:val="BE123C"/>
+                <w:color w:val="8C2F39"/>
                 <w:sz w:val="20"/>
               </w:rPr>
               <w:t>sel</w:t>
@@ -2906,7 +2906,7 @@
                 <w:rFonts w:ascii="Inter" w:hAnsi="Inter"/>
                 <w:b w:val="0"/>
                 <w:i w:val="0"/>
-                <w:color w:val="1B2433"/>
+                <w:color w:val="1F2A38"/>
                 <w:sz w:val="20"/>
               </w:rPr>
               <w:t xml:space="preserve"> (&lt; 6 g/j)</w:t>
@@ -2922,7 +2922,7 @@
                 <w:rFonts w:ascii="Inter" w:hAnsi="Inter"/>
                 <w:b/>
                 <w:i w:val="0"/>
-                <w:color w:val="BE123C"/>
+                <w:color w:val="8C2F39"/>
                 <w:sz w:val="20"/>
               </w:rPr>
               <w:t>perte de poids</w:t>
@@ -2932,7 +2932,7 @@
                 <w:rFonts w:ascii="Inter" w:hAnsi="Inter"/>
                 <w:b w:val="0"/>
                 <w:i w:val="0"/>
-                <w:color w:val="1B2433"/>
+                <w:color w:val="1F2A38"/>
                 <w:sz w:val="20"/>
               </w:rPr>
               <w:t xml:space="preserve"> en cas de surpoids</w:t>
@@ -2948,7 +2948,7 @@
                 <w:rFonts w:ascii="Inter" w:hAnsi="Inter"/>
                 <w:b/>
                 <w:i w:val="0"/>
-                <w:color w:val="BE123C"/>
+                <w:color w:val="8C2F39"/>
                 <w:sz w:val="20"/>
               </w:rPr>
               <w:t>activité physique</w:t>
@@ -2958,7 +2958,7 @@
                 <w:rFonts w:ascii="Inter" w:hAnsi="Inter"/>
                 <w:b w:val="0"/>
                 <w:i w:val="0"/>
-                <w:color w:val="1B2433"/>
+                <w:color w:val="1F2A38"/>
                 <w:sz w:val="20"/>
               </w:rPr>
               <w:t xml:space="preserve"> régulière (30 min/j)</w:t>
@@ -2974,7 +2974,7 @@
                 <w:rFonts w:ascii="Inter" w:hAnsi="Inter"/>
                 <w:b w:val="0"/>
                 <w:i w:val="0"/>
-                <w:color w:val="1B2433"/>
+                <w:color w:val="1F2A38"/>
                 <w:sz w:val="20"/>
               </w:rPr>
               <w:t>limitation de l'</w:t>
@@ -2984,7 +2984,7 @@
                 <w:rFonts w:ascii="Inter" w:hAnsi="Inter"/>
                 <w:b/>
                 <w:i w:val="0"/>
-                <w:color w:val="BE123C"/>
+                <w:color w:val="8C2F39"/>
                 <w:sz w:val="20"/>
               </w:rPr>
               <w:t>alcool</w:t>
@@ -2994,7 +2994,7 @@
                 <w:rFonts w:ascii="Inter" w:hAnsi="Inter"/>
                 <w:b w:val="0"/>
                 <w:i w:val="0"/>
-                <w:color w:val="1B2433"/>
+                <w:color w:val="1F2A38"/>
                 <w:sz w:val="20"/>
               </w:rPr>
               <w:t xml:space="preserve">, arrêt du </w:t>
@@ -3004,7 +3004,7 @@
                 <w:rFonts w:ascii="Inter" w:hAnsi="Inter"/>
                 <w:b/>
                 <w:i w:val="0"/>
-                <w:color w:val="BE123C"/>
+                <w:color w:val="8C2F39"/>
                 <w:sz w:val="20"/>
               </w:rPr>
               <w:t>tabac</w:t>
@@ -3023,12 +3023,12 @@
         <w:tblW w:type="auto" w:w="0"/>
         <w:jc w:val="center"/>
         <w:tblBorders>
-          <w:top w:val="single" w:sz="4" w:space="0" w:color="94A0B0"/>
-          <w:left w:val="single" w:sz="4" w:space="0" w:color="94A0B0"/>
-          <w:bottom w:val="single" w:sz="4" w:space="0" w:color="94A0B0"/>
-          <w:right w:val="single" w:sz="4" w:space="0" w:color="94A0B0"/>
-          <w:insideH w:val="single" w:sz="4" w:space="0" w:color="94A0B0"/>
-          <w:insideV w:val="single" w:sz="4" w:space="0" w:color="94A0B0"/>
+          <w:top w:val="single" w:sz="4" w:space="0" w:color="8E99A8"/>
+          <w:left w:val="single" w:sz="4" w:space="0" w:color="8E99A8"/>
+          <w:bottom w:val="single" w:sz="4" w:space="0" w:color="8E99A8"/>
+          <w:right w:val="single" w:sz="4" w:space="0" w:color="8E99A8"/>
+          <w:insideH w:val="single" w:sz="4" w:space="0" w:color="8E99A8"/>
+          <w:insideV w:val="single" w:sz="4" w:space="0" w:color="8E99A8"/>
         </w:tblBorders>
         <w:tblLayout w:type="fixed"/>
         <w:tblLook w:firstColumn="1" w:firstRow="1" w:lastColumn="0" w:lastRow="0" w:noHBand="0" w:noVBand="1" w:val="04A0"/>
@@ -3047,12 +3047,12 @@
             <w:tcW w:type="dxa" w:w="9865"/>
             <w:gridSpan w:val="2"/>
             <w:tcBorders>
-              <w:top w:val="single" w:sz="4" w:space="0" w:color="0F1E33"/>
-              <w:left w:val="single" w:sz="4" w:space="0" w:color="0F1E33"/>
-              <w:bottom w:val="single" w:sz="4" w:space="0" w:color="0F1E33"/>
-              <w:right w:val="single" w:sz="4" w:space="0" w:color="0F1E33"/>
+              <w:top w:val="single" w:sz="4" w:space="0" w:color="1C2E49"/>
+              <w:left w:val="single" w:sz="4" w:space="0" w:color="1C2E49"/>
+              <w:bottom w:val="single" w:sz="4" w:space="0" w:color="1C2E49"/>
+              <w:right w:val="single" w:sz="4" w:space="0" w:color="1C2E49"/>
             </w:tcBorders>
-            <w:shd w:val="clear" w:color="auto" w:fill="0F1E33"/>
+            <w:shd w:val="clear" w:color="auto" w:fill="1C2E49"/>
             <w:vAlign w:val="center"/>
           </w:tcPr>
           <w:p>
@@ -3063,7 +3063,7 @@
               <w:rPr>
                 <w:rFonts w:ascii="Playfair Display" w:hAnsi="Playfair Display"/>
                 <w:b/>
-                <w:color w:val="C9A961"/>
+                <w:color w:val="B5934A"/>
                 <w:sz w:val="30"/>
               </w:rPr>
               <w:t xml:space="preserve">III  </w:t>
@@ -3088,7 +3088,7 @@
         <w:tc>
           <w:tcPr>
             <w:tcW w:type="dxa" w:w="2663"/>
-            <w:shd w:val="clear" w:color="auto" w:fill="0F1E33"/>
+            <w:shd w:val="clear" w:color="auto" w:fill="1C2E49"/>
             <w:vAlign w:val="center"/>
           </w:tcPr>
           <w:p>
@@ -3110,7 +3110,7 @@
         <w:tc>
           <w:tcPr>
             <w:tcW w:type="dxa" w:w="7201"/>
-            <w:shd w:val="clear" w:color="auto" w:fill="E7ECF3"/>
+            <w:shd w:val="clear" w:color="auto" w:fill="E7EBF1"/>
             <w:vAlign w:val="center"/>
           </w:tcPr>
           <w:p>
@@ -3121,7 +3121,7 @@
               <w:rPr>
                 <w:rFonts w:ascii="Playfair Display" w:hAnsi="Playfair Display"/>
                 <w:b/>
-                <w:color w:val="0F1E33"/>
+                <w:color w:val="1C2E49"/>
                 <w:sz w:val="26"/>
               </w:rPr>
               <w:t>B.  Traitement médicamenteux</w:t>
@@ -3136,7 +3136,7 @@
         <w:tc>
           <w:tcPr>
             <w:tcW w:type="dxa" w:w="2663"/>
-            <w:shd w:val="clear" w:color="auto" w:fill="EEF1F5"/>
+            <w:shd w:val="clear" w:color="auto" w:fill="EEF0F3"/>
             <w:vAlign w:val="center"/>
           </w:tcPr>
           <w:p>
@@ -3148,7 +3148,7 @@
                 <w:rFonts w:ascii="Inter" w:hAnsi="Inter"/>
                 <w:b/>
                 <w:i w:val="0"/>
-                <w:color w:val="C9A961"/>
+                <w:color w:val="B5934A"/>
                 <w:sz w:val="20"/>
               </w:rPr>
               <w:t>★</w:t>
@@ -3158,7 +3158,7 @@
                 <w:rFonts w:ascii="Inter" w:hAnsi="Inter"/>
                 <w:b/>
                 <w:i w:val="0"/>
-                <w:color w:val="1B2433"/>
+                <w:color w:val="1F2A38"/>
                 <w:sz w:val="20"/>
               </w:rPr>
               <w:t xml:space="preserve"> Classes de 1re intention</w:t>
@@ -3175,12 +3175,12 @@
               <w:tblW w:type="auto" w:w="0"/>
               <w:jc w:val="center"/>
               <w:tblBorders>
-                <w:top w:val="single" w:sz="4" w:space="0" w:color="94A0B0"/>
-                <w:left w:val="single" w:sz="4" w:space="0" w:color="94A0B0"/>
-                <w:bottom w:val="single" w:sz="4" w:space="0" w:color="94A0B0"/>
-                <w:right w:val="single" w:sz="4" w:space="0" w:color="94A0B0"/>
-                <w:insideH w:val="single" w:sz="4" w:space="0" w:color="94A0B0"/>
-                <w:insideV w:val="single" w:sz="4" w:space="0" w:color="94A0B0"/>
+                <w:top w:val="single" w:sz="4" w:space="0" w:color="8E99A8"/>
+                <w:left w:val="single" w:sz="4" w:space="0" w:color="8E99A8"/>
+                <w:bottom w:val="single" w:sz="4" w:space="0" w:color="8E99A8"/>
+                <w:right w:val="single" w:sz="4" w:space="0" w:color="8E99A8"/>
+                <w:insideH w:val="single" w:sz="4" w:space="0" w:color="8E99A8"/>
+                <w:insideV w:val="single" w:sz="4" w:space="0" w:color="8E99A8"/>
               </w:tblBorders>
               <w:tblLayout w:type="autofit"/>
               <w:tblLook w:firstColumn="1" w:firstRow="1" w:lastColumn="0" w:lastRow="0" w:noHBand="0" w:noVBand="1" w:val="04A0"/>
@@ -3197,7 +3197,7 @@
               <w:tc>
                 <w:tcPr>
                   <w:tcW w:type="dxa" w:w="2400"/>
-                  <w:shd w:val="clear" w:color="auto" w:fill="EEF1F5"/>
+                  <w:shd w:val="clear" w:color="auto" w:fill="EEF0F3"/>
                 </w:tcPr>
                 <w:p>
                   <w:pPr>
@@ -3208,7 +3208,7 @@
                       <w:rFonts w:ascii="Inter" w:hAnsi="Inter"/>
                       <w:b/>
                       <w:i w:val="0"/>
-                      <w:color w:val="1B2433"/>
+                      <w:color w:val="1F2A38"/>
                       <w:sz w:val="18"/>
                     </w:rPr>
                     <w:t>Classe</w:t>
@@ -3218,7 +3218,7 @@
               <w:tc>
                 <w:tcPr>
                   <w:tcW w:type="dxa" w:w="2400"/>
-                  <w:shd w:val="clear" w:color="auto" w:fill="EEF1F5"/>
+                  <w:shd w:val="clear" w:color="auto" w:fill="EEF0F3"/>
                 </w:tcPr>
                 <w:p>
                   <w:pPr>
@@ -3229,7 +3229,7 @@
                       <w:rFonts w:ascii="Inter" w:hAnsi="Inter"/>
                       <w:b/>
                       <w:i w:val="0"/>
-                      <w:color w:val="1B2433"/>
+                      <w:color w:val="1F2A38"/>
                       <w:sz w:val="18"/>
                     </w:rPr>
                     <w:t>Exemple</w:t>
@@ -3239,7 +3239,7 @@
               <w:tc>
                 <w:tcPr>
                   <w:tcW w:type="dxa" w:w="2400"/>
-                  <w:shd w:val="clear" w:color="auto" w:fill="EEF1F5"/>
+                  <w:shd w:val="clear" w:color="auto" w:fill="EEF0F3"/>
                 </w:tcPr>
                 <w:p>
                   <w:pPr>
@@ -3250,7 +3250,7 @@
                       <w:rFonts w:ascii="Inter" w:hAnsi="Inter"/>
                       <w:b/>
                       <w:i w:val="0"/>
-                      <w:color w:val="1B2433"/>
+                      <w:color w:val="1F2A38"/>
                       <w:sz w:val="18"/>
                     </w:rPr>
                     <w:t>Indication</w:t>
@@ -3275,7 +3275,7 @@
                       <w:rFonts w:ascii="Inter" w:hAnsi="Inter"/>
                       <w:b/>
                       <w:i w:val="0"/>
-                      <w:color w:val="BE123C"/>
+                      <w:color w:val="8C2F39"/>
                       <w:sz w:val="18"/>
                     </w:rPr>
                     <w:t>IEC</w:t>
@@ -3295,7 +3295,7 @@
                       <w:rFonts w:ascii="Inter" w:hAnsi="Inter"/>
                       <w:b w:val="0"/>
                       <w:i w:val="0"/>
-                      <w:color w:val="1B2433"/>
+                      <w:color w:val="1F2A38"/>
                       <w:sz w:val="18"/>
                     </w:rPr>
                     <w:t>Ramipril</w:t>
@@ -3315,7 +3315,7 @@
                       <w:rFonts w:ascii="Inter" w:hAnsi="Inter"/>
                       <w:b w:val="0"/>
                       <w:i w:val="0"/>
-                      <w:color w:val="1B2433"/>
+                      <w:color w:val="1F2A38"/>
                       <w:sz w:val="18"/>
                     </w:rPr>
                     <w:t>Diabète, IC</w:t>
@@ -3330,7 +3330,7 @@
               <w:tc>
                 <w:tcPr>
                   <w:tcW w:type="dxa" w:w="2400"/>
-                  <w:shd w:val="clear" w:color="auto" w:fill="F5F6F9"/>
+                  <w:shd w:val="clear" w:color="auto" w:fill="F5F6F8"/>
                 </w:tcPr>
                 <w:p>
                   <w:pPr>
@@ -3341,7 +3341,7 @@
                       <w:rFonts w:ascii="Inter" w:hAnsi="Inter"/>
                       <w:b/>
                       <w:i w:val="0"/>
-                      <w:color w:val="BE123C"/>
+                      <w:color w:val="8C2F39"/>
                       <w:sz w:val="18"/>
                     </w:rPr>
                     <w:t>ARA II</w:t>
@@ -3351,7 +3351,7 @@
               <w:tc>
                 <w:tcPr>
                   <w:tcW w:type="dxa" w:w="2400"/>
-                  <w:shd w:val="clear" w:color="auto" w:fill="F5F6F9"/>
+                  <w:shd w:val="clear" w:color="auto" w:fill="F5F6F8"/>
                 </w:tcPr>
                 <w:p>
                   <w:pPr>
@@ -3362,7 +3362,7 @@
                       <w:rFonts w:ascii="Inter" w:hAnsi="Inter"/>
                       <w:b w:val="0"/>
                       <w:i w:val="0"/>
-                      <w:color w:val="1B2433"/>
+                      <w:color w:val="1F2A38"/>
                       <w:sz w:val="18"/>
                     </w:rPr>
                     <w:t>Losartan</w:t>
@@ -3372,7 +3372,7 @@
               <w:tc>
                 <w:tcPr>
                   <w:tcW w:type="dxa" w:w="2400"/>
-                  <w:shd w:val="clear" w:color="auto" w:fill="F5F6F9"/>
+                  <w:shd w:val="clear" w:color="auto" w:fill="F5F6F8"/>
                 </w:tcPr>
                 <w:p>
                   <w:pPr>
@@ -3383,7 +3383,7 @@
                       <w:rFonts w:ascii="Inter" w:hAnsi="Inter"/>
                       <w:b w:val="0"/>
                       <w:i w:val="0"/>
-                      <w:color w:val="1B2433"/>
+                      <w:color w:val="1F2A38"/>
                       <w:sz w:val="18"/>
                     </w:rPr>
                     <w:t>Intolérance aux IEC</w:t>
@@ -3408,7 +3408,7 @@
                       <w:rFonts w:ascii="Inter" w:hAnsi="Inter"/>
                       <w:b/>
                       <w:i w:val="0"/>
-                      <w:color w:val="BE123C"/>
+                      <w:color w:val="8C2F39"/>
                       <w:sz w:val="18"/>
                     </w:rPr>
                     <w:t>I. calcique</w:t>
@@ -3428,7 +3428,7 @@
                       <w:rFonts w:ascii="Inter" w:hAnsi="Inter"/>
                       <w:b w:val="0"/>
                       <w:i w:val="0"/>
-                      <w:color w:val="1B2433"/>
+                      <w:color w:val="1F2A38"/>
                       <w:sz w:val="18"/>
                     </w:rPr>
                     <w:t>Amlodipine</w:t>
@@ -3448,7 +3448,7 @@
                       <w:rFonts w:ascii="Inter" w:hAnsi="Inter"/>
                       <w:b w:val="0"/>
                       <w:i w:val="0"/>
-                      <w:color w:val="1B2433"/>
+                      <w:color w:val="1F2A38"/>
                       <w:sz w:val="18"/>
                     </w:rPr>
                     <w:t>Sujet âgé</w:t>
@@ -3463,7 +3463,7 @@
               <w:tc>
                 <w:tcPr>
                   <w:tcW w:type="dxa" w:w="2400"/>
-                  <w:shd w:val="clear" w:color="auto" w:fill="F5F6F9"/>
+                  <w:shd w:val="clear" w:color="auto" w:fill="F5F6F8"/>
                 </w:tcPr>
                 <w:p>
                   <w:pPr>
@@ -3474,7 +3474,7 @@
                       <w:rFonts w:ascii="Inter" w:hAnsi="Inter"/>
                       <w:b/>
                       <w:i w:val="0"/>
-                      <w:color w:val="BE123C"/>
+                      <w:color w:val="8C2F39"/>
                       <w:sz w:val="18"/>
                     </w:rPr>
                     <w:t>Diurétique</w:t>
@@ -3484,7 +3484,7 @@
               <w:tc>
                 <w:tcPr>
                   <w:tcW w:type="dxa" w:w="2400"/>
-                  <w:shd w:val="clear" w:color="auto" w:fill="F5F6F9"/>
+                  <w:shd w:val="clear" w:color="auto" w:fill="F5F6F8"/>
                 </w:tcPr>
                 <w:p>
                   <w:pPr>
@@ -3495,7 +3495,7 @@
                       <w:rFonts w:ascii="Inter" w:hAnsi="Inter"/>
                       <w:b w:val="0"/>
                       <w:i w:val="0"/>
-                      <w:color w:val="1B2433"/>
+                      <w:color w:val="1F2A38"/>
                       <w:sz w:val="18"/>
                     </w:rPr>
                     <w:t>HCTZ</w:t>
@@ -3505,7 +3505,7 @@
               <w:tc>
                 <w:tcPr>
                   <w:tcW w:type="dxa" w:w="2400"/>
-                  <w:shd w:val="clear" w:color="auto" w:fill="F5F6F9"/>
+                  <w:shd w:val="clear" w:color="auto" w:fill="F5F6F8"/>
                 </w:tcPr>
                 <w:p>
                   <w:pPr>
@@ -3516,7 +3516,7 @@
                       <w:rFonts w:ascii="Inter" w:hAnsi="Inter"/>
                       <w:b w:val="0"/>
                       <w:i w:val="0"/>
-                      <w:color w:val="1B2433"/>
+                      <w:color w:val="1F2A38"/>
                       <w:sz w:val="18"/>
                     </w:rPr>
                     <w:t>Sujet âgé</w:t>
@@ -3540,7 +3540,7 @@
         <w:tc>
           <w:tcPr>
             <w:tcW w:type="dxa" w:w="2663"/>
-            <w:shd w:val="clear" w:color="auto" w:fill="EEF1F5"/>
+            <w:shd w:val="clear" w:color="auto" w:fill="EEF0F3"/>
             <w:vAlign w:val="center"/>
           </w:tcPr>
           <w:p>
@@ -3552,7 +3552,7 @@
                 <w:rFonts w:ascii="Inter" w:hAnsi="Inter"/>
                 <w:b/>
                 <w:i w:val="0"/>
-                <w:color w:val="E11D48"/>
+                <w:color w:val="1C2E49"/>
                 <w:sz w:val="20"/>
               </w:rPr>
               <w:t>◆</w:t>
@@ -3562,7 +3562,7 @@
                 <w:rFonts w:ascii="Inter" w:hAnsi="Inter"/>
                 <w:b/>
                 <w:i w:val="0"/>
-                <w:color w:val="1B2433"/>
+                <w:color w:val="1F2A38"/>
                 <w:sz w:val="20"/>
               </w:rPr>
               <w:t xml:space="preserve"> Stratégie</w:t>
@@ -3584,7 +3584,7 @@
                 <w:rFonts w:ascii="Inter" w:hAnsi="Inter"/>
                 <w:b/>
                 <w:i w:val="0"/>
-                <w:color w:val="BE123C"/>
+                <w:color w:val="8C2F39"/>
                 <w:sz w:val="20"/>
               </w:rPr>
               <w:t>bithérapie d'emblée</w:t>
@@ -3594,7 +3594,7 @@
                 <w:rFonts w:ascii="Inter" w:hAnsi="Inter"/>
                 <w:b w:val="0"/>
                 <w:i w:val="0"/>
-                <w:color w:val="1B2433"/>
+                <w:color w:val="1F2A38"/>
                 <w:sz w:val="20"/>
               </w:rPr>
               <w:t xml:space="preserve"> souvent recommandée</w:t>
@@ -3610,7 +3610,7 @@
                 <w:rFonts w:ascii="Inter" w:hAnsi="Inter"/>
                 <w:b w:val="0"/>
                 <w:i w:val="0"/>
-                <w:color w:val="1B2433"/>
+                <w:color w:val="1F2A38"/>
                 <w:sz w:val="20"/>
               </w:rPr>
               <w:t xml:space="preserve">privilégier les </w:t>
@@ -3620,7 +3620,7 @@
                 <w:rFonts w:ascii="Inter" w:hAnsi="Inter"/>
                 <w:b/>
                 <w:i w:val="0"/>
-                <w:color w:val="BE123C"/>
+                <w:color w:val="8C2F39"/>
                 <w:sz w:val="20"/>
               </w:rPr>
               <w:t>associations fixes</w:t>
@@ -3636,7 +3636,7 @@
                 <w:rFonts w:ascii="Inter" w:hAnsi="Inter"/>
                 <w:b w:val="0"/>
                 <w:i w:val="0"/>
-                <w:color w:val="1B2433"/>
+                <w:color w:val="1F2A38"/>
                 <w:sz w:val="20"/>
               </w:rPr>
               <w:t xml:space="preserve">objectif : </w:t>
@@ -3646,7 +3646,7 @@
                 <w:rFonts w:ascii="Inter" w:hAnsi="Inter"/>
                 <w:b/>
                 <w:i w:val="0"/>
-                <w:color w:val="BE123C"/>
+                <w:color w:val="8C2F39"/>
                 <w:sz w:val="20"/>
               </w:rPr>
               <w:t>&lt; 140/90 mmHg</w:t>
@@ -3656,7 +3656,7 @@
                 <w:rFonts w:ascii="Inter" w:hAnsi="Inter"/>
                 <w:b w:val="0"/>
                 <w:i w:val="0"/>
-                <w:color w:val="1B2433"/>
+                <w:color w:val="1F2A38"/>
                 <w:sz w:val="20"/>
               </w:rPr>
               <w:t xml:space="preserve">, voire </w:t>
@@ -3666,7 +3666,7 @@
                 <w:rFonts w:ascii="Inter" w:hAnsi="Inter"/>
                 <w:b/>
                 <w:i w:val="0"/>
-                <w:color w:val="BE123C"/>
+                <w:color w:val="8C2F39"/>
                 <w:sz w:val="20"/>
               </w:rPr>
               <w:t>&lt; 130/80 mmHg</w:t>
@@ -3683,12 +3683,12 @@
             <w:tcW w:type="dxa" w:w="9865"/>
             <w:gridSpan w:val="2"/>
             <w:tcBorders>
-              <w:top w:val="single" w:sz="4" w:space="0" w:color="9A7B33"/>
-              <w:left w:val="single" w:sz="22" w:space="0" w:color="9A7B33"/>
-              <w:bottom w:val="single" w:sz="4" w:space="0" w:color="9A7B33"/>
-              <w:right w:val="single" w:sz="4" w:space="0" w:color="9A7B33"/>
+              <w:top w:val="single" w:sz="4" w:space="0" w:color="8A6D2E"/>
+              <w:left w:val="single" w:sz="22" w:space="0" w:color="8A6D2E"/>
+              <w:bottom w:val="single" w:sz="4" w:space="0" w:color="8A6D2E"/>
+              <w:right w:val="single" w:sz="4" w:space="0" w:color="8A6D2E"/>
             </w:tcBorders>
-            <w:shd w:val="clear" w:color="auto" w:fill="FBF6E8"/>
+            <w:shd w:val="clear" w:color="auto" w:fill="F6F1E4"/>
             <w:vAlign w:val="top"/>
           </w:tcPr>
           <w:p>
@@ -3699,7 +3699,7 @@
               <w:rPr>
                 <w:rFonts w:ascii="Inter" w:hAnsi="Inter"/>
                 <w:b/>
-                <w:color w:val="9A7B33"/>
+                <w:color w:val="8A6D2E"/>
                 <w:spacing w:val="14"/>
                 <w:sz w:val="16"/>
               </w:rPr>
@@ -3712,7 +3712,7 @@
                 <w:rFonts w:ascii="Inter" w:hAnsi="Inter"/>
                 <w:b w:val="0"/>
                 <w:i w:val="0"/>
-                <w:color w:val="1B2433"/>
+                <w:color w:val="1F2A38"/>
                 <w:sz w:val="20"/>
               </w:rPr>
               <w:t xml:space="preserve">Les 5 classes — moyen mnémotechnique </w:t>
@@ -3722,7 +3722,7 @@
                 <w:rFonts w:ascii="Inter" w:hAnsi="Inter"/>
                 <w:b/>
                 <w:i w:val="0"/>
-                <w:color w:val="BE123C"/>
+                <w:color w:val="8C2F39"/>
                 <w:sz w:val="20"/>
               </w:rPr>
               <w:t>« A-B-C-D »</w:t>
@@ -3732,7 +3732,7 @@
                 <w:rFonts w:ascii="Inter" w:hAnsi="Inter"/>
                 <w:b w:val="0"/>
                 <w:i w:val="0"/>
-                <w:color w:val="1B2433"/>
+                <w:color w:val="1F2A38"/>
                 <w:sz w:val="20"/>
               </w:rPr>
               <w:t xml:space="preserve"> : </w:t>
@@ -3742,7 +3742,7 @@
                 <w:rFonts w:ascii="Inter" w:hAnsi="Inter"/>
                 <w:b/>
                 <w:i w:val="0"/>
-                <w:color w:val="BE123C"/>
+                <w:color w:val="8C2F39"/>
                 <w:sz w:val="20"/>
               </w:rPr>
               <w:t>A</w:t>
@@ -3752,7 +3752,7 @@
                 <w:rFonts w:ascii="Inter" w:hAnsi="Inter"/>
                 <w:b w:val="0"/>
                 <w:i w:val="0"/>
-                <w:color w:val="1B2433"/>
+                <w:color w:val="1F2A38"/>
                 <w:sz w:val="20"/>
               </w:rPr>
               <w:t xml:space="preserve">RA II / IEC, </w:t>
@@ -3762,7 +3762,7 @@
                 <w:rFonts w:ascii="Inter" w:hAnsi="Inter"/>
                 <w:b/>
                 <w:i w:val="0"/>
-                <w:color w:val="BE123C"/>
+                <w:color w:val="8C2F39"/>
                 <w:sz w:val="20"/>
               </w:rPr>
               <w:t>B</w:t>
@@ -3772,7 +3772,7 @@
                 <w:rFonts w:ascii="Inter" w:hAnsi="Inter"/>
                 <w:b w:val="0"/>
                 <w:i w:val="0"/>
-                <w:color w:val="1B2433"/>
+                <w:color w:val="1F2A38"/>
                 <w:sz w:val="20"/>
               </w:rPr>
               <w:t xml:space="preserve">êtabloquants, </w:t>
@@ -3782,7 +3782,7 @@
                 <w:rFonts w:ascii="Inter" w:hAnsi="Inter"/>
                 <w:b/>
                 <w:i w:val="0"/>
-                <w:color w:val="BE123C"/>
+                <w:color w:val="8C2F39"/>
                 <w:sz w:val="20"/>
               </w:rPr>
               <w:t>C</w:t>
@@ -3792,7 +3792,7 @@
                 <w:rFonts w:ascii="Inter" w:hAnsi="Inter"/>
                 <w:b w:val="0"/>
                 <w:i w:val="0"/>
-                <w:color w:val="1B2433"/>
+                <w:color w:val="1F2A38"/>
                 <w:sz w:val="20"/>
               </w:rPr>
               <w:t xml:space="preserve">alciques, </w:t>
@@ -3802,7 +3802,7 @@
                 <w:rFonts w:ascii="Inter" w:hAnsi="Inter"/>
                 <w:b/>
                 <w:i w:val="0"/>
-                <w:color w:val="BE123C"/>
+                <w:color w:val="8C2F39"/>
                 <w:sz w:val="20"/>
               </w:rPr>
               <w:t>D</w:t>
@@ -3812,7 +3812,7 @@
                 <w:rFonts w:ascii="Inter" w:hAnsi="Inter"/>
                 <w:b w:val="0"/>
                 <w:i w:val="0"/>
-                <w:color w:val="1B2433"/>
+                <w:color w:val="1F2A38"/>
                 <w:sz w:val="20"/>
               </w:rPr>
               <w:t>iurétiques.</w:t>
@@ -3834,7 +3834,7 @@
     <w:p>
       <w:pPr>
         <w:keepNext/>
-        <w:shd w:val="clear" w:color="auto" w:fill="0F1E33"/>
+        <w:shd w:val="clear" w:color="auto" w:fill="1C2E49"/>
         <w:spacing w:before="40" w:after="200"/>
       </w:pPr>
       <w:r>
@@ -3855,7 +3855,7 @@
         <w:rPr>
           <w:rFonts w:ascii="Cormorant Garamond" w:hAnsi="Cormorant Garamond"/>
           <w:b/>
-          <w:color w:val="0F1E33"/>
+          <w:color w:val="1C2E49"/>
           <w:sz w:val="26"/>
         </w:rPr>
         <w:t>Chiffres-clés à connaître</w:t>
@@ -3866,12 +3866,12 @@
         <w:tblW w:type="auto" w:w="0"/>
         <w:jc w:val="center"/>
         <w:tblBorders>
-          <w:top w:val="single" w:sz="4" w:space="0" w:color="94A0B0"/>
-          <w:left w:val="single" w:sz="4" w:space="0" w:color="94A0B0"/>
-          <w:bottom w:val="single" w:sz="4" w:space="0" w:color="94A0B0"/>
-          <w:right w:val="single" w:sz="4" w:space="0" w:color="94A0B0"/>
-          <w:insideH w:val="single" w:sz="4" w:space="0" w:color="94A0B0"/>
-          <w:insideV w:val="single" w:sz="4" w:space="0" w:color="94A0B0"/>
+          <w:top w:val="single" w:sz="4" w:space="0" w:color="8E99A8"/>
+          <w:left w:val="single" w:sz="4" w:space="0" w:color="8E99A8"/>
+          <w:bottom w:val="single" w:sz="4" w:space="0" w:color="8E99A8"/>
+          <w:right w:val="single" w:sz="4" w:space="0" w:color="8E99A8"/>
+          <w:insideH w:val="single" w:sz="4" w:space="0" w:color="8E99A8"/>
+          <w:insideV w:val="single" w:sz="4" w:space="0" w:color="8E99A8"/>
         </w:tblBorders>
         <w:tblLayout w:type="autofit"/>
         <w:tblLook w:firstColumn="1" w:firstRow="1" w:lastColumn="0" w:lastRow="0" w:noHBand="0" w:noVBand="1" w:val="04A0"/>
@@ -3888,7 +3888,7 @@
         <w:tc>
           <w:tcPr>
             <w:tcW w:type="dxa" w:w="3289"/>
-            <w:shd w:val="clear" w:color="auto" w:fill="0F1E33"/>
+            <w:shd w:val="clear" w:color="auto" w:fill="1C2E49"/>
           </w:tcPr>
           <w:p>
             <w:pPr>
@@ -3909,7 +3909,7 @@
         <w:tc>
           <w:tcPr>
             <w:tcW w:type="dxa" w:w="3289"/>
-            <w:shd w:val="clear" w:color="auto" w:fill="0F1E33"/>
+            <w:shd w:val="clear" w:color="auto" w:fill="1C2E49"/>
           </w:tcPr>
           <w:p>
             <w:pPr>
@@ -3930,7 +3930,7 @@
         <w:tc>
           <w:tcPr>
             <w:tcW w:type="dxa" w:w="3289"/>
-            <w:shd w:val="clear" w:color="auto" w:fill="0F1E33"/>
+            <w:shd w:val="clear" w:color="auto" w:fill="1C2E49"/>
           </w:tcPr>
           <w:p>
             <w:pPr>
@@ -3966,7 +3966,7 @@
                 <w:rFonts w:ascii="Inter" w:hAnsi="Inter"/>
                 <w:b w:val="0"/>
                 <w:i w:val="0"/>
-                <w:color w:val="1B2433"/>
+                <w:color w:val="1F2A38"/>
                 <w:sz w:val="18"/>
               </w:rPr>
               <w:t>Seuil HTA au cabinet</w:t>
@@ -3986,7 +3986,7 @@
                 <w:rFonts w:ascii="Inter" w:hAnsi="Inter"/>
                 <w:b/>
                 <w:i w:val="0"/>
-                <w:color w:val="BE123C"/>
+                <w:color w:val="8C2F39"/>
                 <w:sz w:val="18"/>
               </w:rPr>
               <w:t>140/90 mmHg</w:t>
@@ -4006,7 +4006,7 @@
                 <w:rFonts w:ascii="Inter" w:hAnsi="Inter"/>
                 <w:b w:val="0"/>
                 <w:i w:val="0"/>
-                <w:color w:val="1B2433"/>
+                <w:color w:val="1F2A38"/>
                 <w:sz w:val="18"/>
               </w:rPr>
               <w:t>sur 2 consultations</w:t>
@@ -4021,7 +4021,7 @@
         <w:tc>
           <w:tcPr>
             <w:tcW w:type="dxa" w:w="3289"/>
-            <w:shd w:val="clear" w:color="auto" w:fill="EEF1F5"/>
+            <w:shd w:val="clear" w:color="auto" w:fill="EEF0F3"/>
           </w:tcPr>
           <w:p>
             <w:pPr>
@@ -4032,7 +4032,7 @@
                 <w:rFonts w:ascii="Inter" w:hAnsi="Inter"/>
                 <w:b w:val="0"/>
                 <w:i w:val="0"/>
-                <w:color w:val="1B2433"/>
+                <w:color w:val="1F2A38"/>
                 <w:sz w:val="18"/>
               </w:rPr>
               <w:t>Seuil en automesure</w:t>
@@ -4042,7 +4042,7 @@
         <w:tc>
           <w:tcPr>
             <w:tcW w:type="dxa" w:w="3289"/>
-            <w:shd w:val="clear" w:color="auto" w:fill="EEF1F5"/>
+            <w:shd w:val="clear" w:color="auto" w:fill="EEF0F3"/>
           </w:tcPr>
           <w:p>
             <w:pPr>
@@ -4053,7 +4053,7 @@
                 <w:rFonts w:ascii="Inter" w:hAnsi="Inter"/>
                 <w:b/>
                 <w:i w:val="0"/>
-                <w:color w:val="BE123C"/>
+                <w:color w:val="8C2F39"/>
                 <w:sz w:val="18"/>
               </w:rPr>
               <w:t>135/85 mmHg</w:t>
@@ -4063,7 +4063,7 @@
         <w:tc>
           <w:tcPr>
             <w:tcW w:type="dxa" w:w="3289"/>
-            <w:shd w:val="clear" w:color="auto" w:fill="EEF1F5"/>
+            <w:shd w:val="clear" w:color="auto" w:fill="EEF0F3"/>
           </w:tcPr>
           <w:p>
             <w:pPr>
@@ -4074,7 +4074,7 @@
                 <w:rFonts w:ascii="Inter" w:hAnsi="Inter"/>
                 <w:b w:val="0"/>
                 <w:i w:val="0"/>
-                <w:color w:val="1B2433"/>
+                <w:color w:val="1F2A38"/>
                 <w:sz w:val="18"/>
               </w:rPr>
               <w:t>règle des 3</w:t>
@@ -4099,7 +4099,7 @@
                 <w:rFonts w:ascii="Inter" w:hAnsi="Inter"/>
                 <w:b w:val="0"/>
                 <w:i w:val="0"/>
-                <w:color w:val="1B2433"/>
+                <w:color w:val="1F2A38"/>
                 <w:sz w:val="18"/>
               </w:rPr>
               <w:t>Apports en sel conseillés</w:t>
@@ -4119,7 +4119,7 @@
                 <w:rFonts w:ascii="Inter" w:hAnsi="Inter"/>
                 <w:b/>
                 <w:i w:val="0"/>
-                <w:color w:val="BE123C"/>
+                <w:color w:val="8C2F39"/>
                 <w:sz w:val="18"/>
               </w:rPr>
               <w:t>&lt; 6 g/j</w:t>
@@ -4139,7 +4139,7 @@
                 <w:rFonts w:ascii="Inter" w:hAnsi="Inter"/>
                 <w:b w:val="0"/>
                 <w:i w:val="0"/>
-                <w:color w:val="1B2433"/>
+                <w:color w:val="1F2A38"/>
                 <w:sz w:val="18"/>
               </w:rPr>
               <w:t>mesure hygiéno-diététique</w:t>
@@ -4154,7 +4154,7 @@
         <w:tc>
           <w:tcPr>
             <w:tcW w:type="dxa" w:w="3289"/>
-            <w:shd w:val="clear" w:color="auto" w:fill="EEF1F5"/>
+            <w:shd w:val="clear" w:color="auto" w:fill="EEF0F3"/>
           </w:tcPr>
           <w:p>
             <w:pPr>
@@ -4165,7 +4165,7 @@
                 <w:rFonts w:ascii="Inter" w:hAnsi="Inter"/>
                 <w:b w:val="0"/>
                 <w:i w:val="0"/>
-                <w:color w:val="1B2433"/>
+                <w:color w:val="1F2A38"/>
                 <w:sz w:val="18"/>
               </w:rPr>
               <w:t>Objectif tensionnel</w:t>
@@ -4175,7 +4175,7 @@
         <w:tc>
           <w:tcPr>
             <w:tcW w:type="dxa" w:w="3289"/>
-            <w:shd w:val="clear" w:color="auto" w:fill="EEF1F5"/>
+            <w:shd w:val="clear" w:color="auto" w:fill="EEF0F3"/>
           </w:tcPr>
           <w:p>
             <w:pPr>
@@ -4186,7 +4186,7 @@
                 <w:rFonts w:ascii="Inter" w:hAnsi="Inter"/>
                 <w:b/>
                 <w:i w:val="0"/>
-                <w:color w:val="BE123C"/>
+                <w:color w:val="8C2F39"/>
                 <w:sz w:val="18"/>
               </w:rPr>
               <w:t>&lt; 140/90 mmHg</w:t>
@@ -4196,7 +4196,7 @@
         <w:tc>
           <w:tcPr>
             <w:tcW w:type="dxa" w:w="3289"/>
-            <w:shd w:val="clear" w:color="auto" w:fill="EEF1F5"/>
+            <w:shd w:val="clear" w:color="auto" w:fill="EEF0F3"/>
           </w:tcPr>
           <w:p>
             <w:pPr>
@@ -4207,7 +4207,7 @@
                 <w:rFonts w:ascii="Inter" w:hAnsi="Inter"/>
                 <w:b w:val="0"/>
                 <w:i w:val="0"/>
-                <w:color w:val="1B2433"/>
+                <w:color w:val="1F2A38"/>
                 <w:sz w:val="18"/>
               </w:rPr>
               <w:t>voire &lt; 130/80 si toléré</w:t>
@@ -4232,7 +4232,7 @@
                 <w:rFonts w:ascii="Inter" w:hAnsi="Inter"/>
                 <w:b w:val="0"/>
                 <w:i w:val="0"/>
-                <w:color w:val="1B2433"/>
+                <w:color w:val="1F2A38"/>
                 <w:sz w:val="18"/>
               </w:rPr>
               <w:t>Prévalence de l'HTA</w:t>
@@ -4252,7 +4252,7 @@
                 <w:rFonts w:ascii="Inter" w:hAnsi="Inter"/>
                 <w:b/>
                 <w:i w:val="0"/>
-                <w:color w:val="BE123C"/>
+                <w:color w:val="8C2F39"/>
                 <w:sz w:val="18"/>
               </w:rPr>
               <w:t>≈ 30 %</w:t>
@@ -4272,7 +4272,7 @@
                 <w:rFonts w:ascii="Inter" w:hAnsi="Inter"/>
                 <w:b w:val="0"/>
                 <w:i w:val="0"/>
-                <w:color w:val="1B2433"/>
+                <w:color w:val="1F2A38"/>
                 <w:sz w:val="18"/>
               </w:rPr>
               <w:t>population adulte</w:t>
@@ -4294,7 +4294,7 @@
         <w:rPr>
           <w:rFonts w:ascii="Cormorant Garamond" w:hAnsi="Cormorant Garamond"/>
           <w:b/>
-          <w:color w:val="0F1E33"/>
+          <w:color w:val="1C2E49"/>
           <w:sz w:val="26"/>
         </w:rPr>
         <w:t>Grades de sévérité de l'HTA</w:t>
@@ -4305,12 +4305,12 @@
         <w:tblW w:type="auto" w:w="0"/>
         <w:jc w:val="center"/>
         <w:tblBorders>
-          <w:top w:val="single" w:sz="4" w:space="0" w:color="94A0B0"/>
-          <w:left w:val="single" w:sz="4" w:space="0" w:color="94A0B0"/>
-          <w:bottom w:val="single" w:sz="4" w:space="0" w:color="94A0B0"/>
-          <w:right w:val="single" w:sz="4" w:space="0" w:color="94A0B0"/>
-          <w:insideH w:val="single" w:sz="4" w:space="0" w:color="94A0B0"/>
-          <w:insideV w:val="single" w:sz="4" w:space="0" w:color="94A0B0"/>
+          <w:top w:val="single" w:sz="4" w:space="0" w:color="8E99A8"/>
+          <w:left w:val="single" w:sz="4" w:space="0" w:color="8E99A8"/>
+          <w:bottom w:val="single" w:sz="4" w:space="0" w:color="8E99A8"/>
+          <w:right w:val="single" w:sz="4" w:space="0" w:color="8E99A8"/>
+          <w:insideH w:val="single" w:sz="4" w:space="0" w:color="8E99A8"/>
+          <w:insideV w:val="single" w:sz="4" w:space="0" w:color="8E99A8"/>
         </w:tblBorders>
         <w:tblLayout w:type="autofit"/>
         <w:tblLook w:firstColumn="1" w:firstRow="1" w:lastColumn="0" w:lastRow="0" w:noHBand="0" w:noVBand="1" w:val="04A0"/>
@@ -4327,7 +4327,7 @@
         <w:tc>
           <w:tcPr>
             <w:tcW w:type="dxa" w:w="3289"/>
-            <w:shd w:val="clear" w:color="auto" w:fill="0F1E33"/>
+            <w:shd w:val="clear" w:color="auto" w:fill="1C2E49"/>
           </w:tcPr>
           <w:p>
             <w:pPr>
@@ -4348,7 +4348,7 @@
         <w:tc>
           <w:tcPr>
             <w:tcW w:type="dxa" w:w="3289"/>
-            <w:shd w:val="clear" w:color="auto" w:fill="0F1E33"/>
+            <w:shd w:val="clear" w:color="auto" w:fill="1C2E49"/>
           </w:tcPr>
           <w:p>
             <w:pPr>
@@ -4369,7 +4369,7 @@
         <w:tc>
           <w:tcPr>
             <w:tcW w:type="dxa" w:w="3289"/>
-            <w:shd w:val="clear" w:color="auto" w:fill="0F1E33"/>
+            <w:shd w:val="clear" w:color="auto" w:fill="1C2E49"/>
           </w:tcPr>
           <w:p>
             <w:pPr>
@@ -4405,7 +4405,7 @@
                 <w:rFonts w:ascii="Inter" w:hAnsi="Inter"/>
                 <w:b/>
                 <w:i w:val="0"/>
-                <w:color w:val="BE123C"/>
+                <w:color w:val="8C2F39"/>
                 <w:sz w:val="18"/>
               </w:rPr>
               <w:t>Grade 1</w:t>
@@ -4425,7 +4425,7 @@
                 <w:rFonts w:ascii="Inter" w:hAnsi="Inter"/>
                 <w:b w:val="0"/>
                 <w:i w:val="0"/>
-                <w:color w:val="1B2433"/>
+                <w:color w:val="1F2A38"/>
                 <w:sz w:val="18"/>
               </w:rPr>
               <w:t>140-159</w:t>
@@ -4445,7 +4445,7 @@
                 <w:rFonts w:ascii="Inter" w:hAnsi="Inter"/>
                 <w:b w:val="0"/>
                 <w:i w:val="0"/>
-                <w:color w:val="1B2433"/>
+                <w:color w:val="1F2A38"/>
                 <w:sz w:val="18"/>
               </w:rPr>
               <w:t>90-99</w:t>
@@ -4460,7 +4460,7 @@
         <w:tc>
           <w:tcPr>
             <w:tcW w:type="dxa" w:w="3289"/>
-            <w:shd w:val="clear" w:color="auto" w:fill="EEF1F5"/>
+            <w:shd w:val="clear" w:color="auto" w:fill="EEF0F3"/>
           </w:tcPr>
           <w:p>
             <w:pPr>
@@ -4471,7 +4471,7 @@
                 <w:rFonts w:ascii="Inter" w:hAnsi="Inter"/>
                 <w:b/>
                 <w:i w:val="0"/>
-                <w:color w:val="BE123C"/>
+                <w:color w:val="8C2F39"/>
                 <w:sz w:val="18"/>
               </w:rPr>
               <w:t>Grade 2</w:t>
@@ -4481,7 +4481,7 @@
         <w:tc>
           <w:tcPr>
             <w:tcW w:type="dxa" w:w="3289"/>
-            <w:shd w:val="clear" w:color="auto" w:fill="EEF1F5"/>
+            <w:shd w:val="clear" w:color="auto" w:fill="EEF0F3"/>
           </w:tcPr>
           <w:p>
             <w:pPr>
@@ -4492,7 +4492,7 @@
                 <w:rFonts w:ascii="Inter" w:hAnsi="Inter"/>
                 <w:b w:val="0"/>
                 <w:i w:val="0"/>
-                <w:color w:val="1B2433"/>
+                <w:color w:val="1F2A38"/>
                 <w:sz w:val="18"/>
               </w:rPr>
               <w:t>160-179</w:t>
@@ -4502,7 +4502,7 @@
         <w:tc>
           <w:tcPr>
             <w:tcW w:type="dxa" w:w="3289"/>
-            <w:shd w:val="clear" w:color="auto" w:fill="EEF1F5"/>
+            <w:shd w:val="clear" w:color="auto" w:fill="EEF0F3"/>
           </w:tcPr>
           <w:p>
             <w:pPr>
@@ -4513,7 +4513,7 @@
                 <w:rFonts w:ascii="Inter" w:hAnsi="Inter"/>
                 <w:b w:val="0"/>
                 <w:i w:val="0"/>
-                <w:color w:val="1B2433"/>
+                <w:color w:val="1F2A38"/>
                 <w:sz w:val="18"/>
               </w:rPr>
               <w:t>100-109</w:t>
@@ -4538,7 +4538,7 @@
                 <w:rFonts w:ascii="Inter" w:hAnsi="Inter"/>
                 <w:b/>
                 <w:i w:val="0"/>
-                <w:color w:val="BE123C"/>
+                <w:color w:val="8C2F39"/>
                 <w:sz w:val="18"/>
               </w:rPr>
               <w:t>Grade 3</w:t>
@@ -4558,7 +4558,7 @@
                 <w:rFonts w:ascii="Inter" w:hAnsi="Inter"/>
                 <w:b w:val="0"/>
                 <w:i w:val="0"/>
-                <w:color w:val="1B2433"/>
+                <w:color w:val="1F2A38"/>
                 <w:sz w:val="18"/>
               </w:rPr>
               <w:t>≥ 180</w:t>
@@ -4578,7 +4578,7 @@
                 <w:rFonts w:ascii="Inter" w:hAnsi="Inter"/>
                 <w:b w:val="0"/>
                 <w:i w:val="0"/>
-                <w:color w:val="1B2433"/>
+                <w:color w:val="1F2A38"/>
                 <w:sz w:val="18"/>
               </w:rPr>
               <w:t>≥ 110</w:t>
@@ -4600,7 +4600,7 @@
         <w:rPr>
           <w:rFonts w:ascii="Cormorant Garamond" w:hAnsi="Cormorant Garamond"/>
           <w:b/>
-          <w:color w:val="0F1E33"/>
+          <w:color w:val="1C2E49"/>
           <w:sz w:val="26"/>
         </w:rPr>
         <w:t>Classes thérapeutiques de première intention</w:t>
@@ -4611,12 +4611,12 @@
         <w:tblW w:type="auto" w:w="0"/>
         <w:jc w:val="center"/>
         <w:tblBorders>
-          <w:top w:val="single" w:sz="4" w:space="0" w:color="94A0B0"/>
-          <w:left w:val="single" w:sz="4" w:space="0" w:color="94A0B0"/>
-          <w:bottom w:val="single" w:sz="4" w:space="0" w:color="94A0B0"/>
-          <w:right w:val="single" w:sz="4" w:space="0" w:color="94A0B0"/>
-          <w:insideH w:val="single" w:sz="4" w:space="0" w:color="94A0B0"/>
-          <w:insideV w:val="single" w:sz="4" w:space="0" w:color="94A0B0"/>
+          <w:top w:val="single" w:sz="4" w:space="0" w:color="8E99A8"/>
+          <w:left w:val="single" w:sz="4" w:space="0" w:color="8E99A8"/>
+          <w:bottom w:val="single" w:sz="4" w:space="0" w:color="8E99A8"/>
+          <w:right w:val="single" w:sz="4" w:space="0" w:color="8E99A8"/>
+          <w:insideH w:val="single" w:sz="4" w:space="0" w:color="8E99A8"/>
+          <w:insideV w:val="single" w:sz="4" w:space="0" w:color="8E99A8"/>
         </w:tblBorders>
         <w:tblLayout w:type="autofit"/>
         <w:tblLook w:firstColumn="1" w:firstRow="1" w:lastColumn="0" w:lastRow="0" w:noHBand="0" w:noVBand="1" w:val="04A0"/>
@@ -4633,7 +4633,7 @@
         <w:tc>
           <w:tcPr>
             <w:tcW w:type="dxa" w:w="3289"/>
-            <w:shd w:val="clear" w:color="auto" w:fill="0F1E33"/>
+            <w:shd w:val="clear" w:color="auto" w:fill="1C2E49"/>
           </w:tcPr>
           <w:p>
             <w:pPr>
@@ -4654,7 +4654,7 @@
         <w:tc>
           <w:tcPr>
             <w:tcW w:type="dxa" w:w="3289"/>
-            <w:shd w:val="clear" w:color="auto" w:fill="0F1E33"/>
+            <w:shd w:val="clear" w:color="auto" w:fill="1C2E49"/>
           </w:tcPr>
           <w:p>
             <w:pPr>
@@ -4675,7 +4675,7 @@
         <w:tc>
           <w:tcPr>
             <w:tcW w:type="dxa" w:w="3289"/>
-            <w:shd w:val="clear" w:color="auto" w:fill="0F1E33"/>
+            <w:shd w:val="clear" w:color="auto" w:fill="1C2E49"/>
           </w:tcPr>
           <w:p>
             <w:pPr>
@@ -4711,7 +4711,7 @@
                 <w:rFonts w:ascii="Inter" w:hAnsi="Inter"/>
                 <w:b/>
                 <w:i w:val="0"/>
-                <w:color w:val="BE123C"/>
+                <w:color w:val="8C2F39"/>
                 <w:sz w:val="18"/>
               </w:rPr>
               <w:t>IEC</w:t>
@@ -4731,7 +4731,7 @@
                 <w:rFonts w:ascii="Inter" w:hAnsi="Inter"/>
                 <w:b w:val="0"/>
                 <w:i w:val="0"/>
-                <w:color w:val="1B2433"/>
+                <w:color w:val="1F2A38"/>
                 <w:sz w:val="18"/>
               </w:rPr>
               <w:t>Ramipril</w:t>
@@ -4751,7 +4751,7 @@
                 <w:rFonts w:ascii="Inter" w:hAnsi="Inter"/>
                 <w:b w:val="0"/>
                 <w:i w:val="0"/>
-                <w:color w:val="1B2433"/>
+                <w:color w:val="1F2A38"/>
                 <w:sz w:val="18"/>
               </w:rPr>
               <w:t>Diabète, insuffisance cardiaque</w:t>
@@ -4766,7 +4766,7 @@
         <w:tc>
           <w:tcPr>
             <w:tcW w:type="dxa" w:w="3289"/>
-            <w:shd w:val="clear" w:color="auto" w:fill="EEF1F5"/>
+            <w:shd w:val="clear" w:color="auto" w:fill="EEF0F3"/>
           </w:tcPr>
           <w:p>
             <w:pPr>
@@ -4777,7 +4777,7 @@
                 <w:rFonts w:ascii="Inter" w:hAnsi="Inter"/>
                 <w:b/>
                 <w:i w:val="0"/>
-                <w:color w:val="BE123C"/>
+                <w:color w:val="8C2F39"/>
                 <w:sz w:val="18"/>
               </w:rPr>
               <w:t>ARA II</w:t>
@@ -4787,7 +4787,7 @@
         <w:tc>
           <w:tcPr>
             <w:tcW w:type="dxa" w:w="3289"/>
-            <w:shd w:val="clear" w:color="auto" w:fill="EEF1F5"/>
+            <w:shd w:val="clear" w:color="auto" w:fill="EEF0F3"/>
           </w:tcPr>
           <w:p>
             <w:pPr>
@@ -4798,7 +4798,7 @@
                 <w:rFonts w:ascii="Inter" w:hAnsi="Inter"/>
                 <w:b w:val="0"/>
                 <w:i w:val="0"/>
-                <w:color w:val="1B2433"/>
+                <w:color w:val="1F2A38"/>
                 <w:sz w:val="18"/>
               </w:rPr>
               <w:t>Losartan</w:t>
@@ -4808,7 +4808,7 @@
         <w:tc>
           <w:tcPr>
             <w:tcW w:type="dxa" w:w="3289"/>
-            <w:shd w:val="clear" w:color="auto" w:fill="EEF1F5"/>
+            <w:shd w:val="clear" w:color="auto" w:fill="EEF0F3"/>
           </w:tcPr>
           <w:p>
             <w:pPr>
@@ -4819,7 +4819,7 @@
                 <w:rFonts w:ascii="Inter" w:hAnsi="Inter"/>
                 <w:b w:val="0"/>
                 <w:i w:val="0"/>
-                <w:color w:val="1B2433"/>
+                <w:color w:val="1F2A38"/>
                 <w:sz w:val="18"/>
               </w:rPr>
               <w:t>Intolérance aux IEC (toux)</w:t>
@@ -4844,7 +4844,7 @@
                 <w:rFonts w:ascii="Inter" w:hAnsi="Inter"/>
                 <w:b/>
                 <w:i w:val="0"/>
-                <w:color w:val="BE123C"/>
+                <w:color w:val="8C2F39"/>
                 <w:sz w:val="18"/>
               </w:rPr>
               <w:t>Inhibiteur calcique</w:t>
@@ -4864,7 +4864,7 @@
                 <w:rFonts w:ascii="Inter" w:hAnsi="Inter"/>
                 <w:b w:val="0"/>
                 <w:i w:val="0"/>
-                <w:color w:val="1B2433"/>
+                <w:color w:val="1F2A38"/>
                 <w:sz w:val="18"/>
               </w:rPr>
               <w:t>Amlodipine</w:t>
@@ -4884,7 +4884,7 @@
                 <w:rFonts w:ascii="Inter" w:hAnsi="Inter"/>
                 <w:b w:val="0"/>
                 <w:i w:val="0"/>
-                <w:color w:val="1B2433"/>
+                <w:color w:val="1F2A38"/>
                 <w:sz w:val="18"/>
               </w:rPr>
               <w:t>Sujet âgé</w:t>
@@ -4899,7 +4899,7 @@
         <w:tc>
           <w:tcPr>
             <w:tcW w:type="dxa" w:w="3289"/>
-            <w:shd w:val="clear" w:color="auto" w:fill="EEF1F5"/>
+            <w:shd w:val="clear" w:color="auto" w:fill="EEF0F3"/>
           </w:tcPr>
           <w:p>
             <w:pPr>
@@ -4910,7 +4910,7 @@
                 <w:rFonts w:ascii="Inter" w:hAnsi="Inter"/>
                 <w:b/>
                 <w:i w:val="0"/>
-                <w:color w:val="BE123C"/>
+                <w:color w:val="8C2F39"/>
                 <w:sz w:val="18"/>
               </w:rPr>
               <w:t>Diurétique thiazidique</w:t>
@@ -4920,7 +4920,7 @@
         <w:tc>
           <w:tcPr>
             <w:tcW w:type="dxa" w:w="3289"/>
-            <w:shd w:val="clear" w:color="auto" w:fill="EEF1F5"/>
+            <w:shd w:val="clear" w:color="auto" w:fill="EEF0F3"/>
           </w:tcPr>
           <w:p>
             <w:pPr>
@@ -4931,7 +4931,7 @@
                 <w:rFonts w:ascii="Inter" w:hAnsi="Inter"/>
                 <w:b w:val="0"/>
                 <w:i w:val="0"/>
-                <w:color w:val="1B2433"/>
+                <w:color w:val="1F2A38"/>
                 <w:sz w:val="18"/>
               </w:rPr>
               <w:t>HCTZ</w:t>
@@ -4941,7 +4941,7 @@
         <w:tc>
           <w:tcPr>
             <w:tcW w:type="dxa" w:w="3289"/>
-            <w:shd w:val="clear" w:color="auto" w:fill="EEF1F5"/>
+            <w:shd w:val="clear" w:color="auto" w:fill="EEF0F3"/>
           </w:tcPr>
           <w:p>
             <w:pPr>
@@ -4952,7 +4952,7 @@
                 <w:rFonts w:ascii="Inter" w:hAnsi="Inter"/>
                 <w:b w:val="0"/>
                 <w:i w:val="0"/>
-                <w:color w:val="1B2433"/>
+                <w:color w:val="1F2A38"/>
                 <w:sz w:val="18"/>
               </w:rPr>
               <w:t>Sujet âgé</w:t>
@@ -4977,7 +4977,7 @@
                 <w:rFonts w:ascii="Inter" w:hAnsi="Inter"/>
                 <w:b/>
                 <w:i w:val="0"/>
-                <w:color w:val="BE123C"/>
+                <w:color w:val="8C2F39"/>
                 <w:sz w:val="18"/>
               </w:rPr>
               <w:t>Bêtabloquant</w:t>
@@ -4997,7 +4997,7 @@
                 <w:rFonts w:ascii="Inter" w:hAnsi="Inter"/>
                 <w:b w:val="0"/>
                 <w:i w:val="0"/>
-                <w:color w:val="1B2433"/>
+                <w:color w:val="1F2A38"/>
                 <w:sz w:val="18"/>
               </w:rPr>
               <w:t>Bisoprolol</w:t>
@@ -5017,7 +5017,7 @@
                 <w:rFonts w:ascii="Inter" w:hAnsi="Inter"/>
                 <w:b w:val="0"/>
                 <w:i w:val="0"/>
-                <w:color w:val="1B2433"/>
+                <w:color w:val="1F2A38"/>
                 <w:sz w:val="18"/>
               </w:rPr>
               <w:t>Coronaropathie associée</w:t>
@@ -5044,7 +5044,7 @@
       <w:r>
         <w:rPr>
           <w:rFonts w:ascii="Inter" w:hAnsi="Inter"/>
-          <w:color w:val="C9A961"/>
+          <w:color w:val="B5934A"/>
           <w:spacing w:val="56"/>
           <w:sz w:val="18"/>
         </w:rPr>
@@ -5059,7 +5059,7 @@
         <w:rPr>
           <w:rFonts w:ascii="Playfair Display" w:hAnsi="Playfair Display"/>
           <w:b/>
-          <w:color w:val="1B2433"/>
+          <w:color w:val="1F2A38"/>
           <w:sz w:val="52"/>
         </w:rPr>
         <w:t>Fiche éclair</w:t>
@@ -5074,7 +5074,7 @@
         <w:rPr>
           <w:rFonts w:ascii="Cormorant Garamond" w:hAnsi="Cormorant Garamond"/>
           <w:i/>
-          <w:color w:val="0F1E33"/>
+          <w:color w:val="1C2E49"/>
           <w:sz w:val="26"/>
         </w:rPr>
         <w:t>Hypertension Artérielle</w:t>
@@ -5086,7 +5086,7 @@
           <w:rFonts w:ascii="Inter" w:hAnsi="Inter"/>
           <w:b/>
           <w:i w:val="0"/>
-          <w:color w:val="BE123C"/>
+          <w:color w:val="8C2F39"/>
           <w:sz w:val="20"/>
         </w:rPr>
         <w:t>Définition</w:t>
@@ -5096,7 +5096,7 @@
           <w:rFonts w:ascii="Inter" w:hAnsi="Inter"/>
           <w:b w:val="0"/>
           <w:i w:val="0"/>
-          <w:color w:val="1B2433"/>
+          <w:color w:val="1F2A38"/>
           <w:sz w:val="20"/>
         </w:rPr>
         <w:t xml:space="preserve"> : PA ≥ 140/90 mmHg au cabinet (135/85 en automesure), confirmée sur 2 consultations.</w:t>
@@ -5108,7 +5108,7 @@
           <w:rFonts w:ascii="Inter" w:hAnsi="Inter"/>
           <w:b/>
           <w:i w:val="0"/>
-          <w:color w:val="BE123C"/>
+          <w:color w:val="8C2F39"/>
           <w:sz w:val="20"/>
         </w:rPr>
         <w:t>Diagnostic</w:t>
@@ -5118,7 +5118,7 @@
           <w:rFonts w:ascii="Inter" w:hAnsi="Inter"/>
           <w:b w:val="0"/>
           <w:i w:val="0"/>
-          <w:color w:val="1B2433"/>
+          <w:color w:val="1F2A38"/>
           <w:sz w:val="20"/>
         </w:rPr>
         <w:t xml:space="preserve"> : MAPA = examen de référence ; rechercher HTA blouse blanche et HTA masquée.</w:t>
@@ -5130,7 +5130,7 @@
           <w:rFonts w:ascii="Inter" w:hAnsi="Inter"/>
           <w:b/>
           <w:i w:val="0"/>
-          <w:color w:val="BE123C"/>
+          <w:color w:val="8C2F39"/>
           <w:sz w:val="20"/>
         </w:rPr>
         <w:t>Bilan</w:t>
@@ -5140,7 +5140,7 @@
           <w:rFonts w:ascii="Inter" w:hAnsi="Inter"/>
           <w:b w:val="0"/>
           <w:i w:val="0"/>
-          <w:color w:val="1B2433"/>
+          <w:color w:val="1F2A38"/>
           <w:sz w:val="20"/>
         </w:rPr>
         <w:t xml:space="preserve"> : organes cibles (cœur, rein, œil) + bilan biologique minimal ; évoquer une HTA secondaire si résistance ou sujet jeune.</w:t>
@@ -5152,7 +5152,7 @@
           <w:rFonts w:ascii="Inter" w:hAnsi="Inter"/>
           <w:b/>
           <w:i w:val="0"/>
-          <w:color w:val="BE123C"/>
+          <w:color w:val="8C2F39"/>
           <w:sz w:val="20"/>
         </w:rPr>
         <w:t>Traitement</w:t>
@@ -5162,7 +5162,7 @@
           <w:rFonts w:ascii="Inter" w:hAnsi="Inter"/>
           <w:b w:val="0"/>
           <w:i w:val="0"/>
-          <w:color w:val="1B2433"/>
+          <w:color w:val="1F2A38"/>
           <w:sz w:val="20"/>
         </w:rPr>
         <w:t xml:space="preserve"> : RHD systématiques + 5 classes (IEC, ARA II, calciques, diurétiques, bêtabloquants) ; bithérapie d'emblée fréquente ; objectif &lt; 140/90 mmHg.</w:t>
@@ -5171,7 +5171,7 @@
     <w:p>
       <w:pPr>
         <w:pBdr>
-          <w:bottom w:val="single" w:sz="4" w:space="4" w:color="C9A961"/>
+          <w:bottom w:val="single" w:sz="4" w:space="4" w:color="B5934A"/>
         </w:pBdr>
         <w:spacing w:before="180" w:after="40"/>
       </w:pPr>
@@ -5179,7 +5179,7 @@
         <w:rPr>
           <w:rFonts w:ascii="Cormorant Garamond" w:hAnsi="Cormorant Garamond"/>
           <w:b/>
-          <w:color w:val="0F1E33"/>
+          <w:color w:val="1C2E49"/>
           <w:sz w:val="26"/>
         </w:rPr>
         <w:t>À retenir absolument</w:t>
@@ -5195,7 +5195,7 @@
           <w:rFonts w:ascii="Inter" w:hAnsi="Inter"/>
           <w:b w:val="0"/>
           <w:i w:val="0"/>
-          <w:color w:val="1B2433"/>
+          <w:color w:val="1F2A38"/>
           <w:sz w:val="21"/>
         </w:rPr>
         <w:t>L'</w:t>
@@ -5205,7 +5205,7 @@
           <w:rFonts w:ascii="Inter" w:hAnsi="Inter"/>
           <w:b/>
           <w:i w:val="0"/>
-          <w:color w:val="BE123C"/>
+          <w:color w:val="8C2F39"/>
           <w:sz w:val="21"/>
         </w:rPr>
         <w:t>HTA</w:t>
@@ -5215,7 +5215,7 @@
           <w:rFonts w:ascii="Inter" w:hAnsi="Inter"/>
           <w:b w:val="0"/>
           <w:i w:val="0"/>
-          <w:color w:val="1B2433"/>
+          <w:color w:val="1F2A38"/>
           <w:sz w:val="21"/>
         </w:rPr>
         <w:t xml:space="preserve"> est définie par une PA </w:t>
@@ -5225,7 +5225,7 @@
           <w:rFonts w:ascii="Inter" w:hAnsi="Inter"/>
           <w:b/>
           <w:i w:val="0"/>
-          <w:color w:val="BE123C"/>
+          <w:color w:val="8C2F39"/>
           <w:sz w:val="21"/>
         </w:rPr>
         <w:t>≥ 140/90 mmHg</w:t>
@@ -5235,7 +5235,7 @@
           <w:rFonts w:ascii="Inter" w:hAnsi="Inter"/>
           <w:b w:val="0"/>
           <w:i w:val="0"/>
-          <w:color w:val="1B2433"/>
+          <w:color w:val="1F2A38"/>
           <w:sz w:val="21"/>
         </w:rPr>
         <w:t xml:space="preserve"> au cabinet, confirmée sur des mesures répétées.</w:t>
@@ -5251,7 +5251,7 @@
           <w:rFonts w:ascii="Inter" w:hAnsi="Inter"/>
           <w:b w:val="0"/>
           <w:i w:val="0"/>
-          <w:color w:val="1B2433"/>
+          <w:color w:val="1F2A38"/>
           <w:sz w:val="21"/>
         </w:rPr>
         <w:t xml:space="preserve">La </w:t>
@@ -5261,7 +5261,7 @@
           <w:rFonts w:ascii="Inter" w:hAnsi="Inter"/>
           <w:b/>
           <w:i w:val="0"/>
-          <w:color w:val="BE123C"/>
+          <w:color w:val="8C2F39"/>
           <w:sz w:val="21"/>
         </w:rPr>
         <w:t>MAPA</w:t>
@@ -5271,7 +5271,7 @@
           <w:rFonts w:ascii="Inter" w:hAnsi="Inter"/>
           <w:b w:val="0"/>
           <w:i w:val="0"/>
-          <w:color w:val="1B2433"/>
+          <w:color w:val="1F2A38"/>
           <w:sz w:val="21"/>
         </w:rPr>
         <w:t xml:space="preserve"> et l'</w:t>
@@ -5281,7 +5281,7 @@
           <w:rFonts w:ascii="Inter" w:hAnsi="Inter"/>
           <w:b/>
           <w:i w:val="0"/>
-          <w:color w:val="BE123C"/>
+          <w:color w:val="8C2F39"/>
           <w:sz w:val="21"/>
         </w:rPr>
         <w:t>automesure</w:t>
@@ -5291,7 +5291,7 @@
           <w:rFonts w:ascii="Inter" w:hAnsi="Inter"/>
           <w:b w:val="0"/>
           <w:i w:val="0"/>
-          <w:color w:val="1B2433"/>
+          <w:color w:val="1F2A38"/>
           <w:sz w:val="21"/>
         </w:rPr>
         <w:t xml:space="preserve"> confirment le diagnostic et dépistent l'HTA blouse blanche et l'HTA masquée.</w:t>
@@ -5307,7 +5307,7 @@
           <w:rFonts w:ascii="Inter" w:hAnsi="Inter"/>
           <w:b w:val="0"/>
           <w:i w:val="0"/>
-          <w:color w:val="1B2433"/>
+          <w:color w:val="1F2A38"/>
           <w:sz w:val="21"/>
         </w:rPr>
         <w:t xml:space="preserve">Le bilan initial recherche une </w:t>
@@ -5317,7 +5317,7 @@
           <w:rFonts w:ascii="Inter" w:hAnsi="Inter"/>
           <w:b/>
           <w:i w:val="0"/>
-          <w:color w:val="BE123C"/>
+          <w:color w:val="8C2F39"/>
           <w:sz w:val="21"/>
         </w:rPr>
         <w:t>atteinte des organes cibles</w:t>
@@ -5327,7 +5327,7 @@
           <w:rFonts w:ascii="Inter" w:hAnsi="Inter"/>
           <w:b w:val="0"/>
           <w:i w:val="0"/>
-          <w:color w:val="1B2433"/>
+          <w:color w:val="1F2A38"/>
           <w:sz w:val="21"/>
         </w:rPr>
         <w:t xml:space="preserve"> et une </w:t>
@@ -5337,7 +5337,7 @@
           <w:rFonts w:ascii="Inter" w:hAnsi="Inter"/>
           <w:b/>
           <w:i w:val="0"/>
-          <w:color w:val="BE123C"/>
+          <w:color w:val="8C2F39"/>
           <w:sz w:val="21"/>
         </w:rPr>
         <w:t>HTA secondaire</w:t>
@@ -5347,7 +5347,7 @@
           <w:rFonts w:ascii="Inter" w:hAnsi="Inter"/>
           <w:b w:val="0"/>
           <w:i w:val="0"/>
-          <w:color w:val="1B2433"/>
+          <w:color w:val="1F2A38"/>
           <w:sz w:val="21"/>
         </w:rPr>
         <w:t>.</w:t>
@@ -5363,7 +5363,7 @@
           <w:rFonts w:ascii="Inter" w:hAnsi="Inter"/>
           <w:b w:val="0"/>
           <w:i w:val="0"/>
-          <w:color w:val="1B2433"/>
+          <w:color w:val="1F2A38"/>
           <w:sz w:val="21"/>
         </w:rPr>
         <w:t xml:space="preserve">Les </w:t>
@@ -5373,7 +5373,7 @@
           <w:rFonts w:ascii="Inter" w:hAnsi="Inter"/>
           <w:b/>
           <w:i w:val="0"/>
-          <w:color w:val="BE123C"/>
+          <w:color w:val="8C2F39"/>
           <w:sz w:val="21"/>
         </w:rPr>
         <w:t>règles hygiéno-diététiques</w:t>
@@ -5383,7 +5383,7 @@
           <w:rFonts w:ascii="Inter" w:hAnsi="Inter"/>
           <w:b w:val="0"/>
           <w:i w:val="0"/>
-          <w:color w:val="1B2433"/>
+          <w:color w:val="1F2A38"/>
           <w:sz w:val="21"/>
         </w:rPr>
         <w:t xml:space="preserve"> sont la base du traitement.</w:t>
@@ -5399,7 +5399,7 @@
           <w:rFonts w:ascii="Inter" w:hAnsi="Inter"/>
           <w:b w:val="0"/>
           <w:i w:val="0"/>
-          <w:color w:val="1B2433"/>
+          <w:color w:val="1F2A38"/>
           <w:sz w:val="21"/>
         </w:rPr>
         <w:t xml:space="preserve">Cinq classes de 1re intention ; la </w:t>
@@ -5409,7 +5409,7 @@
           <w:rFonts w:ascii="Inter" w:hAnsi="Inter"/>
           <w:b/>
           <w:i w:val="0"/>
-          <w:color w:val="BE123C"/>
+          <w:color w:val="8C2F39"/>
           <w:sz w:val="21"/>
         </w:rPr>
         <w:t>bithérapie</w:t>
@@ -5419,7 +5419,7 @@
           <w:rFonts w:ascii="Inter" w:hAnsi="Inter"/>
           <w:b w:val="0"/>
           <w:i w:val="0"/>
-          <w:color w:val="1B2433"/>
+          <w:color w:val="1F2A38"/>
           <w:sz w:val="21"/>
         </w:rPr>
         <w:t xml:space="preserve"> est souvent d'emblée.</w:t>
@@ -5435,7 +5435,7 @@
           <w:rFonts w:ascii="Inter" w:hAnsi="Inter"/>
           <w:b w:val="0"/>
           <w:i w:val="0"/>
-          <w:color w:val="1B2433"/>
+          <w:color w:val="1F2A38"/>
           <w:sz w:val="21"/>
         </w:rPr>
         <w:t xml:space="preserve">Objectif : </w:t>
@@ -5445,7 +5445,7 @@
           <w:rFonts w:ascii="Inter" w:hAnsi="Inter"/>
           <w:b/>
           <w:i w:val="0"/>
-          <w:color w:val="BE123C"/>
+          <w:color w:val="8C2F39"/>
           <w:sz w:val="21"/>
         </w:rPr>
         <w:t>&lt; 140/90 mmHg</w:t>
@@ -5455,7 +5455,7 @@
           <w:rFonts w:ascii="Inter" w:hAnsi="Inter"/>
           <w:b w:val="0"/>
           <w:i w:val="0"/>
-          <w:color w:val="1B2433"/>
+          <w:color w:val="1F2A38"/>
           <w:sz w:val="21"/>
         </w:rPr>
         <w:t xml:space="preserve">, idéalement </w:t>
@@ -5465,7 +5465,7 @@
           <w:rFonts w:ascii="Inter" w:hAnsi="Inter"/>
           <w:b/>
           <w:i w:val="0"/>
-          <w:color w:val="BE123C"/>
+          <w:color w:val="8C2F39"/>
           <w:sz w:val="21"/>
         </w:rPr>
         <w:t>&lt; 130/80 mmHg</w:t>
@@ -5475,7 +5475,7 @@
           <w:rFonts w:ascii="Inter" w:hAnsi="Inter"/>
           <w:b w:val="0"/>
           <w:i w:val="0"/>
-          <w:color w:val="1B2433"/>
+          <w:color w:val="1F2A38"/>
           <w:sz w:val="21"/>
         </w:rPr>
         <w:t xml:space="preserve"> si toléré.</w:t>
@@ -5528,7 +5528,7 @@
       <w:r>
         <w:rPr>
           <w:rFonts w:ascii="Inter" w:hAnsi="Inter"/>
-          <w:color w:val="94A0B0"/>
+          <w:color w:val="8E99A8"/>
           <w:spacing w:val="36"/>
           <w:sz w:val="17"/>
         </w:rPr>
@@ -5561,7 +5561,7 @@
     <w:r>
       <w:rPr>
         <w:rFonts w:ascii="Inter" w:hAnsi="Inter"/>
-        <w:color w:val="94A0B0"/>
+        <w:color w:val="8E99A8"/>
         <w:spacing w:val="24"/>
         <w:sz w:val="16"/>
       </w:rPr>
@@ -5572,7 +5572,7 @@
       <w:rPr>
         <w:rFonts w:ascii="Inter" w:hAnsi="Inter"/>
         <w:b/>
-        <w:color w:val="0F1E33"/>
+        <w:color w:val="1C2E49"/>
         <w:sz w:val="17"/>
       </w:rPr>
       <w:fldChar w:fldCharType="begin"/>
@@ -5583,7 +5583,7 @@
       <w:rPr>
         <w:rFonts w:ascii="Inter" w:hAnsi="Inter"/>
         <w:b/>
-        <w:color w:val="0F1E33"/>
+        <w:color w:val="1C2E49"/>
         <w:sz w:val="17"/>
       </w:rPr>
       <w:t xml:space="preserve">  /  </w:t>
@@ -5592,7 +5592,7 @@
       <w:rPr>
         <w:rFonts w:ascii="Inter" w:hAnsi="Inter"/>
         <w:b/>
-        <w:color w:val="0F1E33"/>
+        <w:color w:val="1C2E49"/>
         <w:sz w:val="17"/>
       </w:rPr>
       <w:fldChar w:fldCharType="begin"/>
@@ -5609,7 +5609,7 @@
     <w:pPr>
       <w:pStyle w:val="Header"/>
       <w:pBdr>
-        <w:bottom w:val="single" w:sz="6" w:space="4" w:color="0F1E33"/>
+        <w:bottom w:val="single" w:sz="6" w:space="4" w:color="1C2E49"/>
       </w:pBdr>
     </w:pPr>
     <w:r/>
@@ -5617,7 +5617,7 @@
       <w:rPr>
         <w:rFonts w:ascii="Inter" w:hAnsi="Inter"/>
         <w:i/>
-        <w:color w:val="94A0B0"/>
+        <w:color w:val="8E99A8"/>
         <w:sz w:val="16"/>
       </w:rPr>
       <w:t>Hypertension Artérielle</w:t>
@@ -5994,7 +5994,7 @@
     </w:pPr>
     <w:rPr>
       <w:rFonts w:ascii="Inter" w:hAnsi="Inter"/>
-      <w:color w:val="1B2433"/>
+      <w:color w:val="1F2A38"/>
       <w:sz w:val="21"/>
     </w:rPr>
   </w:style>

</xml_diff>

<commit_message>
Remplace le logo et retire les croix de la page de garde
Installe le logo « MAJOR ECN » (stéthoscope) fourni et supprime le motif
de croix médicales de la bande de couverture.

https://claude.ai/code/session_019UxbrWiVNiHBdkHsxX6ghC
</commit_message>
<xml_diff>
--- a/examples/Cardiologie_Hypertension-Arterielle_2025-2026.docx
+++ b/examples/Cardiologie_Hypertension-Arterielle_2025-2026.docx
@@ -44,7 +44,7 @@
             <w:r>
               <w:drawing>
                 <wp:inline xmlns:a="http://schemas.openxmlformats.org/drawingml/2006/main" xmlns:pic="http://schemas.openxmlformats.org/drawingml/2006/picture">
-                  <wp:extent cx="1872000" cy="936000"/>
+                  <wp:extent cx="1872000" cy="1188997"/>
                   <wp:docPr id="1" name="Picture 1"/>
                   <wp:cNvGraphicFramePr>
                     <a:graphicFrameLocks noChangeAspect="1"/>
@@ -65,7 +65,7 @@
                         <pic:spPr>
                           <a:xfrm>
                             <a:off x="0" y="0"/>
-                            <a:ext cx="1872000" cy="936000"/>
+                            <a:ext cx="1872000" cy="1188997"/>
                           </a:xfrm>
                           <a:prstGeom prst="rect"/>
                         </pic:spPr>
@@ -5489,7 +5489,7 @@
       <w:r>
         <w:drawing>
           <wp:inline xmlns:a="http://schemas.openxmlformats.org/drawingml/2006/main" xmlns:pic="http://schemas.openxmlformats.org/drawingml/2006/picture">
-            <wp:extent cx="792000" cy="396000"/>
+            <wp:extent cx="792000" cy="503037"/>
             <wp:docPr id="4" name="Picture 4"/>
             <wp:cNvGraphicFramePr>
               <a:graphicFrameLocks noChangeAspect="1"/>
@@ -5510,7 +5510,7 @@
                   <pic:spPr>
                     <a:xfrm>
                       <a:off x="0" y="0"/>
-                      <a:ext cx="792000" cy="396000"/>
+                      <a:ext cx="792000" cy="503037"/>
                     </a:xfrm>
                     <a:prstGeom prst="rect"/>
                   </pic:spPr>

</xml_diff>

<commit_message>
Refonte de la page de garde et filigrane du logo
- Page de garde repensée : identité (matière affichée une seule fois,
  titre, année), plan des grandes parties (chiffres romains uniquement),
  légende ; logo réduit et placé en haut à droite.
- Suppression de la page de plan dédiée, désormais inutile.
- Filigrane : logo gris très pâle, centré et répété sur chaque page
  (hors page de garde), en PDF comme en Word.

https://claude.ai/code/session_019UxbrWiVNiHBdkHsxX6ghC
</commit_message>
<xml_diff>
--- a/examples/Cardiologie_Hypertension-Arterielle_2025-2026.docx
+++ b/examples/Cardiologie_Hypertension-Arterielle_2025-2026.docx
@@ -23,28 +23,29 @@
       </w:tblGrid>
       <w:tr>
         <w:trPr>
-          <w:trHeight w:val="14173" w:hRule="atLeast"/>
+          <w:trHeight w:val="14287" w:hRule="atLeast"/>
         </w:trPr>
         <w:tc>
           <w:tcPr>
-            <w:tcW w:type="dxa" w:w="1361"/>
+            <w:tcW w:type="dxa" w:w="737"/>
             <w:shd w:val="clear" w:color="auto" w:fill="1C2E49"/>
           </w:tcPr>
           <w:p/>
         </w:tc>
         <w:tc>
           <w:tcPr>
-            <w:tcW w:type="dxa" w:w="8504"/>
-            <w:vAlign w:val="center"/>
+            <w:tcW w:type="dxa" w:w="9128"/>
+            <w:vAlign w:val="top"/>
           </w:tcPr>
           <w:p>
             <w:pPr>
-              <w:jc w:val="center"/>
+              <w:spacing w:after="160"/>
+              <w:jc w:val="right"/>
             </w:pPr>
             <w:r>
               <w:drawing>
                 <wp:inline xmlns:a="http://schemas.openxmlformats.org/drawingml/2006/main" xmlns:pic="http://schemas.openxmlformats.org/drawingml/2006/picture">
-                  <wp:extent cx="1872000" cy="1188997"/>
+                  <wp:extent cx="1512000" cy="960344"/>
                   <wp:docPr id="1" name="Picture 1"/>
                   <wp:cNvGraphicFramePr>
                     <a:graphicFrameLocks noChangeAspect="1"/>
@@ -65,7 +66,7 @@
                         <pic:spPr>
                           <a:xfrm>
                             <a:off x="0" y="0"/>
-                            <a:ext cx="1872000" cy="1188997"/>
+                            <a:ext cx="1512000" cy="960344"/>
                           </a:xfrm>
                           <a:prstGeom prst="rect"/>
                         </pic:spPr>
@@ -77,156 +78,170 @@
             </w:r>
           </w:p>
           <w:p>
-            <w:r>
-              <w:rPr>
-                <w:sz w:val="28"/>
-              </w:rPr>
-            </w:r>
-          </w:p>
-          <w:p>
-            <w:r>
-              <w:rPr>
-                <w:sz w:val="28"/>
-              </w:rPr>
-            </w:r>
-          </w:p>
-          <w:p>
             <w:pPr>
-              <w:jc w:val="center"/>
+              <w:spacing w:before="200"/>
             </w:pPr>
             <w:r>
               <w:rPr>
                 <w:rFonts w:ascii="Inter" w:hAnsi="Inter"/>
                 <w:b/>
                 <w:color w:val="B5934A"/>
-                <w:spacing w:val="80"/>
-                <w:sz w:val="26"/>
+                <w:spacing w:val="60"/>
+                <w:sz w:val="24"/>
               </w:rPr>
               <w:t>CARDIOLOGIE</w:t>
             </w:r>
           </w:p>
           <w:p>
             <w:pPr>
-              <w:jc w:val="center"/>
-            </w:pPr>
-            <w:r>
-              <w:rPr>
-                <w:rFonts w:ascii="Cormorant Garamond" w:hAnsi="Cormorant Garamond"/>
-                <w:color w:val="B5934A"/>
-                <w:sz w:val="24"/>
-              </w:rPr>
-              <w:t>— · —</w:t>
-            </w:r>
-          </w:p>
-          <w:p>
-            <w:pPr>
-              <w:jc w:val="center"/>
+              <w:spacing w:before="160"/>
             </w:pPr>
             <w:r>
               <w:rPr>
                 <w:rFonts w:ascii="Playfair Display" w:hAnsi="Playfair Display"/>
                 <w:b/>
-                <w:color w:val="1F2A38"/>
-                <w:sz w:val="68"/>
+                <w:color w:val="1C2E49"/>
+                <w:sz w:val="66"/>
               </w:rPr>
               <w:t>Hypertension Artérielle</w:t>
             </w:r>
           </w:p>
           <w:p>
             <w:pPr>
-              <w:jc w:val="center"/>
-            </w:pPr>
-            <w:r>
-              <w:rPr>
-                <w:rFonts w:ascii="Cormorant Garamond" w:hAnsi="Cormorant Garamond"/>
-                <w:color w:val="B5934A"/>
-                <w:sz w:val="24"/>
-              </w:rPr>
-              <w:t>— · —</w:t>
-            </w:r>
-          </w:p>
-          <w:p>
-            <w:pPr>
-              <w:jc w:val="center"/>
+              <w:spacing w:before="120"/>
             </w:pPr>
             <w:r>
               <w:rPr>
                 <w:rFonts w:ascii="Cormorant Garamond" w:hAnsi="Cormorant Garamond"/>
                 <w:i/>
-                <w:color w:val="1F2A38"/>
-                <w:sz w:val="32"/>
+                <w:color w:val="8E99A8"/>
+                <w:sz w:val="30"/>
               </w:rPr>
               <w:t>Année 2025-2026</w:t>
             </w:r>
           </w:p>
           <w:p>
             <w:pPr>
-              <w:jc w:val="center"/>
+              <w:spacing w:before="60"/>
             </w:pPr>
             <w:r>
               <w:rPr>
                 <w:rFonts w:ascii="Inter" w:hAnsi="Inter"/>
                 <w:color w:val="8E99A8"/>
-                <w:spacing w:val="40"/>
+                <w:spacing w:val="30"/>
                 <w:sz w:val="18"/>
               </w:rPr>
               <w:t>ITEM 224</w:t>
             </w:r>
           </w:p>
           <w:p>
-            <w:r>
-              <w:rPr>
-                <w:sz w:val="28"/>
-              </w:rPr>
-            </w:r>
-          </w:p>
-          <w:p>
-            <w:r>
-              <w:rPr>
-                <w:sz w:val="28"/>
-              </w:rPr>
-            </w:r>
-          </w:p>
-          <w:p>
             <w:pPr>
-              <w:jc w:val="center"/>
-            </w:pPr>
-            <w:r>
-              <w:rPr>
-                <w:rFonts w:ascii="Cormorant Garamond" w:hAnsi="Cormorant Garamond"/>
-                <w:i/>
-                <w:color w:val="1C2E49"/>
-                <w:sz w:val="24"/>
-              </w:rPr>
-              <w:t>Item 224</w:t>
-            </w:r>
-          </w:p>
-          <w:p>
-            <w:r>
-              <w:rPr>
-                <w:sz w:val="28"/>
-              </w:rPr>
-            </w:r>
-          </w:p>
-          <w:p>
-            <w:pPr>
-              <w:jc w:val="center"/>
+              <w:pBdr>
+                <w:bottom w:val="single" w:sz="4" w:space="4" w:color="1C2E49"/>
+              </w:pBdr>
+              <w:spacing w:before="600" w:after="120"/>
             </w:pPr>
             <w:r>
               <w:rPr>
                 <w:rFonts w:ascii="Inter" w:hAnsi="Inter"/>
                 <w:b/>
+                <w:color w:val="1C2E49"/>
+                <w:spacing w:val="50"/>
+                <w:sz w:val="19"/>
+              </w:rPr>
+              <w:t>PLAN DU COURS</w:t>
+            </w:r>
+          </w:p>
+          <w:p>
+            <w:pPr>
+              <w:spacing w:before="100" w:after="100"/>
+            </w:pPr>
+            <w:r>
+              <w:rPr>
+                <w:rFonts w:ascii="Playfair Display" w:hAnsi="Playfair Display"/>
+                <w:b/>
                 <w:color w:val="B5934A"/>
-                <w:spacing w:val="44"/>
-                <w:sz w:val="18"/>
+                <w:sz w:val="26"/>
+              </w:rPr>
+              <w:t xml:space="preserve">I    </w:t>
+            </w:r>
+            <w:r>
+              <w:rPr>
+                <w:rFonts w:ascii="Cormorant Garamond" w:hAnsi="Cormorant Garamond"/>
+                <w:b/>
+                <w:color w:val="1F2A38"/>
+                <w:sz w:val="25"/>
+              </w:rPr>
+              <w:t>Définition et épidémiologie</w:t>
+            </w:r>
+          </w:p>
+          <w:p>
+            <w:pPr>
+              <w:spacing w:before="100" w:after="100"/>
+            </w:pPr>
+            <w:r>
+              <w:rPr>
+                <w:rFonts w:ascii="Playfair Display" w:hAnsi="Playfair Display"/>
+                <w:b/>
+                <w:color w:val="B5934A"/>
+                <w:sz w:val="26"/>
+              </w:rPr>
+              <w:t xml:space="preserve">II    </w:t>
+            </w:r>
+            <w:r>
+              <w:rPr>
+                <w:rFonts w:ascii="Cormorant Garamond" w:hAnsi="Cormorant Garamond"/>
+                <w:b/>
+                <w:color w:val="1F2A38"/>
+                <w:sz w:val="25"/>
+              </w:rPr>
+              <w:t>Diagnostic et bilan initial</w:t>
+            </w:r>
+          </w:p>
+          <w:p>
+            <w:pPr>
+              <w:spacing w:before="100" w:after="100"/>
+            </w:pPr>
+            <w:r>
+              <w:rPr>
+                <w:rFonts w:ascii="Playfair Display" w:hAnsi="Playfair Display"/>
+                <w:b/>
+                <w:color w:val="B5934A"/>
+                <w:sz w:val="26"/>
+              </w:rPr>
+              <w:t xml:space="preserve">III    </w:t>
+            </w:r>
+            <w:r>
+              <w:rPr>
+                <w:rFonts w:ascii="Cormorant Garamond" w:hAnsi="Cormorant Garamond"/>
+                <w:b/>
+                <w:color w:val="1F2A38"/>
+                <w:sz w:val="25"/>
+              </w:rPr>
+              <w:t>Prise en charge thérapeutique</w:t>
+            </w:r>
+          </w:p>
+          <w:p>
+            <w:pPr>
+              <w:pBdr>
+                <w:bottom w:val="single" w:sz="4" w:space="4" w:color="1C2E49"/>
+              </w:pBdr>
+              <w:spacing w:before="520" w:after="120"/>
+            </w:pPr>
+            <w:r>
+              <w:rPr>
+                <w:rFonts w:ascii="Inter" w:hAnsi="Inter"/>
+                <w:b/>
+                <w:color w:val="1C2E49"/>
+                <w:spacing w:val="50"/>
+                <w:sz w:val="19"/>
               </w:rPr>
               <w:t>LÉGENDE</w:t>
             </w:r>
           </w:p>
           <w:p>
             <w:pPr>
-              <w:spacing w:after="40"/>
-              <w:jc w:val="center"/>
+              <w:spacing w:before="60"/>
             </w:pPr>
             <w:r>
               <w:rPr>
@@ -234,21 +249,20 @@
                 <w:color w:val="B5934A"/>
                 <w:sz w:val="22"/>
               </w:rPr>
-              <w:t xml:space="preserve">★  </w:t>
+              <w:t xml:space="preserve">★   </w:t>
             </w:r>
             <w:r>
               <w:rPr>
                 <w:rFonts w:ascii="Inter" w:hAnsi="Inter"/>
                 <w:color w:val="1F2A38"/>
-                <w:sz w:val="18"/>
+                <w:sz w:val="19"/>
               </w:rPr>
               <w:t>Déjà tombé aux ECN</w:t>
             </w:r>
           </w:p>
           <w:p>
             <w:pPr>
-              <w:spacing w:after="40"/>
-              <w:jc w:val="center"/>
+              <w:spacing w:before="60"/>
             </w:pPr>
             <w:r>
               <w:rPr>
@@ -256,21 +270,20 @@
                 <w:color w:val="1C2E49"/>
                 <w:sz w:val="22"/>
               </w:rPr>
-              <w:t xml:space="preserve">◆  </w:t>
+              <w:t xml:space="preserve">◆   </w:t>
             </w:r>
             <w:r>
               <w:rPr>
                 <w:rFonts w:ascii="Inter" w:hAnsi="Inter"/>
                 <w:color w:val="1F2A38"/>
-                <w:sz w:val="18"/>
+                <w:sz w:val="19"/>
               </w:rPr>
               <w:t>Notion à haut rendement</w:t>
             </w:r>
           </w:p>
           <w:p>
             <w:pPr>
-              <w:spacing w:after="40"/>
-              <w:jc w:val="center"/>
+              <w:spacing w:before="60"/>
             </w:pPr>
             <w:r>
               <w:rPr>
@@ -278,13 +291,13 @@
                 <w:color w:val="8C2F39"/>
                 <w:sz w:val="22"/>
               </w:rPr>
-              <w:t xml:space="preserve">⚠  </w:t>
+              <w:t xml:space="preserve">⚠   </w:t>
             </w:r>
             <w:r>
               <w:rPr>
                 <w:rFonts w:ascii="Inter" w:hAnsi="Inter"/>
                 <w:color w:val="1F2A38"/>
-                <w:sz w:val="18"/>
+                <w:sz w:val="19"/>
               </w:rPr>
               <w:t>Piège classique</w:t>
             </w:r>
@@ -292,330 +305,6 @@
         </w:tc>
       </w:tr>
     </w:tbl>
-    <w:p>
-      <w:r>
-        <w:br w:type="page"/>
-      </w:r>
-    </w:p>
-    <w:p>
-      <w:pPr>
-        <w:pBdr>
-          <w:top w:val="single" w:sz="12" w:space="6" w:color="1C2E49"/>
-          <w:bottom w:val="single" w:sz="12" w:space="6" w:color="1C2E49"/>
-        </w:pBdr>
-        <w:spacing w:before="80"/>
-        <w:jc w:val="center"/>
-      </w:pPr>
-      <w:r>
-        <w:rPr>
-          <w:rFonts w:ascii="Playfair Display" w:hAnsi="Playfair Display"/>
-          <w:b/>
-          <w:color w:val="1F2A38"/>
-          <w:sz w:val="46"/>
-        </w:rPr>
-        <w:t>Plan du cours</w:t>
-      </w:r>
-    </w:p>
-    <w:p>
-      <w:pPr>
-        <w:spacing w:after="240"/>
-        <w:jc w:val="center"/>
-      </w:pPr>
-      <w:r>
-        <w:rPr>
-          <w:rFonts w:ascii="Cormorant Garamond" w:hAnsi="Cormorant Garamond"/>
-          <w:i/>
-          <w:color w:val="B5934A"/>
-          <w:sz w:val="24"/>
-        </w:rPr>
-        <w:t>Cardiologie  ·  Hypertension Artérielle</w:t>
-      </w:r>
-    </w:p>
-    <w:p>
-      <w:pPr>
-        <w:spacing w:before="160"/>
-      </w:pPr>
-      <w:r>
-        <w:rPr>
-          <w:rFonts w:ascii="Playfair Display" w:hAnsi="Playfair Display"/>
-          <w:b/>
-          <w:color w:val="1C2E49"/>
-          <w:sz w:val="28"/>
-        </w:rPr>
-        <w:t xml:space="preserve">I.  </w:t>
-      </w:r>
-      <w:r>
-        <w:rPr>
-          <w:rFonts w:ascii="Cormorant Garamond" w:hAnsi="Cormorant Garamond"/>
-          <w:b/>
-          <w:color w:val="1F2A38"/>
-          <w:sz w:val="27"/>
-        </w:rPr>
-        <w:t>Définition et épidémiologie</w:t>
-      </w:r>
-    </w:p>
-    <w:p>
-      <w:pPr>
-        <w:ind w:left="454"/>
-      </w:pPr>
-      <w:r>
-        <w:rPr>
-          <w:rFonts w:ascii="Cormorant Garamond" w:hAnsi="Cormorant Garamond"/>
-          <w:i/>
-          <w:color w:val="8E99A8"/>
-          <w:sz w:val="21"/>
-        </w:rPr>
-        <w:t>Cadre nosologique et poids de santé publique.</w:t>
-      </w:r>
-    </w:p>
-    <w:p>
-      <w:pPr>
-        <w:ind w:left="567"/>
-      </w:pPr>
-      <w:r>
-        <w:rPr>
-          <w:b/>
-          <w:color w:val="B5934A"/>
-          <w:sz w:val="21"/>
-        </w:rPr>
-        <w:t xml:space="preserve">A.  </w:t>
-      </w:r>
-      <w:r>
-        <w:rPr>
-          <w:b/>
-          <w:sz w:val="21"/>
-        </w:rPr>
-        <w:t>Définitions et seuils</w:t>
-      </w:r>
-      <w:r>
-        <w:rPr>
-          <w:rFonts w:ascii="Cormorant Garamond" w:hAnsi="Cormorant Garamond"/>
-          <w:i/>
-          <w:color w:val="8E99A8"/>
-          <w:sz w:val="20"/>
-        </w:rPr>
-        <w:t xml:space="preserve"> — Seuils et grades.</w:t>
-      </w:r>
-    </w:p>
-    <w:p>
-      <w:pPr>
-        <w:ind w:left="567"/>
-      </w:pPr>
-      <w:r>
-        <w:rPr>
-          <w:b/>
-          <w:color w:val="B5934A"/>
-          <w:sz w:val="21"/>
-        </w:rPr>
-        <w:t xml:space="preserve">B.  </w:t>
-      </w:r>
-      <w:r>
-        <w:rPr>
-          <w:b/>
-          <w:sz w:val="21"/>
-        </w:rPr>
-        <w:t>Épidémiologie</w:t>
-      </w:r>
-      <w:r>
-        <w:rPr>
-          <w:rFonts w:ascii="Cormorant Garamond" w:hAnsi="Cormorant Garamond"/>
-          <w:i/>
-          <w:color w:val="8E99A8"/>
-          <w:sz w:val="20"/>
-        </w:rPr>
-        <w:t xml:space="preserve"> — Prévalence et FdR.</w:t>
-      </w:r>
-    </w:p>
-    <w:p>
-      <w:pPr>
-        <w:spacing w:before="160"/>
-      </w:pPr>
-      <w:r>
-        <w:rPr>
-          <w:rFonts w:ascii="Playfair Display" w:hAnsi="Playfair Display"/>
-          <w:b/>
-          <w:color w:val="1C2E49"/>
-          <w:sz w:val="28"/>
-        </w:rPr>
-        <w:t xml:space="preserve">II.  </w:t>
-      </w:r>
-      <w:r>
-        <w:rPr>
-          <w:rFonts w:ascii="Cormorant Garamond" w:hAnsi="Cormorant Garamond"/>
-          <w:b/>
-          <w:color w:val="1F2A38"/>
-          <w:sz w:val="27"/>
-        </w:rPr>
-        <w:t>Diagnostic et bilan initial</w:t>
-      </w:r>
-    </w:p>
-    <w:p>
-      <w:pPr>
-        <w:ind w:left="454"/>
-      </w:pPr>
-      <w:r>
-        <w:rPr>
-          <w:rFonts w:ascii="Cormorant Garamond" w:hAnsi="Cormorant Garamond"/>
-          <w:i/>
-          <w:color w:val="8E99A8"/>
-          <w:sz w:val="21"/>
-        </w:rPr>
-        <w:t>Confirmation et recherche du retentissement.</w:t>
-      </w:r>
-    </w:p>
-    <w:p>
-      <w:pPr>
-        <w:ind w:left="567"/>
-      </w:pPr>
-      <w:r>
-        <w:rPr>
-          <w:b/>
-          <w:color w:val="B5934A"/>
-          <w:sz w:val="21"/>
-        </w:rPr>
-        <w:t xml:space="preserve">A.  </w:t>
-      </w:r>
-      <w:r>
-        <w:rPr>
-          <w:b/>
-          <w:sz w:val="21"/>
-        </w:rPr>
-        <w:t>Mesure de la PA</w:t>
-      </w:r>
-      <w:r>
-        <w:rPr>
-          <w:rFonts w:ascii="Cormorant Garamond" w:hAnsi="Cormorant Garamond"/>
-          <w:i/>
-          <w:color w:val="8E99A8"/>
-          <w:sz w:val="20"/>
-        </w:rPr>
-        <w:t xml:space="preserve"> — Conditions et MAPA.</w:t>
-      </w:r>
-    </w:p>
-    <w:p>
-      <w:pPr>
-        <w:ind w:left="567"/>
-      </w:pPr>
-      <w:r>
-        <w:rPr>
-          <w:b/>
-          <w:color w:val="B5934A"/>
-          <w:sz w:val="21"/>
-        </w:rPr>
-        <w:t xml:space="preserve">B.  </w:t>
-      </w:r>
-      <w:r>
-        <w:rPr>
-          <w:b/>
-          <w:sz w:val="21"/>
-        </w:rPr>
-        <w:t>Bilan de retentissement</w:t>
-      </w:r>
-      <w:r>
-        <w:rPr>
-          <w:rFonts w:ascii="Cormorant Garamond" w:hAnsi="Cormorant Garamond"/>
-          <w:i/>
-          <w:color w:val="8E99A8"/>
-          <w:sz w:val="20"/>
-        </w:rPr>
-        <w:t xml:space="preserve"> — Organes cibles.</w:t>
-      </w:r>
-    </w:p>
-    <w:p>
-      <w:pPr>
-        <w:spacing w:before="160"/>
-      </w:pPr>
-      <w:r>
-        <w:rPr>
-          <w:rFonts w:ascii="Playfair Display" w:hAnsi="Playfair Display"/>
-          <w:b/>
-          <w:color w:val="1C2E49"/>
-          <w:sz w:val="28"/>
-        </w:rPr>
-        <w:t xml:space="preserve">III.  </w:t>
-      </w:r>
-      <w:r>
-        <w:rPr>
-          <w:rFonts w:ascii="Cormorant Garamond" w:hAnsi="Cormorant Garamond"/>
-          <w:b/>
-          <w:color w:val="1F2A38"/>
-          <w:sz w:val="27"/>
-        </w:rPr>
-        <w:t>Prise en charge thérapeutique</w:t>
-      </w:r>
-    </w:p>
-    <w:p>
-      <w:pPr>
-        <w:ind w:left="454"/>
-      </w:pPr>
-      <w:r>
-        <w:rPr>
-          <w:rFonts w:ascii="Cormorant Garamond" w:hAnsi="Cormorant Garamond"/>
-          <w:i/>
-          <w:color w:val="8E99A8"/>
-          <w:sz w:val="21"/>
-        </w:rPr>
-        <w:t>Mesures hygiéno-diététiques et médicaments.</w:t>
-      </w:r>
-    </w:p>
-    <w:p>
-      <w:pPr>
-        <w:ind w:left="567"/>
-      </w:pPr>
-      <w:r>
-        <w:rPr>
-          <w:b/>
-          <w:color w:val="B5934A"/>
-          <w:sz w:val="21"/>
-        </w:rPr>
-        <w:t xml:space="preserve">A.  </w:t>
-      </w:r>
-      <w:r>
-        <w:rPr>
-          <w:b/>
-          <w:sz w:val="21"/>
-        </w:rPr>
-        <w:t>Mesures non médicamenteuses</w:t>
-      </w:r>
-      <w:r>
-        <w:rPr>
-          <w:rFonts w:ascii="Cormorant Garamond" w:hAnsi="Cormorant Garamond"/>
-          <w:i/>
-          <w:color w:val="8E99A8"/>
-          <w:sz w:val="20"/>
-        </w:rPr>
-        <w:t xml:space="preserve"> — RHD.</w:t>
-      </w:r>
-    </w:p>
-    <w:p>
-      <w:pPr>
-        <w:ind w:left="567"/>
-      </w:pPr>
-      <w:r>
-        <w:rPr>
-          <w:b/>
-          <w:color w:val="B5934A"/>
-          <w:sz w:val="21"/>
-        </w:rPr>
-        <w:t xml:space="preserve">B.  </w:t>
-      </w:r>
-      <w:r>
-        <w:rPr>
-          <w:b/>
-          <w:sz w:val="21"/>
-        </w:rPr>
-        <w:t>Traitement médicamenteux</w:t>
-      </w:r>
-      <w:r>
-        <w:rPr>
-          <w:rFonts w:ascii="Cormorant Garamond" w:hAnsi="Cormorant Garamond"/>
-          <w:i/>
-          <w:color w:val="8E99A8"/>
-          <w:sz w:val="20"/>
-        </w:rPr>
-        <w:t xml:space="preserve"> — Classes.</w:t>
-      </w:r>
-    </w:p>
     <w:p>
       <w:r>
         <w:br w:type="page"/>
@@ -5622,6 +5311,32 @@
       </w:rPr>
       <w:t>Hypertension Artérielle</w:t>
     </w:r>
+    <w:r>
+      <w:pict>
+        <v:shapetype id="_x0000_t75" coordsize="21600,21600" o:spt="75" o:preferrelative="t" path="m@4@5l@4@11@9@11@9@5xe" filled="f" stroked="f">
+          <v:stroke joinstyle="miter"/>
+          <v:formulas>
+            <v:f eqn="if lineDrawn pixelLineWidth 0"/>
+            <v:f eqn="sum @0 1 0"/>
+            <v:f eqn="sum 0 0 @1"/>
+            <v:f eqn="prod @2 1 2"/>
+            <v:f eqn="prod @3 21600 pixelWidth"/>
+            <v:f eqn="prod @3 21600 pixelHeight"/>
+            <v:f eqn="sum @0 0 1"/>
+            <v:f eqn="prod @6 1 2"/>
+            <v:f eqn="prod @7 21600 pixelWidth"/>
+            <v:f eqn="sum @8 21600 0"/>
+            <v:f eqn="prod @7 21600 pixelHeight"/>
+            <v:f eqn="sum @10 21600 0"/>
+          </v:formulas>
+          <v:path o:extrusionok="f" gradientshapeok="t" o:connecttype="rect"/>
+          <o:lock v:ext="edit" aspectratio="t"/>
+        </v:shapetype>
+        <v:shape id="MajorEcnWatermark" o:spid="_x0000_s2051" type="#_x0000_t75" o:allowincell="f" style="position:absolute;margin-left:0;margin-top:0;width:442.2pt;height:280.9pt;z-index:251659264;mso-position-horizontal:center;mso-position-horizontal-relative:page;mso-position-vertical:center;mso-position-vertical-relative:page">
+          <v:imagedata r:id="rId1" o:title="Major ECN"/>
+        </v:shape>
+      </w:pict>
+    </w:r>
   </w:p>
 </w:hdr>
 </file>

</xml_diff>